<commit_message>
update analyses of listening
</commit_message>
<xml_diff>
--- a/IELTS Notes/Listening Test And Analyses..docx
+++ b/IELTS Notes/Listening Test And Analyses..docx
@@ -1,6 +1,6 @@
 
 <file path=word/document.xml><?xml version="1.0" encoding="utf-8"?>
-<w:document xmlns:ve="http://schemas.openxmlformats.org/markup-compatibility/2006" xmlns:o="urn:schemas-microsoft-com:office:office" xmlns:r="http://schemas.openxmlformats.org/officeDocument/2006/relationships" xmlns:m="http://schemas.openxmlformats.org/officeDocument/2006/math" xmlns:v="urn:schemas-microsoft-com:vml" xmlns:wp="http://schemas.openxmlformats.org/drawingml/2006/wordprocessingDrawing" xmlns:w10="urn:schemas-microsoft-com:office:word" xmlns:w="http://schemas.openxmlformats.org/wordprocessingml/2006/main" xmlns:wne="http://schemas.microsoft.com/office/word/2006/wordml">
+<w:document xmlns:wpc="http://schemas.microsoft.com/office/word/2010/wordprocessingCanvas" xmlns:mc="http://schemas.openxmlformats.org/markup-compatibility/2006" xmlns:o="urn:schemas-microsoft-com:office:office" xmlns:r="http://schemas.openxmlformats.org/officeDocument/2006/relationships" xmlns:m="http://schemas.openxmlformats.org/officeDocument/2006/math" xmlns:v="urn:schemas-microsoft-com:vml" xmlns:wp14="http://schemas.microsoft.com/office/word/2010/wordprocessingDrawing" xmlns:wp="http://schemas.openxmlformats.org/drawingml/2006/wordprocessingDrawing" xmlns:w10="urn:schemas-microsoft-com:office:word" xmlns:w="http://schemas.openxmlformats.org/wordprocessingml/2006/main" xmlns:w14="http://schemas.microsoft.com/office/word/2010/wordml" xmlns:wpg="http://schemas.microsoft.com/office/word/2010/wordprocessingGroup" xmlns:wpi="http://schemas.microsoft.com/office/word/2010/wordprocessingInk" xmlns:wne="http://schemas.microsoft.com/office/word/2006/wordml" xmlns:wps="http://schemas.microsoft.com/office/word/2010/wordprocessingShape" mc:Ignorable="w14 wp14">
   <w:body>
     <w:p>
       <w:pPr>
@@ -911,32 +911,32 @@
         <w:rPr>
           <w:rFonts w:ascii="Times New Roman" w:hAnsi="Times New Roman" w:cs="Times New Roman" w:hint="eastAsia"/>
         </w:rPr>
+        <w:t>39. ___ (</w:t>
+      </w:r>
+      <w:r>
+        <w:rPr>
+          <w:rFonts w:ascii="Times New Roman" w:hAnsi="Times New Roman" w:cs="Times New Roman"/>
+        </w:rPr>
+        <w:t>×</w:t>
+      </w:r>
+      <w:r>
+        <w:rPr>
+          <w:rFonts w:ascii="Times New Roman" w:hAnsi="Times New Roman" w:cs="Times New Roman" w:hint="eastAsia"/>
+        </w:rPr>
+        <w:t>) money management</w:t>
+      </w:r>
+    </w:p>
+    <w:p>
+      <w:pPr>
+        <w:rPr>
+          <w:rFonts w:ascii="Times New Roman" w:hAnsi="Times New Roman" w:cs="Times New Roman"/>
+        </w:rPr>
+      </w:pPr>
+      <w:r>
+        <w:rPr>
+          <w:rFonts w:ascii="Times New Roman" w:hAnsi="Times New Roman" w:cs="Times New Roman" w:hint="eastAsia"/>
+        </w:rPr>
         <w:lastRenderedPageBreak/>
-        <w:t>39. ___ (</w:t>
-      </w:r>
-      <w:r>
-        <w:rPr>
-          <w:rFonts w:ascii="Times New Roman" w:hAnsi="Times New Roman" w:cs="Times New Roman"/>
-        </w:rPr>
-        <w:t>×</w:t>
-      </w:r>
-      <w:r>
-        <w:rPr>
-          <w:rFonts w:ascii="Times New Roman" w:hAnsi="Times New Roman" w:cs="Times New Roman" w:hint="eastAsia"/>
-        </w:rPr>
-        <w:t>) money management</w:t>
-      </w:r>
-    </w:p>
-    <w:p>
-      <w:pPr>
-        <w:rPr>
-          <w:rFonts w:ascii="Times New Roman" w:hAnsi="Times New Roman" w:cs="Times New Roman"/>
-        </w:rPr>
-      </w:pPr>
-      <w:r>
-        <w:rPr>
-          <w:rFonts w:ascii="Times New Roman" w:hAnsi="Times New Roman" w:cs="Times New Roman" w:hint="eastAsia"/>
-        </w:rPr>
         <w:t>40. low risk investments (</w:t>
       </w:r>
       <w:r>
@@ -1969,6 +1969,7 @@
           <w:i/>
           <w:iCs/>
         </w:rPr>
+        <w:lastRenderedPageBreak/>
         <w:t>Section 2</w:t>
       </w:r>
     </w:p>
@@ -3033,43 +3034,37 @@
         <w:rPr>
           <w:rFonts w:ascii="Times New Roman" w:hAnsi="Times New Roman" w:cs="Times New Roman" w:hint="eastAsia"/>
         </w:rPr>
-        <w:t xml:space="preserve"> as the </w:t>
+        <w:t xml:space="preserve"> as the speaker said</w:t>
+      </w:r>
+      <w:r>
+        <w:rPr>
+          <w:rFonts w:ascii="Times New Roman" w:hAnsi="Times New Roman" w:cs="Times New Roman"/>
+        </w:rPr>
+        <w:t>”</w:t>
+      </w:r>
+      <w:r>
+        <w:rPr>
+          <w:rFonts w:ascii="Times New Roman" w:hAnsi="Times New Roman" w:cs="Times New Roman" w:hint="eastAsia"/>
+        </w:rPr>
+        <w:t>. Just writing numnbers is right.</w:t>
+      </w:r>
+      <w:r>
+        <w:rPr>
+          <w:rFonts w:ascii="Times New Roman" w:hAnsi="Times New Roman" w:cs="Times New Roman" w:hint="eastAsia"/>
+        </w:rPr>
+        <w:t>)</w:t>
+      </w:r>
+      <w:r>
+        <w:rPr>
+          <w:rFonts w:ascii="Times New Roman" w:hAnsi="Times New Roman" w:cs="Times New Roman"/>
+        </w:rPr>
+        <w:br/>
       </w:r>
       <w:r>
         <w:rPr>
           <w:rFonts w:ascii="Times New Roman" w:hAnsi="Times New Roman" w:cs="Times New Roman" w:hint="eastAsia"/>
         </w:rPr>
         <w:lastRenderedPageBreak/>
-        <w:t>speaker said</w:t>
-      </w:r>
-      <w:r>
-        <w:rPr>
-          <w:rFonts w:ascii="Times New Roman" w:hAnsi="Times New Roman" w:cs="Times New Roman"/>
-        </w:rPr>
-        <w:t>”</w:t>
-      </w:r>
-      <w:r>
-        <w:rPr>
-          <w:rFonts w:ascii="Times New Roman" w:hAnsi="Times New Roman" w:cs="Times New Roman" w:hint="eastAsia"/>
-        </w:rPr>
-        <w:t>. Just writing numnbers is right.</w:t>
-      </w:r>
-      <w:r>
-        <w:rPr>
-          <w:rFonts w:ascii="Times New Roman" w:hAnsi="Times New Roman" w:cs="Times New Roman" w:hint="eastAsia"/>
-        </w:rPr>
-        <w:t>)</w:t>
-      </w:r>
-      <w:r>
-        <w:rPr>
-          <w:rFonts w:ascii="Times New Roman" w:hAnsi="Times New Roman" w:cs="Times New Roman"/>
-        </w:rPr>
-        <w:br/>
-      </w:r>
-      <w:r>
-        <w:rPr>
-          <w:rFonts w:ascii="Times New Roman" w:hAnsi="Times New Roman" w:cs="Times New Roman" w:hint="eastAsia"/>
-        </w:rPr>
         <w:t xml:space="preserve">When the speaker </w:t>
       </w:r>
       <w:r>
@@ -4011,44 +4006,38 @@
         <w:rPr>
           <w:rFonts w:ascii="Times New Roman" w:hAnsi="Times New Roman" w:cs="Times New Roman" w:hint="eastAsia"/>
         </w:rPr>
-        <w:t xml:space="preserve">At the beginning of the last paragraph, the speaker said that the library offered specialised </w:t>
-      </w:r>
+        <w:t>At the beginning of the last paragraph, the speaker said that the library offered specialised training sessions and then added that information about compters and programmes later.</w:t>
+      </w:r>
+      <w:r>
+        <w:rPr>
+          <w:rFonts w:ascii="Times New Roman" w:hAnsi="Times New Roman" w:cs="Times New Roman" w:hint="eastAsia"/>
+        </w:rPr>
+        <w:t xml:space="preserve"> Apparently, it was the library staffs who helped postgraduates. </w:t>
+      </w:r>
+      <w:r>
+        <w:rPr>
+          <w:rFonts w:ascii="Times New Roman" w:hAnsi="Times New Roman" w:cs="Times New Roman"/>
+        </w:rPr>
+        <w:tab/>
+      </w:r>
+      <w:r>
+        <w:rPr>
+          <w:rFonts w:ascii="Times New Roman" w:hAnsi="Times New Roman" w:cs="Times New Roman" w:hint="eastAsia"/>
+        </w:rPr>
+        <w:t xml:space="preserve"> </w:t>
+      </w:r>
+    </w:p>
+    <w:p>
+      <w:pPr>
+        <w:rPr>
+          <w:rFonts w:ascii="Times New Roman" w:hAnsi="Times New Roman" w:cs="Times New Roman"/>
+        </w:rPr>
+      </w:pPr>
       <w:r>
         <w:rPr>
           <w:rFonts w:ascii="Times New Roman" w:hAnsi="Times New Roman" w:cs="Times New Roman" w:hint="eastAsia"/>
         </w:rPr>
         <w:lastRenderedPageBreak/>
-        <w:t>training sessions and then added that information about compters and programmes later.</w:t>
-      </w:r>
-      <w:r>
-        <w:rPr>
-          <w:rFonts w:ascii="Times New Roman" w:hAnsi="Times New Roman" w:cs="Times New Roman" w:hint="eastAsia"/>
-        </w:rPr>
-        <w:t xml:space="preserve"> Apparently, it was the library staffs who helped postgraduates. </w:t>
-      </w:r>
-      <w:r>
-        <w:rPr>
-          <w:rFonts w:ascii="Times New Roman" w:hAnsi="Times New Roman" w:cs="Times New Roman"/>
-        </w:rPr>
-        <w:tab/>
-      </w:r>
-      <w:r>
-        <w:rPr>
-          <w:rFonts w:ascii="Times New Roman" w:hAnsi="Times New Roman" w:cs="Times New Roman" w:hint="eastAsia"/>
-        </w:rPr>
-        <w:t xml:space="preserve"> </w:t>
-      </w:r>
-    </w:p>
-    <w:p>
-      <w:pPr>
-        <w:rPr>
-          <w:rFonts w:ascii="Times New Roman" w:hAnsi="Times New Roman" w:cs="Times New Roman"/>
-        </w:rPr>
-      </w:pPr>
-      <w:r>
-        <w:rPr>
-          <w:rFonts w:ascii="Times New Roman" w:hAnsi="Times New Roman" w:cs="Times New Roman" w:hint="eastAsia"/>
-        </w:rPr>
         <w:t>38, B (</w:t>
       </w:r>
       <w:r>
@@ -4896,7 +4885,19 @@
         <w:rPr>
           <w:rFonts w:ascii="Times New Roman" w:hAnsi="Times New Roman" w:cs="Times New Roman" w:hint="eastAsia"/>
         </w:rPr>
-        <w:t xml:space="preserve">The tutor said they like people to write a case study which is not a report?? Or Brian said he had finished it and wanted to </w:t>
+        <w:t>The tutor said they like people to write a case study which i</w:t>
+      </w:r>
+      <w:r>
+        <w:rPr>
+          <w:rFonts w:ascii="Times New Roman" w:hAnsi="Times New Roman" w:cs="Times New Roman" w:hint="eastAsia"/>
+        </w:rPr>
+        <w:t xml:space="preserve">s not a report. </w:t>
+      </w:r>
+      <w:r>
+        <w:rPr>
+          <w:rFonts w:ascii="Times New Roman" w:hAnsi="Times New Roman" w:cs="Times New Roman" w:hint="eastAsia"/>
+        </w:rPr>
+        <w:t xml:space="preserve">Brian said he had finished it and wanted to </w:t>
       </w:r>
       <w:r>
         <w:rPr>
@@ -4939,9 +4940,176 @@
     <w:p>
       <w:pPr>
         <w:rPr>
-          <w:rFonts w:ascii="Times New Roman" w:hAnsi="Times New Roman" w:cs="Times New Roman"/>
-        </w:rPr>
-      </w:pPr>
+          <w:rFonts w:ascii="Times New Roman" w:hAnsi="Times New Roman" w:cs="Times New Roman" w:hint="eastAsia"/>
+        </w:rPr>
+      </w:pPr>
+    </w:p>
+    <w:p>
+      <w:pPr>
+        <w:rPr>
+          <w:rFonts w:ascii="Times New Roman" w:hAnsi="Times New Roman" w:cs="Times New Roman" w:hint="eastAsia"/>
+        </w:rPr>
+      </w:pPr>
+    </w:p>
+    <w:p>
+      <w:pPr>
+        <w:outlineLvl w:val="2"/>
+        <w:rPr>
+          <w:rFonts w:ascii="Times New Roman" w:hAnsi="Times New Roman" w:cs="Times New Roman"/>
+          <w:b/>
+          <w:bCs/>
+          <w:sz w:val="24"/>
+          <w:szCs w:val="24"/>
+        </w:rPr>
+      </w:pPr>
+      <w:r>
+        <w:rPr>
+          <w:rFonts w:ascii="Times New Roman" w:hAnsi="Times New Roman" w:cs="Times New Roman"/>
+          <w:b/>
+          <w:bCs/>
+          <w:sz w:val="24"/>
+          <w:szCs w:val="24"/>
+        </w:rPr>
+        <w:lastRenderedPageBreak/>
+        <w:t>Test 2</w:t>
+      </w:r>
+      <w:r>
+        <w:rPr>
+          <w:rFonts w:ascii="Times New Roman" w:hAnsi="Times New Roman" w:cs="Times New Roman" w:hint="eastAsia"/>
+          <w:b/>
+          <w:bCs/>
+          <w:sz w:val="24"/>
+          <w:szCs w:val="24"/>
+        </w:rPr>
+        <w:t xml:space="preserve"> </w:t>
+      </w:r>
+      <w:r>
+        <w:rPr>
+          <w:rFonts w:ascii="Times New Roman" w:hAnsi="Times New Roman" w:cs="Times New Roman"/>
+          <w:b/>
+          <w:bCs/>
+          <w:sz w:val="24"/>
+          <w:szCs w:val="24"/>
+        </w:rPr>
+        <w:t xml:space="preserve">Listening </w:t>
+      </w:r>
+    </w:p>
+    <w:p>
+      <w:pPr>
+        <w:rPr>
+          <w:rFonts w:ascii="Times New Roman" w:hAnsi="Times New Roman" w:cs="Times New Roman"/>
+          <w:b/>
+          <w:bCs/>
+          <w:i/>
+          <w:iCs/>
+          <w:sz w:val="24"/>
+          <w:szCs w:val="24"/>
+        </w:rPr>
+      </w:pPr>
+      <w:r>
+        <w:rPr>
+          <w:rFonts w:ascii="Times New Roman" w:hAnsi="Times New Roman" w:cs="Times New Roman"/>
+          <w:b/>
+          <w:bCs/>
+          <w:i/>
+          <w:iCs/>
+          <w:sz w:val="24"/>
+          <w:szCs w:val="24"/>
+        </w:rPr>
+        <w:t>Section 1</w:t>
+      </w:r>
+    </w:p>
+    <w:p>
+      <w:pPr>
+        <w:rPr>
+          <w:rFonts w:ascii="Times New Roman" w:hAnsi="Times New Roman" w:cs="Times New Roman"/>
+        </w:rPr>
+      </w:pPr>
+      <w:r>
+        <w:rPr>
+          <w:rFonts w:ascii="Times New Roman" w:hAnsi="Times New Roman" w:cs="Times New Roman"/>
+        </w:rPr>
+        <w:t>8. long-bottle tops (x)</w:t>
+      </w:r>
+    </w:p>
+    <w:p>
+      <w:pPr>
+        <w:rPr>
+          <w:rFonts w:ascii="Times New Roman" w:hAnsi="Times New Roman" w:cs="Times New Roman"/>
+        </w:rPr>
+      </w:pPr>
+      <w:r>
+        <w:rPr>
+          <w:rFonts w:ascii="Times New Roman" w:hAnsi="Times New Roman" w:cs="Times New Roman"/>
+        </w:rPr>
+        <w:t xml:space="preserve">bottle tops </w:t>
+      </w:r>
+    </w:p>
+    <w:p>
+      <w:pPr>
+        <w:rPr>
+          <w:rFonts w:ascii="Times New Roman" w:hAnsi="Times New Roman" w:cs="Times New Roman"/>
+        </w:rPr>
+      </w:pPr>
+      <w:r>
+        <w:rPr>
+          <w:rFonts w:ascii="Times New Roman" w:hAnsi="Times New Roman" w:cs="Times New Roman" w:hint="eastAsia"/>
+        </w:rPr>
+        <w:t>“</w:t>
+      </w:r>
+      <w:r>
+        <w:rPr>
+          <w:rFonts w:ascii="Times New Roman" w:hAnsi="Times New Roman" w:cs="Times New Roman"/>
+        </w:rPr>
+        <w:t>Could you bring along bottle tops?...”</w:t>
+      </w:r>
+    </w:p>
+    <w:p>
+      <w:pPr>
+        <w:rPr>
+          <w:rFonts w:ascii="Times New Roman" w:hAnsi="Times New Roman" w:cs="Times New Roman"/>
+        </w:rPr>
+      </w:pPr>
+      <w:r>
+        <w:rPr>
+          <w:rFonts w:ascii="Times New Roman" w:hAnsi="Times New Roman" w:cs="Times New Roman"/>
+        </w:rPr>
+        <w:t>9. under-sea world  (x)</w:t>
+      </w:r>
+    </w:p>
+    <w:p>
+      <w:pPr>
+        <w:rPr>
+          <w:rFonts w:ascii="Times New Roman" w:hAnsi="Times New Roman" w:cs="Times New Roman"/>
+        </w:rPr>
+      </w:pPr>
+      <w:r>
+        <w:rPr>
+          <w:rFonts w:ascii="Times New Roman" w:hAnsi="Times New Roman" w:cs="Times New Roman"/>
+        </w:rPr>
+        <w:t>undersea world</w:t>
+      </w:r>
+    </w:p>
+    <w:p>
+      <w:pPr>
+        <w:rPr>
+          <w:rFonts w:ascii="Times New Roman" w:hAnsi="Times New Roman" w:cs="Times New Roman"/>
+        </w:rPr>
+      </w:pPr>
+      <w:r>
+        <w:rPr>
+          <w:rFonts w:ascii="Times New Roman" w:hAnsi="Times New Roman" w:cs="Times New Roman"/>
+        </w:rPr>
+        <w:t>There is no hyphen in “undersea” and the “worlds”</w:t>
+      </w:r>
+      <w:bookmarkStart w:id="1" w:name="_GoBack"/>
+      <w:bookmarkEnd w:id="1"/>
+      <w:r>
+        <w:rPr>
+          <w:rFonts w:ascii="Times New Roman" w:hAnsi="Times New Roman" w:cs="Times New Roman"/>
+        </w:rPr>
+        <w:t xml:space="preserve"> is plural.</w:t>
+      </w:r>
     </w:p>
     <w:sectPr>
       <w:pgSz w:w="11906" w:h="16838"/>
@@ -4954,7 +5122,7 @@
 </file>
 
 <file path=word/endnotes.xml><?xml version="1.0" encoding="utf-8"?>
-<w:endnotes xmlns:ve="http://schemas.openxmlformats.org/markup-compatibility/2006" xmlns:o="urn:schemas-microsoft-com:office:office" xmlns:r="http://schemas.openxmlformats.org/officeDocument/2006/relationships" xmlns:m="http://schemas.openxmlformats.org/officeDocument/2006/math" xmlns:v="urn:schemas-microsoft-com:vml" xmlns:wp="http://schemas.openxmlformats.org/drawingml/2006/wordprocessingDrawing" xmlns:w10="urn:schemas-microsoft-com:office:word" xmlns:w="http://schemas.openxmlformats.org/wordprocessingml/2006/main" xmlns:wne="http://schemas.microsoft.com/office/word/2006/wordml">
+<w:endnotes xmlns:wpc="http://schemas.microsoft.com/office/word/2010/wordprocessingCanvas" xmlns:mc="http://schemas.openxmlformats.org/markup-compatibility/2006" xmlns:o="urn:schemas-microsoft-com:office:office" xmlns:r="http://schemas.openxmlformats.org/officeDocument/2006/relationships" xmlns:m="http://schemas.openxmlformats.org/officeDocument/2006/math" xmlns:v="urn:schemas-microsoft-com:vml" xmlns:wp14="http://schemas.microsoft.com/office/word/2010/wordprocessingDrawing" xmlns:wp="http://schemas.openxmlformats.org/drawingml/2006/wordprocessingDrawing" xmlns:w10="urn:schemas-microsoft-com:office:word" xmlns:w="http://schemas.openxmlformats.org/wordprocessingml/2006/main" xmlns:w14="http://schemas.microsoft.com/office/word/2010/wordml" xmlns:wpg="http://schemas.microsoft.com/office/word/2010/wordprocessingGroup" xmlns:wpi="http://schemas.microsoft.com/office/word/2010/wordprocessingInk" xmlns:wne="http://schemas.microsoft.com/office/word/2006/wordml" xmlns:wps="http://schemas.microsoft.com/office/word/2010/wordprocessingShape" mc:Ignorable="w14 wp14">
   <w:endnote w:type="separator" w:id="-1">
     <w:p>
       <w:pPr>
@@ -4979,7 +5147,7 @@
 </file>
 
 <file path=word/footnotes.xml><?xml version="1.0" encoding="utf-8"?>
-<w:footnotes xmlns:ve="http://schemas.openxmlformats.org/markup-compatibility/2006" xmlns:o="urn:schemas-microsoft-com:office:office" xmlns:r="http://schemas.openxmlformats.org/officeDocument/2006/relationships" xmlns:m="http://schemas.openxmlformats.org/officeDocument/2006/math" xmlns:v="urn:schemas-microsoft-com:vml" xmlns:wp="http://schemas.openxmlformats.org/drawingml/2006/wordprocessingDrawing" xmlns:w10="urn:schemas-microsoft-com:office:word" xmlns:w="http://schemas.openxmlformats.org/wordprocessingml/2006/main" xmlns:wne="http://schemas.microsoft.com/office/word/2006/wordml">
+<w:footnotes xmlns:wpc="http://schemas.microsoft.com/office/word/2010/wordprocessingCanvas" xmlns:mc="http://schemas.openxmlformats.org/markup-compatibility/2006" xmlns:o="urn:schemas-microsoft-com:office:office" xmlns:r="http://schemas.openxmlformats.org/officeDocument/2006/relationships" xmlns:m="http://schemas.openxmlformats.org/officeDocument/2006/math" xmlns:v="urn:schemas-microsoft-com:vml" xmlns:wp14="http://schemas.microsoft.com/office/word/2010/wordprocessingDrawing" xmlns:wp="http://schemas.openxmlformats.org/drawingml/2006/wordprocessingDrawing" xmlns:w10="urn:schemas-microsoft-com:office:word" xmlns:w="http://schemas.openxmlformats.org/wordprocessingml/2006/main" xmlns:w14="http://schemas.microsoft.com/office/word/2010/wordml" xmlns:wpg="http://schemas.microsoft.com/office/word/2010/wordprocessingGroup" xmlns:wpi="http://schemas.microsoft.com/office/word/2010/wordprocessingInk" xmlns:wne="http://schemas.microsoft.com/office/word/2006/wordml" xmlns:wps="http://schemas.microsoft.com/office/word/2010/wordprocessingShape" mc:Ignorable="w14 wp14">
   <w:footnote w:type="separator" w:id="-1">
     <w:p>
       <w:pPr>
@@ -5004,7 +5172,7 @@
 </file>
 
 <file path=word/styles.xml><?xml version="1.0" encoding="utf-8"?>
-<w:styles xmlns:r="http://schemas.openxmlformats.org/officeDocument/2006/relationships" xmlns:w="http://schemas.openxmlformats.org/wordprocessingml/2006/main">
+<w:styles xmlns:mc="http://schemas.openxmlformats.org/markup-compatibility/2006" xmlns:r="http://schemas.openxmlformats.org/officeDocument/2006/relationships" xmlns:w="http://schemas.openxmlformats.org/wordprocessingml/2006/main" xmlns:w14="http://schemas.microsoft.com/office/word/2010/wordml" mc:Ignorable="w14">
   <w:docDefaults>
     <w:rPrDefault>
       <w:rPr>
@@ -5175,7 +5343,6 @@
     <w:uiPriority w:val="99"/>
     <w:semiHidden/>
     <w:unhideWhenUsed/>
-    <w:qFormat/>
     <w:tblPr>
       <w:tblInd w:w="0" w:type="dxa"/>
       <w:tblCellMar>
@@ -5273,6 +5440,197 @@
       <w:sz w:val="18"/>
       <w:szCs w:val="18"/>
     </w:rPr>
+  </w:style>
+</w:styles>
+</file>
+
+<file path=word/stylesWithEffects.xml><?xml version="1.0" encoding="utf-8"?>
+<w:styles xmlns:wpc="http://schemas.microsoft.com/office/word/2010/wordprocessingCanvas" xmlns:mc="http://schemas.openxmlformats.org/markup-compatibility/2006" xmlns:o="urn:schemas-microsoft-com:office:office" xmlns:r="http://schemas.openxmlformats.org/officeDocument/2006/relationships" xmlns:m="http://schemas.openxmlformats.org/officeDocument/2006/math" xmlns:v="urn:schemas-microsoft-com:vml" xmlns:wp14="http://schemas.microsoft.com/office/word/2010/wordprocessingDrawing" xmlns:wp="http://schemas.openxmlformats.org/drawingml/2006/wordprocessingDrawing" xmlns:w10="urn:schemas-microsoft-com:office:word" xmlns:w="http://schemas.openxmlformats.org/wordprocessingml/2006/main" xmlns:w14="http://schemas.microsoft.com/office/word/2010/wordml" xmlns:wpg="http://schemas.microsoft.com/office/word/2010/wordprocessingGroup" xmlns:wpi="http://schemas.microsoft.com/office/word/2010/wordprocessingInk" xmlns:wne="http://schemas.microsoft.com/office/word/2006/wordml" xmlns:wps="http://schemas.microsoft.com/office/word/2010/wordprocessingShape" mc:Ignorable="w14 wp14">
+  <w:docDefaults>
+    <w:rPrDefault>
+      <w:rPr>
+        <w:rFonts w:asciiTheme="minorHAnsi" w:eastAsiaTheme="minorEastAsia" w:hAnsiTheme="minorHAnsi" w:cstheme="minorBidi"/>
+        <w:kern w:val="2"/>
+        <w:sz w:val="21"/>
+        <w:szCs w:val="22"/>
+        <w:lang w:val="en-US" w:eastAsia="zh-CN" w:bidi="ar-SA"/>
+      </w:rPr>
+    </w:rPrDefault>
+    <w:pPrDefault/>
+  </w:docDefaults>
+  <w:latentStyles w:defLockedState="0" w:defUIPriority="99" w:defSemiHidden="1" w:defUnhideWhenUsed="1" w:defQFormat="0" w:count="267">
+    <w:lsdException w:name="Normal" w:semiHidden="0" w:uiPriority="0" w:unhideWhenUsed="0" w:qFormat="1"/>
+    <w:lsdException w:name="heading 1" w:semiHidden="0" w:uiPriority="9" w:unhideWhenUsed="0" w:qFormat="1"/>
+    <w:lsdException w:name="heading 2" w:uiPriority="9" w:qFormat="1"/>
+    <w:lsdException w:name="heading 3" w:uiPriority="9" w:qFormat="1"/>
+    <w:lsdException w:name="heading 4" w:uiPriority="9" w:qFormat="1"/>
+    <w:lsdException w:name="heading 5" w:uiPriority="9" w:qFormat="1"/>
+    <w:lsdException w:name="heading 6" w:uiPriority="9" w:qFormat="1"/>
+    <w:lsdException w:name="heading 7" w:uiPriority="9" w:qFormat="1"/>
+    <w:lsdException w:name="heading 8" w:uiPriority="9" w:qFormat="1"/>
+    <w:lsdException w:name="heading 9" w:uiPriority="9" w:qFormat="1"/>
+    <w:lsdException w:name="toc 1" w:uiPriority="39"/>
+    <w:lsdException w:name="toc 2" w:uiPriority="39"/>
+    <w:lsdException w:name="toc 3" w:uiPriority="39"/>
+    <w:lsdException w:name="toc 4" w:uiPriority="39"/>
+    <w:lsdException w:name="toc 5" w:uiPriority="39"/>
+    <w:lsdException w:name="toc 6" w:uiPriority="39"/>
+    <w:lsdException w:name="toc 7" w:uiPriority="39"/>
+    <w:lsdException w:name="toc 8" w:uiPriority="39"/>
+    <w:lsdException w:name="toc 9" w:uiPriority="39"/>
+    <w:lsdException w:name="caption" w:uiPriority="35" w:qFormat="1"/>
+    <w:lsdException w:name="Title" w:semiHidden="0" w:uiPriority="10" w:unhideWhenUsed="0" w:qFormat="1"/>
+    <w:lsdException w:name="Default Paragraph Font" w:uiPriority="1"/>
+    <w:lsdException w:name="Subtitle" w:semiHidden="0" w:uiPriority="11" w:unhideWhenUsed="0" w:qFormat="1"/>
+    <w:lsdException w:name="Strong" w:semiHidden="0" w:uiPriority="22" w:unhideWhenUsed="0" w:qFormat="1"/>
+    <w:lsdException w:name="Emphasis" w:semiHidden="0" w:uiPriority="20" w:unhideWhenUsed="0" w:qFormat="1"/>
+    <w:lsdException w:name="Table Grid" w:semiHidden="0" w:uiPriority="59" w:unhideWhenUsed="0"/>
+    <w:lsdException w:name="Placeholder Text" w:unhideWhenUsed="0"/>
+    <w:lsdException w:name="No Spacing" w:semiHidden="0" w:uiPriority="1" w:unhideWhenUsed="0" w:qFormat="1"/>
+    <w:lsdException w:name="Light Shading" w:semiHidden="0" w:uiPriority="60" w:unhideWhenUsed="0"/>
+    <w:lsdException w:name="Light List" w:semiHidden="0" w:uiPriority="61" w:unhideWhenUsed="0"/>
+    <w:lsdException w:name="Light Grid" w:semiHidden="0" w:uiPriority="62" w:unhideWhenUsed="0"/>
+    <w:lsdException w:name="Medium Shading 1" w:semiHidden="0" w:uiPriority="63" w:unhideWhenUsed="0"/>
+    <w:lsdException w:name="Medium Shading 2" w:semiHidden="0" w:uiPriority="64" w:unhideWhenUsed="0"/>
+    <w:lsdException w:name="Medium List 1" w:semiHidden="0" w:uiPriority="65" w:unhideWhenUsed="0"/>
+    <w:lsdException w:name="Medium List 2" w:semiHidden="0" w:uiPriority="66" w:unhideWhenUsed="0"/>
+    <w:lsdException w:name="Medium Grid 1" w:semiHidden="0" w:uiPriority="67" w:unhideWhenUsed="0"/>
+    <w:lsdException w:name="Medium Grid 2" w:semiHidden="0" w:uiPriority="68" w:unhideWhenUsed="0"/>
+    <w:lsdException w:name="Medium Grid 3" w:semiHidden="0" w:uiPriority="69" w:unhideWhenUsed="0"/>
+    <w:lsdException w:name="Dark List" w:semiHidden="0" w:uiPriority="70" w:unhideWhenUsed="0"/>
+    <w:lsdException w:name="Colorful Shading" w:semiHidden="0" w:uiPriority="71" w:unhideWhenUsed="0"/>
+    <w:lsdException w:name="Colorful List" w:semiHidden="0" w:uiPriority="72" w:unhideWhenUsed="0"/>
+    <w:lsdException w:name="Colorful Grid" w:semiHidden="0" w:uiPriority="73" w:unhideWhenUsed="0"/>
+    <w:lsdException w:name="Light Shading Accent 1" w:semiHidden="0" w:uiPriority="60" w:unhideWhenUsed="0"/>
+    <w:lsdException w:name="Light List Accent 1" w:semiHidden="0" w:uiPriority="61" w:unhideWhenUsed="0"/>
+    <w:lsdException w:name="Light Grid Accent 1" w:semiHidden="0" w:uiPriority="62" w:unhideWhenUsed="0"/>
+    <w:lsdException w:name="Medium Shading 1 Accent 1" w:semiHidden="0" w:uiPriority="63" w:unhideWhenUsed="0"/>
+    <w:lsdException w:name="Medium Shading 2 Accent 1" w:semiHidden="0" w:uiPriority="64" w:unhideWhenUsed="0"/>
+    <w:lsdException w:name="Medium List 1 Accent 1" w:semiHidden="0" w:uiPriority="65" w:unhideWhenUsed="0"/>
+    <w:lsdException w:name="Revision" w:unhideWhenUsed="0"/>
+    <w:lsdException w:name="List Paragraph" w:semiHidden="0" w:uiPriority="34" w:unhideWhenUsed="0" w:qFormat="1"/>
+    <w:lsdException w:name="Quote" w:semiHidden="0" w:uiPriority="29" w:unhideWhenUsed="0" w:qFormat="1"/>
+    <w:lsdException w:name="Intense Quote" w:semiHidden="0" w:uiPriority="30" w:unhideWhenUsed="0" w:qFormat="1"/>
+    <w:lsdException w:name="Medium List 2 Accent 1" w:semiHidden="0" w:uiPriority="66" w:unhideWhenUsed="0"/>
+    <w:lsdException w:name="Medium Grid 1 Accent 1" w:semiHidden="0" w:uiPriority="67" w:unhideWhenUsed="0"/>
+    <w:lsdException w:name="Medium Grid 2 Accent 1" w:semiHidden="0" w:uiPriority="68" w:unhideWhenUsed="0"/>
+    <w:lsdException w:name="Medium Grid 3 Accent 1" w:semiHidden="0" w:uiPriority="69" w:unhideWhenUsed="0"/>
+    <w:lsdException w:name="Dark List Accent 1" w:semiHidden="0" w:uiPriority="70" w:unhideWhenUsed="0"/>
+    <w:lsdException w:name="Colorful Shading Accent 1" w:semiHidden="0" w:uiPriority="71" w:unhideWhenUsed="0"/>
+    <w:lsdException w:name="Colorful List Accent 1" w:semiHidden="0" w:uiPriority="72" w:unhideWhenUsed="0"/>
+    <w:lsdException w:name="Colorful Grid Accent 1" w:semiHidden="0" w:uiPriority="73" w:unhideWhenUsed="0"/>
+    <w:lsdException w:name="Light Shading Accent 2" w:semiHidden="0" w:uiPriority="60" w:unhideWhenUsed="0"/>
+    <w:lsdException w:name="Light List Accent 2" w:semiHidden="0" w:uiPriority="61" w:unhideWhenUsed="0"/>
+    <w:lsdException w:name="Light Grid Accent 2" w:semiHidden="0" w:uiPriority="62" w:unhideWhenUsed="0"/>
+    <w:lsdException w:name="Medium Shading 1 Accent 2" w:semiHidden="0" w:uiPriority="63" w:unhideWhenUsed="0"/>
+    <w:lsdException w:name="Medium Shading 2 Accent 2" w:semiHidden="0" w:uiPriority="64" w:unhideWhenUsed="0"/>
+    <w:lsdException w:name="Medium List 1 Accent 2" w:semiHidden="0" w:uiPriority="65" w:unhideWhenUsed="0"/>
+    <w:lsdException w:name="Medium List 2 Accent 2" w:semiHidden="0" w:uiPriority="66" w:unhideWhenUsed="0"/>
+    <w:lsdException w:name="Medium Grid 1 Accent 2" w:semiHidden="0" w:uiPriority="67" w:unhideWhenUsed="0"/>
+    <w:lsdException w:name="Medium Grid 2 Accent 2" w:semiHidden="0" w:uiPriority="68" w:unhideWhenUsed="0"/>
+    <w:lsdException w:name="Medium Grid 3 Accent 2" w:semiHidden="0" w:uiPriority="69" w:unhideWhenUsed="0"/>
+    <w:lsdException w:name="Dark List Accent 2" w:semiHidden="0" w:uiPriority="70" w:unhideWhenUsed="0"/>
+    <w:lsdException w:name="Colorful Shading Accent 2" w:semiHidden="0" w:uiPriority="71" w:unhideWhenUsed="0"/>
+    <w:lsdException w:name="Colorful List Accent 2" w:semiHidden="0" w:uiPriority="72" w:unhideWhenUsed="0"/>
+    <w:lsdException w:name="Colorful Grid Accent 2" w:semiHidden="0" w:uiPriority="73" w:unhideWhenUsed="0"/>
+    <w:lsdException w:name="Light Shading Accent 3" w:semiHidden="0" w:uiPriority="60" w:unhideWhenUsed="0"/>
+    <w:lsdException w:name="Light List Accent 3" w:semiHidden="0" w:uiPriority="61" w:unhideWhenUsed="0"/>
+    <w:lsdException w:name="Light Grid Accent 3" w:semiHidden="0" w:uiPriority="62" w:unhideWhenUsed="0"/>
+    <w:lsdException w:name="Medium Shading 1 Accent 3" w:semiHidden="0" w:uiPriority="63" w:unhideWhenUsed="0"/>
+    <w:lsdException w:name="Medium Shading 2 Accent 3" w:semiHidden="0" w:uiPriority="64" w:unhideWhenUsed="0"/>
+    <w:lsdException w:name="Medium List 1 Accent 3" w:semiHidden="0" w:uiPriority="65" w:unhideWhenUsed="0"/>
+    <w:lsdException w:name="Medium List 2 Accent 3" w:semiHidden="0" w:uiPriority="66" w:unhideWhenUsed="0"/>
+    <w:lsdException w:name="Medium Grid 1 Accent 3" w:semiHidden="0" w:uiPriority="67" w:unhideWhenUsed="0"/>
+    <w:lsdException w:name="Medium Grid 2 Accent 3" w:semiHidden="0" w:uiPriority="68" w:unhideWhenUsed="0"/>
+    <w:lsdException w:name="Medium Grid 3 Accent 3" w:semiHidden="0" w:uiPriority="69" w:unhideWhenUsed="0"/>
+    <w:lsdException w:name="Dark List Accent 3" w:semiHidden="0" w:uiPriority="70" w:unhideWhenUsed="0"/>
+    <w:lsdException w:name="Colorful Shading Accent 3" w:semiHidden="0" w:uiPriority="71" w:unhideWhenUsed="0"/>
+    <w:lsdException w:name="Colorful List Accent 3" w:semiHidden="0" w:uiPriority="72" w:unhideWhenUsed="0"/>
+    <w:lsdException w:name="Colorful Grid Accent 3" w:semiHidden="0" w:uiPriority="73" w:unhideWhenUsed="0"/>
+    <w:lsdException w:name="Light Shading Accent 4" w:semiHidden="0" w:uiPriority="60" w:unhideWhenUsed="0"/>
+    <w:lsdException w:name="Light List Accent 4" w:semiHidden="0" w:uiPriority="61" w:unhideWhenUsed="0"/>
+    <w:lsdException w:name="Light Grid Accent 4" w:semiHidden="0" w:uiPriority="62" w:unhideWhenUsed="0"/>
+    <w:lsdException w:name="Medium Shading 1 Accent 4" w:semiHidden="0" w:uiPriority="63" w:unhideWhenUsed="0"/>
+    <w:lsdException w:name="Medium Shading 2 Accent 4" w:semiHidden="0" w:uiPriority="64" w:unhideWhenUsed="0"/>
+    <w:lsdException w:name="Medium List 1 Accent 4" w:semiHidden="0" w:uiPriority="65" w:unhideWhenUsed="0"/>
+    <w:lsdException w:name="Medium List 2 Accent 4" w:semiHidden="0" w:uiPriority="66" w:unhideWhenUsed="0"/>
+    <w:lsdException w:name="Medium Grid 1 Accent 4" w:semiHidden="0" w:uiPriority="67" w:unhideWhenUsed="0"/>
+    <w:lsdException w:name="Medium Grid 2 Accent 4" w:semiHidden="0" w:uiPriority="68" w:unhideWhenUsed="0"/>
+    <w:lsdException w:name="Medium Grid 3 Accent 4" w:semiHidden="0" w:uiPriority="69" w:unhideWhenUsed="0"/>
+    <w:lsdException w:name="Dark List Accent 4" w:semiHidden="0" w:uiPriority="70" w:unhideWhenUsed="0"/>
+    <w:lsdException w:name="Colorful Shading Accent 4" w:semiHidden="0" w:uiPriority="71" w:unhideWhenUsed="0"/>
+    <w:lsdException w:name="Colorful List Accent 4" w:semiHidden="0" w:uiPriority="72" w:unhideWhenUsed="0"/>
+    <w:lsdException w:name="Colorful Grid Accent 4" w:semiHidden="0" w:uiPriority="73" w:unhideWhenUsed="0"/>
+    <w:lsdException w:name="Light Shading Accent 5" w:semiHidden="0" w:uiPriority="60" w:unhideWhenUsed="0"/>
+    <w:lsdException w:name="Light List Accent 5" w:semiHidden="0" w:uiPriority="61" w:unhideWhenUsed="0"/>
+    <w:lsdException w:name="Light Grid Accent 5" w:semiHidden="0" w:uiPriority="62" w:unhideWhenUsed="0"/>
+    <w:lsdException w:name="Medium Shading 1 Accent 5" w:semiHidden="0" w:uiPriority="63" w:unhideWhenUsed="0"/>
+    <w:lsdException w:name="Medium Shading 2 Accent 5" w:semiHidden="0" w:uiPriority="64" w:unhideWhenUsed="0"/>
+    <w:lsdException w:name="Medium List 1 Accent 5" w:semiHidden="0" w:uiPriority="65" w:unhideWhenUsed="0"/>
+    <w:lsdException w:name="Medium List 2 Accent 5" w:semiHidden="0" w:uiPriority="66" w:unhideWhenUsed="0"/>
+    <w:lsdException w:name="Medium Grid 1 Accent 5" w:semiHidden="0" w:uiPriority="67" w:unhideWhenUsed="0"/>
+    <w:lsdException w:name="Medium Grid 2 Accent 5" w:semiHidden="0" w:uiPriority="68" w:unhideWhenUsed="0"/>
+    <w:lsdException w:name="Medium Grid 3 Accent 5" w:semiHidden="0" w:uiPriority="69" w:unhideWhenUsed="0"/>
+    <w:lsdException w:name="Dark List Accent 5" w:semiHidden="0" w:uiPriority="70" w:unhideWhenUsed="0"/>
+    <w:lsdException w:name="Colorful Shading Accent 5" w:semiHidden="0" w:uiPriority="71" w:unhideWhenUsed="0"/>
+    <w:lsdException w:name="Colorful List Accent 5" w:semiHidden="0" w:uiPriority="72" w:unhideWhenUsed="0"/>
+    <w:lsdException w:name="Colorful Grid Accent 5" w:semiHidden="0" w:uiPriority="73" w:unhideWhenUsed="0"/>
+    <w:lsdException w:name="Light Shading Accent 6" w:semiHidden="0" w:uiPriority="60" w:unhideWhenUsed="0"/>
+    <w:lsdException w:name="Light List Accent 6" w:semiHidden="0" w:uiPriority="61" w:unhideWhenUsed="0"/>
+    <w:lsdException w:name="Light Grid Accent 6" w:semiHidden="0" w:uiPriority="62" w:unhideWhenUsed="0"/>
+    <w:lsdException w:name="Medium Shading 1 Accent 6" w:semiHidden="0" w:uiPriority="63" w:unhideWhenUsed="0"/>
+    <w:lsdException w:name="Medium Shading 2 Accent 6" w:semiHidden="0" w:uiPriority="64" w:unhideWhenUsed="0"/>
+    <w:lsdException w:name="Medium List 1 Accent 6" w:semiHidden="0" w:uiPriority="65" w:unhideWhenUsed="0"/>
+    <w:lsdException w:name="Medium List 2 Accent 6" w:semiHidden="0" w:uiPriority="66" w:unhideWhenUsed="0"/>
+    <w:lsdException w:name="Medium Grid 1 Accent 6" w:semiHidden="0" w:uiPriority="67" w:unhideWhenUsed="0"/>
+    <w:lsdException w:name="Medium Grid 2 Accent 6" w:semiHidden="0" w:uiPriority="68" w:unhideWhenUsed="0"/>
+    <w:lsdException w:name="Medium Grid 3 Accent 6" w:semiHidden="0" w:uiPriority="69" w:unhideWhenUsed="0"/>
+    <w:lsdException w:name="Dark List Accent 6" w:semiHidden="0" w:uiPriority="70" w:unhideWhenUsed="0"/>
+    <w:lsdException w:name="Colorful Shading Accent 6" w:semiHidden="0" w:uiPriority="71" w:unhideWhenUsed="0"/>
+    <w:lsdException w:name="Colorful List Accent 6" w:semiHidden="0" w:uiPriority="72" w:unhideWhenUsed="0"/>
+    <w:lsdException w:name="Colorful Grid Accent 6" w:semiHidden="0" w:uiPriority="73" w:unhideWhenUsed="0"/>
+    <w:lsdException w:name="Subtle Emphasis" w:semiHidden="0" w:uiPriority="19" w:unhideWhenUsed="0" w:qFormat="1"/>
+    <w:lsdException w:name="Intense Emphasis" w:semiHidden="0" w:uiPriority="21" w:unhideWhenUsed="0" w:qFormat="1"/>
+    <w:lsdException w:name="Subtle Reference" w:semiHidden="0" w:uiPriority="31" w:unhideWhenUsed="0" w:qFormat="1"/>
+    <w:lsdException w:name="Intense Reference" w:semiHidden="0" w:uiPriority="32" w:unhideWhenUsed="0" w:qFormat="1"/>
+    <w:lsdException w:name="Book Title" w:semiHidden="0" w:uiPriority="33" w:unhideWhenUsed="0" w:qFormat="1"/>
+    <w:lsdException w:name="Bibliography" w:uiPriority="37"/>
+    <w:lsdException w:name="TOC Heading" w:uiPriority="39" w:qFormat="1"/>
+  </w:latentStyles>
+  <w:style w:type="paragraph" w:default="1" w:styleId="a">
+    <w:name w:val="Normal"/>
+    <w:qFormat/>
+    <w:pPr>
+      <w:widowControl w:val="0"/>
+      <w:jc w:val="both"/>
+    </w:pPr>
+  </w:style>
+  <w:style w:type="character" w:default="1" w:styleId="a0">
+    <w:name w:val="Default Paragraph Font"/>
+    <w:uiPriority w:val="1"/>
+    <w:semiHidden/>
+    <w:unhideWhenUsed/>
+  </w:style>
+  <w:style w:type="table" w:default="1" w:styleId="a1">
+    <w:name w:val="Normal Table"/>
+    <w:uiPriority w:val="99"/>
+    <w:semiHidden/>
+    <w:unhideWhenUsed/>
+    <w:tblPr>
+      <w:tblInd w:w="0" w:type="dxa"/>
+      <w:tblCellMar>
+        <w:top w:w="0" w:type="dxa"/>
+        <w:left w:w="108" w:type="dxa"/>
+        <w:bottom w:w="0" w:type="dxa"/>
+        <w:right w:w="108" w:type="dxa"/>
+      </w:tblCellMar>
+    </w:tblPr>
+  </w:style>
+  <w:style w:type="numbering" w:default="1" w:styleId="a2">
+    <w:name w:val="No List"/>
+    <w:uiPriority w:val="99"/>
+    <w:semiHidden/>
+    <w:unhideWhenUsed/>
   </w:style>
 </w:styles>
 </file>
@@ -5566,7 +5924,7 @@
   <a:extraClrSchemeLst/>
   <a:extLst>
     <a:ext uri="{05A4C25C-085E-4340-85A3-A5531E510DB2}">
-      <thm15:themeFamily xmlns:thm15="http://schemas.microsoft.com/office/thememl/2012/main" xmlns="" name="Office Theme" id="{62F939B6-93AF-4DB8-9C6B-D6C7DFDC589F}" vid="{4A3C46E8-61CC-4603-A589-7422A47A8E4A}"/>
+      <thm15:themeFamily xmlns="" xmlns:thm15="http://schemas.microsoft.com/office/thememl/2012/main" name="Office Theme" id="{62F939B6-93AF-4DB8-9C6B-D6C7DFDC589F}" vid="{4A3C46E8-61CC-4603-A589-7422A47A8E4A}"/>
     </a:ext>
   </a:extLst>
 </a:theme>

</xml_diff>

<commit_message>
update notes of IELTS
</commit_message>
<xml_diff>
--- a/IELTS Notes/Listening Test And Analyses..docx
+++ b/IELTS Notes/Listening Test And Analyses..docx
@@ -4940,14 +4940,14 @@
     <w:p>
       <w:pPr>
         <w:rPr>
-          <w:rFonts w:ascii="Times New Roman" w:hAnsi="Times New Roman" w:cs="Times New Roman" w:hint="eastAsia"/>
-        </w:rPr>
-      </w:pPr>
-    </w:p>
-    <w:p>
-      <w:pPr>
-        <w:rPr>
-          <w:rFonts w:ascii="Times New Roman" w:hAnsi="Times New Roman" w:cs="Times New Roman" w:hint="eastAsia"/>
+          <w:rFonts w:ascii="Times New Roman" w:hAnsi="Times New Roman" w:cs="Times New Roman"/>
+        </w:rPr>
+      </w:pPr>
+    </w:p>
+    <w:p>
+      <w:pPr>
+        <w:rPr>
+          <w:rFonts w:ascii="Times New Roman" w:hAnsi="Times New Roman" w:cs="Times New Roman"/>
         </w:rPr>
       </w:pPr>
     </w:p>
@@ -5085,31 +5085,402 @@
       </w:pPr>
       <w:r>
         <w:rPr>
-          <w:rFonts w:ascii="Times New Roman" w:hAnsi="Times New Roman" w:cs="Times New Roman"/>
-        </w:rPr>
-        <w:t>undersea world</w:t>
-      </w:r>
-    </w:p>
-    <w:p>
-      <w:pPr>
-        <w:rPr>
-          <w:rFonts w:ascii="Times New Roman" w:hAnsi="Times New Roman" w:cs="Times New Roman"/>
-        </w:rPr>
-      </w:pPr>
-      <w:r>
-        <w:rPr>
-          <w:rFonts w:ascii="Times New Roman" w:hAnsi="Times New Roman" w:cs="Times New Roman"/>
-        </w:rPr>
-        <w:t>There is no hyphen in “undersea” and the “worlds”</w:t>
+          <w:rFonts w:ascii="Times New Roman" w:hAnsi="Times New Roman" w:cs="Times New Roman" w:hint="eastAsia"/>
+        </w:rPr>
+        <w:t>U</w:t>
+      </w:r>
+      <w:r>
+        <w:rPr>
+          <w:rFonts w:ascii="Times New Roman" w:hAnsi="Times New Roman" w:cs="Times New Roman"/>
+        </w:rPr>
+        <w:t xml:space="preserve">ndersea </w:t>
+      </w:r>
+      <w:r>
+        <w:rPr>
+          <w:rFonts w:ascii="Times New Roman" w:hAnsi="Times New Roman" w:cs="Times New Roman" w:hint="eastAsia"/>
+        </w:rPr>
+        <w:t>W</w:t>
+      </w:r>
+      <w:r>
+        <w:rPr>
+          <w:rFonts w:ascii="Times New Roman" w:hAnsi="Times New Roman" w:cs="Times New Roman"/>
+        </w:rPr>
+        <w:t>orld</w:t>
+      </w:r>
+      <w:r>
+        <w:rPr>
+          <w:rFonts w:ascii="Times New Roman" w:hAnsi="Times New Roman" w:cs="Times New Roman" w:hint="eastAsia"/>
+        </w:rPr>
+        <w:t>s</w:t>
+      </w:r>
+    </w:p>
+    <w:p>
+      <w:pPr>
+        <w:rPr>
+          <w:rFonts w:ascii="Times New Roman" w:hAnsi="Times New Roman" w:cs="Times New Roman" w:hint="eastAsia"/>
+        </w:rPr>
+      </w:pPr>
+      <w:r>
+        <w:rPr>
+          <w:rFonts w:ascii="Times New Roman" w:hAnsi="Times New Roman" w:cs="Times New Roman"/>
+        </w:rPr>
+        <w:t>There is no hyphen in “undersea” and the “worlds” is plural.</w:t>
+      </w:r>
+    </w:p>
+    <w:p>
+      <w:pPr>
+        <w:rPr>
+          <w:rFonts w:ascii="Times New Roman" w:hAnsi="Times New Roman" w:cs="Times New Roman" w:hint="eastAsia"/>
+          <w:b/>
+          <w:bCs/>
+          <w:i/>
+          <w:iCs/>
+          <w:sz w:val="24"/>
+          <w:szCs w:val="24"/>
+        </w:rPr>
+      </w:pPr>
+      <w:r>
+        <w:rPr>
+          <w:rFonts w:ascii="Times New Roman" w:hAnsi="Times New Roman" w:cs="Times New Roman" w:hint="eastAsia"/>
+          <w:b/>
+          <w:bCs/>
+          <w:i/>
+          <w:iCs/>
+          <w:sz w:val="24"/>
+          <w:szCs w:val="24"/>
+        </w:rPr>
+        <w:t>Section 2</w:t>
+      </w:r>
+    </w:p>
+    <w:p>
+      <w:pPr>
+        <w:rPr>
+          <w:rFonts w:ascii="Times New Roman" w:hAnsi="Times New Roman" w:cs="Times New Roman" w:hint="eastAsia"/>
+        </w:rPr>
+      </w:pPr>
+      <w:r>
+        <w:rPr>
+          <w:rFonts w:ascii="Times New Roman" w:hAnsi="Times New Roman" w:cs="Times New Roman" w:hint="eastAsia"/>
+        </w:rPr>
+        <w:t>11. King Streets (x)  King Street</w:t>
+      </w:r>
+      <w:r>
+        <w:rPr>
+          <w:rFonts w:ascii="Times New Roman" w:hAnsi="Times New Roman" w:cs="Times New Roman"/>
+        </w:rPr>
+        <w:br/>
+      </w:r>
+      <w:r>
+        <w:rPr>
+          <w:rFonts w:ascii="Times New Roman" w:hAnsi="Times New Roman" w:cs="Times New Roman" w:hint="eastAsia"/>
+        </w:rPr>
+        <w:t xml:space="preserve">Normally, the word in a name of a place is sigular.     </w:t>
+      </w:r>
+    </w:p>
+    <w:p>
+      <w:pPr>
+        <w:rPr>
+          <w:rFonts w:ascii="Times New Roman" w:hAnsi="Times New Roman" w:cs="Times New Roman" w:hint="eastAsia"/>
+        </w:rPr>
+      </w:pPr>
+      <w:r>
+        <w:rPr>
+          <w:rFonts w:ascii="Times New Roman" w:hAnsi="Times New Roman" w:cs="Times New Roman" w:hint="eastAsia"/>
+        </w:rPr>
+        <w:t>12. central (x)  Central</w:t>
+      </w:r>
+      <w:r>
+        <w:rPr>
+          <w:rFonts w:ascii="Times New Roman" w:hAnsi="Times New Roman" w:cs="Times New Roman"/>
+        </w:rPr>
+        <w:br/>
+      </w:r>
+      <w:r>
+        <w:rPr>
+          <w:rFonts w:ascii="Times New Roman" w:hAnsi="Times New Roman" w:cs="Times New Roman" w:hint="eastAsia"/>
+        </w:rPr>
+        <w:t>The name of a place should be capitalised.</w:t>
+      </w:r>
+    </w:p>
+    <w:p>
+      <w:pPr>
+        <w:rPr>
+          <w:rFonts w:ascii="Times New Roman" w:hAnsi="Times New Roman" w:cs="Times New Roman" w:hint="eastAsia"/>
+        </w:rPr>
+      </w:pPr>
+      <w:r>
+        <w:rPr>
+          <w:rFonts w:ascii="Times New Roman" w:hAnsi="Times New Roman" w:cs="Times New Roman" w:hint="eastAsia"/>
+        </w:rPr>
+        <w:t>16. Advanced  (x) Advance</w:t>
+      </w:r>
+      <w:r>
+        <w:rPr>
+          <w:rFonts w:ascii="Times New Roman" w:hAnsi="Times New Roman" w:cs="Times New Roman"/>
+        </w:rPr>
+        <w:br/>
+      </w:r>
+      <w:r>
+        <w:rPr>
+          <w:rFonts w:ascii="Times New Roman" w:hAnsi="Times New Roman" w:cs="Times New Roman" w:hint="eastAsia"/>
+        </w:rPr>
+        <w:t xml:space="preserve">Other types of ticket are infinitives, so the answer should follow suit. </w:t>
+      </w:r>
+      <w:r>
+        <w:rPr>
+          <w:rFonts w:ascii="Times New Roman" w:hAnsi="Times New Roman" w:cs="Times New Roman" w:hint="eastAsia"/>
+        </w:rPr>
+        <w:t xml:space="preserve"> If you can</w:t>
+      </w:r>
+      <w:r>
+        <w:rPr>
+          <w:rFonts w:ascii="Times New Roman" w:hAnsi="Times New Roman" w:cs="Times New Roman"/>
+        </w:rPr>
+        <w:t>’</w:t>
+      </w:r>
+      <w:r>
+        <w:rPr>
+          <w:rFonts w:ascii="Times New Roman" w:hAnsi="Times New Roman" w:cs="Times New Roman" w:hint="eastAsia"/>
+        </w:rPr>
+        <w:t>t hear a word clearly, you shouldn</w:t>
+      </w:r>
+      <w:r>
+        <w:rPr>
+          <w:rFonts w:ascii="Times New Roman" w:hAnsi="Times New Roman" w:cs="Times New Roman"/>
+        </w:rPr>
+        <w:t>’</w:t>
+      </w:r>
+      <w:r>
+        <w:rPr>
+          <w:rFonts w:ascii="Times New Roman" w:hAnsi="Times New Roman" w:cs="Times New Roman" w:hint="eastAsia"/>
+        </w:rPr>
+        <w:t>t change the form arbitrarily.</w:t>
+      </w:r>
+    </w:p>
+    <w:p>
+      <w:pPr>
+        <w:rPr>
+          <w:rFonts w:ascii="Times New Roman" w:hAnsi="Times New Roman" w:cs="Times New Roman" w:hint="eastAsia"/>
+        </w:rPr>
+      </w:pPr>
+      <w:r>
+        <w:rPr>
+          <w:rFonts w:ascii="Times New Roman" w:hAnsi="Times New Roman" w:cs="Times New Roman" w:hint="eastAsia"/>
+        </w:rPr>
+        <w:t>17. seat reservation  (x)  seat reservations</w:t>
+      </w:r>
+      <w:r>
+        <w:rPr>
+          <w:rFonts w:ascii="Times New Roman" w:hAnsi="Times New Roman" w:cs="Times New Roman"/>
+        </w:rPr>
+        <w:br/>
+        <w:t>“</w:t>
+      </w:r>
+      <w:r>
+        <w:rPr>
+          <w:rFonts w:ascii="Times New Roman" w:hAnsi="Times New Roman" w:cs="Times New Roman" w:hint="eastAsia"/>
+        </w:rPr>
+        <w:t>reservation</w:t>
+      </w:r>
+      <w:r>
+        <w:rPr>
+          <w:rFonts w:ascii="Times New Roman" w:hAnsi="Times New Roman" w:cs="Times New Roman"/>
+        </w:rPr>
+        <w:t>”</w:t>
+      </w:r>
+      <w:r>
+        <w:rPr>
+          <w:rFonts w:ascii="Times New Roman" w:hAnsi="Times New Roman" w:cs="Times New Roman" w:hint="eastAsia"/>
+        </w:rPr>
+        <w:t xml:space="preserve"> is countable word. </w:t>
+      </w:r>
+      <w:r>
+        <w:rPr>
+          <w:rFonts w:ascii="Times New Roman" w:hAnsi="Times New Roman" w:cs="Times New Roman" w:hint="eastAsia"/>
+        </w:rPr>
+        <w:t>Conc</w:t>
+      </w:r>
+      <w:r>
+        <w:rPr>
+          <w:rFonts w:ascii="Times New Roman" w:hAnsi="Times New Roman" w:cs="Times New Roman" w:hint="eastAsia"/>
+        </w:rPr>
+        <w:t>e</w:t>
+      </w:r>
+      <w:r>
+        <w:rPr>
+          <w:rFonts w:ascii="Times New Roman" w:hAnsi="Times New Roman" w:cs="Times New Roman" w:hint="eastAsia"/>
+        </w:rPr>
+        <w:t>ntrate on what the speaker said!</w:t>
+      </w:r>
+    </w:p>
+    <w:p>
+      <w:pPr>
+        <w:rPr>
+          <w:rFonts w:ascii="Times New Roman" w:hAnsi="Times New Roman" w:cs="Times New Roman" w:hint="eastAsia"/>
+        </w:rPr>
+      </w:pPr>
+      <w:r>
+        <w:rPr>
+          <w:rFonts w:ascii="Times New Roman" w:hAnsi="Times New Roman" w:cs="Times New Roman" w:hint="eastAsia"/>
+        </w:rPr>
+        <w:t>18-20</w:t>
+      </w:r>
+      <w:r>
+        <w:rPr>
+          <w:rFonts w:ascii="Times New Roman" w:hAnsi="Times New Roman" w:cs="Times New Roman" w:hint="eastAsia"/>
+        </w:rPr>
+        <w:t xml:space="preserve"> </w:t>
+      </w:r>
+      <w:r>
+        <w:rPr>
+          <w:rFonts w:ascii="Times New Roman" w:hAnsi="Times New Roman" w:cs="Times New Roman" w:hint="eastAsia"/>
+        </w:rPr>
+        <w:t xml:space="preserve">D,B,G  (x)  </w:t>
+      </w:r>
+      <w:r>
+        <w:rPr>
+          <w:rFonts w:ascii="Times New Roman" w:hAnsi="Times New Roman" w:cs="Times New Roman" w:hint="eastAsia"/>
+        </w:rPr>
+        <w:t xml:space="preserve"> D G C</w:t>
+      </w:r>
+    </w:p>
+    <w:p>
+      <w:pPr>
+        <w:rPr>
+          <w:rFonts w:ascii="Times New Roman" w:hAnsi="Times New Roman" w:cs="Times New Roman" w:hint="eastAsia"/>
+        </w:rPr>
+      </w:pPr>
+      <w:r>
+        <w:rPr>
+          <w:rFonts w:ascii="Times New Roman" w:hAnsi="Times New Roman" w:cs="Times New Roman" w:hint="eastAsia"/>
+        </w:rPr>
+        <w:t>Note that all the options are mentioned in the conservation, but only three of them are corret.</w:t>
+      </w:r>
+    </w:p>
+    <w:p>
+      <w:pPr>
+        <w:rPr>
+          <w:rFonts w:ascii="Times New Roman" w:hAnsi="Times New Roman" w:cs="Times New Roman" w:hint="eastAsia"/>
+        </w:rPr>
+      </w:pPr>
+      <w:r>
+        <w:rPr>
+          <w:rFonts w:ascii="Times New Roman" w:hAnsi="Times New Roman" w:cs="Times New Roman" w:hint="eastAsia"/>
+        </w:rPr>
+        <w:t>A. a science museum  (It will open next year)</w:t>
+      </w:r>
+    </w:p>
+    <w:p>
+      <w:pPr>
+        <w:rPr>
+          <w:rFonts w:ascii="Times New Roman" w:hAnsi="Times New Roman" w:cs="Times New Roman" w:hint="eastAsia"/>
+        </w:rPr>
+      </w:pPr>
+      <w:r>
+        <w:rPr>
+          <w:rFonts w:ascii="Times New Roman" w:hAnsi="Times New Roman" w:cs="Times New Roman" w:hint="eastAsia"/>
+        </w:rPr>
+        <w:t xml:space="preserve">B. a theme park  (a mining museum is... </w:t>
+      </w:r>
+      <w:r>
+        <w:rPr>
+          <w:rFonts w:ascii="Times New Roman" w:hAnsi="Times New Roman" w:cs="Times New Roman" w:hint="eastAsia"/>
+          <w:b/>
+        </w:rPr>
+        <w:t>as any</w:t>
+      </w:r>
+      <w:r>
+        <w:rPr>
+          <w:rFonts w:ascii="Times New Roman" w:hAnsi="Times New Roman" w:cs="Times New Roman" w:hint="eastAsia"/>
+        </w:rPr>
+        <w:t xml:space="preserve"> theme park) </w:t>
+      </w:r>
+    </w:p>
+    <w:p>
+      <w:pPr>
+        <w:rPr>
+          <w:rFonts w:ascii="Times New Roman" w:hAnsi="Times New Roman" w:cs="Times New Roman" w:hint="eastAsia"/>
+        </w:rPr>
+      </w:pPr>
+      <w:r>
+        <w:rPr>
+          <w:rFonts w:ascii="Times New Roman" w:hAnsi="Times New Roman" w:cs="Times New Roman" w:hint="eastAsia"/>
+        </w:rPr>
+        <w:t>C. a climbing wall</w:t>
+      </w:r>
+    </w:p>
+    <w:p>
+      <w:pPr>
+        <w:rPr>
+          <w:rFonts w:ascii="Times New Roman" w:hAnsi="Times New Roman" w:cs="Times New Roman" w:hint="eastAsia"/>
+        </w:rPr>
+      </w:pPr>
+      <w:r>
+        <w:rPr>
+          <w:rFonts w:ascii="Times New Roman" w:hAnsi="Times New Roman" w:cs="Times New Roman" w:hint="eastAsia"/>
+        </w:rPr>
+        <w:t>D. a mining museum</w:t>
+      </w:r>
+    </w:p>
+    <w:p>
+      <w:pPr>
+        <w:rPr>
+          <w:rFonts w:ascii="Times New Roman" w:hAnsi="Times New Roman" w:cs="Times New Roman" w:hint="eastAsia"/>
+        </w:rPr>
+      </w:pPr>
+      <w:r>
+        <w:rPr>
+          <w:rFonts w:ascii="Times New Roman" w:hAnsi="Times New Roman" w:cs="Times New Roman" w:hint="eastAsia"/>
+        </w:rPr>
+        <w:t>E. an aquarium</w:t>
+      </w:r>
+      <w:r>
+        <w:rPr>
+          <w:rFonts w:ascii="Times New Roman" w:hAnsi="Times New Roman" w:cs="Times New Roman" w:hint="eastAsia"/>
+        </w:rPr>
+        <w:t xml:space="preserve">  (a climbing wall is built on the old site of an aquarium</w:t>
       </w:r>
       <w:bookmarkStart w:id="1" w:name="_GoBack"/>
       <w:bookmarkEnd w:id="1"/>
       <w:r>
         <w:rPr>
-          <w:rFonts w:ascii="Times New Roman" w:hAnsi="Times New Roman" w:cs="Times New Roman"/>
-        </w:rPr>
-        <w:t xml:space="preserve"> is plural.</w:t>
-      </w:r>
+          <w:rFonts w:ascii="Times New Roman" w:hAnsi="Times New Roman" w:cs="Times New Roman" w:hint="eastAsia"/>
+        </w:rPr>
+        <w:t>)</w:t>
+      </w:r>
+    </w:p>
+    <w:p>
+      <w:pPr>
+        <w:rPr>
+          <w:rFonts w:ascii="Times New Roman" w:hAnsi="Times New Roman" w:cs="Times New Roman" w:hint="eastAsia"/>
+        </w:rPr>
+      </w:pPr>
+      <w:r>
+        <w:rPr>
+          <w:rFonts w:ascii="Times New Roman" w:hAnsi="Times New Roman" w:cs="Times New Roman" w:hint="eastAsia"/>
+        </w:rPr>
+        <w:t>F. a castle (a zoo built on the park land of an old castle)</w:t>
+      </w:r>
+    </w:p>
+    <w:p>
+      <w:pPr>
+        <w:rPr>
+          <w:rFonts w:ascii="Times New Roman" w:hAnsi="Times New Roman" w:cs="Times New Roman" w:hint="eastAsia"/>
+        </w:rPr>
+      </w:pPr>
+      <w:r>
+        <w:rPr>
+          <w:rFonts w:ascii="Times New Roman" w:hAnsi="Times New Roman" w:cs="Times New Roman" w:hint="eastAsia"/>
+        </w:rPr>
+        <w:t>G. a zoo</w:t>
+      </w:r>
+    </w:p>
+    <w:p>
+      <w:pPr>
+        <w:rPr>
+          <w:rFonts w:ascii="Times New Roman" w:hAnsi="Times New Roman" w:cs="Times New Roman"/>
+        </w:rPr>
+      </w:pPr>
     </w:p>
     <w:sectPr>
       <w:pgSz w:w="11906" w:h="16838"/>
@@ -5924,7 +6295,7 @@
   <a:extraClrSchemeLst/>
   <a:extLst>
     <a:ext uri="{05A4C25C-085E-4340-85A3-A5531E510DB2}">
-      <thm15:themeFamily xmlns="" xmlns:thm15="http://schemas.microsoft.com/office/thememl/2012/main" name="Office Theme" id="{62F939B6-93AF-4DB8-9C6B-D6C7DFDC589F}" vid="{4A3C46E8-61CC-4603-A589-7422A47A8E4A}"/>
+      <thm15:themeFamily xmlns:thm15="http://schemas.microsoft.com/office/thememl/2012/main" xmlns="" name="Office Theme" id="{62F939B6-93AF-4DB8-9C6B-D6C7DFDC589F}" vid="{4A3C46E8-61CC-4603-A589-7422A47A8E4A}"/>
     </a:ext>
   </a:extLst>
 </a:theme>

</xml_diff>

<commit_message>
Cambridge IELTS 6 listening test 3 section 1
</commit_message>
<xml_diff>
--- a/IELTS Notes/Listening Test And Analyses..docx
+++ b/IELTS Notes/Listening Test And Analyses..docx
@@ -5457,7 +5457,7 @@
     <w:p>
       <w:pPr>
         <w:rPr>
-          <w:rFonts w:ascii="Times New Roman" w:hAnsi="Times New Roman" w:cs="Times New Roman" w:hint="eastAsia"/>
+          <w:rFonts w:ascii="Times New Roman" w:hAnsi="Times New Roman" w:cs="Times New Roman"/>
         </w:rPr>
       </w:pPr>
       <w:r>
@@ -5470,7 +5470,7 @@
     <w:p>
       <w:pPr>
         <w:rPr>
-          <w:rFonts w:ascii="Times New Roman" w:hAnsi="Times New Roman" w:cs="Times New Roman" w:hint="eastAsia"/>
+          <w:rFonts w:ascii="Times New Roman" w:hAnsi="Times New Roman" w:cs="Times New Roman"/>
           <w:b/>
           <w:bCs/>
           <w:i/>
@@ -5495,7 +5495,7 @@
     <w:p>
       <w:pPr>
         <w:rPr>
-          <w:rFonts w:ascii="Times New Roman" w:hAnsi="Times New Roman" w:cs="Times New Roman" w:hint="eastAsia"/>
+          <w:rFonts w:ascii="Times New Roman" w:hAnsi="Times New Roman" w:cs="Times New Roman"/>
         </w:rPr>
       </w:pPr>
       <w:r>
@@ -5526,7 +5526,7 @@
     <w:p>
       <w:pPr>
         <w:rPr>
-          <w:rFonts w:ascii="Times New Roman" w:hAnsi="Times New Roman" w:cs="Times New Roman" w:hint="eastAsia"/>
+          <w:rFonts w:ascii="Times New Roman" w:hAnsi="Times New Roman" w:cs="Times New Roman"/>
         </w:rPr>
       </w:pPr>
       <w:r>
@@ -5643,7 +5643,7 @@
     <w:p>
       <w:pPr>
         <w:rPr>
-          <w:rFonts w:ascii="Times New Roman" w:hAnsi="Times New Roman" w:cs="Times New Roman" w:hint="eastAsia"/>
+          <w:rFonts w:ascii="Times New Roman" w:hAnsi="Times New Roman" w:cs="Times New Roman"/>
           <w:b/>
           <w:bCs/>
           <w:i/>
@@ -5669,7 +5669,7 @@
     <w:p>
       <w:pPr>
         <w:rPr>
-          <w:rFonts w:ascii="Times New Roman" w:hAnsi="Times New Roman" w:cs="Times New Roman" w:hint="eastAsia"/>
+          <w:rFonts w:ascii="Times New Roman" w:hAnsi="Times New Roman" w:cs="Times New Roman"/>
         </w:rPr>
       </w:pPr>
       <w:r>
@@ -5719,7 +5719,7 @@
     <w:p>
       <w:pPr>
         <w:rPr>
-          <w:rFonts w:ascii="Times New Roman" w:hAnsi="Times New Roman" w:cs="Times New Roman" w:hint="eastAsia"/>
+          <w:rFonts w:ascii="Times New Roman" w:hAnsi="Times New Roman" w:cs="Times New Roman"/>
         </w:rPr>
       </w:pPr>
       <w:r>
@@ -5732,7 +5732,7 @@
     <w:p>
       <w:pPr>
         <w:rPr>
-          <w:rFonts w:ascii="Times New Roman" w:hAnsi="Times New Roman" w:cs="Times New Roman" w:hint="eastAsia"/>
+          <w:rFonts w:ascii="Times New Roman" w:hAnsi="Times New Roman" w:cs="Times New Roman"/>
         </w:rPr>
       </w:pPr>
       <w:r>
@@ -5745,7 +5745,7 @@
     <w:p>
       <w:pPr>
         <w:rPr>
-          <w:rFonts w:ascii="Times New Roman" w:hAnsi="Times New Roman" w:cs="Times New Roman" w:hint="eastAsia"/>
+          <w:rFonts w:ascii="Times New Roman" w:hAnsi="Times New Roman" w:cs="Times New Roman"/>
         </w:rPr>
       </w:pPr>
       <w:r>
@@ -5770,7 +5770,7 @@
     <w:p>
       <w:pPr>
         <w:rPr>
-          <w:rFonts w:ascii="Times New Roman" w:hAnsi="Times New Roman" w:cs="Times New Roman" w:hint="eastAsia"/>
+          <w:rFonts w:ascii="Times New Roman" w:hAnsi="Times New Roman" w:cs="Times New Roman"/>
         </w:rPr>
       </w:pPr>
       <w:r>
@@ -5801,7 +5801,7 @@
     <w:p>
       <w:pPr>
         <w:rPr>
-          <w:rFonts w:ascii="Times New Roman" w:hAnsi="Times New Roman" w:cs="Times New Roman" w:hint="eastAsia"/>
+          <w:rFonts w:ascii="Times New Roman" w:hAnsi="Times New Roman" w:cs="Times New Roman"/>
         </w:rPr>
       </w:pPr>
       <w:r>
@@ -5862,7 +5862,7 @@
     <w:p>
       <w:pPr>
         <w:rPr>
-          <w:rFonts w:ascii="Times New Roman" w:hAnsi="Times New Roman" w:cs="Times New Roman" w:hint="eastAsia"/>
+          <w:rFonts w:ascii="Times New Roman" w:hAnsi="Times New Roman" w:cs="Times New Roman"/>
         </w:rPr>
       </w:pPr>
       <w:r>
@@ -5923,7 +5923,7 @@
     <w:p>
       <w:pPr>
         <w:rPr>
-          <w:rFonts w:ascii="Times New Roman" w:hAnsi="Times New Roman" w:cs="Times New Roman" w:hint="eastAsia"/>
+          <w:rFonts w:ascii="Times New Roman" w:hAnsi="Times New Roman" w:cs="Times New Roman"/>
         </w:rPr>
       </w:pPr>
       <w:r>
@@ -5937,6 +5937,166 @@
           <w:rFonts w:ascii="Times New Roman" w:hAnsi="Times New Roman" w:cs="Times New Roman" w:hint="eastAsia"/>
         </w:rPr>
         <w:t>n</w:t>
+      </w:r>
+      <w:r>
+        <w:rPr>
+          <w:rFonts w:ascii="Times New Roman" w:hAnsi="Times New Roman" w:cs="Times New Roman" w:hint="eastAsia"/>
+        </w:rPr>
+        <w:t>d  (x)  sound effects</w:t>
+      </w:r>
+    </w:p>
+    <w:p>
+      <w:pPr>
+        <w:rPr>
+          <w:rFonts w:ascii="Times New Roman" w:hAnsi="Times New Roman" w:cs="Times New Roman" w:hint="eastAsia"/>
+        </w:rPr>
+      </w:pPr>
+      <w:r>
+        <w:rPr>
+          <w:rFonts w:ascii="Times New Roman" w:hAnsi="Times New Roman" w:cs="Times New Roman" w:hint="eastAsia"/>
+        </w:rPr>
+        <w:t xml:space="preserve">The word </w:t>
+      </w:r>
+      <w:r>
+        <w:rPr>
+          <w:rFonts w:ascii="Times New Roman" w:hAnsi="Times New Roman" w:cs="Times New Roman"/>
+        </w:rPr>
+        <w:t>“</w:t>
+      </w:r>
+      <w:r>
+        <w:rPr>
+          <w:rFonts w:ascii="Times New Roman" w:hAnsi="Times New Roman" w:cs="Times New Roman" w:hint="eastAsia"/>
+        </w:rPr>
+        <w:t>effects</w:t>
+      </w:r>
+      <w:r>
+        <w:rPr>
+          <w:rFonts w:ascii="Times New Roman" w:hAnsi="Times New Roman" w:cs="Times New Roman"/>
+        </w:rPr>
+        <w:t>”</w:t>
+      </w:r>
+      <w:r>
+        <w:rPr>
+          <w:rFonts w:ascii="Times New Roman" w:hAnsi="Times New Roman" w:cs="Times New Roman" w:hint="eastAsia"/>
+        </w:rPr>
+        <w:t xml:space="preserve"> was addressed shortly so that I could recognised it and it was plural.</w:t>
+      </w:r>
+    </w:p>
+    <w:p>
+      <w:pPr>
+        <w:rPr>
+          <w:rFonts w:ascii="Times New Roman" w:hAnsi="Times New Roman" w:cs="Times New Roman" w:hint="eastAsia"/>
+        </w:rPr>
+      </w:pPr>
+    </w:p>
+    <w:p>
+      <w:pPr>
+        <w:outlineLvl w:val="2"/>
+        <w:rPr>
+          <w:rFonts w:ascii="Times New Roman" w:hAnsi="Times New Roman" w:cs="Times New Roman" w:hint="eastAsia"/>
+          <w:b/>
+          <w:bCs/>
+          <w:sz w:val="24"/>
+          <w:szCs w:val="24"/>
+        </w:rPr>
+      </w:pPr>
+      <w:r>
+        <w:rPr>
+          <w:rFonts w:ascii="Times New Roman" w:hAnsi="Times New Roman" w:cs="Times New Roman" w:hint="eastAsia"/>
+          <w:b/>
+          <w:bCs/>
+          <w:sz w:val="24"/>
+          <w:szCs w:val="24"/>
+        </w:rPr>
+        <w:t>Test 3 Listening</w:t>
+      </w:r>
+    </w:p>
+    <w:p>
+      <w:pPr>
+        <w:rPr>
+          <w:rFonts w:ascii="Times New Roman" w:hAnsi="Times New Roman" w:cs="Times New Roman" w:hint="eastAsia"/>
+          <w:b/>
+          <w:bCs/>
+          <w:i/>
+          <w:iCs/>
+          <w:sz w:val="24"/>
+          <w:szCs w:val="24"/>
+        </w:rPr>
+      </w:pPr>
+      <w:r>
+        <w:rPr>
+          <w:rFonts w:ascii="Times New Roman" w:hAnsi="Times New Roman" w:cs="Times New Roman" w:hint="eastAsia"/>
+          <w:b/>
+          <w:bCs/>
+          <w:i/>
+          <w:iCs/>
+          <w:sz w:val="24"/>
+          <w:szCs w:val="24"/>
+        </w:rPr>
+        <w:t>Section 1</w:t>
+      </w:r>
+    </w:p>
+    <w:p>
+      <w:pPr>
+        <w:rPr>
+          <w:rFonts w:ascii="Times New Roman" w:hAnsi="Times New Roman" w:cs="Times New Roman" w:hint="eastAsia"/>
+        </w:rPr>
+      </w:pPr>
+      <w:r>
+        <w:rPr>
+          <w:rFonts w:ascii="Times New Roman" w:hAnsi="Times New Roman" w:cs="Times New Roman" w:hint="eastAsia"/>
+        </w:rPr>
+        <w:t>One word and/or a number</w:t>
+      </w:r>
+      <w:r>
+        <w:rPr>
+          <w:rFonts w:ascii="Times New Roman" w:hAnsi="Times New Roman" w:cs="Times New Roman" w:hint="eastAsia"/>
+        </w:rPr>
+        <w:t>.</w:t>
+      </w:r>
+    </w:p>
+    <w:p>
+      <w:pPr>
+        <w:rPr>
+          <w:rFonts w:ascii="Times New Roman" w:hAnsi="Times New Roman" w:cs="Times New Roman" w:hint="eastAsia"/>
+        </w:rPr>
+      </w:pPr>
+      <w:r>
+        <w:rPr>
+          <w:rFonts w:ascii="Times New Roman" w:hAnsi="Times New Roman" w:cs="Times New Roman" w:hint="eastAsia"/>
+        </w:rPr>
+        <w:t>1. select  (x) Select</w:t>
+      </w:r>
+    </w:p>
+    <w:p>
+      <w:pPr>
+        <w:rPr>
+          <w:rFonts w:ascii="Times New Roman" w:hAnsi="Times New Roman" w:cs="Times New Roman" w:hint="eastAsia"/>
+        </w:rPr>
+      </w:pPr>
+      <w:r>
+        <w:rPr>
+          <w:rFonts w:ascii="Times New Roman" w:hAnsi="Times New Roman" w:cs="Times New Roman" w:hint="eastAsia"/>
+        </w:rPr>
+        <w:t>The answer should be ca</w:t>
+      </w:r>
+      <w:r>
+        <w:rPr>
+          <w:rFonts w:ascii="Times New Roman" w:hAnsi="Times New Roman" w:cs="Times New Roman" w:hint="eastAsia"/>
+        </w:rPr>
+        <w:t xml:space="preserve">pital in its first letter if it is quoted. </w:t>
+      </w:r>
+      <w:r>
+        <w:rPr>
+          <w:rFonts w:ascii="Times New Roman" w:hAnsi="Times New Roman" w:cs="Times New Roman" w:hint="eastAsia"/>
+        </w:rPr>
+        <w:t>Normally, options in an applica</w:t>
+      </w:r>
+      <w:r>
+        <w:rPr>
+          <w:rFonts w:ascii="Times New Roman" w:hAnsi="Times New Roman" w:cs="Times New Roman" w:hint="eastAsia"/>
+        </w:rPr>
+        <w:t>tion form are always capitalised</w:t>
       </w:r>
       <w:bookmarkStart w:id="1" w:name="_GoBack"/>
       <w:bookmarkEnd w:id="1"/>
@@ -5944,20 +6104,45 @@
         <w:rPr>
           <w:rFonts w:ascii="Times New Roman" w:hAnsi="Times New Roman" w:cs="Times New Roman" w:hint="eastAsia"/>
         </w:rPr>
-        <w:t>d  (x)  sound effects</w:t>
-      </w:r>
-    </w:p>
-    <w:p>
-      <w:pPr>
-        <w:rPr>
-          <w:rFonts w:ascii="Times New Roman" w:hAnsi="Times New Roman" w:cs="Times New Roman"/>
-        </w:rPr>
-      </w:pPr>
-      <w:r>
-        <w:rPr>
-          <w:rFonts w:ascii="Times New Roman" w:hAnsi="Times New Roman" w:cs="Times New Roman" w:hint="eastAsia"/>
-        </w:rPr>
-        <w:t xml:space="preserve">The word </w:t>
+        <w:t xml:space="preserve">. </w:t>
+      </w:r>
+    </w:p>
+    <w:p>
+      <w:pPr>
+        <w:rPr>
+          <w:rFonts w:ascii="Times New Roman" w:hAnsi="Times New Roman" w:cs="Times New Roman" w:hint="eastAsia"/>
+        </w:rPr>
+      </w:pPr>
+      <w:r>
+        <w:rPr>
+          <w:rFonts w:ascii="Times New Roman" w:hAnsi="Times New Roman" w:cs="Times New Roman" w:hint="eastAsia"/>
+        </w:rPr>
+        <w:t>2.</w:t>
+      </w:r>
+      <w:r>
+        <w:rPr>
+          <w:rFonts w:ascii="Times New Roman" w:hAnsi="Times New Roman" w:cs="Times New Roman" w:hint="eastAsia"/>
+        </w:rPr>
+        <w:t xml:space="preserve">____  (x) </w:t>
+      </w:r>
+      <w:r>
+        <w:rPr>
+          <w:rFonts w:ascii="Times New Roman" w:hAnsi="Times New Roman" w:cs="Times New Roman" w:hint="eastAsia"/>
+        </w:rPr>
+        <w:t xml:space="preserve"> 27.01.1973</w:t>
+      </w:r>
+    </w:p>
+    <w:p>
+      <w:pPr>
+        <w:rPr>
+          <w:rFonts w:ascii="Times New Roman" w:hAnsi="Times New Roman" w:cs="Times New Roman" w:hint="eastAsia"/>
+        </w:rPr>
+      </w:pPr>
+      <w:r>
+        <w:rPr>
+          <w:rFonts w:ascii="Times New Roman" w:hAnsi="Times New Roman" w:cs="Times New Roman" w:hint="eastAsia"/>
+        </w:rPr>
+        <w:t xml:space="preserve">The man spoke </w:t>
       </w:r>
       <w:r>
         <w:rPr>
@@ -5969,7 +6154,7 @@
         <w:rPr>
           <w:rFonts w:ascii="Times New Roman" w:hAnsi="Times New Roman" w:cs="Times New Roman" w:hint="eastAsia"/>
         </w:rPr>
-        <w:t>effects</w:t>
+        <w:t>the first</w:t>
       </w:r>
       <w:r>
         <w:rPr>
@@ -5981,7 +6166,118 @@
         <w:rPr>
           <w:rFonts w:ascii="Times New Roman" w:hAnsi="Times New Roman" w:cs="Times New Roman" w:hint="eastAsia"/>
         </w:rPr>
-        <w:t xml:space="preserve"> was addressed shortly so that I could recognised it and it was plural.</w:t>
+        <w:t xml:space="preserve"> instead of </w:t>
+      </w:r>
+      <w:r>
+        <w:rPr>
+          <w:rFonts w:ascii="Times New Roman" w:hAnsi="Times New Roman" w:cs="Times New Roman"/>
+        </w:rPr>
+        <w:t>“</w:t>
+      </w:r>
+      <w:r>
+        <w:rPr>
+          <w:rFonts w:ascii="Times New Roman" w:hAnsi="Times New Roman" w:cs="Times New Roman" w:hint="eastAsia"/>
+        </w:rPr>
+        <w:t>January</w:t>
+      </w:r>
+      <w:r>
+        <w:rPr>
+          <w:rFonts w:ascii="Times New Roman" w:hAnsi="Times New Roman" w:cs="Times New Roman"/>
+        </w:rPr>
+        <w:t>”</w:t>
+      </w:r>
+      <w:r>
+        <w:rPr>
+          <w:rFonts w:ascii="Times New Roman" w:hAnsi="Times New Roman" w:cs="Times New Roman" w:hint="eastAsia"/>
+        </w:rPr>
+        <w:t xml:space="preserve">. I have never heared that before. </w:t>
+      </w:r>
+    </w:p>
+    <w:p>
+      <w:pPr>
+        <w:rPr>
+          <w:rFonts w:ascii="Times New Roman" w:hAnsi="Times New Roman" w:cs="Times New Roman" w:hint="eastAsia"/>
+        </w:rPr>
+      </w:pPr>
+      <w:r>
+        <w:rPr>
+          <w:rFonts w:ascii="Times New Roman" w:hAnsi="Times New Roman" w:cs="Times New Roman" w:hint="eastAsia"/>
+        </w:rPr>
+        <w:t xml:space="preserve">Apparently, </w:t>
+      </w:r>
+      <w:r>
+        <w:rPr>
+          <w:rFonts w:ascii="Times New Roman" w:hAnsi="Times New Roman" w:cs="Times New Roman"/>
+        </w:rPr>
+        <w:t>“</w:t>
+      </w:r>
+      <w:r>
+        <w:rPr>
+          <w:rFonts w:ascii="Times New Roman" w:hAnsi="Times New Roman" w:cs="Times New Roman" w:hint="eastAsia"/>
+        </w:rPr>
+        <w:t>27.01.1973</w:t>
+      </w:r>
+      <w:r>
+        <w:rPr>
+          <w:rFonts w:ascii="Times New Roman" w:hAnsi="Times New Roman" w:cs="Times New Roman"/>
+        </w:rPr>
+        <w:t>”</w:t>
+      </w:r>
+      <w:r>
+        <w:rPr>
+          <w:rFonts w:ascii="Times New Roman" w:hAnsi="Times New Roman" w:cs="Times New Roman" w:hint="eastAsia"/>
+        </w:rPr>
+        <w:t xml:space="preserve"> is a number.</w:t>
+      </w:r>
+    </w:p>
+    <w:p>
+      <w:pPr>
+        <w:rPr>
+          <w:rFonts w:ascii="Times New Roman" w:hAnsi="Times New Roman" w:cs="Times New Roman" w:hint="eastAsia"/>
+        </w:rPr>
+      </w:pPr>
+      <w:r>
+        <w:rPr>
+          <w:rFonts w:ascii="Times New Roman" w:hAnsi="Times New Roman" w:cs="Times New Roman" w:hint="eastAsia"/>
+        </w:rPr>
+        <w:t>3. a month  (x)   2 weeks</w:t>
+      </w:r>
+    </w:p>
+    <w:p>
+      <w:pPr>
+        <w:rPr>
+          <w:rFonts w:ascii="Times New Roman" w:hAnsi="Times New Roman" w:cs="Times New Roman"/>
+        </w:rPr>
+      </w:pPr>
+      <w:r>
+        <w:rPr>
+          <w:rFonts w:ascii="Times New Roman" w:hAnsi="Times New Roman" w:cs="Times New Roman" w:hint="eastAsia"/>
+        </w:rPr>
+        <w:t>I didn</w:t>
+      </w:r>
+      <w:r>
+        <w:rPr>
+          <w:rFonts w:ascii="Times New Roman" w:hAnsi="Times New Roman" w:cs="Times New Roman"/>
+        </w:rPr>
+        <w:t>’</w:t>
+      </w:r>
+      <w:r>
+        <w:rPr>
+          <w:rFonts w:ascii="Times New Roman" w:hAnsi="Times New Roman" w:cs="Times New Roman" w:hint="eastAsia"/>
+        </w:rPr>
+        <w:t>t hear it clearly. By the way, o</w:t>
+      </w:r>
+      <w:r>
+        <w:rPr>
+          <w:rFonts w:ascii="Times New Roman" w:hAnsi="Times New Roman" w:cs="Times New Roman" w:hint="eastAsia"/>
+        </w:rPr>
+        <w:t>ne word and / or a number  are a valid answer.</w:t>
+      </w:r>
+      <w:r>
+        <w:rPr>
+          <w:rFonts w:ascii="Times New Roman" w:hAnsi="Times New Roman" w:cs="Times New Roman" w:hint="eastAsia"/>
+        </w:rPr>
+        <w:t xml:space="preserve"> </w:t>
       </w:r>
     </w:p>
     <w:sectPr>
@@ -6797,7 +7093,7 @@
   <a:extraClrSchemeLst/>
   <a:extLst>
     <a:ext uri="{05A4C25C-085E-4340-85A3-A5531E510DB2}">
-      <thm15:themeFamily xmlns="" xmlns:thm15="http://schemas.microsoft.com/office/thememl/2012/main" name="Office Theme" id="{62F939B6-93AF-4DB8-9C6B-D6C7DFDC589F}" vid="{4A3C46E8-61CC-4603-A589-7422A47A8E4A}"/>
+      <thm15:themeFamily xmlns:thm15="http://schemas.microsoft.com/office/thememl/2012/main" xmlns="" name="Office Theme" id="{62F939B6-93AF-4DB8-9C6B-D6C7DFDC589F}" vid="{4A3C46E8-61CC-4603-A589-7422A47A8E4A}"/>
     </a:ext>
   </a:extLst>
 </a:theme>

</xml_diff>

<commit_message>
Analysed of Cambridge IETLS 6 Test 3 Listening Section 2
</commit_message>
<xml_diff>
--- a/IELTS Notes/Listening Test And Analyses..docx
+++ b/IELTS Notes/Listening Test And Analyses..docx
@@ -5948,7 +5948,7 @@
     <w:p>
       <w:pPr>
         <w:rPr>
-          <w:rFonts w:ascii="Times New Roman" w:hAnsi="Times New Roman" w:cs="Times New Roman" w:hint="eastAsia"/>
+          <w:rFonts w:ascii="Times New Roman" w:hAnsi="Times New Roman" w:cs="Times New Roman"/>
         </w:rPr>
       </w:pPr>
       <w:r>
@@ -5985,7 +5985,7 @@
     <w:p>
       <w:pPr>
         <w:rPr>
-          <w:rFonts w:ascii="Times New Roman" w:hAnsi="Times New Roman" w:cs="Times New Roman" w:hint="eastAsia"/>
+          <w:rFonts w:ascii="Times New Roman" w:hAnsi="Times New Roman" w:cs="Times New Roman"/>
         </w:rPr>
       </w:pPr>
     </w:p>
@@ -5993,7 +5993,7 @@
       <w:pPr>
         <w:outlineLvl w:val="2"/>
         <w:rPr>
-          <w:rFonts w:ascii="Times New Roman" w:hAnsi="Times New Roman" w:cs="Times New Roman" w:hint="eastAsia"/>
+          <w:rFonts w:ascii="Times New Roman" w:hAnsi="Times New Roman" w:cs="Times New Roman"/>
           <w:b/>
           <w:bCs/>
           <w:sz w:val="24"/>
@@ -6014,7 +6014,7 @@
     <w:p>
       <w:pPr>
         <w:rPr>
-          <w:rFonts w:ascii="Times New Roman" w:hAnsi="Times New Roman" w:cs="Times New Roman" w:hint="eastAsia"/>
+          <w:rFonts w:ascii="Times New Roman" w:hAnsi="Times New Roman" w:cs="Times New Roman"/>
           <w:b/>
           <w:bCs/>
           <w:i/>
@@ -6039,7 +6039,7 @@
     <w:p>
       <w:pPr>
         <w:rPr>
-          <w:rFonts w:ascii="Times New Roman" w:hAnsi="Times New Roman" w:cs="Times New Roman" w:hint="eastAsia"/>
+          <w:rFonts w:ascii="Times New Roman" w:hAnsi="Times New Roman" w:cs="Times New Roman"/>
         </w:rPr>
       </w:pPr>
       <w:r>
@@ -6058,7 +6058,7 @@
     <w:p>
       <w:pPr>
         <w:rPr>
-          <w:rFonts w:ascii="Times New Roman" w:hAnsi="Times New Roman" w:cs="Times New Roman" w:hint="eastAsia"/>
+          <w:rFonts w:ascii="Times New Roman" w:hAnsi="Times New Roman" w:cs="Times New Roman"/>
         </w:rPr>
       </w:pPr>
       <w:r>
@@ -6071,7 +6071,7 @@
     <w:p>
       <w:pPr>
         <w:rPr>
-          <w:rFonts w:ascii="Times New Roman" w:hAnsi="Times New Roman" w:cs="Times New Roman" w:hint="eastAsia"/>
+          <w:rFonts w:ascii="Times New Roman" w:hAnsi="Times New Roman" w:cs="Times New Roman"/>
         </w:rPr>
       </w:pPr>
       <w:r>
@@ -6097,188 +6097,435 @@
           <w:rFonts w:ascii="Times New Roman" w:hAnsi="Times New Roman" w:cs="Times New Roman" w:hint="eastAsia"/>
         </w:rPr>
         <w:t>tion form are always capitalised</w:t>
+      </w:r>
+      <w:r>
+        <w:rPr>
+          <w:rFonts w:ascii="Times New Roman" w:hAnsi="Times New Roman" w:cs="Times New Roman" w:hint="eastAsia"/>
+        </w:rPr>
+        <w:t xml:space="preserve">. </w:t>
+      </w:r>
+    </w:p>
+    <w:p>
+      <w:pPr>
+        <w:rPr>
+          <w:rFonts w:ascii="Times New Roman" w:hAnsi="Times New Roman" w:cs="Times New Roman"/>
+        </w:rPr>
+      </w:pPr>
+      <w:r>
+        <w:rPr>
+          <w:rFonts w:ascii="Times New Roman" w:hAnsi="Times New Roman" w:cs="Times New Roman" w:hint="eastAsia"/>
+        </w:rPr>
+        <w:t>2.</w:t>
+      </w:r>
+      <w:r>
+        <w:rPr>
+          <w:rFonts w:ascii="Times New Roman" w:hAnsi="Times New Roman" w:cs="Times New Roman" w:hint="eastAsia"/>
+        </w:rPr>
+        <w:t xml:space="preserve">____  (x) </w:t>
+      </w:r>
+      <w:r>
+        <w:rPr>
+          <w:rFonts w:ascii="Times New Roman" w:hAnsi="Times New Roman" w:cs="Times New Roman" w:hint="eastAsia"/>
+        </w:rPr>
+        <w:t xml:space="preserve"> 27.01.1973</w:t>
+      </w:r>
+    </w:p>
+    <w:p>
+      <w:pPr>
+        <w:rPr>
+          <w:rFonts w:ascii="Times New Roman" w:hAnsi="Times New Roman" w:cs="Times New Roman"/>
+        </w:rPr>
+      </w:pPr>
+      <w:r>
+        <w:rPr>
+          <w:rFonts w:ascii="Times New Roman" w:hAnsi="Times New Roman" w:cs="Times New Roman" w:hint="eastAsia"/>
+        </w:rPr>
+        <w:t xml:space="preserve">The man spoke </w:t>
+      </w:r>
+      <w:r>
+        <w:rPr>
+          <w:rFonts w:ascii="Times New Roman" w:hAnsi="Times New Roman" w:cs="Times New Roman"/>
+        </w:rPr>
+        <w:t>“</w:t>
+      </w:r>
+      <w:r>
+        <w:rPr>
+          <w:rFonts w:ascii="Times New Roman" w:hAnsi="Times New Roman" w:cs="Times New Roman" w:hint="eastAsia"/>
+        </w:rPr>
+        <w:t>the first</w:t>
+      </w:r>
+      <w:r>
+        <w:rPr>
+          <w:rFonts w:ascii="Times New Roman" w:hAnsi="Times New Roman" w:cs="Times New Roman"/>
+        </w:rPr>
+        <w:t>”</w:t>
+      </w:r>
+      <w:r>
+        <w:rPr>
+          <w:rFonts w:ascii="Times New Roman" w:hAnsi="Times New Roman" w:cs="Times New Roman" w:hint="eastAsia"/>
+        </w:rPr>
+        <w:t xml:space="preserve"> instead of </w:t>
+      </w:r>
+      <w:r>
+        <w:rPr>
+          <w:rFonts w:ascii="Times New Roman" w:hAnsi="Times New Roman" w:cs="Times New Roman"/>
+        </w:rPr>
+        <w:t>“</w:t>
+      </w:r>
+      <w:r>
+        <w:rPr>
+          <w:rFonts w:ascii="Times New Roman" w:hAnsi="Times New Roman" w:cs="Times New Roman" w:hint="eastAsia"/>
+        </w:rPr>
+        <w:t>January</w:t>
+      </w:r>
+      <w:r>
+        <w:rPr>
+          <w:rFonts w:ascii="Times New Roman" w:hAnsi="Times New Roman" w:cs="Times New Roman"/>
+        </w:rPr>
+        <w:t>”</w:t>
+      </w:r>
+      <w:r>
+        <w:rPr>
+          <w:rFonts w:ascii="Times New Roman" w:hAnsi="Times New Roman" w:cs="Times New Roman" w:hint="eastAsia"/>
+        </w:rPr>
+        <w:t xml:space="preserve">. I have never heared that before. </w:t>
+      </w:r>
+    </w:p>
+    <w:p>
+      <w:pPr>
+        <w:rPr>
+          <w:rFonts w:ascii="Times New Roman" w:hAnsi="Times New Roman" w:cs="Times New Roman"/>
+        </w:rPr>
+      </w:pPr>
+      <w:r>
+        <w:rPr>
+          <w:rFonts w:ascii="Times New Roman" w:hAnsi="Times New Roman" w:cs="Times New Roman" w:hint="eastAsia"/>
+        </w:rPr>
+        <w:t xml:space="preserve">Apparently, </w:t>
+      </w:r>
+      <w:r>
+        <w:rPr>
+          <w:rFonts w:ascii="Times New Roman" w:hAnsi="Times New Roman" w:cs="Times New Roman"/>
+        </w:rPr>
+        <w:t>“</w:t>
+      </w:r>
+      <w:r>
+        <w:rPr>
+          <w:rFonts w:ascii="Times New Roman" w:hAnsi="Times New Roman" w:cs="Times New Roman" w:hint="eastAsia"/>
+        </w:rPr>
+        <w:t>27.01.1973</w:t>
+      </w:r>
+      <w:r>
+        <w:rPr>
+          <w:rFonts w:ascii="Times New Roman" w:hAnsi="Times New Roman" w:cs="Times New Roman"/>
+        </w:rPr>
+        <w:t>”</w:t>
+      </w:r>
+      <w:r>
+        <w:rPr>
+          <w:rFonts w:ascii="Times New Roman" w:hAnsi="Times New Roman" w:cs="Times New Roman" w:hint="eastAsia"/>
+        </w:rPr>
+        <w:t xml:space="preserve"> is a number.</w:t>
+      </w:r>
+    </w:p>
+    <w:p>
+      <w:pPr>
+        <w:rPr>
+          <w:rFonts w:ascii="Times New Roman" w:hAnsi="Times New Roman" w:cs="Times New Roman"/>
+        </w:rPr>
+      </w:pPr>
+      <w:r>
+        <w:rPr>
+          <w:rFonts w:ascii="Times New Roman" w:hAnsi="Times New Roman" w:cs="Times New Roman" w:hint="eastAsia"/>
+        </w:rPr>
+        <w:t>3. a month  (x)   2 weeks</w:t>
+      </w:r>
+    </w:p>
+    <w:p>
+      <w:pPr>
+        <w:rPr>
+          <w:rFonts w:ascii="Times New Roman" w:hAnsi="Times New Roman" w:cs="Times New Roman" w:hint="eastAsia"/>
+        </w:rPr>
+      </w:pPr>
+      <w:r>
+        <w:rPr>
+          <w:rFonts w:ascii="Times New Roman" w:hAnsi="Times New Roman" w:cs="Times New Roman" w:hint="eastAsia"/>
+        </w:rPr>
+        <w:t>I didn</w:t>
+      </w:r>
+      <w:r>
+        <w:rPr>
+          <w:rFonts w:ascii="Times New Roman" w:hAnsi="Times New Roman" w:cs="Times New Roman"/>
+        </w:rPr>
+        <w:t>’</w:t>
+      </w:r>
+      <w:r>
+        <w:rPr>
+          <w:rFonts w:ascii="Times New Roman" w:hAnsi="Times New Roman" w:cs="Times New Roman" w:hint="eastAsia"/>
+        </w:rPr>
+        <w:t>t hear it clearly. By the way, o</w:t>
+      </w:r>
+      <w:r>
+        <w:rPr>
+          <w:rFonts w:ascii="Times New Roman" w:hAnsi="Times New Roman" w:cs="Times New Roman" w:hint="eastAsia"/>
+        </w:rPr>
+        <w:t>ne word and / or a number  are a valid answer.</w:t>
+      </w:r>
+      <w:r>
+        <w:rPr>
+          <w:rFonts w:ascii="Times New Roman" w:hAnsi="Times New Roman" w:cs="Times New Roman" w:hint="eastAsia"/>
+        </w:rPr>
+        <w:t xml:space="preserve"> </w:t>
+      </w:r>
+    </w:p>
+    <w:p>
+      <w:pPr>
+        <w:rPr>
+          <w:rFonts w:ascii="Times New Roman" w:hAnsi="Times New Roman" w:cs="Times New Roman" w:hint="eastAsia"/>
+          <w:b/>
+          <w:bCs/>
+          <w:i/>
+          <w:iCs/>
+          <w:sz w:val="24"/>
+          <w:szCs w:val="24"/>
+        </w:rPr>
+      </w:pPr>
+      <w:r>
+        <w:rPr>
+          <w:rFonts w:ascii="Times New Roman" w:hAnsi="Times New Roman" w:cs="Times New Roman" w:hint="eastAsia"/>
+          <w:b/>
+          <w:bCs/>
+          <w:i/>
+          <w:iCs/>
+          <w:sz w:val="24"/>
+          <w:szCs w:val="24"/>
+        </w:rPr>
+        <w:t>Section 2</w:t>
+      </w:r>
+    </w:p>
+    <w:p>
+      <w:pPr>
+        <w:rPr>
+          <w:rFonts w:ascii="Times New Roman" w:hAnsi="Times New Roman" w:cs="Times New Roman" w:hint="eastAsia"/>
+        </w:rPr>
+      </w:pPr>
+      <w:r>
+        <w:rPr>
+          <w:rFonts w:ascii="Times New Roman" w:hAnsi="Times New Roman" w:cs="Times New Roman" w:hint="eastAsia"/>
+        </w:rPr>
+        <w:t>11, A  (x)  C</w:t>
+      </w:r>
+      <w:r>
+        <w:rPr>
+          <w:rFonts w:ascii="Times New Roman" w:hAnsi="Times New Roman" w:cs="Times New Roman"/>
+        </w:rPr>
+        <w:br/>
+        <w:t>“</w:t>
+      </w:r>
+      <w:r>
+        <w:rPr>
+          <w:rFonts w:ascii="Times New Roman" w:hAnsi="Times New Roman" w:cs="Times New Roman" w:hint="eastAsia"/>
+        </w:rPr>
+        <w:t>Geroge was too slow to make up his mind to buy it.</w:t>
+      </w:r>
+      <w:r>
+        <w:rPr>
+          <w:rFonts w:ascii="Times New Roman" w:hAnsi="Times New Roman" w:cs="Times New Roman"/>
+        </w:rPr>
+        <w:t>”</w:t>
+      </w:r>
+    </w:p>
+    <w:p>
+      <w:pPr>
+        <w:rPr>
+          <w:rFonts w:ascii="Times New Roman" w:hAnsi="Times New Roman" w:cs="Times New Roman" w:hint="eastAsia"/>
+        </w:rPr>
+      </w:pPr>
+      <w:r>
+        <w:rPr>
+          <w:rFonts w:ascii="Times New Roman" w:hAnsi="Times New Roman" w:cs="Times New Roman" w:hint="eastAsia"/>
+        </w:rPr>
+        <w:t>16, E  (x)  B</w:t>
+      </w:r>
+      <w:r>
+        <w:rPr>
+          <w:rFonts w:ascii="Times New Roman" w:hAnsi="Times New Roman" w:cs="Times New Roman"/>
+        </w:rPr>
+        <w:br/>
+        <w:t>“</w:t>
+      </w:r>
+      <w:r>
+        <w:rPr>
+          <w:rFonts w:ascii="Times New Roman" w:hAnsi="Times New Roman" w:cs="Times New Roman" w:hint="eastAsia"/>
+        </w:rPr>
+        <w:t xml:space="preserve">then leave the house by </w:t>
+      </w:r>
+      <w:r>
+        <w:rPr>
+          <w:rFonts w:ascii="Times New Roman" w:hAnsi="Times New Roman" w:cs="Times New Roman" w:hint="eastAsia"/>
+          <w:b/>
+        </w:rPr>
+        <w:t>the side entrance</w:t>
+      </w:r>
+      <w:r>
+        <w:rPr>
+          <w:rFonts w:ascii="Times New Roman" w:hAnsi="Times New Roman" w:cs="Times New Roman"/>
+        </w:rPr>
+        <w:t>”</w:t>
+      </w:r>
+      <w:r>
+        <w:rPr>
+          <w:rFonts w:ascii="Times New Roman" w:hAnsi="Times New Roman" w:cs="Times New Roman" w:hint="eastAsia"/>
+        </w:rPr>
+        <w:t xml:space="preserve">. </w:t>
+      </w:r>
+      <w:r>
+        <w:rPr>
+          <w:rFonts w:ascii="Times New Roman" w:hAnsi="Times New Roman" w:cs="Times New Roman"/>
+        </w:rPr>
+        <w:br/>
+      </w:r>
+      <w:r>
+        <w:rPr>
+          <w:rFonts w:ascii="Times New Roman" w:hAnsi="Times New Roman" w:cs="Times New Roman" w:hint="eastAsia"/>
+        </w:rPr>
+        <w:t xml:space="preserve">I heard the word </w:t>
+      </w:r>
+      <w:r>
+        <w:rPr>
+          <w:rFonts w:ascii="Times New Roman" w:hAnsi="Times New Roman" w:cs="Times New Roman"/>
+        </w:rPr>
+        <w:t>“</w:t>
+      </w:r>
+      <w:r>
+        <w:rPr>
+          <w:rFonts w:ascii="Times New Roman" w:hAnsi="Times New Roman" w:cs="Times New Roman" w:hint="eastAsia"/>
+        </w:rPr>
+        <w:t>entrance</w:t>
+      </w:r>
+      <w:r>
+        <w:rPr>
+          <w:rFonts w:ascii="Times New Roman" w:hAnsi="Times New Roman" w:cs="Times New Roman"/>
+        </w:rPr>
+        <w:t>”</w:t>
+      </w:r>
+      <w:r>
+        <w:rPr>
+          <w:rFonts w:ascii="Times New Roman" w:hAnsi="Times New Roman" w:cs="Times New Roman" w:hint="eastAsia"/>
+        </w:rPr>
+        <w:t xml:space="preserve"> only but ignored the word </w:t>
+      </w:r>
+      <w:r>
+        <w:rPr>
+          <w:rFonts w:ascii="Times New Roman" w:hAnsi="Times New Roman" w:cs="Times New Roman"/>
+        </w:rPr>
+        <w:t>“</w:t>
+      </w:r>
+      <w:r>
+        <w:rPr>
+          <w:rFonts w:ascii="Times New Roman" w:hAnsi="Times New Roman" w:cs="Times New Roman" w:hint="eastAsia"/>
+        </w:rPr>
+        <w:t>side</w:t>
+      </w:r>
+      <w:r>
+        <w:rPr>
+          <w:rFonts w:ascii="Times New Roman" w:hAnsi="Times New Roman" w:cs="Times New Roman"/>
+        </w:rPr>
+        <w:t>”</w:t>
+      </w:r>
+      <w:r>
+        <w:rPr>
+          <w:rFonts w:ascii="Times New Roman" w:hAnsi="Times New Roman" w:cs="Times New Roman" w:hint="eastAsia"/>
+        </w:rPr>
+        <w:t>.</w:t>
+      </w:r>
+    </w:p>
+    <w:p>
+      <w:pPr>
+        <w:rPr>
+          <w:rFonts w:ascii="Times New Roman" w:hAnsi="Times New Roman" w:cs="Times New Roman"/>
+        </w:rPr>
+      </w:pPr>
+      <w:r>
+        <w:rPr>
+          <w:rFonts w:ascii="Times New Roman" w:hAnsi="Times New Roman" w:cs="Times New Roman" w:hint="eastAsia"/>
+        </w:rPr>
+        <w:t>19, river (x) footbridge</w:t>
+      </w:r>
+      <w:r>
+        <w:rPr>
+          <w:rFonts w:ascii="Times New Roman" w:hAnsi="Times New Roman" w:cs="Times New Roman"/>
+        </w:rPr>
+        <w:br/>
+      </w:r>
+      <w:r>
+        <w:rPr>
+          <w:rFonts w:ascii="Times New Roman" w:hAnsi="Times New Roman" w:cs="Times New Roman" w:hint="eastAsia"/>
+        </w:rPr>
+        <w:t xml:space="preserve">I did not knowd the word </w:t>
+      </w:r>
+      <w:r>
+        <w:rPr>
+          <w:rFonts w:ascii="Times New Roman" w:hAnsi="Times New Roman" w:cs="Times New Roman"/>
+        </w:rPr>
+        <w:t>“</w:t>
+      </w:r>
+      <w:r>
+        <w:rPr>
+          <w:rFonts w:ascii="Times New Roman" w:hAnsi="Times New Roman" w:cs="Times New Roman" w:hint="eastAsia"/>
+        </w:rPr>
+        <w:t>footbridge</w:t>
+      </w:r>
+      <w:r>
+        <w:rPr>
+          <w:rFonts w:ascii="Times New Roman" w:hAnsi="Times New Roman" w:cs="Times New Roman"/>
+        </w:rPr>
+        <w:t>”</w:t>
+      </w:r>
+      <w:r>
+        <w:rPr>
+          <w:rFonts w:ascii="Times New Roman" w:hAnsi="Times New Roman" w:cs="Times New Roman" w:hint="eastAsia"/>
+        </w:rPr>
+        <w:t xml:space="preserve"> so I did not heared it clearly. </w:t>
+      </w:r>
+      <w:r>
+        <w:rPr>
+          <w:rFonts w:ascii="Times New Roman" w:hAnsi="Times New Roman" w:cs="Times New Roman"/>
+        </w:rPr>
+        <w:br/>
+      </w:r>
+      <w:r>
+        <w:rPr>
+          <w:rFonts w:ascii="Times New Roman" w:hAnsi="Times New Roman" w:cs="Times New Roman" w:hint="eastAsia"/>
+        </w:rPr>
+        <w:t xml:space="preserve">N.B. There is not any hyphen in </w:t>
+      </w:r>
+      <w:r>
+        <w:rPr>
+          <w:rFonts w:ascii="Times New Roman" w:hAnsi="Times New Roman" w:cs="Times New Roman"/>
+        </w:rPr>
+        <w:t>“</w:t>
+      </w:r>
+      <w:r>
+        <w:rPr>
+          <w:rFonts w:ascii="Times New Roman" w:hAnsi="Times New Roman" w:cs="Times New Roman" w:hint="eastAsia"/>
+        </w:rPr>
+        <w:t>footbridge</w:t>
+      </w:r>
+      <w:r>
+        <w:rPr>
+          <w:rFonts w:ascii="Times New Roman" w:hAnsi="Times New Roman" w:cs="Times New Roman"/>
+        </w:rPr>
+        <w:t>”</w:t>
+      </w:r>
+      <w:r>
+        <w:rPr>
+          <w:rFonts w:ascii="Times New Roman" w:hAnsi="Times New Roman" w:cs="Times New Roman" w:hint="eastAsia"/>
+        </w:rPr>
+        <w:t>.</w:t>
       </w:r>
       <w:bookmarkStart w:id="1" w:name="_GoBack"/>
       <w:bookmarkEnd w:id="1"/>
-      <w:r>
-        <w:rPr>
-          <w:rFonts w:ascii="Times New Roman" w:hAnsi="Times New Roman" w:cs="Times New Roman" w:hint="eastAsia"/>
-        </w:rPr>
-        <w:t xml:space="preserve">. </w:t>
-      </w:r>
-    </w:p>
-    <w:p>
-      <w:pPr>
-        <w:rPr>
-          <w:rFonts w:ascii="Times New Roman" w:hAnsi="Times New Roman" w:cs="Times New Roman" w:hint="eastAsia"/>
-        </w:rPr>
-      </w:pPr>
-      <w:r>
-        <w:rPr>
-          <w:rFonts w:ascii="Times New Roman" w:hAnsi="Times New Roman" w:cs="Times New Roman" w:hint="eastAsia"/>
-        </w:rPr>
-        <w:t>2.</w:t>
-      </w:r>
-      <w:r>
-        <w:rPr>
-          <w:rFonts w:ascii="Times New Roman" w:hAnsi="Times New Roman" w:cs="Times New Roman" w:hint="eastAsia"/>
-        </w:rPr>
-        <w:t xml:space="preserve">____  (x) </w:t>
-      </w:r>
-      <w:r>
-        <w:rPr>
-          <w:rFonts w:ascii="Times New Roman" w:hAnsi="Times New Roman" w:cs="Times New Roman" w:hint="eastAsia"/>
-        </w:rPr>
-        <w:t xml:space="preserve"> 27.01.1973</w:t>
-      </w:r>
-    </w:p>
-    <w:p>
-      <w:pPr>
-        <w:rPr>
-          <w:rFonts w:ascii="Times New Roman" w:hAnsi="Times New Roman" w:cs="Times New Roman" w:hint="eastAsia"/>
-        </w:rPr>
-      </w:pPr>
-      <w:r>
-        <w:rPr>
-          <w:rFonts w:ascii="Times New Roman" w:hAnsi="Times New Roman" w:cs="Times New Roman" w:hint="eastAsia"/>
-        </w:rPr>
-        <w:t xml:space="preserve">The man spoke </w:t>
-      </w:r>
-      <w:r>
-        <w:rPr>
-          <w:rFonts w:ascii="Times New Roman" w:hAnsi="Times New Roman" w:cs="Times New Roman"/>
-        </w:rPr>
-        <w:t>“</w:t>
-      </w:r>
-      <w:r>
-        <w:rPr>
-          <w:rFonts w:ascii="Times New Roman" w:hAnsi="Times New Roman" w:cs="Times New Roman" w:hint="eastAsia"/>
-        </w:rPr>
-        <w:t>the first</w:t>
-      </w:r>
-      <w:r>
-        <w:rPr>
-          <w:rFonts w:ascii="Times New Roman" w:hAnsi="Times New Roman" w:cs="Times New Roman"/>
-        </w:rPr>
-        <w:t>”</w:t>
-      </w:r>
-      <w:r>
-        <w:rPr>
-          <w:rFonts w:ascii="Times New Roman" w:hAnsi="Times New Roman" w:cs="Times New Roman" w:hint="eastAsia"/>
-        </w:rPr>
-        <w:t xml:space="preserve"> instead of </w:t>
-      </w:r>
-      <w:r>
-        <w:rPr>
-          <w:rFonts w:ascii="Times New Roman" w:hAnsi="Times New Roman" w:cs="Times New Roman"/>
-        </w:rPr>
-        <w:t>“</w:t>
-      </w:r>
-      <w:r>
-        <w:rPr>
-          <w:rFonts w:ascii="Times New Roman" w:hAnsi="Times New Roman" w:cs="Times New Roman" w:hint="eastAsia"/>
-        </w:rPr>
-        <w:t>January</w:t>
-      </w:r>
-      <w:r>
-        <w:rPr>
-          <w:rFonts w:ascii="Times New Roman" w:hAnsi="Times New Roman" w:cs="Times New Roman"/>
-        </w:rPr>
-        <w:t>”</w:t>
-      </w:r>
-      <w:r>
-        <w:rPr>
-          <w:rFonts w:ascii="Times New Roman" w:hAnsi="Times New Roman" w:cs="Times New Roman" w:hint="eastAsia"/>
-        </w:rPr>
-        <w:t xml:space="preserve">. I have never heared that before. </w:t>
-      </w:r>
-    </w:p>
-    <w:p>
-      <w:pPr>
-        <w:rPr>
-          <w:rFonts w:ascii="Times New Roman" w:hAnsi="Times New Roman" w:cs="Times New Roman" w:hint="eastAsia"/>
-        </w:rPr>
-      </w:pPr>
-      <w:r>
-        <w:rPr>
-          <w:rFonts w:ascii="Times New Roman" w:hAnsi="Times New Roman" w:cs="Times New Roman" w:hint="eastAsia"/>
-        </w:rPr>
-        <w:t xml:space="preserve">Apparently, </w:t>
-      </w:r>
-      <w:r>
-        <w:rPr>
-          <w:rFonts w:ascii="Times New Roman" w:hAnsi="Times New Roman" w:cs="Times New Roman"/>
-        </w:rPr>
-        <w:t>“</w:t>
-      </w:r>
-      <w:r>
-        <w:rPr>
-          <w:rFonts w:ascii="Times New Roman" w:hAnsi="Times New Roman" w:cs="Times New Roman" w:hint="eastAsia"/>
-        </w:rPr>
-        <w:t>27.01.1973</w:t>
-      </w:r>
-      <w:r>
-        <w:rPr>
-          <w:rFonts w:ascii="Times New Roman" w:hAnsi="Times New Roman" w:cs="Times New Roman"/>
-        </w:rPr>
-        <w:t>”</w:t>
-      </w:r>
-      <w:r>
-        <w:rPr>
-          <w:rFonts w:ascii="Times New Roman" w:hAnsi="Times New Roman" w:cs="Times New Roman" w:hint="eastAsia"/>
-        </w:rPr>
-        <w:t xml:space="preserve"> is a number.</w:t>
-      </w:r>
-    </w:p>
-    <w:p>
-      <w:pPr>
-        <w:rPr>
-          <w:rFonts w:ascii="Times New Roman" w:hAnsi="Times New Roman" w:cs="Times New Roman" w:hint="eastAsia"/>
-        </w:rPr>
-      </w:pPr>
-      <w:r>
-        <w:rPr>
-          <w:rFonts w:ascii="Times New Roman" w:hAnsi="Times New Roman" w:cs="Times New Roman" w:hint="eastAsia"/>
-        </w:rPr>
-        <w:t>3. a month  (x)   2 weeks</w:t>
-      </w:r>
-    </w:p>
-    <w:p>
-      <w:pPr>
-        <w:rPr>
-          <w:rFonts w:ascii="Times New Roman" w:hAnsi="Times New Roman" w:cs="Times New Roman"/>
-        </w:rPr>
-      </w:pPr>
-      <w:r>
-        <w:rPr>
-          <w:rFonts w:ascii="Times New Roman" w:hAnsi="Times New Roman" w:cs="Times New Roman" w:hint="eastAsia"/>
-        </w:rPr>
-        <w:t>I didn</w:t>
-      </w:r>
-      <w:r>
-        <w:rPr>
-          <w:rFonts w:ascii="Times New Roman" w:hAnsi="Times New Roman" w:cs="Times New Roman"/>
-        </w:rPr>
-        <w:t>’</w:t>
-      </w:r>
-      <w:r>
-        <w:rPr>
-          <w:rFonts w:ascii="Times New Roman" w:hAnsi="Times New Roman" w:cs="Times New Roman" w:hint="eastAsia"/>
-        </w:rPr>
-        <w:t>t hear it clearly. By the way, o</w:t>
-      </w:r>
-      <w:r>
-        <w:rPr>
-          <w:rFonts w:ascii="Times New Roman" w:hAnsi="Times New Roman" w:cs="Times New Roman" w:hint="eastAsia"/>
-        </w:rPr>
-        <w:t>ne word and / or a number  are a valid answer.</w:t>
-      </w:r>
-      <w:r>
-        <w:rPr>
-          <w:rFonts w:ascii="Times New Roman" w:hAnsi="Times New Roman" w:cs="Times New Roman" w:hint="eastAsia"/>
-        </w:rPr>
-        <w:t xml:space="preserve"> </w:t>
-      </w:r>
     </w:p>
     <w:sectPr>
       <w:pgSz w:w="11906" w:h="16838"/>
@@ -7093,7 +7340,7 @@
   <a:extraClrSchemeLst/>
   <a:extLst>
     <a:ext uri="{05A4C25C-085E-4340-85A3-A5531E510DB2}">
-      <thm15:themeFamily xmlns:thm15="http://schemas.microsoft.com/office/thememl/2012/main" xmlns="" name="Office Theme" id="{62F939B6-93AF-4DB8-9C6B-D6C7DFDC589F}" vid="{4A3C46E8-61CC-4603-A589-7422A47A8E4A}"/>
+      <thm15:themeFamily xmlns="" xmlns:thm15="http://schemas.microsoft.com/office/thememl/2012/main" name="Office Theme" id="{62F939B6-93AF-4DB8-9C6B-D6C7DFDC589F}" vid="{4A3C46E8-61CC-4603-A589-7422A47A8E4A}"/>
     </a:ext>
   </a:extLst>
 </a:theme>

</xml_diff>

<commit_message>
update notes of IELTS listening
</commit_message>
<xml_diff>
--- a/IELTS Notes/Listening Test And Analyses..docx
+++ b/IELTS Notes/Listening Test And Analyses..docx
@@ -6244,7 +6244,7 @@
     <w:p>
       <w:pPr>
         <w:rPr>
-          <w:rFonts w:ascii="Times New Roman" w:hAnsi="Times New Roman" w:cs="Times New Roman" w:hint="eastAsia"/>
+          <w:rFonts w:ascii="Times New Roman" w:hAnsi="Times New Roman" w:cs="Times New Roman"/>
         </w:rPr>
       </w:pPr>
       <w:r>
@@ -6281,12 +6281,12 @@
     <w:p>
       <w:pPr>
         <w:rPr>
-          <w:rFonts w:ascii="Times New Roman" w:hAnsi="Times New Roman" w:cs="Times New Roman" w:hint="eastAsia"/>
+          <w:rFonts w:ascii="Times New Roman" w:hAnsi="Times New Roman" w:cs="Times New Roman"/>
           <w:b/>
           <w:bCs/>
           <w:i/>
           <w:iCs/>
-          <w:sz w:val="24"/>
+          <w:sz w:val="28"/>
           <w:szCs w:val="24"/>
         </w:rPr>
       </w:pPr>
@@ -6297,7 +6297,7 @@
           <w:bCs/>
           <w:i/>
           <w:iCs/>
-          <w:sz w:val="24"/>
+          <w:sz w:val="28"/>
           <w:szCs w:val="24"/>
         </w:rPr>
         <w:t>Section 2</w:t>
@@ -6306,7 +6306,7 @@
     <w:p>
       <w:pPr>
         <w:rPr>
-          <w:rFonts w:ascii="Times New Roman" w:hAnsi="Times New Roman" w:cs="Times New Roman" w:hint="eastAsia"/>
+          <w:rFonts w:ascii="Times New Roman" w:hAnsi="Times New Roman" w:cs="Times New Roman"/>
         </w:rPr>
       </w:pPr>
       <w:r>
@@ -6338,7 +6338,7 @@
     <w:p>
       <w:pPr>
         <w:rPr>
-          <w:rFonts w:ascii="Times New Roman" w:hAnsi="Times New Roman" w:cs="Times New Roman" w:hint="eastAsia"/>
+          <w:rFonts w:ascii="Times New Roman" w:hAnsi="Times New Roman" w:cs="Times New Roman"/>
         </w:rPr>
       </w:pPr>
       <w:r>
@@ -6443,7 +6443,7 @@
     <w:p>
       <w:pPr>
         <w:rPr>
-          <w:rFonts w:ascii="Times New Roman" w:hAnsi="Times New Roman" w:cs="Times New Roman"/>
+          <w:rFonts w:ascii="Times New Roman" w:hAnsi="Times New Roman" w:cs="Times New Roman" w:hint="eastAsia"/>
         </w:rPr>
       </w:pPr>
       <w:r>
@@ -6523,9 +6523,445 @@
           <w:rFonts w:ascii="Times New Roman" w:hAnsi="Times New Roman" w:cs="Times New Roman" w:hint="eastAsia"/>
         </w:rPr>
         <w:t>.</w:t>
+      </w:r>
+    </w:p>
+    <w:p>
+      <w:pPr>
+        <w:rPr>
+          <w:rFonts w:ascii="Times New Roman" w:hAnsi="Times New Roman" w:cs="Times New Roman" w:hint="eastAsia"/>
+        </w:rPr>
+      </w:pPr>
+    </w:p>
+    <w:p>
+      <w:pPr>
+        <w:rPr>
+          <w:rFonts w:ascii="Times New Roman" w:hAnsi="Times New Roman" w:cs="Times New Roman" w:hint="eastAsia"/>
+          <w:b/>
+          <w:bCs/>
+          <w:i/>
+          <w:iCs/>
+          <w:sz w:val="28"/>
+          <w:szCs w:val="24"/>
+        </w:rPr>
+      </w:pPr>
+      <w:r>
+        <w:rPr>
+          <w:rFonts w:ascii="Times New Roman" w:hAnsi="Times New Roman" w:cs="Times New Roman" w:hint="eastAsia"/>
+          <w:b/>
+          <w:bCs/>
+          <w:i/>
+          <w:iCs/>
+          <w:sz w:val="28"/>
+          <w:szCs w:val="24"/>
+        </w:rPr>
+        <w:lastRenderedPageBreak/>
+        <w:t>Section 3</w:t>
+      </w:r>
+    </w:p>
+    <w:p>
+      <w:pPr>
+        <w:rPr>
+          <w:rFonts w:ascii="Times New Roman" w:hAnsi="Times New Roman" w:cs="Times New Roman" w:hint="eastAsia"/>
+        </w:rPr>
+      </w:pPr>
+      <w:r>
+        <w:rPr>
+          <w:rFonts w:ascii="Times New Roman" w:hAnsi="Times New Roman" w:cs="Times New Roman" w:hint="eastAsia"/>
+        </w:rPr>
+        <w:t>22. telephone interview  (x)  telephones interviews</w:t>
+      </w:r>
+      <w:r>
+        <w:rPr>
+          <w:rFonts w:ascii="Times New Roman" w:hAnsi="Times New Roman" w:cs="Times New Roman"/>
+        </w:rPr>
+        <w:br/>
+      </w:r>
+      <w:r>
+        <w:rPr>
+          <w:rFonts w:ascii="Times New Roman" w:hAnsi="Times New Roman" w:cs="Times New Roman" w:hint="eastAsia"/>
+        </w:rPr>
+        <w:t xml:space="preserve">The </w:t>
+      </w:r>
+      <w:r>
+        <w:rPr>
+          <w:rFonts w:ascii="Times New Roman" w:hAnsi="Times New Roman" w:cs="Times New Roman"/>
+        </w:rPr>
+        <w:t>“</w:t>
+      </w:r>
+      <w:r>
+        <w:rPr>
+          <w:rFonts w:ascii="Times New Roman" w:hAnsi="Times New Roman" w:cs="Times New Roman" w:hint="eastAsia"/>
+        </w:rPr>
+        <w:t>interviews</w:t>
+      </w:r>
+      <w:r>
+        <w:rPr>
+          <w:rFonts w:ascii="Times New Roman" w:hAnsi="Times New Roman" w:cs="Times New Roman"/>
+        </w:rPr>
+        <w:t>”</w:t>
+      </w:r>
+      <w:r>
+        <w:rPr>
+          <w:rFonts w:ascii="Times New Roman" w:hAnsi="Times New Roman" w:cs="Times New Roman" w:hint="eastAsia"/>
+        </w:rPr>
+        <w:t xml:space="preserve"> is plural.</w:t>
+      </w:r>
+    </w:p>
+    <w:p>
+      <w:pPr>
+        <w:rPr>
+          <w:rFonts w:ascii="Times New Roman" w:hAnsi="Times New Roman" w:cs="Times New Roman" w:hint="eastAsia"/>
+        </w:rPr>
+      </w:pPr>
+      <w:r>
+        <w:rPr>
+          <w:rFonts w:ascii="Times New Roman" w:hAnsi="Times New Roman" w:cs="Times New Roman" w:hint="eastAsia"/>
+        </w:rPr>
+        <w:t xml:space="preserve">23. ______  (x)  male and female </w:t>
+      </w:r>
+      <w:r>
+        <w:rPr>
+          <w:rFonts w:ascii="Times New Roman" w:hAnsi="Times New Roman" w:cs="Times New Roman"/>
+        </w:rPr>
+        <w:br/>
+      </w:r>
+      <w:r>
+        <w:rPr>
+          <w:rFonts w:ascii="Times New Roman" w:hAnsi="Times New Roman" w:cs="Times New Roman"/>
+        </w:rPr>
+        <w:t>“</w:t>
+      </w:r>
+      <w:r>
+        <w:rPr>
+          <w:rFonts w:ascii="Times New Roman" w:hAnsi="Times New Roman" w:cs="Times New Roman" w:hint="eastAsia"/>
+        </w:rPr>
+        <w:t>Most of my femal friends like the same music as me.</w:t>
+      </w:r>
+      <w:r>
+        <w:rPr>
+          <w:rFonts w:ascii="Times New Roman" w:hAnsi="Times New Roman" w:cs="Times New Roman"/>
+        </w:rPr>
+        <w:t>”</w:t>
+      </w:r>
+    </w:p>
+    <w:p>
+      <w:pPr>
+        <w:rPr>
+          <w:rFonts w:ascii="Times New Roman" w:hAnsi="Times New Roman" w:cs="Times New Roman" w:hint="eastAsia"/>
+        </w:rPr>
+      </w:pPr>
+      <w:r>
+        <w:rPr>
+          <w:rFonts w:ascii="Times New Roman" w:hAnsi="Times New Roman" w:cs="Times New Roman" w:hint="eastAsia"/>
+        </w:rPr>
+        <w:t>27. Live Music (x)  Cocerts</w:t>
+      </w:r>
+      <w:r>
+        <w:rPr>
+          <w:rFonts w:ascii="Times New Roman" w:hAnsi="Times New Roman" w:cs="Times New Roman"/>
+        </w:rPr>
+        <w:br/>
+      </w:r>
+      <w:r>
+        <w:rPr>
+          <w:rFonts w:ascii="Times New Roman" w:hAnsi="Times New Roman" w:cs="Times New Roman" w:hint="eastAsia"/>
+        </w:rPr>
+        <w:t xml:space="preserve">The question is that what are the medium for listening to music. </w:t>
+      </w:r>
+      <w:r>
+        <w:rPr>
+          <w:rFonts w:ascii="Times New Roman" w:hAnsi="Times New Roman" w:cs="Times New Roman"/>
+        </w:rPr>
+        <w:t>“</w:t>
+      </w:r>
+      <w:r>
+        <w:rPr>
+          <w:rFonts w:ascii="Times New Roman" w:hAnsi="Times New Roman" w:cs="Times New Roman" w:hint="eastAsia"/>
+        </w:rPr>
+        <w:t>Live Music</w:t>
+      </w:r>
+      <w:r>
+        <w:rPr>
+          <w:rFonts w:ascii="Times New Roman" w:hAnsi="Times New Roman" w:cs="Times New Roman"/>
+        </w:rPr>
+        <w:t>”</w:t>
+      </w:r>
+      <w:r>
+        <w:rPr>
+          <w:rFonts w:ascii="Times New Roman" w:hAnsi="Times New Roman" w:cs="Times New Roman" w:hint="eastAsia"/>
+        </w:rPr>
+        <w:t xml:space="preserve"> is not a medium. </w:t>
+      </w:r>
+    </w:p>
+    <w:p>
+      <w:pPr>
+        <w:rPr>
+          <w:rFonts w:ascii="Times New Roman" w:hAnsi="Times New Roman" w:cs="Times New Roman" w:hint="eastAsia"/>
+        </w:rPr>
+      </w:pPr>
+      <w:r>
+        <w:rPr>
+          <w:rFonts w:ascii="Times New Roman" w:hAnsi="Times New Roman" w:cs="Times New Roman" w:hint="eastAsia"/>
+        </w:rPr>
+        <w:t>28. Department  (x)  Department Stores</w:t>
+      </w:r>
+      <w:r>
+        <w:rPr>
+          <w:rFonts w:ascii="Times New Roman" w:hAnsi="Times New Roman" w:cs="Times New Roman"/>
+        </w:rPr>
+        <w:br/>
+      </w:r>
+      <w:r>
+        <w:rPr>
+          <w:rFonts w:ascii="Times New Roman" w:hAnsi="Times New Roman" w:cs="Times New Roman" w:hint="eastAsia"/>
+        </w:rPr>
+        <w:t xml:space="preserve">I just noticed the word </w:t>
+      </w:r>
+      <w:r>
+        <w:rPr>
+          <w:rFonts w:ascii="Times New Roman" w:hAnsi="Times New Roman" w:cs="Times New Roman"/>
+        </w:rPr>
+        <w:t>“</w:t>
+      </w:r>
+      <w:r>
+        <w:rPr>
+          <w:rFonts w:ascii="Times New Roman" w:hAnsi="Times New Roman" w:cs="Times New Roman" w:hint="eastAsia"/>
+        </w:rPr>
+        <w:t>department</w:t>
+      </w:r>
+      <w:r>
+        <w:rPr>
+          <w:rFonts w:ascii="Times New Roman" w:hAnsi="Times New Roman" w:cs="Times New Roman"/>
+        </w:rPr>
+        <w:t>”</w:t>
+      </w:r>
+      <w:r>
+        <w:rPr>
+          <w:rFonts w:ascii="Times New Roman" w:hAnsi="Times New Roman" w:cs="Times New Roman" w:hint="eastAsia"/>
+        </w:rPr>
+        <w:t xml:space="preserve"> and ignored </w:t>
+      </w:r>
+      <w:r>
+        <w:rPr>
+          <w:rFonts w:ascii="Times New Roman" w:hAnsi="Times New Roman" w:cs="Times New Roman"/>
+        </w:rPr>
+        <w:t>“</w:t>
+      </w:r>
+      <w:r>
+        <w:rPr>
+          <w:rFonts w:ascii="Times New Roman" w:hAnsi="Times New Roman" w:cs="Times New Roman" w:hint="eastAsia"/>
+        </w:rPr>
+        <w:t>stores</w:t>
+      </w:r>
+      <w:r>
+        <w:rPr>
+          <w:rFonts w:ascii="Times New Roman" w:hAnsi="Times New Roman" w:cs="Times New Roman"/>
+        </w:rPr>
+        <w:t>”</w:t>
+      </w:r>
+      <w:r>
+        <w:rPr>
+          <w:rFonts w:ascii="Times New Roman" w:hAnsi="Times New Roman" w:cs="Times New Roman" w:hint="eastAsia"/>
+        </w:rPr>
+        <w:t xml:space="preserve"> because I didn</w:t>
+      </w:r>
+      <w:r>
+        <w:rPr>
+          <w:rFonts w:ascii="Times New Roman" w:hAnsi="Times New Roman" w:cs="Times New Roman"/>
+        </w:rPr>
+        <w:t>’</w:t>
+      </w:r>
+      <w:r>
+        <w:rPr>
+          <w:rFonts w:ascii="Times New Roman" w:hAnsi="Times New Roman" w:cs="Times New Roman" w:hint="eastAsia"/>
+        </w:rPr>
+        <w:t xml:space="preserve">t </w:t>
+      </w:r>
+      <w:r>
+        <w:rPr>
+          <w:rFonts w:ascii="Times New Roman" w:hAnsi="Times New Roman" w:cs="Times New Roman" w:hint="eastAsia"/>
+        </w:rPr>
+        <w:t xml:space="preserve">know </w:t>
+      </w:r>
+      <w:r>
+        <w:rPr>
+          <w:rFonts w:ascii="Times New Roman" w:hAnsi="Times New Roman" w:cs="Times New Roman" w:hint="eastAsia"/>
+        </w:rPr>
+        <w:t xml:space="preserve">the collation </w:t>
+      </w:r>
+      <w:r>
+        <w:rPr>
+          <w:rFonts w:ascii="Times New Roman" w:hAnsi="Times New Roman" w:cs="Times New Roman"/>
+        </w:rPr>
+        <w:t>“</w:t>
+      </w:r>
+      <w:r>
+        <w:rPr>
+          <w:rFonts w:ascii="Times New Roman" w:hAnsi="Times New Roman" w:cs="Times New Roman" w:hint="eastAsia"/>
+        </w:rPr>
+        <w:t>department stores</w:t>
+      </w:r>
+      <w:r>
+        <w:rPr>
+          <w:rFonts w:ascii="Times New Roman" w:hAnsi="Times New Roman" w:cs="Times New Roman"/>
+        </w:rPr>
+        <w:t>”</w:t>
+      </w:r>
+      <w:r>
+        <w:rPr>
+          <w:rFonts w:ascii="Times New Roman" w:hAnsi="Times New Roman" w:cs="Times New Roman" w:hint="eastAsia"/>
+        </w:rPr>
+        <w:t>.</w:t>
+      </w:r>
+    </w:p>
+    <w:p>
+      <w:pPr>
+        <w:rPr>
+          <w:rFonts w:ascii="Times New Roman" w:hAnsi="Times New Roman" w:cs="Times New Roman" w:hint="eastAsia"/>
+        </w:rPr>
+      </w:pPr>
+      <w:r>
+        <w:rPr>
+          <w:rFonts w:ascii="Times New Roman" w:hAnsi="Times New Roman" w:cs="Times New Roman" w:hint="eastAsia"/>
+        </w:rPr>
+        <w:t>29. Opera House (x) Club</w:t>
+      </w:r>
+      <w:r>
+        <w:rPr>
+          <w:rFonts w:ascii="Times New Roman" w:hAnsi="Times New Roman" w:cs="Times New Roman"/>
+        </w:rPr>
+        <w:br/>
+      </w:r>
+      <w:r>
+        <w:rPr>
+          <w:rFonts w:ascii="Times New Roman" w:hAnsi="Times New Roman" w:cs="Times New Roman"/>
+        </w:rPr>
+        <w:t>“</w:t>
+      </w:r>
+      <w:r>
+        <w:rPr>
+          <w:rFonts w:ascii="Times New Roman" w:hAnsi="Times New Roman" w:cs="Times New Roman" w:hint="eastAsia"/>
+        </w:rPr>
+        <w:t>Club</w:t>
+      </w:r>
+      <w:r>
+        <w:rPr>
+          <w:rFonts w:ascii="Times New Roman" w:hAnsi="Times New Roman" w:cs="Times New Roman"/>
+        </w:rPr>
+        <w:t>”</w:t>
+      </w:r>
+      <w:r>
+        <w:rPr>
+          <w:rFonts w:ascii="Times New Roman" w:hAnsi="Times New Roman" w:cs="Times New Roman" w:hint="eastAsia"/>
+        </w:rPr>
+        <w:t xml:space="preserve"> is so short that I didn</w:t>
+      </w:r>
+      <w:r>
+        <w:rPr>
+          <w:rFonts w:ascii="Times New Roman" w:hAnsi="Times New Roman" w:cs="Times New Roman"/>
+        </w:rPr>
+        <w:t>’</w:t>
+      </w:r>
+      <w:r>
+        <w:rPr>
+          <w:rFonts w:ascii="Times New Roman" w:hAnsi="Times New Roman" w:cs="Times New Roman" w:hint="eastAsia"/>
+        </w:rPr>
+        <w:t xml:space="preserve">t hear it. </w:t>
+      </w:r>
+      <w:r>
+        <w:rPr>
+          <w:rFonts w:ascii="Times New Roman" w:hAnsi="Times New Roman" w:cs="Times New Roman" w:hint="eastAsia"/>
+        </w:rPr>
+        <w:t>On the other hand, a</w:t>
       </w:r>
       <w:bookmarkStart w:id="1" w:name="_GoBack"/>
       <w:bookmarkEnd w:id="1"/>
+      <w:r>
+        <w:rPr>
+          <w:rFonts w:ascii="Times New Roman" w:hAnsi="Times New Roman" w:cs="Times New Roman" w:hint="eastAsia"/>
+        </w:rPr>
+        <w:t xml:space="preserve">nswers come in order. </w:t>
+      </w:r>
+      <w:r>
+        <w:rPr>
+          <w:rFonts w:ascii="Times New Roman" w:hAnsi="Times New Roman" w:cs="Times New Roman"/>
+        </w:rPr>
+        <w:t>“</w:t>
+      </w:r>
+      <w:r>
+        <w:rPr>
+          <w:rFonts w:ascii="Times New Roman" w:hAnsi="Times New Roman" w:cs="Times New Roman" w:hint="eastAsia"/>
+        </w:rPr>
+        <w:t>Opera House</w:t>
+      </w:r>
+      <w:r>
+        <w:rPr>
+          <w:rFonts w:ascii="Times New Roman" w:hAnsi="Times New Roman" w:cs="Times New Roman"/>
+        </w:rPr>
+        <w:t>”</w:t>
+      </w:r>
+      <w:r>
+        <w:rPr>
+          <w:rFonts w:ascii="Times New Roman" w:hAnsi="Times New Roman" w:cs="Times New Roman" w:hint="eastAsia"/>
+        </w:rPr>
+        <w:t xml:space="preserve"> comes after Concert Hall. </w:t>
+      </w:r>
+    </w:p>
+    <w:p>
+      <w:pPr>
+        <w:rPr>
+          <w:rFonts w:ascii="Times New Roman" w:hAnsi="Times New Roman" w:cs="Times New Roman"/>
+        </w:rPr>
+      </w:pPr>
+      <w:r>
+        <w:rPr>
+          <w:rFonts w:ascii="Times New Roman" w:hAnsi="Times New Roman" w:cs="Times New Roman" w:hint="eastAsia"/>
+        </w:rPr>
+        <w:t>30. Karoke House (x)  Opera House</w:t>
+      </w:r>
+      <w:r>
+        <w:rPr>
+          <w:rFonts w:ascii="Times New Roman" w:hAnsi="Times New Roman" w:cs="Times New Roman"/>
+        </w:rPr>
+        <w:br/>
+        <w:t>“</w:t>
+      </w:r>
+      <w:r>
+        <w:rPr>
+          <w:rFonts w:ascii="Times New Roman" w:hAnsi="Times New Roman" w:cs="Times New Roman" w:hint="eastAsia"/>
+        </w:rPr>
+        <w:t>...karaoke bars</w:t>
+      </w:r>
+      <w:r>
+        <w:rPr>
+          <w:rFonts w:ascii="Times New Roman" w:hAnsi="Times New Roman" w:cs="Times New Roman"/>
+        </w:rPr>
+        <w:t>”</w:t>
+      </w:r>
+      <w:r>
+        <w:rPr>
+          <w:rFonts w:ascii="Times New Roman" w:hAnsi="Times New Roman" w:cs="Times New Roman" w:hint="eastAsia"/>
+        </w:rPr>
+        <w:t xml:space="preserve">.  </w:t>
+      </w:r>
+      <w:r>
+        <w:rPr>
+          <w:rFonts w:ascii="Times New Roman" w:hAnsi="Times New Roman" w:cs="Times New Roman"/>
+        </w:rPr>
+        <w:t>“</w:t>
+      </w:r>
+      <w:r>
+        <w:rPr>
+          <w:rFonts w:ascii="Times New Roman" w:hAnsi="Times New Roman" w:cs="Times New Roman" w:hint="eastAsia"/>
+        </w:rPr>
+        <w:t>Not many of them in this city.</w:t>
+      </w:r>
+      <w:r>
+        <w:rPr>
+          <w:rFonts w:ascii="Times New Roman" w:hAnsi="Times New Roman" w:cs="Times New Roman"/>
+        </w:rPr>
+        <w:t>”</w:t>
+      </w:r>
     </w:p>
     <w:sectPr>
       <w:pgSz w:w="11906" w:h="16838"/>
@@ -7340,7 +7776,7 @@
   <a:extraClrSchemeLst/>
   <a:extLst>
     <a:ext uri="{05A4C25C-085E-4340-85A3-A5531E510DB2}">
-      <thm15:themeFamily xmlns="" xmlns:thm15="http://schemas.microsoft.com/office/thememl/2012/main" name="Office Theme" id="{62F939B6-93AF-4DB8-9C6B-D6C7DFDC589F}" vid="{4A3C46E8-61CC-4603-A589-7422A47A8E4A}"/>
+      <thm15:themeFamily xmlns:thm15="http://schemas.microsoft.com/office/thememl/2012/main" xmlns="" name="Office Theme" id="{62F939B6-93AF-4DB8-9C6B-D6C7DFDC589F}" vid="{4A3C46E8-61CC-4603-A589-7422A47A8E4A}"/>
     </a:ext>
   </a:extLst>
 </a:theme>

</xml_diff>

<commit_message>
Cambridge IETLS Test 6 Listening
</commit_message>
<xml_diff>
--- a/IELTS Notes/Listening Test And Analyses..docx
+++ b/IELTS Notes/Listening Test And Analyses..docx
@@ -6443,7 +6443,7 @@
     <w:p>
       <w:pPr>
         <w:rPr>
-          <w:rFonts w:ascii="Times New Roman" w:hAnsi="Times New Roman" w:cs="Times New Roman" w:hint="eastAsia"/>
+          <w:rFonts w:ascii="Times New Roman" w:hAnsi="Times New Roman" w:cs="Times New Roman"/>
         </w:rPr>
       </w:pPr>
       <w:r>
@@ -6528,14 +6528,14 @@
     <w:p>
       <w:pPr>
         <w:rPr>
-          <w:rFonts w:ascii="Times New Roman" w:hAnsi="Times New Roman" w:cs="Times New Roman" w:hint="eastAsia"/>
-        </w:rPr>
-      </w:pPr>
-    </w:p>
-    <w:p>
-      <w:pPr>
-        <w:rPr>
-          <w:rFonts w:ascii="Times New Roman" w:hAnsi="Times New Roman" w:cs="Times New Roman" w:hint="eastAsia"/>
+          <w:rFonts w:ascii="Times New Roman" w:hAnsi="Times New Roman" w:cs="Times New Roman"/>
+        </w:rPr>
+      </w:pPr>
+    </w:p>
+    <w:p>
+      <w:pPr>
+        <w:rPr>
+          <w:rFonts w:ascii="Times New Roman" w:hAnsi="Times New Roman" w:cs="Times New Roman"/>
           <w:b/>
           <w:bCs/>
           <w:i/>
@@ -6561,7 +6561,7 @@
     <w:p>
       <w:pPr>
         <w:rPr>
-          <w:rFonts w:ascii="Times New Roman" w:hAnsi="Times New Roman" w:cs="Times New Roman" w:hint="eastAsia"/>
+          <w:rFonts w:ascii="Times New Roman" w:hAnsi="Times New Roman" w:cs="Times New Roman"/>
         </w:rPr>
       </w:pPr>
       <w:r>
@@ -6610,7 +6610,7 @@
     <w:p>
       <w:pPr>
         <w:rPr>
-          <w:rFonts w:ascii="Times New Roman" w:hAnsi="Times New Roman" w:cs="Times New Roman" w:hint="eastAsia"/>
+          <w:rFonts w:ascii="Times New Roman" w:hAnsi="Times New Roman" w:cs="Times New Roman"/>
         </w:rPr>
       </w:pPr>
       <w:r>
@@ -6647,14 +6647,26 @@
     <w:p>
       <w:pPr>
         <w:rPr>
-          <w:rFonts w:ascii="Times New Roman" w:hAnsi="Times New Roman" w:cs="Times New Roman" w:hint="eastAsia"/>
-        </w:rPr>
-      </w:pPr>
-      <w:r>
-        <w:rPr>
-          <w:rFonts w:ascii="Times New Roman" w:hAnsi="Times New Roman" w:cs="Times New Roman" w:hint="eastAsia"/>
-        </w:rPr>
-        <w:t>27. Live Music (x)  Cocerts</w:t>
+          <w:rFonts w:ascii="Times New Roman" w:hAnsi="Times New Roman" w:cs="Times New Roman"/>
+        </w:rPr>
+      </w:pPr>
+      <w:r>
+        <w:rPr>
+          <w:rFonts w:ascii="Times New Roman" w:hAnsi="Times New Roman" w:cs="Times New Roman" w:hint="eastAsia"/>
+        </w:rPr>
+        <w:t>27. Live Music (x)  Co</w:t>
+      </w:r>
+      <w:r>
+        <w:rPr>
+          <w:rFonts w:ascii="Times New Roman" w:hAnsi="Times New Roman" w:cs="Times New Roman" w:hint="eastAsia"/>
+        </w:rPr>
+        <w:t>n</w:t>
+      </w:r>
+      <w:r>
+        <w:rPr>
+          <w:rFonts w:ascii="Times New Roman" w:hAnsi="Times New Roman" w:cs="Times New Roman" w:hint="eastAsia"/>
+        </w:rPr>
+        <w:t>certs</w:t>
       </w:r>
       <w:r>
         <w:rPr>
@@ -6696,7 +6708,7 @@
     <w:p>
       <w:pPr>
         <w:rPr>
-          <w:rFonts w:ascii="Times New Roman" w:hAnsi="Times New Roman" w:cs="Times New Roman" w:hint="eastAsia"/>
+          <w:rFonts w:ascii="Times New Roman" w:hAnsi="Times New Roman" w:cs="Times New Roman"/>
         </w:rPr>
       </w:pPr>
       <w:r>
@@ -6817,7 +6829,7 @@
     <w:p>
       <w:pPr>
         <w:rPr>
-          <w:rFonts w:ascii="Times New Roman" w:hAnsi="Times New Roman" w:cs="Times New Roman" w:hint="eastAsia"/>
+          <w:rFonts w:ascii="Times New Roman" w:hAnsi="Times New Roman" w:cs="Times New Roman"/>
         </w:rPr>
       </w:pPr>
       <w:r>
@@ -6873,95 +6885,367 @@
           <w:rFonts w:ascii="Times New Roman" w:hAnsi="Times New Roman" w:cs="Times New Roman" w:hint="eastAsia"/>
         </w:rPr>
         <w:t>On the other hand, a</w:t>
+      </w:r>
+      <w:r>
+        <w:rPr>
+          <w:rFonts w:ascii="Times New Roman" w:hAnsi="Times New Roman" w:cs="Times New Roman" w:hint="eastAsia"/>
+        </w:rPr>
+        <w:t xml:space="preserve">nswers come in order. </w:t>
+      </w:r>
+      <w:r>
+        <w:rPr>
+          <w:rFonts w:ascii="Times New Roman" w:hAnsi="Times New Roman" w:cs="Times New Roman"/>
+        </w:rPr>
+        <w:t>“</w:t>
+      </w:r>
+      <w:r>
+        <w:rPr>
+          <w:rFonts w:ascii="Times New Roman" w:hAnsi="Times New Roman" w:cs="Times New Roman" w:hint="eastAsia"/>
+        </w:rPr>
+        <w:t>Opera House</w:t>
+      </w:r>
+      <w:r>
+        <w:rPr>
+          <w:rFonts w:ascii="Times New Roman" w:hAnsi="Times New Roman" w:cs="Times New Roman"/>
+        </w:rPr>
+        <w:t>”</w:t>
+      </w:r>
+      <w:r>
+        <w:rPr>
+          <w:rFonts w:ascii="Times New Roman" w:hAnsi="Times New Roman" w:cs="Times New Roman" w:hint="eastAsia"/>
+        </w:rPr>
+        <w:t xml:space="preserve"> comes after Concert Hall. </w:t>
+      </w:r>
+    </w:p>
+    <w:p>
+      <w:pPr>
+        <w:rPr>
+          <w:rFonts w:ascii="Times New Roman" w:hAnsi="Times New Roman" w:cs="Times New Roman" w:hint="eastAsia"/>
+        </w:rPr>
+      </w:pPr>
+      <w:r>
+        <w:rPr>
+          <w:rFonts w:ascii="Times New Roman" w:hAnsi="Times New Roman" w:cs="Times New Roman" w:hint="eastAsia"/>
+        </w:rPr>
+        <w:t>30. Karoke House (x)  Opera House</w:t>
+      </w:r>
+      <w:r>
+        <w:rPr>
+          <w:rFonts w:ascii="Times New Roman" w:hAnsi="Times New Roman" w:cs="Times New Roman"/>
+        </w:rPr>
+        <w:br/>
+        <w:t>“</w:t>
+      </w:r>
+      <w:r>
+        <w:rPr>
+          <w:rFonts w:ascii="Times New Roman" w:hAnsi="Times New Roman" w:cs="Times New Roman" w:hint="eastAsia"/>
+        </w:rPr>
+        <w:t>...karaoke bars</w:t>
+      </w:r>
+      <w:r>
+        <w:rPr>
+          <w:rFonts w:ascii="Times New Roman" w:hAnsi="Times New Roman" w:cs="Times New Roman"/>
+        </w:rPr>
+        <w:t>”</w:t>
+      </w:r>
+      <w:r>
+        <w:rPr>
+          <w:rFonts w:ascii="Times New Roman" w:hAnsi="Times New Roman" w:cs="Times New Roman" w:hint="eastAsia"/>
+        </w:rPr>
+        <w:t xml:space="preserve">.  </w:t>
+      </w:r>
+      <w:r>
+        <w:rPr>
+          <w:rFonts w:ascii="Times New Roman" w:hAnsi="Times New Roman" w:cs="Times New Roman"/>
+        </w:rPr>
+        <w:t>“</w:t>
+      </w:r>
+      <w:r>
+        <w:rPr>
+          <w:rFonts w:ascii="Times New Roman" w:hAnsi="Times New Roman" w:cs="Times New Roman" w:hint="eastAsia"/>
+        </w:rPr>
+        <w:t>Not many of them in this city.</w:t>
+      </w:r>
+      <w:r>
+        <w:rPr>
+          <w:rFonts w:ascii="Times New Roman" w:hAnsi="Times New Roman" w:cs="Times New Roman"/>
+        </w:rPr>
+        <w:t>”</w:t>
+      </w:r>
+    </w:p>
+    <w:p>
+      <w:pPr>
+        <w:rPr>
+          <w:rFonts w:ascii="Times New Roman" w:hAnsi="Times New Roman" w:cs="Times New Roman" w:hint="eastAsia"/>
+          <w:b/>
+          <w:bCs/>
+          <w:i/>
+          <w:iCs/>
+          <w:sz w:val="28"/>
+          <w:szCs w:val="24"/>
+        </w:rPr>
+      </w:pPr>
+      <w:r>
+        <w:rPr>
+          <w:rFonts w:ascii="Times New Roman" w:hAnsi="Times New Roman" w:cs="Times New Roman" w:hint="eastAsia"/>
+          <w:b/>
+          <w:bCs/>
+          <w:i/>
+          <w:iCs/>
+          <w:sz w:val="28"/>
+          <w:szCs w:val="24"/>
+        </w:rPr>
+        <w:t>Section 4</w:t>
+      </w:r>
+    </w:p>
+    <w:p>
+      <w:pPr>
+        <w:rPr>
+          <w:rFonts w:ascii="Times New Roman" w:hAnsi="Times New Roman" w:cs="Times New Roman" w:hint="eastAsia"/>
+        </w:rPr>
+      </w:pPr>
+      <w:r>
+        <w:rPr>
+          <w:rFonts w:ascii="Times New Roman" w:hAnsi="Times New Roman" w:cs="Times New Roman" w:hint="eastAsia"/>
+        </w:rPr>
+        <w:t xml:space="preserve">31. ___  (x)  C </w:t>
+      </w:r>
+      <w:r>
+        <w:rPr>
+          <w:rFonts w:ascii="Times New Roman" w:hAnsi="Times New Roman" w:cs="Times New Roman"/>
+        </w:rPr>
+        <w:br/>
+      </w:r>
+      <w:r>
+        <w:rPr>
+          <w:rFonts w:ascii="Times New Roman" w:hAnsi="Times New Roman" w:cs="Times New Roman" w:hint="eastAsia"/>
+        </w:rPr>
+        <w:t>Three options of this</w:t>
+      </w:r>
+      <w:r>
+        <w:rPr>
+          <w:rFonts w:ascii="Times New Roman" w:hAnsi="Times New Roman" w:cs="Times New Roman" w:hint="eastAsia"/>
+        </w:rPr>
+        <w:t xml:space="preserve"> questions are different types so it is important to read all the options in advance if possible.</w:t>
+      </w:r>
+    </w:p>
+    <w:p>
+      <w:pPr>
+        <w:rPr>
+          <w:rFonts w:ascii="Times New Roman" w:hAnsi="Times New Roman" w:cs="Times New Roman" w:hint="eastAsia"/>
+        </w:rPr>
+      </w:pPr>
+      <w:r>
+        <w:rPr>
+          <w:rFonts w:ascii="Times New Roman" w:hAnsi="Times New Roman" w:cs="Times New Roman" w:hint="eastAsia"/>
+        </w:rPr>
+        <w:t>32. ___ (x)  C</w:t>
+      </w:r>
+    </w:p>
+    <w:p>
+      <w:pPr>
+        <w:rPr>
+          <w:rFonts w:ascii="Times New Roman" w:hAnsi="Times New Roman" w:cs="Times New Roman" w:hint="eastAsia"/>
+        </w:rPr>
+      </w:pPr>
+      <w:r>
+        <w:rPr>
+          <w:rFonts w:ascii="Times New Roman" w:hAnsi="Times New Roman" w:cs="Times New Roman" w:hint="eastAsia"/>
+        </w:rPr>
+        <w:t>If you didn</w:t>
+      </w:r>
+      <w:r>
+        <w:rPr>
+          <w:rFonts w:ascii="Times New Roman" w:hAnsi="Times New Roman" w:cs="Times New Roman"/>
+        </w:rPr>
+        <w:t>’</w:t>
+      </w:r>
+      <w:r>
+        <w:rPr>
+          <w:rFonts w:ascii="Times New Roman" w:hAnsi="Times New Roman" w:cs="Times New Roman" w:hint="eastAsia"/>
+        </w:rPr>
+        <w:t xml:space="preserve">t know the answer, just guess. </w:t>
+      </w:r>
+      <w:r>
+        <w:rPr>
+          <w:rFonts w:ascii="Times New Roman" w:hAnsi="Times New Roman" w:cs="Times New Roman" w:hint="eastAsia"/>
+        </w:rPr>
+        <w:t xml:space="preserve"> Don</w:t>
+      </w:r>
+      <w:r>
+        <w:rPr>
+          <w:rFonts w:ascii="Times New Roman" w:hAnsi="Times New Roman" w:cs="Times New Roman"/>
+        </w:rPr>
+        <w:t>’</w:t>
+      </w:r>
+      <w:r>
+        <w:rPr>
+          <w:rFonts w:ascii="Times New Roman" w:hAnsi="Times New Roman" w:cs="Times New Roman" w:hint="eastAsia"/>
+        </w:rPr>
+        <w:t>t leave the answer sheet empty.</w:t>
+      </w:r>
+    </w:p>
+    <w:p>
+      <w:pPr>
+        <w:rPr>
+          <w:rFonts w:ascii="Times New Roman" w:hAnsi="Times New Roman" w:cs="Times New Roman" w:hint="eastAsia"/>
+        </w:rPr>
+      </w:pPr>
+      <w:r>
+        <w:rPr>
+          <w:rFonts w:ascii="Times New Roman" w:hAnsi="Times New Roman" w:cs="Times New Roman" w:hint="eastAsia"/>
+        </w:rPr>
+        <w:t>33. ___ (x)  A</w:t>
+      </w:r>
+    </w:p>
+    <w:p>
+      <w:pPr>
+        <w:rPr>
+          <w:rFonts w:ascii="Times New Roman" w:hAnsi="Times New Roman" w:cs="Times New Roman" w:hint="eastAsia"/>
+        </w:rPr>
+      </w:pPr>
+      <w:r>
+        <w:rPr>
+          <w:rFonts w:ascii="Times New Roman" w:hAnsi="Times New Roman" w:cs="Times New Roman" w:hint="eastAsia"/>
+        </w:rPr>
+        <w:t>34. A  (x)  B</w:t>
+      </w:r>
+      <w:r>
+        <w:rPr>
+          <w:rFonts w:ascii="Times New Roman" w:hAnsi="Times New Roman" w:cs="Times New Roman"/>
+        </w:rPr>
+        <w:br/>
+      </w:r>
+      <w:r>
+        <w:rPr>
+          <w:rFonts w:ascii="Times New Roman" w:hAnsi="Times New Roman" w:cs="Times New Roman" w:hint="eastAsia"/>
+        </w:rPr>
+        <w:t xml:space="preserve">The option A is </w:t>
+      </w:r>
+      <w:r>
+        <w:rPr>
+          <w:rFonts w:ascii="Times New Roman" w:hAnsi="Times New Roman" w:cs="Times New Roman"/>
+        </w:rPr>
+        <w:t>“</w:t>
+      </w:r>
+      <w:r>
+        <w:rPr>
+          <w:rFonts w:ascii="Times New Roman" w:hAnsi="Times New Roman" w:cs="Times New Roman" w:hint="eastAsia"/>
+        </w:rPr>
+        <w:t>the remains of burnt grain in pots</w:t>
+      </w:r>
+      <w:r>
+        <w:rPr>
+          <w:rFonts w:ascii="Times New Roman" w:hAnsi="Times New Roman" w:cs="Times New Roman"/>
+        </w:rPr>
+        <w:t>”</w:t>
+      </w:r>
+      <w:r>
+        <w:rPr>
+          <w:rFonts w:ascii="Times New Roman" w:hAnsi="Times New Roman" w:cs="Times New Roman" w:hint="eastAsia"/>
+        </w:rPr>
+        <w:t>. It is impossible for grains to be reamined in pots after it burnt thouands of years ago.</w:t>
+      </w:r>
+      <w:r>
+        <w:rPr>
+          <w:rFonts w:ascii="Times New Roman" w:hAnsi="Times New Roman" w:cs="Times New Roman" w:hint="eastAsia"/>
+        </w:rPr>
+        <w:t xml:space="preserve"> It was its marks that was left on pots.</w:t>
+      </w:r>
+    </w:p>
+    <w:p>
+      <w:pPr>
+        <w:rPr>
+          <w:rFonts w:ascii="Times New Roman" w:hAnsi="Times New Roman" w:cs="Times New Roman" w:hint="eastAsia"/>
+        </w:rPr>
+      </w:pPr>
+      <w:r>
+        <w:rPr>
+          <w:rFonts w:ascii="Times New Roman" w:hAnsi="Times New Roman" w:cs="Times New Roman" w:hint="eastAsia"/>
+        </w:rPr>
+        <w:t>38. firing  (x)  outside</w:t>
+      </w:r>
+      <w:r>
+        <w:rPr>
+          <w:rFonts w:ascii="Times New Roman" w:hAnsi="Times New Roman" w:cs="Times New Roman"/>
+        </w:rPr>
+        <w:br/>
+      </w:r>
+      <w:r>
+        <w:rPr>
+          <w:rFonts w:ascii="Times New Roman" w:hAnsi="Times New Roman" w:cs="Times New Roman" w:hint="eastAsia"/>
+        </w:rPr>
+        <w:t xml:space="preserve">Not only it </w:t>
+      </w:r>
+      <w:r>
+        <w:rPr>
+          <w:rFonts w:ascii="Times New Roman" w:hAnsi="Times New Roman" w:cs="Times New Roman"/>
+        </w:rPr>
+        <w:t>“</w:t>
+      </w:r>
+      <w:r>
+        <w:rPr>
+          <w:rFonts w:ascii="Times New Roman" w:hAnsi="Times New Roman" w:cs="Times New Roman" w:hint="eastAsia"/>
+        </w:rPr>
+        <w:t>outside</w:t>
+      </w:r>
+      <w:r>
+        <w:rPr>
+          <w:rFonts w:ascii="Times New Roman" w:hAnsi="Times New Roman" w:cs="Times New Roman"/>
+        </w:rPr>
+        <w:t>”</w:t>
+      </w:r>
+      <w:r>
+        <w:rPr>
+          <w:rFonts w:ascii="Times New Roman" w:hAnsi="Times New Roman" w:cs="Times New Roman" w:hint="eastAsia"/>
+        </w:rPr>
+        <w:t xml:space="preserve">  an adjective, but also it is a noun.</w:t>
+      </w:r>
+    </w:p>
+    <w:p>
+      <w:pPr>
+        <w:rPr>
+          <w:rFonts w:ascii="Times New Roman" w:hAnsi="Times New Roman" w:cs="Times New Roman"/>
+        </w:rPr>
+      </w:pPr>
+      <w:r>
+        <w:rPr>
+          <w:rFonts w:ascii="Times New Roman" w:hAnsi="Times New Roman" w:cs="Times New Roman" w:hint="eastAsia"/>
+        </w:rPr>
+        <w:t>40. top  (x) tops</w:t>
+      </w:r>
+      <w:r>
+        <w:rPr>
+          <w:rFonts w:ascii="Times New Roman" w:hAnsi="Times New Roman" w:cs="Times New Roman"/>
+        </w:rPr>
+        <w:br/>
+      </w:r>
+      <w:r>
+        <w:rPr>
+          <w:rFonts w:ascii="Times New Roman" w:hAnsi="Times New Roman" w:cs="Times New Roman" w:hint="eastAsia"/>
+        </w:rPr>
+        <w:t>I should have obtained a score if I had written a plural</w:t>
+      </w:r>
+      <w:r>
+        <w:rPr>
+          <w:rFonts w:ascii="Times New Roman" w:hAnsi="Times New Roman" w:cs="Times New Roman" w:hint="eastAsia"/>
+        </w:rPr>
+        <w:t xml:space="preserve"> noun</w:t>
+      </w:r>
+      <w:r>
+        <w:rPr>
+          <w:rFonts w:ascii="Times New Roman" w:hAnsi="Times New Roman" w:cs="Times New Roman" w:hint="eastAsia"/>
+        </w:rPr>
+        <w:t>.</w:t>
+      </w:r>
+      <w:r>
+        <w:rPr>
+          <w:rFonts w:ascii="Times New Roman" w:hAnsi="Times New Roman" w:cs="Times New Roman" w:hint="eastAsia"/>
+        </w:rPr>
+        <w:t xml:space="preserve"> </w:t>
       </w:r>
       <w:bookmarkStart w:id="1" w:name="_GoBack"/>
       <w:bookmarkEnd w:id="1"/>
-      <w:r>
-        <w:rPr>
-          <w:rFonts w:ascii="Times New Roman" w:hAnsi="Times New Roman" w:cs="Times New Roman" w:hint="eastAsia"/>
-        </w:rPr>
-        <w:t xml:space="preserve">nswers come in order. </w:t>
-      </w:r>
-      <w:r>
-        <w:rPr>
-          <w:rFonts w:ascii="Times New Roman" w:hAnsi="Times New Roman" w:cs="Times New Roman"/>
-        </w:rPr>
-        <w:t>“</w:t>
-      </w:r>
-      <w:r>
-        <w:rPr>
-          <w:rFonts w:ascii="Times New Roman" w:hAnsi="Times New Roman" w:cs="Times New Roman" w:hint="eastAsia"/>
-        </w:rPr>
-        <w:t>Opera House</w:t>
-      </w:r>
-      <w:r>
-        <w:rPr>
-          <w:rFonts w:ascii="Times New Roman" w:hAnsi="Times New Roman" w:cs="Times New Roman"/>
-        </w:rPr>
-        <w:t>”</w:t>
-      </w:r>
-      <w:r>
-        <w:rPr>
-          <w:rFonts w:ascii="Times New Roman" w:hAnsi="Times New Roman" w:cs="Times New Roman" w:hint="eastAsia"/>
-        </w:rPr>
-        <w:t xml:space="preserve"> comes after Concert Hall. </w:t>
-      </w:r>
-    </w:p>
-    <w:p>
-      <w:pPr>
-        <w:rPr>
-          <w:rFonts w:ascii="Times New Roman" w:hAnsi="Times New Roman" w:cs="Times New Roman"/>
-        </w:rPr>
-      </w:pPr>
-      <w:r>
-        <w:rPr>
-          <w:rFonts w:ascii="Times New Roman" w:hAnsi="Times New Roman" w:cs="Times New Roman" w:hint="eastAsia"/>
-        </w:rPr>
-        <w:t>30. Karoke House (x)  Opera House</w:t>
-      </w:r>
-      <w:r>
-        <w:rPr>
-          <w:rFonts w:ascii="Times New Roman" w:hAnsi="Times New Roman" w:cs="Times New Roman"/>
-        </w:rPr>
-        <w:br/>
-        <w:t>“</w:t>
-      </w:r>
-      <w:r>
-        <w:rPr>
-          <w:rFonts w:ascii="Times New Roman" w:hAnsi="Times New Roman" w:cs="Times New Roman" w:hint="eastAsia"/>
-        </w:rPr>
-        <w:t>...karaoke bars</w:t>
-      </w:r>
-      <w:r>
-        <w:rPr>
-          <w:rFonts w:ascii="Times New Roman" w:hAnsi="Times New Roman" w:cs="Times New Roman"/>
-        </w:rPr>
-        <w:t>”</w:t>
-      </w:r>
-      <w:r>
-        <w:rPr>
-          <w:rFonts w:ascii="Times New Roman" w:hAnsi="Times New Roman" w:cs="Times New Roman" w:hint="eastAsia"/>
-        </w:rPr>
-        <w:t xml:space="preserve">.  </w:t>
-      </w:r>
-      <w:r>
-        <w:rPr>
-          <w:rFonts w:ascii="Times New Roman" w:hAnsi="Times New Roman" w:cs="Times New Roman"/>
-        </w:rPr>
-        <w:t>“</w:t>
-      </w:r>
-      <w:r>
-        <w:rPr>
-          <w:rFonts w:ascii="Times New Roman" w:hAnsi="Times New Roman" w:cs="Times New Roman" w:hint="eastAsia"/>
-        </w:rPr>
-        <w:t>Not many of them in this city.</w:t>
-      </w:r>
-      <w:r>
-        <w:rPr>
-          <w:rFonts w:ascii="Times New Roman" w:hAnsi="Times New Roman" w:cs="Times New Roman"/>
-        </w:rPr>
-        <w:t>”</w:t>
-      </w:r>
     </w:p>
     <w:sectPr>
       <w:pgSz w:w="11906" w:h="16838"/>
@@ -7776,7 +8060,7 @@
   <a:extraClrSchemeLst/>
   <a:extLst>
     <a:ext uri="{05A4C25C-085E-4340-85A3-A5531E510DB2}">
-      <thm15:themeFamily xmlns:thm15="http://schemas.microsoft.com/office/thememl/2012/main" xmlns="" name="Office Theme" id="{62F939B6-93AF-4DB8-9C6B-D6C7DFDC589F}" vid="{4A3C46E8-61CC-4603-A589-7422A47A8E4A}"/>
+      <thm15:themeFamily xmlns="" xmlns:thm15="http://schemas.microsoft.com/office/thememl/2012/main" name="Office Theme" id="{62F939B6-93AF-4DB8-9C6B-D6C7DFDC589F}" vid="{4A3C46E8-61CC-4603-A589-7422A47A8E4A}"/>
     </a:ext>
   </a:extLst>
 </a:theme>

</xml_diff>

<commit_message>
Test 6 Listening section 4
</commit_message>
<xml_diff>
--- a/IELTS Notes/Listening Test And Analyses..docx
+++ b/IELTS Notes/Listening Test And Analyses..docx
@@ -7164,7 +7164,7 @@
     <w:p>
       <w:pPr>
         <w:rPr>
-          <w:rFonts w:ascii="Times New Roman" w:hAnsi="Times New Roman" w:cs="Times New Roman" w:hint="eastAsia"/>
+          <w:rFonts w:ascii="Times New Roman" w:hAnsi="Times New Roman" w:cs="Times New Roman"/>
         </w:rPr>
       </w:pPr>
       <w:r>
@@ -7207,7 +7207,7 @@
     <w:p>
       <w:pPr>
         <w:rPr>
-          <w:rFonts w:ascii="Times New Roman" w:hAnsi="Times New Roman" w:cs="Times New Roman" w:hint="eastAsia"/>
+          <w:rFonts w:ascii="Times New Roman" w:hAnsi="Times New Roman" w:cs="Times New Roman"/>
         </w:rPr>
       </w:pPr>
     </w:p>
@@ -7230,17 +7230,7 @@
           <w:sz w:val="24"/>
           <w:szCs w:val="24"/>
         </w:rPr>
-        <w:t>Test 4</w:t>
-      </w:r>
-      <w:r>
-        <w:rPr>
-          <w:rFonts w:ascii="Times New Roman" w:hAnsi="Times New Roman" w:cs="Times New Roman" w:hint="eastAsia"/>
-          <w:b/>
-          <w:bCs/>
-          <w:sz w:val="24"/>
-          <w:szCs w:val="24"/>
-        </w:rPr>
-        <w:t xml:space="preserve"> Listening</w:t>
+        <w:t>Test 4 Listening</w:t>
       </w:r>
     </w:p>
     <w:p>
@@ -7271,7 +7261,7 @@
     <w:p>
       <w:pPr>
         <w:rPr>
-          <w:rFonts w:ascii="Times New Roman" w:hAnsi="Times New Roman" w:cs="Times New Roman" w:hint="eastAsia"/>
+          <w:rFonts w:ascii="Times New Roman" w:hAnsi="Times New Roman" w:cs="Times New Roman"/>
         </w:rPr>
       </w:pPr>
       <w:r>
@@ -7326,7 +7316,7 @@
     <w:p>
       <w:pPr>
         <w:rPr>
-          <w:rFonts w:ascii="Times New Roman" w:hAnsi="Times New Roman" w:cs="Times New Roman" w:hint="eastAsia"/>
+          <w:rFonts w:ascii="Times New Roman" w:hAnsi="Times New Roman" w:cs="Times New Roman"/>
         </w:rPr>
       </w:pPr>
       <w:r>
@@ -7417,7 +7407,7 @@
     <w:p>
       <w:pPr>
         <w:rPr>
-          <w:rFonts w:ascii="Times New Roman" w:hAnsi="Times New Roman" w:cs="Times New Roman" w:hint="eastAsia"/>
+          <w:rFonts w:ascii="Times New Roman" w:hAnsi="Times New Roman" w:cs="Times New Roman"/>
         </w:rPr>
       </w:pPr>
       <w:r>
@@ -7455,19 +7445,13 @@
         <w:rPr>
           <w:rFonts w:ascii="Times New Roman" w:hAnsi="Times New Roman" w:cs="Times New Roman" w:hint="eastAsia"/>
         </w:rPr>
-        <w:t>t expect that t</w:t>
-      </w:r>
-      <w:r>
-        <w:rPr>
-          <w:rFonts w:ascii="Times New Roman" w:hAnsi="Times New Roman" w:cs="Times New Roman" w:hint="eastAsia"/>
-        </w:rPr>
-        <w:t>he answer is in the very first sentence.</w:t>
-      </w:r>
-    </w:p>
-    <w:p>
-      <w:pPr>
-        <w:rPr>
-          <w:rFonts w:ascii="Times New Roman" w:hAnsi="Times New Roman" w:cs="Times New Roman" w:hint="eastAsia"/>
+        <w:t>t expect that the answer is in the very first sentence.</w:t>
+      </w:r>
+    </w:p>
+    <w:p>
+      <w:pPr>
+        <w:rPr>
+          <w:rFonts w:ascii="Times New Roman" w:hAnsi="Times New Roman" w:cs="Times New Roman"/>
         </w:rPr>
       </w:pPr>
       <w:r>
@@ -7480,7 +7464,7 @@
     <w:p>
       <w:pPr>
         <w:rPr>
-          <w:rFonts w:ascii="Times New Roman" w:hAnsi="Times New Roman" w:cs="Times New Roman" w:hint="eastAsia"/>
+          <w:rFonts w:ascii="Times New Roman" w:hAnsi="Times New Roman" w:cs="Times New Roman"/>
         </w:rPr>
       </w:pPr>
       <w:r>
@@ -7493,7 +7477,7 @@
     <w:p>
       <w:pPr>
         <w:rPr>
-          <w:rFonts w:ascii="Times New Roman" w:hAnsi="Times New Roman" w:cs="Times New Roman" w:hint="eastAsia"/>
+          <w:rFonts w:ascii="Times New Roman" w:hAnsi="Times New Roman" w:cs="Times New Roman"/>
         </w:rPr>
       </w:pPr>
       <w:r>
@@ -7518,7 +7502,7 @@
     <w:p>
       <w:pPr>
         <w:rPr>
-          <w:rFonts w:ascii="Times New Roman" w:hAnsi="Times New Roman" w:cs="Times New Roman" w:hint="eastAsia"/>
+          <w:rFonts w:ascii="Times New Roman" w:hAnsi="Times New Roman" w:cs="Times New Roman"/>
         </w:rPr>
       </w:pPr>
       <w:r>
@@ -7537,7 +7521,7 @@
     <w:p>
       <w:pPr>
         <w:rPr>
-          <w:rFonts w:ascii="Times New Roman" w:hAnsi="Times New Roman" w:cs="Times New Roman" w:hint="eastAsia"/>
+          <w:rFonts w:ascii="Times New Roman" w:hAnsi="Times New Roman" w:cs="Times New Roman"/>
         </w:rPr>
       </w:pPr>
       <w:r>
@@ -7706,7 +7690,7 @@
     <w:p>
       <w:pPr>
         <w:rPr>
-          <w:rFonts w:ascii="Times New Roman" w:hAnsi="Times New Roman" w:cs="Times New Roman" w:hint="eastAsia"/>
+          <w:rFonts w:ascii="Times New Roman" w:hAnsi="Times New Roman" w:cs="Times New Roman"/>
           <w:b/>
           <w:bCs/>
           <w:i/>
@@ -7731,7 +7715,7 @@
     <w:p>
       <w:pPr>
         <w:rPr>
-          <w:rFonts w:ascii="Times New Roman" w:hAnsi="Times New Roman" w:cs="Times New Roman" w:hint="eastAsia"/>
+          <w:rFonts w:ascii="Times New Roman" w:hAnsi="Times New Roman" w:cs="Times New Roman"/>
         </w:rPr>
       </w:pPr>
       <w:r>
@@ -7739,105 +7723,370 @@
           <w:rFonts w:ascii="Times New Roman" w:hAnsi="Times New Roman" w:cs="Times New Roman" w:hint="eastAsia"/>
         </w:rPr>
         <w:t>14. text (x)  tax</w:t>
+      </w:r>
+      <w:r>
+        <w:rPr>
+          <w:rFonts w:ascii="Times New Roman" w:hAnsi="Times New Roman" w:cs="Times New Roman"/>
+        </w:rPr>
+        <w:br/>
+      </w:r>
+      <w:r>
+        <w:rPr>
+          <w:rFonts w:ascii="Times New Roman" w:hAnsi="Times New Roman" w:cs="Times New Roman" w:hint="eastAsia"/>
+        </w:rPr>
+        <w:t xml:space="preserve">The previous sentence in the same cell is </w:t>
+      </w:r>
+      <w:r>
+        <w:rPr>
+          <w:rFonts w:ascii="Times New Roman" w:hAnsi="Times New Roman" w:cs="Times New Roman"/>
+        </w:rPr>
+        <w:t>“</w:t>
+      </w:r>
+      <w:r>
+        <w:rPr>
+          <w:rFonts w:ascii="Times New Roman" w:hAnsi="Times New Roman" w:cs="Times New Roman" w:hint="eastAsia"/>
+        </w:rPr>
+        <w:t>information about pay</w:t>
+      </w:r>
+      <w:r>
+        <w:rPr>
+          <w:rFonts w:ascii="Times New Roman" w:hAnsi="Times New Roman" w:cs="Times New Roman"/>
+        </w:rPr>
+        <w:t>”</w:t>
+      </w:r>
+      <w:r>
+        <w:rPr>
+          <w:rFonts w:ascii="Times New Roman" w:hAnsi="Times New Roman" w:cs="Times New Roman" w:hint="eastAsia"/>
+        </w:rPr>
+        <w:t xml:space="preserve"> so the answer is </w:t>
+      </w:r>
+      <w:r>
+        <w:rPr>
+          <w:rFonts w:ascii="Times New Roman" w:hAnsi="Times New Roman" w:cs="Times New Roman"/>
+        </w:rPr>
+        <w:t>“</w:t>
+      </w:r>
+      <w:r>
+        <w:rPr>
+          <w:rFonts w:ascii="Times New Roman" w:hAnsi="Times New Roman" w:cs="Times New Roman" w:hint="eastAsia"/>
+        </w:rPr>
+        <w:t>tax</w:t>
+      </w:r>
+      <w:r>
+        <w:rPr>
+          <w:rFonts w:ascii="Times New Roman" w:hAnsi="Times New Roman" w:cs="Times New Roman"/>
+        </w:rPr>
+        <w:t>”</w:t>
+      </w:r>
+      <w:r>
+        <w:rPr>
+          <w:rFonts w:ascii="Times New Roman" w:hAnsi="Times New Roman" w:cs="Times New Roman" w:hint="eastAsia"/>
+        </w:rPr>
+        <w:t xml:space="preserve"> form.</w:t>
+      </w:r>
+    </w:p>
+    <w:p>
+      <w:pPr>
+        <w:rPr>
+          <w:rFonts w:ascii="Times New Roman" w:hAnsi="Times New Roman" w:cs="Times New Roman" w:hint="eastAsia"/>
+        </w:rPr>
+      </w:pPr>
+      <w:r>
+        <w:rPr>
+          <w:rFonts w:ascii="Times New Roman" w:hAnsi="Times New Roman" w:cs="Times New Roman" w:hint="eastAsia"/>
+        </w:rPr>
+        <w:t>17. the lecture room  (x)  lecture room 311</w:t>
+      </w:r>
+      <w:r>
+        <w:rPr>
+          <w:rFonts w:ascii="Times New Roman" w:hAnsi="Times New Roman" w:cs="Times New Roman"/>
+        </w:rPr>
+        <w:br/>
+      </w:r>
+      <w:r>
+        <w:rPr>
+          <w:rFonts w:ascii="Times New Roman" w:hAnsi="Times New Roman" w:cs="Times New Roman" w:hint="eastAsia"/>
+        </w:rPr>
+        <w:t>Don</w:t>
+      </w:r>
+      <w:r>
+        <w:rPr>
+          <w:rFonts w:ascii="Times New Roman" w:hAnsi="Times New Roman" w:cs="Times New Roman"/>
+        </w:rPr>
+        <w:t>’</w:t>
+      </w:r>
+      <w:r>
+        <w:rPr>
+          <w:rFonts w:ascii="Times New Roman" w:hAnsi="Times New Roman" w:cs="Times New Roman" w:hint="eastAsia"/>
+        </w:rPr>
+        <w:t>t forget the number of the room.</w:t>
+      </w:r>
+    </w:p>
+    <w:p>
+      <w:pPr>
+        <w:rPr>
+          <w:rFonts w:ascii="Times New Roman" w:hAnsi="Times New Roman" w:cs="Times New Roman" w:hint="eastAsia"/>
+          <w:b/>
+          <w:bCs/>
+          <w:i/>
+          <w:iCs/>
+          <w:sz w:val="24"/>
+          <w:szCs w:val="24"/>
+        </w:rPr>
+      </w:pPr>
+      <w:r>
+        <w:rPr>
+          <w:rFonts w:ascii="Times New Roman" w:hAnsi="Times New Roman" w:cs="Times New Roman" w:hint="eastAsia"/>
+          <w:b/>
+          <w:bCs/>
+          <w:i/>
+          <w:iCs/>
+          <w:sz w:val="24"/>
+          <w:szCs w:val="24"/>
+        </w:rPr>
+        <w:t>Section 3</w:t>
+      </w:r>
+    </w:p>
+    <w:p>
+      <w:pPr>
+        <w:rPr>
+          <w:rFonts w:ascii="Times New Roman" w:hAnsi="Times New Roman" w:cs="Times New Roman" w:hint="eastAsia"/>
+        </w:rPr>
+      </w:pPr>
+      <w:r>
+        <w:rPr>
+          <w:rFonts w:ascii="Times New Roman" w:hAnsi="Times New Roman" w:cs="Times New Roman" w:hint="eastAsia"/>
+        </w:rPr>
+        <w:t>21. references  (x) reference</w:t>
+      </w:r>
+      <w:r>
+        <w:rPr>
+          <w:rFonts w:ascii="Times New Roman" w:hAnsi="Times New Roman" w:cs="Times New Roman"/>
+        </w:rPr>
+        <w:br/>
+      </w:r>
+      <w:r>
+        <w:rPr>
+          <w:rFonts w:ascii="Times New Roman" w:hAnsi="Times New Roman" w:cs="Times New Roman" w:hint="eastAsia"/>
+        </w:rPr>
+        <w:t xml:space="preserve">When a nound precede a plural noun, the first noun should be singular. For instance, </w:t>
+      </w:r>
+      <w:r>
+        <w:rPr>
+          <w:rFonts w:ascii="Times New Roman" w:hAnsi="Times New Roman" w:cs="Times New Roman"/>
+        </w:rPr>
+        <w:t>“</w:t>
+      </w:r>
+      <w:r>
+        <w:rPr>
+          <w:rFonts w:ascii="Times New Roman" w:hAnsi="Times New Roman" w:cs="Times New Roman" w:hint="eastAsia"/>
+        </w:rPr>
+        <w:t>reference materials</w:t>
+      </w:r>
+      <w:r>
+        <w:rPr>
+          <w:rFonts w:ascii="Times New Roman" w:hAnsi="Times New Roman" w:cs="Times New Roman"/>
+        </w:rPr>
+        <w:t>”</w:t>
+      </w:r>
+    </w:p>
+    <w:p>
+      <w:pPr>
+        <w:rPr>
+          <w:rFonts w:ascii="Times New Roman" w:hAnsi="Times New Roman" w:cs="Times New Roman" w:hint="eastAsia"/>
+        </w:rPr>
+      </w:pPr>
+      <w:r>
+        <w:rPr>
+          <w:rFonts w:ascii="Times New Roman" w:hAnsi="Times New Roman" w:cs="Times New Roman" w:hint="eastAsia"/>
+        </w:rPr>
+        <w:t>22. teaching  (x)  textbooks</w:t>
+      </w:r>
+    </w:p>
+    <w:p>
+      <w:pPr>
+        <w:rPr>
+          <w:rFonts w:ascii="Times New Roman" w:hAnsi="Times New Roman" w:cs="Times New Roman" w:hint="eastAsia"/>
+        </w:rPr>
+      </w:pPr>
+      <w:r>
+        <w:rPr>
+          <w:rFonts w:ascii="Times New Roman" w:hAnsi="Times New Roman" w:cs="Times New Roman" w:hint="eastAsia"/>
+        </w:rPr>
+        <w:t>23. ____  (x) secondary</w:t>
+      </w:r>
+    </w:p>
+    <w:p>
+      <w:pPr>
+        <w:rPr>
+          <w:rFonts w:ascii="Times New Roman" w:hAnsi="Times New Roman" w:cs="Times New Roman" w:hint="eastAsia"/>
+        </w:rPr>
+      </w:pPr>
+      <w:r>
+        <w:rPr>
+          <w:rFonts w:ascii="Times New Roman" w:hAnsi="Times New Roman" w:cs="Times New Roman" w:hint="eastAsia"/>
+        </w:rPr>
+        <w:t>25. ____  (x) back</w:t>
+      </w:r>
+    </w:p>
+    <w:p>
+      <w:pPr>
+        <w:rPr>
+          <w:rFonts w:ascii="Times New Roman" w:hAnsi="Times New Roman" w:cs="Times New Roman" w:hint="eastAsia"/>
+        </w:rPr>
+      </w:pPr>
+      <w:r>
+        <w:rPr>
+          <w:rFonts w:ascii="Times New Roman" w:hAnsi="Times New Roman" w:cs="Times New Roman" w:hint="eastAsia"/>
+        </w:rPr>
+        <w:t>26. none (x)  overdue</w:t>
+      </w:r>
+      <w:r>
+        <w:rPr>
+          <w:rFonts w:ascii="Times New Roman" w:hAnsi="Times New Roman" w:cs="Times New Roman" w:hint="eastAsia"/>
+        </w:rPr>
+        <w:t xml:space="preserve"> books. </w:t>
+      </w:r>
+      <w:r>
+        <w:rPr>
+          <w:rFonts w:ascii="Times New Roman" w:hAnsi="Times New Roman" w:cs="Times New Roman"/>
+        </w:rPr>
+        <w:br/>
+      </w:r>
+      <w:r>
+        <w:rPr>
+          <w:rFonts w:ascii="Times New Roman" w:hAnsi="Times New Roman" w:cs="Times New Roman" w:hint="eastAsia"/>
+        </w:rPr>
+        <w:t>I didn</w:t>
+      </w:r>
+      <w:r>
+        <w:rPr>
+          <w:rFonts w:ascii="Times New Roman" w:hAnsi="Times New Roman" w:cs="Times New Roman"/>
+        </w:rPr>
+        <w:t>’</w:t>
+      </w:r>
+      <w:r>
+        <w:rPr>
+          <w:rFonts w:ascii="Times New Roman" w:hAnsi="Times New Roman" w:cs="Times New Roman" w:hint="eastAsia"/>
+        </w:rPr>
+        <w:t xml:space="preserve">t know the word </w:t>
+      </w:r>
+      <w:r>
+        <w:rPr>
+          <w:rFonts w:ascii="Times New Roman" w:hAnsi="Times New Roman" w:cs="Times New Roman"/>
+        </w:rPr>
+        <w:t>“</w:t>
+      </w:r>
+      <w:r>
+        <w:rPr>
+          <w:rFonts w:ascii="Times New Roman" w:hAnsi="Times New Roman" w:cs="Times New Roman" w:hint="eastAsia"/>
+        </w:rPr>
+        <w:t>overdue</w:t>
+      </w:r>
+      <w:r>
+        <w:rPr>
+          <w:rFonts w:ascii="Times New Roman" w:hAnsi="Times New Roman" w:cs="Times New Roman"/>
+        </w:rPr>
+        <w:t>”</w:t>
+      </w:r>
+      <w:r>
+        <w:rPr>
+          <w:rFonts w:ascii="Times New Roman" w:hAnsi="Times New Roman" w:cs="Times New Roman" w:hint="eastAsia"/>
+        </w:rPr>
+        <w:t xml:space="preserve"> so I couldn</w:t>
+      </w:r>
+      <w:r>
+        <w:rPr>
+          <w:rFonts w:ascii="Times New Roman" w:hAnsi="Times New Roman" w:cs="Times New Roman"/>
+        </w:rPr>
+        <w:t>’</w:t>
+      </w:r>
+      <w:r>
+        <w:rPr>
+          <w:rFonts w:ascii="Times New Roman" w:hAnsi="Times New Roman" w:cs="Times New Roman" w:hint="eastAsia"/>
+        </w:rPr>
+        <w:t xml:space="preserve">t write it even if I heard it. </w:t>
+      </w:r>
+      <w:r>
+        <w:rPr>
+          <w:rFonts w:ascii="Times New Roman" w:hAnsi="Times New Roman" w:cs="Times New Roman" w:hint="eastAsia"/>
+        </w:rPr>
+        <w:t xml:space="preserve">The answer is </w:t>
+      </w:r>
+      <w:r>
+        <w:rPr>
+          <w:rFonts w:ascii="Times New Roman" w:hAnsi="Times New Roman" w:cs="Times New Roman"/>
+        </w:rPr>
+        <w:t>“</w:t>
+      </w:r>
+      <w:r>
+        <w:rPr>
+          <w:rFonts w:ascii="Times New Roman" w:hAnsi="Times New Roman" w:cs="Times New Roman" w:hint="eastAsia"/>
+        </w:rPr>
+        <w:t>overdue books</w:t>
+      </w:r>
+      <w:r>
+        <w:rPr>
+          <w:rFonts w:ascii="Times New Roman" w:hAnsi="Times New Roman" w:cs="Times New Roman"/>
+        </w:rPr>
+        <w:t>”</w:t>
+      </w:r>
+      <w:r>
+        <w:rPr>
+          <w:rFonts w:ascii="Times New Roman" w:hAnsi="Times New Roman" w:cs="Times New Roman" w:hint="eastAsia"/>
+        </w:rPr>
+        <w:t xml:space="preserve"> so don</w:t>
+      </w:r>
+      <w:r>
+        <w:rPr>
+          <w:rFonts w:ascii="Times New Roman" w:hAnsi="Times New Roman" w:cs="Times New Roman"/>
+        </w:rPr>
+        <w:t>’</w:t>
+      </w:r>
+      <w:r>
+        <w:rPr>
+          <w:rFonts w:ascii="Times New Roman" w:hAnsi="Times New Roman" w:cs="Times New Roman" w:hint="eastAsia"/>
+        </w:rPr>
+        <w:t xml:space="preserve">t write </w:t>
+      </w:r>
+      <w:r>
+        <w:rPr>
+          <w:rFonts w:ascii="Times New Roman" w:hAnsi="Times New Roman" w:cs="Times New Roman"/>
+        </w:rPr>
+        <w:t>“</w:t>
+      </w:r>
+      <w:r>
+        <w:rPr>
+          <w:rFonts w:ascii="Times New Roman" w:hAnsi="Times New Roman" w:cs="Times New Roman" w:hint="eastAsia"/>
+        </w:rPr>
+        <w:t>overdue</w:t>
+      </w:r>
+      <w:r>
+        <w:rPr>
+          <w:rFonts w:ascii="Times New Roman" w:hAnsi="Times New Roman" w:cs="Times New Roman"/>
+        </w:rPr>
+        <w:t>”</w:t>
+      </w:r>
+      <w:r>
+        <w:rPr>
+          <w:rFonts w:ascii="Times New Roman" w:hAnsi="Times New Roman" w:cs="Times New Roman" w:hint="eastAsia"/>
+        </w:rPr>
+        <w:t xml:space="preserve"> only. </w:t>
       </w:r>
       <w:bookmarkStart w:id="1" w:name="_GoBack"/>
       <w:bookmarkEnd w:id="1"/>
-      <w:r>
-        <w:rPr>
-          <w:rFonts w:ascii="Times New Roman" w:hAnsi="Times New Roman" w:cs="Times New Roman"/>
-        </w:rPr>
-        <w:br/>
-      </w:r>
-      <w:r>
-        <w:rPr>
-          <w:rFonts w:ascii="Times New Roman" w:hAnsi="Times New Roman" w:cs="Times New Roman" w:hint="eastAsia"/>
-        </w:rPr>
-        <w:t xml:space="preserve">The previous sentence in the same cell is </w:t>
-      </w:r>
-      <w:r>
-        <w:rPr>
-          <w:rFonts w:ascii="Times New Roman" w:hAnsi="Times New Roman" w:cs="Times New Roman"/>
-        </w:rPr>
-        <w:t>“</w:t>
-      </w:r>
-      <w:r>
-        <w:rPr>
-          <w:rFonts w:ascii="Times New Roman" w:hAnsi="Times New Roman" w:cs="Times New Roman" w:hint="eastAsia"/>
-        </w:rPr>
-        <w:t>information about pay</w:t>
-      </w:r>
-      <w:r>
-        <w:rPr>
-          <w:rFonts w:ascii="Times New Roman" w:hAnsi="Times New Roman" w:cs="Times New Roman"/>
-        </w:rPr>
-        <w:t>”</w:t>
-      </w:r>
-      <w:r>
-        <w:rPr>
-          <w:rFonts w:ascii="Times New Roman" w:hAnsi="Times New Roman" w:cs="Times New Roman" w:hint="eastAsia"/>
-        </w:rPr>
-        <w:t xml:space="preserve"> so the answer is </w:t>
-      </w:r>
-      <w:r>
-        <w:rPr>
-          <w:rFonts w:ascii="Times New Roman" w:hAnsi="Times New Roman" w:cs="Times New Roman"/>
-        </w:rPr>
-        <w:t>“</w:t>
-      </w:r>
-      <w:r>
-        <w:rPr>
-          <w:rFonts w:ascii="Times New Roman" w:hAnsi="Times New Roman" w:cs="Times New Roman" w:hint="eastAsia"/>
-        </w:rPr>
-        <w:t>tax</w:t>
-      </w:r>
-      <w:r>
-        <w:rPr>
-          <w:rFonts w:ascii="Times New Roman" w:hAnsi="Times New Roman" w:cs="Times New Roman"/>
-        </w:rPr>
-        <w:t>”</w:t>
-      </w:r>
-      <w:r>
-        <w:rPr>
-          <w:rFonts w:ascii="Times New Roman" w:hAnsi="Times New Roman" w:cs="Times New Roman" w:hint="eastAsia"/>
-        </w:rPr>
-        <w:t xml:space="preserve"> form.</w:t>
-      </w:r>
-    </w:p>
-    <w:p>
-      <w:pPr>
-        <w:rPr>
-          <w:rFonts w:ascii="Times New Roman" w:hAnsi="Times New Roman" w:cs="Times New Roman"/>
-        </w:rPr>
-      </w:pPr>
-      <w:r>
-        <w:rPr>
-          <w:rFonts w:ascii="Times New Roman" w:hAnsi="Times New Roman" w:cs="Times New Roman" w:hint="eastAsia"/>
-        </w:rPr>
-        <w:t>17. the lecture room  (x)  lecture room 311</w:t>
-      </w:r>
-      <w:r>
-        <w:rPr>
-          <w:rFonts w:ascii="Times New Roman" w:hAnsi="Times New Roman" w:cs="Times New Roman"/>
-        </w:rPr>
-        <w:br/>
-      </w:r>
-      <w:r>
-        <w:rPr>
-          <w:rFonts w:ascii="Times New Roman" w:hAnsi="Times New Roman" w:cs="Times New Roman" w:hint="eastAsia"/>
-        </w:rPr>
-        <w:t>Don</w:t>
-      </w:r>
-      <w:r>
-        <w:rPr>
-          <w:rFonts w:ascii="Times New Roman" w:hAnsi="Times New Roman" w:cs="Times New Roman"/>
-        </w:rPr>
-        <w:t>’</w:t>
-      </w:r>
-      <w:r>
-        <w:rPr>
-          <w:rFonts w:ascii="Times New Roman" w:hAnsi="Times New Roman" w:cs="Times New Roman" w:hint="eastAsia"/>
-        </w:rPr>
-        <w:t>t forget the number of the room.</w:t>
+    </w:p>
+    <w:p>
+      <w:pPr>
+        <w:rPr>
+          <w:rFonts w:ascii="Times New Roman" w:hAnsi="Times New Roman" w:cs="Times New Roman"/>
+        </w:rPr>
+      </w:pPr>
+      <w:r>
+        <w:rPr>
+          <w:rFonts w:ascii="Times New Roman" w:hAnsi="Times New Roman" w:cs="Times New Roman" w:hint="eastAsia"/>
+        </w:rPr>
+        <w:t>27. one month  (x)  7 working days</w:t>
       </w:r>
     </w:p>
     <w:sectPr>
@@ -8653,7 +8902,7 @@
   <a:extraClrSchemeLst/>
   <a:extLst>
     <a:ext uri="{05A4C25C-085E-4340-85A3-A5531E510DB2}">
-      <thm15:themeFamily xmlns:thm15="http://schemas.microsoft.com/office/thememl/2012/main" xmlns="" name="Office Theme" id="{62F939B6-93AF-4DB8-9C6B-D6C7DFDC589F}" vid="{4A3C46E8-61CC-4603-A589-7422A47A8E4A}"/>
+      <thm15:themeFamily xmlns="" xmlns:thm15="http://schemas.microsoft.com/office/thememl/2012/main" name="Office Theme" id="{62F939B6-93AF-4DB8-9C6B-D6C7DFDC589F}" vid="{4A3C46E8-61CC-4603-A589-7422A47A8E4A}"/>
     </a:ext>
   </a:extLst>
 </a:theme>

</xml_diff>

<commit_message>
udpate notes of IELTS
</commit_message>
<xml_diff>
--- a/IELTS Notes/Listening Test And Analyses..docx
+++ b/IELTS Notes/Listening Test And Analyses..docx
@@ -7925,77 +7925,268 @@
         </w:rPr>
         <w:t xml:space="preserve"> in this answer.</w:t>
       </w:r>
+    </w:p>
+    <w:p>
+      <w:pPr>
+        <w:rPr>
+          <w:rFonts w:ascii="Times New Roman" w:hAnsi="Times New Roman" w:cs="Times New Roman"/>
+        </w:rPr>
+      </w:pPr>
+      <w:r>
+        <w:rPr>
+          <w:rFonts w:ascii="Times New Roman" w:hAnsi="Times New Roman" w:cs="Times New Roman" w:hint="eastAsia"/>
+        </w:rPr>
+        <w:t>22. teaching  (x)  textbooks</w:t>
+      </w:r>
+    </w:p>
+    <w:p>
+      <w:pPr>
+        <w:rPr>
+          <w:rFonts w:ascii="Times New Roman" w:hAnsi="Times New Roman" w:cs="Times New Roman"/>
+        </w:rPr>
+      </w:pPr>
+      <w:r>
+        <w:rPr>
+          <w:rFonts w:ascii="Times New Roman" w:hAnsi="Times New Roman" w:cs="Times New Roman" w:hint="eastAsia"/>
+        </w:rPr>
+        <w:t>23. ____  (x) secondary</w:t>
+      </w:r>
+    </w:p>
+    <w:p>
+      <w:pPr>
+        <w:rPr>
+          <w:rFonts w:ascii="Times New Roman" w:hAnsi="Times New Roman" w:cs="Times New Roman"/>
+        </w:rPr>
+      </w:pPr>
+      <w:r>
+        <w:rPr>
+          <w:rFonts w:ascii="Times New Roman" w:hAnsi="Times New Roman" w:cs="Times New Roman" w:hint="eastAsia"/>
+        </w:rPr>
+        <w:t>25. ____  (x) back</w:t>
+      </w:r>
+    </w:p>
+    <w:p>
+      <w:pPr>
+        <w:rPr>
+          <w:rFonts w:ascii="Times New Roman" w:hAnsi="Times New Roman" w:cs="Times New Roman"/>
+        </w:rPr>
+      </w:pPr>
+      <w:r>
+        <w:rPr>
+          <w:rFonts w:ascii="Times New Roman" w:hAnsi="Times New Roman" w:cs="Times New Roman" w:hint="eastAsia"/>
+        </w:rPr>
+        <w:t>26. none (x)  overdue</w:t>
+      </w:r>
+      <w:r>
+        <w:rPr>
+          <w:rFonts w:ascii="Times New Roman" w:hAnsi="Times New Roman" w:cs="Times New Roman" w:hint="eastAsia"/>
+        </w:rPr>
+        <w:t xml:space="preserve"> books. </w:t>
+      </w:r>
+      <w:r>
+        <w:rPr>
+          <w:rFonts w:ascii="Times New Roman" w:hAnsi="Times New Roman" w:cs="Times New Roman"/>
+        </w:rPr>
+        <w:br/>
+      </w:r>
+      <w:r>
+        <w:rPr>
+          <w:rFonts w:ascii="Times New Roman" w:hAnsi="Times New Roman" w:cs="Times New Roman" w:hint="eastAsia"/>
+        </w:rPr>
+        <w:t>I didn</w:t>
+      </w:r>
+      <w:r>
+        <w:rPr>
+          <w:rFonts w:ascii="Times New Roman" w:hAnsi="Times New Roman" w:cs="Times New Roman"/>
+        </w:rPr>
+        <w:t>’</w:t>
+      </w:r>
+      <w:r>
+        <w:rPr>
+          <w:rFonts w:ascii="Times New Roman" w:hAnsi="Times New Roman" w:cs="Times New Roman" w:hint="eastAsia"/>
+        </w:rPr>
+        <w:t xml:space="preserve">t know the word </w:t>
+      </w:r>
+      <w:r>
+        <w:rPr>
+          <w:rFonts w:ascii="Times New Roman" w:hAnsi="Times New Roman" w:cs="Times New Roman"/>
+        </w:rPr>
+        <w:t>“</w:t>
+      </w:r>
+      <w:r>
+        <w:rPr>
+          <w:rFonts w:ascii="Times New Roman" w:hAnsi="Times New Roman" w:cs="Times New Roman" w:hint="eastAsia"/>
+        </w:rPr>
+        <w:t>overdue</w:t>
+      </w:r>
+      <w:r>
+        <w:rPr>
+          <w:rFonts w:ascii="Times New Roman" w:hAnsi="Times New Roman" w:cs="Times New Roman"/>
+        </w:rPr>
+        <w:t>”</w:t>
+      </w:r>
+      <w:r>
+        <w:rPr>
+          <w:rFonts w:ascii="Times New Roman" w:hAnsi="Times New Roman" w:cs="Times New Roman" w:hint="eastAsia"/>
+        </w:rPr>
+        <w:t xml:space="preserve"> so I couldn</w:t>
+      </w:r>
+      <w:r>
+        <w:rPr>
+          <w:rFonts w:ascii="Times New Roman" w:hAnsi="Times New Roman" w:cs="Times New Roman"/>
+        </w:rPr>
+        <w:t>’</w:t>
+      </w:r>
+      <w:r>
+        <w:rPr>
+          <w:rFonts w:ascii="Times New Roman" w:hAnsi="Times New Roman" w:cs="Times New Roman" w:hint="eastAsia"/>
+        </w:rPr>
+        <w:t xml:space="preserve">t write it even if I heard it. </w:t>
+      </w:r>
+      <w:r>
+        <w:rPr>
+          <w:rFonts w:ascii="Times New Roman" w:hAnsi="Times New Roman" w:cs="Times New Roman" w:hint="eastAsia"/>
+        </w:rPr>
+        <w:t xml:space="preserve">The answer is </w:t>
+      </w:r>
+      <w:r>
+        <w:rPr>
+          <w:rFonts w:ascii="Times New Roman" w:hAnsi="Times New Roman" w:cs="Times New Roman"/>
+        </w:rPr>
+        <w:t>“</w:t>
+      </w:r>
+      <w:r>
+        <w:rPr>
+          <w:rFonts w:ascii="Times New Roman" w:hAnsi="Times New Roman" w:cs="Times New Roman" w:hint="eastAsia"/>
+        </w:rPr>
+        <w:t>overdue books</w:t>
+      </w:r>
+      <w:r>
+        <w:rPr>
+          <w:rFonts w:ascii="Times New Roman" w:hAnsi="Times New Roman" w:cs="Times New Roman"/>
+        </w:rPr>
+        <w:t>”</w:t>
+      </w:r>
+      <w:r>
+        <w:rPr>
+          <w:rFonts w:ascii="Times New Roman" w:hAnsi="Times New Roman" w:cs="Times New Roman" w:hint="eastAsia"/>
+        </w:rPr>
+        <w:t xml:space="preserve"> so don</w:t>
+      </w:r>
+      <w:r>
+        <w:rPr>
+          <w:rFonts w:ascii="Times New Roman" w:hAnsi="Times New Roman" w:cs="Times New Roman"/>
+        </w:rPr>
+        <w:t>’</w:t>
+      </w:r>
+      <w:r>
+        <w:rPr>
+          <w:rFonts w:ascii="Times New Roman" w:hAnsi="Times New Roman" w:cs="Times New Roman" w:hint="eastAsia"/>
+        </w:rPr>
+        <w:t xml:space="preserve">t write </w:t>
+      </w:r>
+      <w:r>
+        <w:rPr>
+          <w:rFonts w:ascii="Times New Roman" w:hAnsi="Times New Roman" w:cs="Times New Roman"/>
+        </w:rPr>
+        <w:t>“</w:t>
+      </w:r>
+      <w:r>
+        <w:rPr>
+          <w:rFonts w:ascii="Times New Roman" w:hAnsi="Times New Roman" w:cs="Times New Roman" w:hint="eastAsia"/>
+        </w:rPr>
+        <w:t>overdue</w:t>
+      </w:r>
+      <w:r>
+        <w:rPr>
+          <w:rFonts w:ascii="Times New Roman" w:hAnsi="Times New Roman" w:cs="Times New Roman"/>
+        </w:rPr>
+        <w:t>”</w:t>
+      </w:r>
+      <w:r>
+        <w:rPr>
+          <w:rFonts w:ascii="Times New Roman" w:hAnsi="Times New Roman" w:cs="Times New Roman" w:hint="eastAsia"/>
+        </w:rPr>
+        <w:t xml:space="preserve"> only. </w:t>
+      </w:r>
+    </w:p>
+    <w:p>
+      <w:pPr>
+        <w:rPr>
+          <w:rFonts w:ascii="Times New Roman" w:hAnsi="Times New Roman" w:cs="Times New Roman" w:hint="eastAsia"/>
+        </w:rPr>
+      </w:pPr>
+      <w:r>
+        <w:rPr>
+          <w:rFonts w:ascii="Times New Roman" w:hAnsi="Times New Roman" w:cs="Times New Roman" w:hint="eastAsia"/>
+        </w:rPr>
+        <w:t>27. one month  (x)  7 working days</w:t>
+      </w:r>
+    </w:p>
+    <w:p>
+      <w:pPr>
+        <w:rPr>
+          <w:rFonts w:ascii="Times New Roman" w:hAnsi="Times New Roman" w:cs="Times New Roman" w:hint="eastAsia"/>
+          <w:b/>
+          <w:bCs/>
+          <w:i/>
+          <w:iCs/>
+          <w:sz w:val="24"/>
+          <w:szCs w:val="24"/>
+        </w:rPr>
+      </w:pPr>
       <w:bookmarkStart w:id="1" w:name="_GoBack"/>
-      <w:bookmarkEnd w:id="1"/>
-    </w:p>
-    <w:p>
-      <w:pPr>
-        <w:rPr>
-          <w:rFonts w:ascii="Times New Roman" w:hAnsi="Times New Roman" w:cs="Times New Roman"/>
-        </w:rPr>
-      </w:pPr>
-      <w:r>
-        <w:rPr>
-          <w:rFonts w:ascii="Times New Roman" w:hAnsi="Times New Roman" w:cs="Times New Roman" w:hint="eastAsia"/>
-        </w:rPr>
-        <w:t>22. teaching  (x)  textbooks</w:t>
-      </w:r>
-    </w:p>
-    <w:p>
-      <w:pPr>
-        <w:rPr>
-          <w:rFonts w:ascii="Times New Roman" w:hAnsi="Times New Roman" w:cs="Times New Roman"/>
-        </w:rPr>
-      </w:pPr>
-      <w:r>
-        <w:rPr>
-          <w:rFonts w:ascii="Times New Roman" w:hAnsi="Times New Roman" w:cs="Times New Roman" w:hint="eastAsia"/>
-        </w:rPr>
-        <w:t>23. ____  (x) secondary</w:t>
-      </w:r>
-    </w:p>
-    <w:p>
-      <w:pPr>
-        <w:rPr>
-          <w:rFonts w:ascii="Times New Roman" w:hAnsi="Times New Roman" w:cs="Times New Roman"/>
-        </w:rPr>
-      </w:pPr>
-      <w:r>
-        <w:rPr>
-          <w:rFonts w:ascii="Times New Roman" w:hAnsi="Times New Roman" w:cs="Times New Roman" w:hint="eastAsia"/>
-        </w:rPr>
-        <w:t>25. ____  (x) back</w:t>
-      </w:r>
-    </w:p>
-    <w:p>
-      <w:pPr>
-        <w:rPr>
-          <w:rFonts w:ascii="Times New Roman" w:hAnsi="Times New Roman" w:cs="Times New Roman"/>
-        </w:rPr>
-      </w:pPr>
-      <w:r>
-        <w:rPr>
-          <w:rFonts w:ascii="Times New Roman" w:hAnsi="Times New Roman" w:cs="Times New Roman" w:hint="eastAsia"/>
-        </w:rPr>
-        <w:t>26. none (x)  overdue</w:t>
-      </w:r>
-      <w:r>
-        <w:rPr>
-          <w:rFonts w:ascii="Times New Roman" w:hAnsi="Times New Roman" w:cs="Times New Roman" w:hint="eastAsia"/>
-        </w:rPr>
-        <w:t xml:space="preserve"> books. </w:t>
+      <w:r>
+        <w:rPr>
+          <w:rFonts w:ascii="Times New Roman" w:hAnsi="Times New Roman" w:cs="Times New Roman" w:hint="eastAsia"/>
+          <w:b/>
+          <w:bCs/>
+          <w:i/>
+          <w:iCs/>
+          <w:sz w:val="24"/>
+          <w:szCs w:val="24"/>
+        </w:rPr>
+        <w:t xml:space="preserve">Section 4 </w:t>
+      </w:r>
+    </w:p>
+    <w:bookmarkEnd w:id="1"/>
+    <w:p>
+      <w:pPr>
+        <w:rPr>
+          <w:rFonts w:ascii="Times New Roman" w:hAnsi="Times New Roman" w:cs="Times New Roman" w:hint="eastAsia"/>
+        </w:rPr>
+      </w:pPr>
+      <w:r>
+        <w:rPr>
+          <w:rFonts w:ascii="Times New Roman" w:hAnsi="Times New Roman" w:cs="Times New Roman" w:hint="eastAsia"/>
+        </w:rPr>
+        <w:t>33. C  (x)  B</w:t>
+      </w:r>
+    </w:p>
+    <w:p>
+      <w:pPr>
+        <w:rPr>
+          <w:rFonts w:ascii="Times New Roman" w:hAnsi="Times New Roman" w:cs="Times New Roman" w:hint="eastAsia"/>
+        </w:rPr>
+      </w:pPr>
+      <w:r>
+        <w:rPr>
+          <w:rFonts w:ascii="Times New Roman" w:hAnsi="Times New Roman" w:cs="Times New Roman" w:hint="eastAsia"/>
+        </w:rPr>
+        <w:t>34. A  (x)  C</w:t>
       </w:r>
       <w:r>
         <w:rPr>
           <w:rFonts w:ascii="Times New Roman" w:hAnsi="Times New Roman" w:cs="Times New Roman"/>
         </w:rPr>
         <w:br/>
-      </w:r>
-      <w:r>
-        <w:rPr>
-          <w:rFonts w:ascii="Times New Roman" w:hAnsi="Times New Roman" w:cs="Times New Roman" w:hint="eastAsia"/>
-        </w:rPr>
-        <w:t>I didn</w:t>
+        <w:t>“</w:t>
+      </w:r>
+      <w:r>
+        <w:rPr>
+          <w:rFonts w:ascii="Times New Roman" w:hAnsi="Times New Roman" w:cs="Times New Roman" w:hint="eastAsia"/>
+        </w:rPr>
+        <w:t>The Asiatic lion</w:t>
       </w:r>
       <w:r>
         <w:rPr>
@@ -8007,7 +8198,31 @@
         <w:rPr>
           <w:rFonts w:ascii="Times New Roman" w:hAnsi="Times New Roman" w:cs="Times New Roman" w:hint="eastAsia"/>
         </w:rPr>
-        <w:t xml:space="preserve">t know the word </w:t>
+        <w:t>s mane is noticeably shorter than the African lion</w:t>
+      </w:r>
+      <w:r>
+        <w:rPr>
+          <w:rFonts w:ascii="Times New Roman" w:hAnsi="Times New Roman" w:cs="Times New Roman"/>
+        </w:rPr>
+        <w:t>’</w:t>
+      </w:r>
+      <w:r>
+        <w:rPr>
+          <w:rFonts w:ascii="Times New Roman" w:hAnsi="Times New Roman" w:cs="Times New Roman" w:hint="eastAsia"/>
+        </w:rPr>
+        <w:t>s.</w:t>
+      </w:r>
+      <w:r>
+        <w:rPr>
+          <w:rFonts w:ascii="Times New Roman" w:hAnsi="Times New Roman" w:cs="Times New Roman"/>
+        </w:rPr>
+        <w:t>”</w:t>
+      </w:r>
+      <w:r>
+        <w:rPr>
+          <w:rFonts w:ascii="Times New Roman" w:hAnsi="Times New Roman" w:cs="Times New Roman" w:hint="eastAsia"/>
+        </w:rPr>
+        <w:br/>
       </w:r>
       <w:r>
         <w:rPr>
@@ -8019,7 +8234,7 @@
         <w:rPr>
           <w:rFonts w:ascii="Times New Roman" w:hAnsi="Times New Roman" w:cs="Times New Roman" w:hint="eastAsia"/>
         </w:rPr>
-        <w:t>overdue</w:t>
+        <w:t>Asiatic lions also have a long fold of skin on their undersides</w:t>
       </w:r>
       <w:r>
         <w:rPr>
@@ -8031,7 +8246,56 @@
         <w:rPr>
           <w:rFonts w:ascii="Times New Roman" w:hAnsi="Times New Roman" w:cs="Times New Roman" w:hint="eastAsia"/>
         </w:rPr>
-        <w:t xml:space="preserve"> so I couldn</w:t>
+        <w:t xml:space="preserve">. Note that the </w:t>
+      </w:r>
+      <w:r>
+        <w:rPr>
+          <w:rFonts w:ascii="Times New Roman" w:hAnsi="Times New Roman" w:cs="Times New Roman"/>
+        </w:rPr>
+        <w:t>“</w:t>
+      </w:r>
+      <w:r>
+        <w:rPr>
+          <w:rFonts w:ascii="Times New Roman" w:hAnsi="Times New Roman" w:cs="Times New Roman" w:hint="eastAsia"/>
+        </w:rPr>
+        <w:t>udersides</w:t>
+      </w:r>
+      <w:r>
+        <w:rPr>
+          <w:rFonts w:ascii="Times New Roman" w:hAnsi="Times New Roman" w:cs="Times New Roman"/>
+        </w:rPr>
+        <w:t>”</w:t>
+      </w:r>
+      <w:r>
+        <w:rPr>
+          <w:rFonts w:ascii="Times New Roman" w:hAnsi="Times New Roman" w:cs="Times New Roman" w:hint="eastAsia"/>
+        </w:rPr>
+        <w:t xml:space="preserve"> of a lion is stomach.</w:t>
+      </w:r>
+    </w:p>
+    <w:p>
+      <w:pPr>
+        <w:rPr>
+          <w:rFonts w:ascii="Times New Roman" w:hAnsi="Times New Roman" w:cs="Times New Roman" w:hint="eastAsia"/>
+        </w:rPr>
+      </w:pPr>
+      <w:r>
+        <w:rPr>
+          <w:rFonts w:ascii="Times New Roman" w:hAnsi="Times New Roman" w:cs="Times New Roman" w:hint="eastAsia"/>
+        </w:rPr>
+        <w:t>35. ____ (x) 1450</w:t>
+      </w:r>
+      <w:r>
+        <w:rPr>
+          <w:rFonts w:ascii="Times New Roman" w:hAnsi="Times New Roman" w:cs="Times New Roman"/>
+        </w:rPr>
+        <w:br/>
+      </w:r>
+      <w:r>
+        <w:rPr>
+          <w:rFonts w:ascii="Times New Roman" w:hAnsi="Times New Roman" w:cs="Times New Roman" w:hint="eastAsia"/>
+        </w:rPr>
+        <w:t>I couldn</w:t>
       </w:r>
       <w:r>
         <w:rPr>
@@ -8043,13 +8307,59 @@
         <w:rPr>
           <w:rFonts w:ascii="Times New Roman" w:hAnsi="Times New Roman" w:cs="Times New Roman" w:hint="eastAsia"/>
         </w:rPr>
-        <w:t xml:space="preserve">t write it even if I heard it. </w:t>
-      </w:r>
-      <w:r>
-        <w:rPr>
-          <w:rFonts w:ascii="Times New Roman" w:hAnsi="Times New Roman" w:cs="Times New Roman" w:hint="eastAsia"/>
-        </w:rPr>
-        <w:t xml:space="preserve">The answer is </w:t>
+        <w:t>t hear the number at the time.</w:t>
+      </w:r>
+    </w:p>
+    <w:p>
+      <w:pPr>
+        <w:rPr>
+          <w:rFonts w:ascii="Times New Roman" w:hAnsi="Times New Roman" w:cs="Times New Roman" w:hint="eastAsia"/>
+        </w:rPr>
+      </w:pPr>
+      <w:r>
+        <w:rPr>
+          <w:rFonts w:ascii="Times New Roman" w:hAnsi="Times New Roman" w:cs="Times New Roman" w:hint="eastAsia"/>
+        </w:rPr>
+        <w:t>37. ____ (x) prince</w:t>
+      </w:r>
+    </w:p>
+    <w:p>
+      <w:pPr>
+        <w:rPr>
+          <w:rFonts w:ascii="Times New Roman" w:hAnsi="Times New Roman" w:cs="Times New Roman" w:hint="eastAsia"/>
+        </w:rPr>
+      </w:pPr>
+      <w:r>
+        <w:rPr>
+          <w:rFonts w:ascii="Times New Roman" w:hAnsi="Times New Roman" w:cs="Times New Roman" w:hint="eastAsia"/>
+        </w:rPr>
+        <w:t>38. feed (x) diet</w:t>
+      </w:r>
+    </w:p>
+    <w:p>
+      <w:pPr>
+        <w:rPr>
+          <w:rFonts w:ascii="Times New Roman" w:hAnsi="Times New Roman" w:cs="Times New Roman" w:hint="eastAsia"/>
+        </w:rPr>
+      </w:pPr>
+      <w:r>
+        <w:rPr>
+          <w:rFonts w:ascii="Times New Roman" w:hAnsi="Times New Roman" w:cs="Times New Roman" w:hint="eastAsia"/>
+        </w:rPr>
+        <w:lastRenderedPageBreak/>
+        <w:t>First of all, I didn</w:t>
+      </w:r>
+      <w:r>
+        <w:rPr>
+          <w:rFonts w:ascii="Times New Roman" w:hAnsi="Times New Roman" w:cs="Times New Roman"/>
+        </w:rPr>
+        <w:t>’</w:t>
+      </w:r>
+      <w:r>
+        <w:rPr>
+          <w:rFonts w:ascii="Times New Roman" w:hAnsi="Times New Roman" w:cs="Times New Roman" w:hint="eastAsia"/>
+        </w:rPr>
+        <w:t xml:space="preserve">t hear the answer and just guessed it. Secondly, </w:t>
       </w:r>
       <w:r>
         <w:rPr>
@@ -8061,7 +8371,7 @@
         <w:rPr>
           <w:rFonts w:ascii="Times New Roman" w:hAnsi="Times New Roman" w:cs="Times New Roman" w:hint="eastAsia"/>
         </w:rPr>
-        <w:t>overdue books</w:t>
+        <w:t>feed</w:t>
       </w:r>
       <w:r>
         <w:rPr>
@@ -8073,56 +8383,26 @@
         <w:rPr>
           <w:rFonts w:ascii="Times New Roman" w:hAnsi="Times New Roman" w:cs="Times New Roman" w:hint="eastAsia"/>
         </w:rPr>
-        <w:t xml:space="preserve"> so don</w:t>
-      </w:r>
-      <w:r>
-        <w:rPr>
-          <w:rFonts w:ascii="Times New Roman" w:hAnsi="Times New Roman" w:cs="Times New Roman"/>
-        </w:rPr>
-        <w:t>’</w:t>
-      </w:r>
-      <w:r>
-        <w:rPr>
-          <w:rFonts w:ascii="Times New Roman" w:hAnsi="Times New Roman" w:cs="Times New Roman" w:hint="eastAsia"/>
-        </w:rPr>
-        <w:t xml:space="preserve">t write </w:t>
-      </w:r>
-      <w:r>
-        <w:rPr>
-          <w:rFonts w:ascii="Times New Roman" w:hAnsi="Times New Roman" w:cs="Times New Roman"/>
-        </w:rPr>
-        <w:t>“</w:t>
-      </w:r>
-      <w:r>
-        <w:rPr>
-          <w:rFonts w:ascii="Times New Roman" w:hAnsi="Times New Roman" w:cs="Times New Roman" w:hint="eastAsia"/>
-        </w:rPr>
-        <w:t>overdue</w:t>
-      </w:r>
-      <w:r>
-        <w:rPr>
-          <w:rFonts w:ascii="Times New Roman" w:hAnsi="Times New Roman" w:cs="Times New Roman"/>
-        </w:rPr>
-        <w:t>”</w:t>
-      </w:r>
-      <w:r>
-        <w:rPr>
-          <w:rFonts w:ascii="Times New Roman" w:hAnsi="Times New Roman" w:cs="Times New Roman" w:hint="eastAsia"/>
-        </w:rPr>
-        <w:t xml:space="preserve"> only. </w:t>
-      </w:r>
-    </w:p>
-    <w:p>
-      <w:pPr>
-        <w:rPr>
-          <w:rFonts w:ascii="Times New Roman" w:hAnsi="Times New Roman" w:cs="Times New Roman"/>
-        </w:rPr>
-      </w:pPr>
-      <w:r>
-        <w:rPr>
-          <w:rFonts w:ascii="Times New Roman" w:hAnsi="Times New Roman" w:cs="Times New Roman" w:hint="eastAsia"/>
-        </w:rPr>
-        <w:t>27. one month  (x)  7 working days</w:t>
+        <w:t xml:space="preserve"> is not grammatically correct in the sentence. </w:t>
+      </w:r>
+    </w:p>
+    <w:p>
+      <w:pPr>
+        <w:rPr>
+          <w:rFonts w:ascii="Times New Roman" w:hAnsi="Times New Roman" w:cs="Times New Roman"/>
+        </w:rPr>
+      </w:pPr>
+      <w:r>
+        <w:rPr>
+          <w:rFonts w:ascii="Times New Roman" w:hAnsi="Times New Roman" w:cs="Times New Roman" w:hint="eastAsia"/>
+        </w:rPr>
+        <w:t>39. ____ (x)</w:t>
+      </w:r>
+      <w:r>
+        <w:rPr>
+          <w:rFonts w:ascii="Times New Roman" w:hAnsi="Times New Roman" w:cs="Times New Roman" w:hint="eastAsia"/>
+        </w:rPr>
+        <w:t xml:space="preserve"> attack humans</w:t>
       </w:r>
     </w:p>
     <w:sectPr>
@@ -8938,7 +9218,7 @@
   <a:extraClrSchemeLst/>
   <a:extLst>
     <a:ext uri="{05A4C25C-085E-4340-85A3-A5531E510DB2}">
-      <thm15:themeFamily xmlns:thm15="http://schemas.microsoft.com/office/thememl/2012/main" xmlns="" name="Office Theme" id="{62F939B6-93AF-4DB8-9C6B-D6C7DFDC589F}" vid="{4A3C46E8-61CC-4603-A589-7422A47A8E4A}"/>
+      <thm15:themeFamily xmlns="" xmlns:thm15="http://schemas.microsoft.com/office/thememl/2012/main" name="Office Theme" id="{62F939B6-93AF-4DB8-9C6B-D6C7DFDC589F}" vid="{4A3C46E8-61CC-4603-A589-7422A47A8E4A}"/>
     </a:ext>
   </a:extLst>
 </a:theme>

</xml_diff>

<commit_message>
add the journal of 8 April 2025
</commit_message>
<xml_diff>
--- a/IELTS Notes/Listening Test And Analyses..docx
+++ b/IELTS Notes/Listening Test And Analyses..docx
@@ -7304,7 +7304,19 @@
         <w:rPr>
           <w:rFonts w:ascii="Times New Roman" w:hAnsi="Times New Roman" w:cs="Times New Roman" w:hint="eastAsia"/>
         </w:rPr>
-        <w:t xml:space="preserve">t be so arbitrary. A speaker said the discount </w:t>
+        <w:t xml:space="preserve">t be so arbitrary. </w:t>
+      </w:r>
+      <w:r>
+        <w:rPr>
+          <w:rFonts w:ascii="Times New Roman" w:hAnsi="Times New Roman" w:cs="Times New Roman" w:hint="eastAsia"/>
+        </w:rPr>
+        <w:t>The waiter in the reception</w:t>
+      </w:r>
+      <w:r>
+        <w:rPr>
+          <w:rFonts w:ascii="Times New Roman" w:hAnsi="Times New Roman" w:cs="Times New Roman" w:hint="eastAsia"/>
+        </w:rPr>
+        <w:t xml:space="preserve"> said the discount </w:t>
       </w:r>
       <w:r>
         <w:rPr>
@@ -7312,6 +7324,26 @@
         </w:rPr>
         <w:t>price later.</w:t>
       </w:r>
+      <w:r>
+        <w:rPr>
+          <w:rFonts w:ascii="Times New Roman" w:hAnsi="Times New Roman" w:cs="Times New Roman" w:hint="eastAsia"/>
+        </w:rPr>
+        <w:t xml:space="preserve"> Don</w:t>
+      </w:r>
+      <w:r>
+        <w:rPr>
+          <w:rFonts w:ascii="Times New Roman" w:hAnsi="Times New Roman" w:cs="Times New Roman"/>
+        </w:rPr>
+        <w:t>’</w:t>
+      </w:r>
+      <w:r>
+        <w:rPr>
+          <w:rFonts w:ascii="Times New Roman" w:hAnsi="Times New Roman" w:cs="Times New Roman" w:hint="eastAsia"/>
+        </w:rPr>
+        <w:t xml:space="preserve">t write your anser too early. </w:t>
+      </w:r>
+      <w:bookmarkStart w:id="1" w:name="_GoBack"/>
+      <w:bookmarkEnd w:id="1"/>
     </w:p>
     <w:p>
       <w:pPr>
@@ -7401,7 +7433,13 @@
         <w:rPr>
           <w:rFonts w:ascii="Times New Roman" w:hAnsi="Times New Roman" w:cs="Times New Roman" w:hint="eastAsia"/>
         </w:rPr>
-        <w:t>; that is grammatically correct in the question.</w:t>
+        <w:t>, which</w:t>
+      </w:r>
+      <w:r>
+        <w:rPr>
+          <w:rFonts w:ascii="Times New Roman" w:hAnsi="Times New Roman" w:cs="Times New Roman" w:hint="eastAsia"/>
+        </w:rPr>
+        <w:t xml:space="preserve"> is grammatically correct in the question.</w:t>
       </w:r>
     </w:p>
     <w:p>
@@ -7564,7 +7602,25 @@
         <w:rPr>
           <w:rFonts w:ascii="Times New Roman" w:hAnsi="Times New Roman" w:cs="Times New Roman" w:hint="eastAsia"/>
         </w:rPr>
-        <w:t xml:space="preserve"> that the speaker said. I thought it was </w:t>
+        <w:t xml:space="preserve"> that what</w:t>
+      </w:r>
+      <w:r>
+        <w:rPr>
+          <w:rFonts w:ascii="Times New Roman" w:hAnsi="Times New Roman" w:cs="Times New Roman" w:hint="eastAsia"/>
+        </w:rPr>
+        <w:t xml:space="preserve"> the </w:t>
+      </w:r>
+      <w:r>
+        <w:rPr>
+          <w:rFonts w:ascii="Times New Roman" w:hAnsi="Times New Roman" w:cs="Times New Roman" w:hint="eastAsia"/>
+        </w:rPr>
+        <w:t>waiter</w:t>
+      </w:r>
+      <w:r>
+        <w:rPr>
+          <w:rFonts w:ascii="Times New Roman" w:hAnsi="Times New Roman" w:cs="Times New Roman" w:hint="eastAsia"/>
+        </w:rPr>
+        <w:t xml:space="preserve"> said. I thought it was </w:t>
       </w:r>
       <w:r>
         <w:rPr>
@@ -7600,13 +7656,37 @@
         <w:rPr>
           <w:rFonts w:ascii="Times New Roman" w:hAnsi="Times New Roman" w:cs="Times New Roman" w:hint="eastAsia"/>
         </w:rPr>
-        <w:t xml:space="preserve"> which is not a natural way to speak number in any country</w:t>
-      </w:r>
-      <w:r>
-        <w:rPr>
-          <w:rFonts w:ascii="Times New Roman" w:hAnsi="Times New Roman" w:cs="Times New Roman" w:hint="eastAsia"/>
-        </w:rPr>
-        <w:t>. If it weren</w:t>
+        <w:t xml:space="preserve"> which is not a natural way to speak number </w:t>
+      </w:r>
+      <w:r>
+        <w:rPr>
+          <w:rFonts w:ascii="Times New Roman" w:hAnsi="Times New Roman" w:cs="Times New Roman" w:hint="eastAsia"/>
+        </w:rPr>
+        <w:t>anyway</w:t>
+      </w:r>
+      <w:r>
+        <w:rPr>
+          <w:rFonts w:ascii="Times New Roman" w:hAnsi="Times New Roman" w:cs="Times New Roman" w:hint="eastAsia"/>
+        </w:rPr>
+        <w:t xml:space="preserve">. </w:t>
+      </w:r>
+      <w:r>
+        <w:rPr>
+          <w:rFonts w:ascii="Times New Roman" w:hAnsi="Times New Roman" w:cs="Times New Roman" w:hint="eastAsia"/>
+        </w:rPr>
+        <w:t xml:space="preserve">It sounds awkard. </w:t>
+      </w:r>
+      <w:r>
+        <w:rPr>
+          <w:rFonts w:ascii="Times New Roman" w:hAnsi="Times New Roman" w:cs="Times New Roman" w:hint="eastAsia"/>
+        </w:rPr>
+        <w:t xml:space="preserve">If </w:t>
+      </w:r>
+      <w:r>
+        <w:rPr>
+          <w:rFonts w:ascii="Times New Roman" w:hAnsi="Times New Roman" w:cs="Times New Roman" w:hint="eastAsia"/>
+        </w:rPr>
+        <w:t>I didn</w:t>
       </w:r>
       <w:r>
         <w:rPr>
@@ -7618,7 +7698,13 @@
         <w:rPr>
           <w:rFonts w:ascii="Times New Roman" w:hAnsi="Times New Roman" w:cs="Times New Roman" w:hint="eastAsia"/>
         </w:rPr>
-        <w:t xml:space="preserve">t </w:t>
+        <w:t>t</w:t>
+      </w:r>
+      <w:r>
+        <w:rPr>
+          <w:rFonts w:ascii="Times New Roman" w:hAnsi="Times New Roman" w:cs="Times New Roman" w:hint="eastAsia"/>
+        </w:rPr>
+        <w:t xml:space="preserve"> </w:t>
       </w:r>
       <w:r>
         <w:rPr>
@@ -8113,7 +8199,7 @@
     <w:p>
       <w:pPr>
         <w:rPr>
-          <w:rFonts w:ascii="Times New Roman" w:hAnsi="Times New Roman" w:cs="Times New Roman" w:hint="eastAsia"/>
+          <w:rFonts w:ascii="Times New Roman" w:hAnsi="Times New Roman" w:cs="Times New Roman"/>
         </w:rPr>
       </w:pPr>
       <w:r>
@@ -8126,7 +8212,7 @@
     <w:p>
       <w:pPr>
         <w:rPr>
-          <w:rFonts w:ascii="Times New Roman" w:hAnsi="Times New Roman" w:cs="Times New Roman" w:hint="eastAsia"/>
+          <w:rFonts w:ascii="Times New Roman" w:hAnsi="Times New Roman" w:cs="Times New Roman"/>
           <w:b/>
           <w:bCs/>
           <w:i/>
@@ -8135,7 +8221,6 @@
           <w:szCs w:val="24"/>
         </w:rPr>
       </w:pPr>
-      <w:bookmarkStart w:id="1" w:name="_GoBack"/>
       <w:r>
         <w:rPr>
           <w:rFonts w:ascii="Times New Roman" w:hAnsi="Times New Roman" w:cs="Times New Roman" w:hint="eastAsia"/>
@@ -8149,11 +8234,10 @@
         <w:t xml:space="preserve">Section 4 </w:t>
       </w:r>
     </w:p>
-    <w:bookmarkEnd w:id="1"/>
-    <w:p>
-      <w:pPr>
-        <w:rPr>
-          <w:rFonts w:ascii="Times New Roman" w:hAnsi="Times New Roman" w:cs="Times New Roman" w:hint="eastAsia"/>
+    <w:p>
+      <w:pPr>
+        <w:rPr>
+          <w:rFonts w:ascii="Times New Roman" w:hAnsi="Times New Roman" w:cs="Times New Roman"/>
         </w:rPr>
       </w:pPr>
       <w:r>
@@ -8166,7 +8250,7 @@
     <w:p>
       <w:pPr>
         <w:rPr>
-          <w:rFonts w:ascii="Times New Roman" w:hAnsi="Times New Roman" w:cs="Times New Roman" w:hint="eastAsia"/>
+          <w:rFonts w:ascii="Times New Roman" w:hAnsi="Times New Roman" w:cs="Times New Roman"/>
         </w:rPr>
       </w:pPr>
       <w:r>
@@ -8276,7 +8360,7 @@
     <w:p>
       <w:pPr>
         <w:rPr>
-          <w:rFonts w:ascii="Times New Roman" w:hAnsi="Times New Roman" w:cs="Times New Roman" w:hint="eastAsia"/>
+          <w:rFonts w:ascii="Times New Roman" w:hAnsi="Times New Roman" w:cs="Times New Roman"/>
         </w:rPr>
       </w:pPr>
       <w:r>
@@ -8313,7 +8397,7 @@
     <w:p>
       <w:pPr>
         <w:rPr>
-          <w:rFonts w:ascii="Times New Roman" w:hAnsi="Times New Roman" w:cs="Times New Roman" w:hint="eastAsia"/>
+          <w:rFonts w:ascii="Times New Roman" w:hAnsi="Times New Roman" w:cs="Times New Roman"/>
         </w:rPr>
       </w:pPr>
       <w:r>
@@ -8326,7 +8410,7 @@
     <w:p>
       <w:pPr>
         <w:rPr>
-          <w:rFonts w:ascii="Times New Roman" w:hAnsi="Times New Roman" w:cs="Times New Roman" w:hint="eastAsia"/>
+          <w:rFonts w:ascii="Times New Roman" w:hAnsi="Times New Roman" w:cs="Times New Roman"/>
         </w:rPr>
       </w:pPr>
       <w:r>
@@ -8339,7 +8423,7 @@
     <w:p>
       <w:pPr>
         <w:rPr>
-          <w:rFonts w:ascii="Times New Roman" w:hAnsi="Times New Roman" w:cs="Times New Roman" w:hint="eastAsia"/>
+          <w:rFonts w:ascii="Times New Roman" w:hAnsi="Times New Roman" w:cs="Times New Roman"/>
         </w:rPr>
       </w:pPr>
       <w:r>
@@ -9218,7 +9302,7 @@
   <a:extraClrSchemeLst/>
   <a:extLst>
     <a:ext uri="{05A4C25C-085E-4340-85A3-A5531E510DB2}">
-      <thm15:themeFamily xmlns="" xmlns:thm15="http://schemas.microsoft.com/office/thememl/2012/main" name="Office Theme" id="{62F939B6-93AF-4DB8-9C6B-D6C7DFDC589F}" vid="{4A3C46E8-61CC-4603-A589-7422A47A8E4A}"/>
+      <thm15:themeFamily xmlns:thm15="http://schemas.microsoft.com/office/thememl/2012/main" xmlns="" name="Office Theme" id="{62F939B6-93AF-4DB8-9C6B-D6C7DFDC589F}" vid="{4A3C46E8-61CC-4603-A589-7422A47A8E4A}"/>
     </a:ext>
   </a:extLst>
 </a:theme>

</xml_diff>

<commit_message>
update notes of IELTS and others
</commit_message>
<xml_diff>
--- a/IELTS Notes/Listening Test And Analyses..docx
+++ b/IELTS Notes/Listening Test And Analyses..docx
@@ -23,8 +23,6 @@
         </w:rPr>
         <w:t xml:space="preserve">Cambridge </w:t>
       </w:r>
-      <w:bookmarkStart w:id="0" w:name="_GoBack"/>
-      <w:bookmarkEnd w:id="0"/>
       <w:r>
         <w:rPr>
           <w:rFonts w:ascii="Times New Roman" w:hAnsi="Times New Roman" w:cs="Times New Roman"/>
@@ -77,7 +75,27 @@
           <w:sz w:val="24"/>
           <w:szCs w:val="24"/>
         </w:rPr>
-        <w:t xml:space="preserve">Test 3 </w:t>
+        <w:t xml:space="preserve">Test </w:t>
+      </w:r>
+      <w:r>
+        <w:rPr>
+          <w:rFonts w:ascii="Times New Roman" w:hAnsi="Times New Roman" w:cs="Times New Roman" w:hint="eastAsia"/>
+          <w:b/>
+          <w:bCs/>
+          <w:sz w:val="24"/>
+          <w:szCs w:val="24"/>
+        </w:rPr>
+        <w:t>1</w:t>
+      </w:r>
+      <w:r>
+        <w:rPr>
+          <w:rFonts w:ascii="Times New Roman" w:hAnsi="Times New Roman" w:cs="Times New Roman"/>
+          <w:b/>
+          <w:bCs/>
+          <w:sz w:val="24"/>
+          <w:szCs w:val="24"/>
+        </w:rPr>
+        <w:t xml:space="preserve"> </w:t>
       </w:r>
       <w:r>
         <w:rPr>
@@ -110,172 +128,11 @@
           <w:sz w:val="24"/>
           <w:szCs w:val="24"/>
         </w:rPr>
-        <w:t>Section 4</w:t>
-      </w:r>
-    </w:p>
-    <w:p>
-      <w:pPr>
-        <w:rPr>
-          <w:rFonts w:ascii="Times New Roman" w:hAnsi="Times New Roman" w:cs="Times New Roman"/>
-        </w:rPr>
-      </w:pPr>
-      <w:r>
-        <w:rPr>
-          <w:rFonts w:ascii="Times New Roman" w:hAnsi="Times New Roman" w:cs="Times New Roman"/>
-        </w:rPr>
-        <w:t xml:space="preserve">32. </w:t>
-      </w:r>
-      <w:r>
-        <w:rPr>
-          <w:rFonts w:ascii="Times New Roman" w:hAnsi="Times New Roman" w:cs="Times New Roman"/>
-          <w:strike/>
-        </w:rPr>
-        <w:t>2000</w:t>
-      </w:r>
-      <w:r>
-        <w:rPr>
-          <w:rFonts w:ascii="Times New Roman" w:hAnsi="Times New Roman" w:cs="Times New Roman"/>
-        </w:rPr>
-        <w:t xml:space="preserve"> (approximately</w:t>
-      </w:r>
-      <w:r>
-        <w:rPr>
-          <w:rFonts w:ascii="Times New Roman" w:hAnsi="Times New Roman" w:cs="Times New Roman"/>
-        </w:rPr>
-        <w:t xml:space="preserve"> 2000</w:t>
-      </w:r>
-      <w:r>
-        <w:rPr>
-          <w:rFonts w:ascii="Times New Roman" w:hAnsi="Times New Roman" w:cs="Times New Roman"/>
-        </w:rPr>
-        <w:t>)</w:t>
-      </w:r>
-    </w:p>
-    <w:p>
-      <w:pPr>
-        <w:rPr>
-          <w:rFonts w:ascii="Times New Roman" w:hAnsi="Times New Roman" w:cs="Times New Roman"/>
-        </w:rPr>
-      </w:pPr>
-      <w:r>
-        <w:rPr>
-          <w:rFonts w:ascii="Times New Roman" w:hAnsi="Times New Roman" w:cs="Times New Roman"/>
-        </w:rPr>
-        <w:t xml:space="preserve">34. </w:t>
-      </w:r>
-      <w:r>
-        <w:rPr>
-          <w:rFonts w:ascii="Times New Roman" w:hAnsi="Times New Roman" w:cs="Times New Roman"/>
-          <w:strike/>
-        </w:rPr>
-        <w:t xml:space="preserve">hall of residents. </w:t>
-      </w:r>
-      <w:r>
-        <w:rPr>
-          <w:rFonts w:ascii="Times New Roman" w:hAnsi="Times New Roman" w:cs="Times New Roman"/>
-        </w:rPr>
-        <w:t xml:space="preserve"> halls of residence</w:t>
-      </w:r>
-      <w:r>
-        <w:rPr>
-          <w:rFonts w:ascii="Times New Roman" w:hAnsi="Times New Roman" w:cs="Times New Roman" w:hint="eastAsia"/>
-        </w:rPr>
-        <w:t>(BrE) = dormitory (AmE)</w:t>
-      </w:r>
-      <w:bookmarkStart w:id="1" w:name="_Hlk183599797"/>
-    </w:p>
-    <w:p>
-      <w:pPr>
-        <w:rPr>
-          <w:rFonts w:ascii="Times New Roman" w:hAnsi="Times New Roman" w:cs="Times New Roman"/>
-        </w:rPr>
-      </w:pPr>
-      <w:r>
-        <w:rPr>
-          <w:rFonts w:ascii="Times New Roman" w:hAnsi="Times New Roman" w:cs="Times New Roman" w:hint="eastAsia"/>
-        </w:rPr>
-        <w:t xml:space="preserve">hall/halls of residence: </w:t>
-      </w:r>
-      <w:r>
-        <w:rPr>
-          <w:rFonts w:ascii="Times New Roman" w:hAnsi="Times New Roman" w:cs="Times New Roman"/>
-        </w:rPr>
-        <w:br/>
-      </w:r>
-      <w:r>
-        <w:rPr>
-          <w:rFonts w:ascii="Times New Roman" w:hAnsi="Times New Roman" w:cs="Times New Roman" w:hint="eastAsia"/>
-        </w:rPr>
-        <w:t>a building for university or college students to live in.</w:t>
-      </w:r>
-      <w:r>
-        <w:rPr>
-          <w:rFonts w:ascii="Times New Roman" w:hAnsi="Times New Roman" w:cs="Times New Roman" w:hint="eastAsia"/>
-        </w:rPr>
-        <w:t xml:space="preserve"> (</w:t>
-      </w:r>
-      <w:r>
-        <w:rPr>
-          <w:rFonts w:ascii="Times New Roman" w:hAnsi="Times New Roman" w:cs="Times New Roman" w:hint="eastAsia"/>
-        </w:rPr>
-        <w:t>学生宿舍</w:t>
-      </w:r>
-      <w:r>
-        <w:rPr>
-          <w:rFonts w:ascii="Times New Roman" w:hAnsi="Times New Roman" w:cs="Times New Roman" w:hint="eastAsia"/>
-        </w:rPr>
-        <w:t>)</w:t>
-      </w:r>
-    </w:p>
-    <w:bookmarkEnd w:id="1"/>
-    <w:p>
-      <w:pPr>
-        <w:outlineLvl w:val="1"/>
-        <w:rPr>
-          <w:rFonts w:ascii="Times New Roman" w:hAnsi="Times New Roman" w:cs="Times New Roman"/>
-          <w:b/>
-          <w:bCs/>
-          <w:sz w:val="28"/>
-          <w:szCs w:val="28"/>
-        </w:rPr>
-      </w:pPr>
-      <w:r>
-        <w:rPr>
-          <w:rFonts w:ascii="Times New Roman" w:hAnsi="Times New Roman" w:cs="Times New Roman" w:hint="eastAsia"/>
-          <w:b/>
-          <w:bCs/>
-          <w:sz w:val="28"/>
-          <w:szCs w:val="28"/>
-        </w:rPr>
-        <w:t>Cambridge IETLS 5</w:t>
-      </w:r>
-    </w:p>
-    <w:p>
-      <w:pPr>
-        <w:outlineLvl w:val="2"/>
-        <w:rPr>
-          <w:rFonts w:ascii="Times New Roman" w:hAnsi="Times New Roman" w:cs="Times New Roman"/>
-          <w:b/>
-          <w:bCs/>
-          <w:sz w:val="24"/>
-          <w:szCs w:val="24"/>
-        </w:rPr>
-      </w:pPr>
-      <w:r>
-        <w:rPr>
-          <w:rFonts w:ascii="Times New Roman" w:hAnsi="Times New Roman" w:cs="Times New Roman" w:hint="eastAsia"/>
-          <w:b/>
-          <w:bCs/>
-          <w:sz w:val="24"/>
-          <w:szCs w:val="24"/>
-        </w:rPr>
-        <w:t>Test 1 Listening</w:t>
-      </w:r>
-    </w:p>
-    <w:p>
-      <w:pPr>
-        <w:rPr>
-          <w:rFonts w:ascii="Times New Roman" w:hAnsi="Times New Roman" w:cs="Times New Roman"/>
+        <w:t xml:space="preserve">Section </w:t>
+      </w:r>
+      <w:r>
+        <w:rPr>
+          <w:rFonts w:ascii="Times New Roman" w:hAnsi="Times New Roman" w:cs="Times New Roman" w:hint="eastAsia"/>
           <w:b/>
           <w:bCs/>
           <w:i/>
@@ -283,10 +140,185 @@
           <w:sz w:val="24"/>
           <w:szCs w:val="24"/>
         </w:rPr>
-      </w:pPr>
-      <w:r>
-        <w:rPr>
-          <w:rFonts w:ascii="Times New Roman" w:hAnsi="Times New Roman" w:cs="Times New Roman" w:hint="eastAsia"/>
+        <w:t>4</w:t>
+      </w:r>
+    </w:p>
+    <w:p>
+      <w:pPr>
+        <w:rPr>
+          <w:rFonts w:ascii="Times New Roman" w:hAnsi="Times New Roman" w:cs="Times New Roman" w:hint="eastAsia"/>
+        </w:rPr>
+      </w:pPr>
+      <w:r>
+        <w:rPr>
+          <w:rFonts w:ascii="Times New Roman" w:hAnsi="Times New Roman" w:cs="Times New Roman" w:hint="eastAsia"/>
+        </w:rPr>
+        <w:t>31. city (x)  cities</w:t>
+      </w:r>
+      <w:r>
+        <w:rPr>
+          <w:rFonts w:ascii="Times New Roman" w:hAnsi="Times New Roman" w:cs="Times New Roman"/>
+        </w:rPr>
+        <w:br/>
+      </w:r>
+      <w:r>
+        <w:rPr>
+          <w:rFonts w:ascii="Times New Roman" w:hAnsi="Times New Roman" w:cs="Times New Roman" w:hint="eastAsia"/>
+        </w:rPr>
+        <w:t xml:space="preserve">It is </w:t>
+      </w:r>
+      <w:r>
+        <w:rPr>
+          <w:rFonts w:ascii="Times New Roman" w:hAnsi="Times New Roman" w:cs="Times New Roman" w:hint="eastAsia"/>
+        </w:rPr>
+        <w:t xml:space="preserve">a </w:t>
+      </w:r>
+      <w:r>
+        <w:rPr>
+          <w:rFonts w:ascii="Times New Roman" w:hAnsi="Times New Roman" w:cs="Times New Roman" w:hint="eastAsia"/>
+        </w:rPr>
+        <w:t>plural</w:t>
+      </w:r>
+      <w:r>
+        <w:rPr>
+          <w:rFonts w:ascii="Times New Roman" w:hAnsi="Times New Roman" w:cs="Times New Roman" w:hint="eastAsia"/>
+        </w:rPr>
+        <w:t>.</w:t>
+      </w:r>
+    </w:p>
+    <w:p>
+      <w:pPr>
+        <w:rPr>
+          <w:rFonts w:ascii="Times New Roman" w:hAnsi="Times New Roman" w:cs="Times New Roman" w:hint="eastAsia"/>
+        </w:rPr>
+      </w:pPr>
+      <w:r>
+        <w:rPr>
+          <w:rFonts w:ascii="Times New Roman" w:hAnsi="Times New Roman" w:cs="Times New Roman" w:hint="eastAsia"/>
+        </w:rPr>
+        <w:t>38. filter and reduce  (x)  considerably reduce/filter</w:t>
+      </w:r>
+      <w:r>
+        <w:rPr>
+          <w:rFonts w:ascii="Times New Roman" w:hAnsi="Times New Roman" w:cs="Times New Roman"/>
+        </w:rPr>
+        <w:br/>
+      </w:r>
+      <w:r>
+        <w:rPr>
+          <w:rFonts w:ascii="Times New Roman" w:hAnsi="Times New Roman" w:cs="Times New Roman" w:hint="eastAsia"/>
+        </w:rPr>
+        <w:t xml:space="preserve">No more than three words are allowed. </w:t>
+      </w:r>
+      <w:r>
+        <w:rPr>
+          <w:rFonts w:ascii="Times New Roman" w:hAnsi="Times New Roman" w:cs="Times New Roman" w:hint="eastAsia"/>
+        </w:rPr>
+        <w:t xml:space="preserve">Either </w:t>
+      </w:r>
+      <w:r>
+        <w:rPr>
+          <w:rFonts w:ascii="Times New Roman" w:hAnsi="Times New Roman" w:cs="Times New Roman"/>
+        </w:rPr>
+        <w:t>‘</w:t>
+      </w:r>
+      <w:r>
+        <w:rPr>
+          <w:rFonts w:ascii="Times New Roman" w:hAnsi="Times New Roman" w:cs="Times New Roman" w:hint="eastAsia"/>
+        </w:rPr>
+        <w:t>filter</w:t>
+      </w:r>
+      <w:r>
+        <w:rPr>
+          <w:rFonts w:ascii="Times New Roman" w:hAnsi="Times New Roman" w:cs="Times New Roman"/>
+        </w:rPr>
+        <w:t>’</w:t>
+      </w:r>
+      <w:r>
+        <w:rPr>
+          <w:rFonts w:ascii="Times New Roman" w:hAnsi="Times New Roman" w:cs="Times New Roman" w:hint="eastAsia"/>
+        </w:rPr>
+        <w:t xml:space="preserve"> or </w:t>
+      </w:r>
+      <w:r>
+        <w:rPr>
+          <w:rFonts w:ascii="Times New Roman" w:hAnsi="Times New Roman" w:cs="Times New Roman"/>
+        </w:rPr>
+        <w:t>‘</w:t>
+      </w:r>
+      <w:r>
+        <w:rPr>
+          <w:rFonts w:ascii="Times New Roman" w:hAnsi="Times New Roman" w:cs="Times New Roman" w:hint="eastAsia"/>
+        </w:rPr>
+        <w:t>reduce</w:t>
+      </w:r>
+      <w:r>
+        <w:rPr>
+          <w:rFonts w:ascii="Times New Roman" w:hAnsi="Times New Roman" w:cs="Times New Roman"/>
+        </w:rPr>
+        <w:t>’</w:t>
+      </w:r>
+      <w:r>
+        <w:rPr>
+          <w:rFonts w:ascii="Times New Roman" w:hAnsi="Times New Roman" w:cs="Times New Roman" w:hint="eastAsia"/>
+        </w:rPr>
+        <w:t xml:space="preserve"> is correct and d</w:t>
+      </w:r>
+      <w:bookmarkStart w:id="0" w:name="_GoBack"/>
+      <w:bookmarkEnd w:id="0"/>
+      <w:r>
+        <w:rPr>
+          <w:rFonts w:ascii="Times New Roman" w:hAnsi="Times New Roman" w:cs="Times New Roman" w:hint="eastAsia"/>
+        </w:rPr>
+        <w:t>on</w:t>
+      </w:r>
+      <w:r>
+        <w:rPr>
+          <w:rFonts w:ascii="Times New Roman" w:hAnsi="Times New Roman" w:cs="Times New Roman"/>
+        </w:rPr>
+        <w:t>’</w:t>
+      </w:r>
+      <w:r>
+        <w:rPr>
+          <w:rFonts w:ascii="Times New Roman" w:hAnsi="Times New Roman" w:cs="Times New Roman" w:hint="eastAsia"/>
+        </w:rPr>
+        <w:t xml:space="preserve">t forget modifers. </w:t>
+      </w:r>
+    </w:p>
+    <w:p>
+      <w:pPr>
+        <w:outlineLvl w:val="2"/>
+        <w:rPr>
+          <w:rFonts w:ascii="Times New Roman" w:hAnsi="Times New Roman" w:cs="Times New Roman"/>
+          <w:b/>
+          <w:bCs/>
+          <w:sz w:val="24"/>
+          <w:szCs w:val="24"/>
+        </w:rPr>
+      </w:pPr>
+      <w:r>
+        <w:rPr>
+          <w:rFonts w:ascii="Times New Roman" w:hAnsi="Times New Roman" w:cs="Times New Roman"/>
+          <w:b/>
+          <w:bCs/>
+          <w:sz w:val="24"/>
+          <w:szCs w:val="24"/>
+        </w:rPr>
+        <w:t xml:space="preserve">Test 3 </w:t>
+      </w:r>
+      <w:r>
+        <w:rPr>
+          <w:rFonts w:ascii="Times New Roman" w:hAnsi="Times New Roman" w:cs="Times New Roman"/>
+          <w:b/>
+          <w:bCs/>
+        </w:rPr>
+        <w:t>Listening</w:t>
+      </w:r>
+    </w:p>
+    <w:p>
+      <w:pPr>
+        <w:rPr>
+          <w:rFonts w:ascii="Times New Roman" w:hAnsi="Times New Roman" w:cs="Times New Roman"/>
           <w:b/>
           <w:bCs/>
           <w:i/>
@@ -294,237 +326,8 @@
           <w:sz w:val="24"/>
           <w:szCs w:val="24"/>
         </w:rPr>
-        <w:t>Section 1</w:t>
-      </w:r>
-    </w:p>
-    <w:p>
-      <w:pPr>
-        <w:rPr>
-          <w:rFonts w:ascii="Times New Roman" w:hAnsi="Times New Roman" w:cs="Times New Roman"/>
-        </w:rPr>
-      </w:pPr>
-      <w:r>
-        <w:rPr>
-          <w:rFonts w:ascii="Times New Roman" w:hAnsi="Times New Roman" w:cs="Times New Roman" w:hint="eastAsia"/>
-        </w:rPr>
-        <w:t>1. mini bus (</w:t>
-      </w:r>
-      <w:r>
-        <w:rPr>
-          <w:rFonts w:ascii="Times New Roman" w:hAnsi="Times New Roman" w:cs="Times New Roman"/>
-        </w:rPr>
-        <w:t>×</w:t>
-      </w:r>
-      <w:r>
-        <w:rPr>
-          <w:rFonts w:ascii="Times New Roman" w:hAnsi="Times New Roman" w:cs="Times New Roman" w:hint="eastAsia"/>
-        </w:rPr>
-        <w:t xml:space="preserve">)  a minibus.  Note </w:t>
-      </w:r>
-      <w:r>
-        <w:rPr>
-          <w:rFonts w:ascii="Times New Roman" w:hAnsi="Times New Roman" w:cs="Times New Roman" w:hint="eastAsia"/>
-        </w:rPr>
-        <w:t xml:space="preserve">that </w:t>
-      </w:r>
-      <w:r>
-        <w:rPr>
-          <w:rFonts w:ascii="Times New Roman" w:hAnsi="Times New Roman" w:cs="Times New Roman"/>
-        </w:rPr>
-        <w:t>‘</w:t>
-      </w:r>
-      <w:r>
-        <w:rPr>
-          <w:rFonts w:ascii="Times New Roman" w:hAnsi="Times New Roman" w:cs="Times New Roman" w:hint="eastAsia"/>
-        </w:rPr>
-        <w:t>minibus</w:t>
-      </w:r>
-      <w:r>
-        <w:rPr>
-          <w:rFonts w:ascii="Times New Roman" w:hAnsi="Times New Roman" w:cs="Times New Roman"/>
-        </w:rPr>
-        <w:t>’</w:t>
-      </w:r>
-      <w:r>
-        <w:rPr>
-          <w:rFonts w:ascii="Times New Roman" w:hAnsi="Times New Roman" w:cs="Times New Roman" w:hint="eastAsia"/>
-        </w:rPr>
-        <w:t xml:space="preserve"> is a single word.</w:t>
-      </w:r>
-    </w:p>
-    <w:p>
-      <w:pPr>
-        <w:rPr>
-          <w:rFonts w:ascii="Times New Roman" w:hAnsi="Times New Roman" w:cs="Times New Roman"/>
-        </w:rPr>
-      </w:pPr>
-      <w:r>
-        <w:rPr>
-          <w:rFonts w:ascii="Times New Roman" w:hAnsi="Times New Roman" w:cs="Times New Roman" w:hint="eastAsia"/>
-        </w:rPr>
-        <w:t>5. BC (</w:t>
-      </w:r>
-      <w:r>
-        <w:rPr>
-          <w:rFonts w:ascii="Times New Roman" w:hAnsi="Times New Roman" w:cs="Times New Roman"/>
-        </w:rPr>
-        <w:t>×</w:t>
-      </w:r>
-      <w:r>
-        <w:rPr>
-          <w:rFonts w:ascii="Times New Roman" w:hAnsi="Times New Roman" w:cs="Times New Roman" w:hint="eastAsia"/>
-        </w:rPr>
-        <w:t xml:space="preserve">) </w:t>
-      </w:r>
-      <w:r>
-        <w:rPr>
-          <w:rFonts w:ascii="Times New Roman" w:hAnsi="Times New Roman" w:cs="Times New Roman" w:hint="eastAsia"/>
-        </w:rPr>
-        <w:t xml:space="preserve"> </w:t>
-      </w:r>
-      <w:r>
-        <w:rPr>
-          <w:rFonts w:ascii="Times New Roman" w:hAnsi="Times New Roman" w:cs="Times New Roman" w:hint="eastAsia"/>
-        </w:rPr>
-        <w:t xml:space="preserve"> </w:t>
-      </w:r>
-      <w:r>
-        <w:rPr>
-          <w:rFonts w:ascii="Times New Roman" w:hAnsi="Times New Roman" w:cs="Times New Roman" w:hint="eastAsia"/>
-        </w:rPr>
-        <w:t>BD</w:t>
-      </w:r>
-      <w:r>
-        <w:rPr>
-          <w:rFonts w:ascii="Times New Roman" w:hAnsi="Times New Roman" w:cs="Times New Roman" w:hint="eastAsia"/>
-        </w:rPr>
-        <w:t xml:space="preserve"> </w:t>
-      </w:r>
-    </w:p>
-    <w:p>
-      <w:pPr>
-        <w:rPr>
-          <w:rFonts w:ascii="Times New Roman" w:hAnsi="Times New Roman" w:cs="Times New Roman"/>
-        </w:rPr>
-      </w:pPr>
-      <w:r>
-        <w:rPr>
-          <w:rFonts w:ascii="Times New Roman" w:hAnsi="Times New Roman" w:cs="Times New Roman" w:hint="eastAsia"/>
-        </w:rPr>
-        <w:t>Don</w:t>
-      </w:r>
-      <w:r>
-        <w:rPr>
-          <w:rFonts w:ascii="Times New Roman" w:hAnsi="Times New Roman" w:cs="Times New Roman"/>
-        </w:rPr>
-        <w:t>’</w:t>
-      </w:r>
-      <w:r>
-        <w:rPr>
-          <w:rFonts w:ascii="Times New Roman" w:hAnsi="Times New Roman" w:cs="Times New Roman" w:hint="eastAsia"/>
-        </w:rPr>
-        <w:t>t write any word you hear</w:t>
-      </w:r>
-      <w:r>
-        <w:rPr>
-          <w:rFonts w:ascii="Times New Roman" w:hAnsi="Times New Roman" w:cs="Times New Roman" w:hint="eastAsia"/>
-        </w:rPr>
-        <w:t xml:space="preserve">, because all the options will apprear in the conversaion. What you should do is to choose the correct answer. </w:t>
-      </w:r>
-      <w:r>
-        <w:rPr>
-          <w:rFonts w:ascii="Times New Roman" w:hAnsi="Times New Roman" w:cs="Times New Roman" w:hint="eastAsia"/>
-        </w:rPr>
-        <w:t>For instance, this question need you to select two kind of service included in the price, which means they are free if you</w:t>
-      </w:r>
-      <w:r>
-        <w:rPr>
-          <w:rFonts w:ascii="Times New Roman" w:hAnsi="Times New Roman" w:cs="Times New Roman" w:hint="eastAsia"/>
-        </w:rPr>
-        <w:t xml:space="preserve"> have</w:t>
-      </w:r>
-      <w:r>
-        <w:rPr>
-          <w:rFonts w:ascii="Times New Roman" w:hAnsi="Times New Roman" w:cs="Times New Roman" w:hint="eastAsia"/>
-        </w:rPr>
-        <w:t xml:space="preserve"> pa</w:t>
-      </w:r>
-      <w:r>
-        <w:rPr>
-          <w:rFonts w:ascii="Times New Roman" w:hAnsi="Times New Roman" w:cs="Times New Roman" w:hint="eastAsia"/>
-        </w:rPr>
-        <w:t>id</w:t>
-      </w:r>
-      <w:r>
-        <w:rPr>
-          <w:rFonts w:ascii="Times New Roman" w:hAnsi="Times New Roman" w:cs="Times New Roman" w:hint="eastAsia"/>
-        </w:rPr>
-        <w:t xml:space="preserve"> the tour. Note that attending some of the course</w:t>
-      </w:r>
-      <w:r>
-        <w:rPr>
-          <w:rFonts w:ascii="Times New Roman" w:hAnsi="Times New Roman" w:cs="Times New Roman" w:hint="eastAsia"/>
-        </w:rPr>
-        <w:t xml:space="preserve"> you</w:t>
-      </w:r>
-      <w:r>
-        <w:rPr>
-          <w:rFonts w:ascii="Times New Roman" w:hAnsi="Times New Roman" w:cs="Times New Roman" w:hint="eastAsia"/>
-        </w:rPr>
-        <w:t xml:space="preserve"> should </w:t>
-      </w:r>
-      <w:r>
-        <w:rPr>
-          <w:rFonts w:ascii="Times New Roman" w:hAnsi="Times New Roman" w:cs="Times New Roman" w:hint="eastAsia"/>
-        </w:rPr>
-        <w:t xml:space="preserve">need to </w:t>
-      </w:r>
-      <w:r>
-        <w:rPr>
-          <w:rFonts w:ascii="Times New Roman" w:hAnsi="Times New Roman" w:cs="Times New Roman" w:hint="eastAsia"/>
-        </w:rPr>
-        <w:t xml:space="preserve">pay </w:t>
-      </w:r>
-      <w:r>
-        <w:rPr>
-          <w:rFonts w:ascii="Times New Roman" w:hAnsi="Times New Roman" w:cs="Times New Roman" w:hint="eastAsia"/>
-        </w:rPr>
-        <w:t>extra money.</w:t>
-      </w:r>
-    </w:p>
-    <w:p>
-      <w:pPr>
-        <w:rPr>
-          <w:rFonts w:ascii="Times New Roman" w:hAnsi="Times New Roman" w:cs="Times New Roman"/>
-        </w:rPr>
-      </w:pPr>
-      <w:r>
-        <w:rPr>
-          <w:rFonts w:ascii="Times New Roman" w:hAnsi="Times New Roman" w:cs="Times New Roman" w:hint="eastAsia"/>
-        </w:rPr>
-        <w:t>7. 290 (</w:t>
-      </w:r>
-      <w:r>
-        <w:rPr>
-          <w:rFonts w:ascii="Times New Roman" w:hAnsi="Times New Roman" w:cs="Times New Roman"/>
-        </w:rPr>
-        <w:t>×</w:t>
-      </w:r>
-      <w:r>
-        <w:rPr>
-          <w:rFonts w:ascii="Times New Roman" w:hAnsi="Times New Roman" w:cs="Times New Roman" w:hint="eastAsia"/>
-        </w:rPr>
-        <w:t>)  280</w:t>
-      </w:r>
-      <w:r>
-        <w:rPr>
-          <w:rFonts w:ascii="Times New Roman" w:hAnsi="Times New Roman" w:cs="Times New Roman" w:hint="eastAsia"/>
-        </w:rPr>
-        <w:t xml:space="preserve"> </w:t>
-      </w:r>
-    </w:p>
-    <w:p>
-      <w:pPr>
+      </w:pPr>
+      <w:r>
         <w:rPr>
           <w:rFonts w:ascii="Times New Roman" w:hAnsi="Times New Roman" w:cs="Times New Roman"/>
           <w:b/>
@@ -534,10 +337,172 @@
           <w:sz w:val="24"/>
           <w:szCs w:val="24"/>
         </w:rPr>
-      </w:pPr>
-      <w:r>
-        <w:rPr>
-          <w:rFonts w:ascii="Times New Roman" w:hAnsi="Times New Roman" w:cs="Times New Roman" w:hint="eastAsia"/>
+        <w:t>Section 4</w:t>
+      </w:r>
+    </w:p>
+    <w:p>
+      <w:pPr>
+        <w:rPr>
+          <w:rFonts w:ascii="Times New Roman" w:hAnsi="Times New Roman" w:cs="Times New Roman"/>
+        </w:rPr>
+      </w:pPr>
+      <w:r>
+        <w:rPr>
+          <w:rFonts w:ascii="Times New Roman" w:hAnsi="Times New Roman" w:cs="Times New Roman"/>
+        </w:rPr>
+        <w:t xml:space="preserve">32. </w:t>
+      </w:r>
+      <w:r>
+        <w:rPr>
+          <w:rFonts w:ascii="Times New Roman" w:hAnsi="Times New Roman" w:cs="Times New Roman"/>
+          <w:strike/>
+        </w:rPr>
+        <w:t>2000</w:t>
+      </w:r>
+      <w:r>
+        <w:rPr>
+          <w:rFonts w:ascii="Times New Roman" w:hAnsi="Times New Roman" w:cs="Times New Roman"/>
+        </w:rPr>
+        <w:t xml:space="preserve"> (approximately</w:t>
+      </w:r>
+      <w:r>
+        <w:rPr>
+          <w:rFonts w:ascii="Times New Roman" w:hAnsi="Times New Roman" w:cs="Times New Roman"/>
+        </w:rPr>
+        <w:t xml:space="preserve"> 2000</w:t>
+      </w:r>
+      <w:r>
+        <w:rPr>
+          <w:rFonts w:ascii="Times New Roman" w:hAnsi="Times New Roman" w:cs="Times New Roman"/>
+        </w:rPr>
+        <w:t>)</w:t>
+      </w:r>
+    </w:p>
+    <w:p>
+      <w:pPr>
+        <w:rPr>
+          <w:rFonts w:ascii="Times New Roman" w:hAnsi="Times New Roman" w:cs="Times New Roman"/>
+        </w:rPr>
+      </w:pPr>
+      <w:r>
+        <w:rPr>
+          <w:rFonts w:ascii="Times New Roman" w:hAnsi="Times New Roman" w:cs="Times New Roman"/>
+        </w:rPr>
+        <w:t xml:space="preserve">34. </w:t>
+      </w:r>
+      <w:r>
+        <w:rPr>
+          <w:rFonts w:ascii="Times New Roman" w:hAnsi="Times New Roman" w:cs="Times New Roman"/>
+          <w:strike/>
+        </w:rPr>
+        <w:t xml:space="preserve">hall of residents. </w:t>
+      </w:r>
+      <w:r>
+        <w:rPr>
+          <w:rFonts w:ascii="Times New Roman" w:hAnsi="Times New Roman" w:cs="Times New Roman"/>
+        </w:rPr>
+        <w:t xml:space="preserve"> halls of residence</w:t>
+      </w:r>
+      <w:r>
+        <w:rPr>
+          <w:rFonts w:ascii="Times New Roman" w:hAnsi="Times New Roman" w:cs="Times New Roman" w:hint="eastAsia"/>
+        </w:rPr>
+        <w:t>(BrE) = dormitory (AmE)</w:t>
+      </w:r>
+      <w:bookmarkStart w:id="1" w:name="_Hlk183599797"/>
+    </w:p>
+    <w:p>
+      <w:pPr>
+        <w:rPr>
+          <w:rFonts w:ascii="Times New Roman" w:hAnsi="Times New Roman" w:cs="Times New Roman"/>
+        </w:rPr>
+      </w:pPr>
+      <w:r>
+        <w:rPr>
+          <w:rFonts w:ascii="Times New Roman" w:hAnsi="Times New Roman" w:cs="Times New Roman" w:hint="eastAsia"/>
+        </w:rPr>
+        <w:t xml:space="preserve">hall/halls of residence: </w:t>
+      </w:r>
+      <w:r>
+        <w:rPr>
+          <w:rFonts w:ascii="Times New Roman" w:hAnsi="Times New Roman" w:cs="Times New Roman"/>
+        </w:rPr>
+        <w:br/>
+      </w:r>
+      <w:r>
+        <w:rPr>
+          <w:rFonts w:ascii="Times New Roman" w:hAnsi="Times New Roman" w:cs="Times New Roman" w:hint="eastAsia"/>
+        </w:rPr>
+        <w:t>a building for university or college students to live in.</w:t>
+      </w:r>
+      <w:r>
+        <w:rPr>
+          <w:rFonts w:ascii="Times New Roman" w:hAnsi="Times New Roman" w:cs="Times New Roman" w:hint="eastAsia"/>
+        </w:rPr>
+        <w:t xml:space="preserve"> (</w:t>
+      </w:r>
+      <w:r>
+        <w:rPr>
+          <w:rFonts w:ascii="Times New Roman" w:hAnsi="Times New Roman" w:cs="Times New Roman" w:hint="eastAsia"/>
+        </w:rPr>
+        <w:t>学生宿舍</w:t>
+      </w:r>
+      <w:r>
+        <w:rPr>
+          <w:rFonts w:ascii="Times New Roman" w:hAnsi="Times New Roman" w:cs="Times New Roman" w:hint="eastAsia"/>
+        </w:rPr>
+        <w:t>)</w:t>
+      </w:r>
+    </w:p>
+    <w:bookmarkEnd w:id="1"/>
+    <w:p>
+      <w:pPr>
+        <w:outlineLvl w:val="1"/>
+        <w:rPr>
+          <w:rFonts w:ascii="Times New Roman" w:hAnsi="Times New Roman" w:cs="Times New Roman"/>
+          <w:b/>
+          <w:bCs/>
+          <w:sz w:val="28"/>
+          <w:szCs w:val="28"/>
+        </w:rPr>
+      </w:pPr>
+      <w:r>
+        <w:rPr>
+          <w:rFonts w:ascii="Times New Roman" w:hAnsi="Times New Roman" w:cs="Times New Roman" w:hint="eastAsia"/>
+          <w:b/>
+          <w:bCs/>
+          <w:sz w:val="28"/>
+          <w:szCs w:val="28"/>
+        </w:rPr>
+        <w:t>Cambridge IETLS 5</w:t>
+      </w:r>
+    </w:p>
+    <w:p>
+      <w:pPr>
+        <w:outlineLvl w:val="2"/>
+        <w:rPr>
+          <w:rFonts w:ascii="Times New Roman" w:hAnsi="Times New Roman" w:cs="Times New Roman"/>
+          <w:b/>
+          <w:bCs/>
+          <w:sz w:val="24"/>
+          <w:szCs w:val="24"/>
+        </w:rPr>
+      </w:pPr>
+      <w:r>
+        <w:rPr>
+          <w:rFonts w:ascii="Times New Roman" w:hAnsi="Times New Roman" w:cs="Times New Roman" w:hint="eastAsia"/>
+          <w:b/>
+          <w:bCs/>
+          <w:sz w:val="24"/>
+          <w:szCs w:val="24"/>
+        </w:rPr>
+        <w:t>Test 1 Listening</w:t>
+      </w:r>
+    </w:p>
+    <w:p>
+      <w:pPr>
+        <w:rPr>
+          <w:rFonts w:ascii="Times New Roman" w:hAnsi="Times New Roman" w:cs="Times New Roman"/>
           <w:b/>
           <w:bCs/>
           <w:i/>
@@ -545,234 +510,496 @@
           <w:sz w:val="24"/>
           <w:szCs w:val="24"/>
         </w:rPr>
-        <w:t>Section 2</w:t>
-      </w:r>
-    </w:p>
-    <w:p>
-      <w:pPr>
-        <w:rPr>
-          <w:rFonts w:ascii="Times New Roman" w:hAnsi="Times New Roman" w:cs="Times New Roman"/>
-        </w:rPr>
-      </w:pPr>
-      <w:r>
-        <w:rPr>
-          <w:rFonts w:ascii="Times New Roman" w:hAnsi="Times New Roman" w:cs="Times New Roman" w:hint="eastAsia"/>
-        </w:rPr>
-        <w:t>12 breaks (</w:t>
-      </w:r>
-      <w:r>
-        <w:rPr>
-          <w:rFonts w:ascii="Times New Roman" w:hAnsi="Times New Roman" w:cs="Times New Roman"/>
-        </w:rPr>
-        <w:t>×</w:t>
-      </w:r>
-      <w:r>
-        <w:rPr>
-          <w:rFonts w:ascii="Times New Roman" w:hAnsi="Times New Roman" w:cs="Times New Roman" w:hint="eastAsia"/>
-        </w:rPr>
-        <w:t xml:space="preserve">) </w:t>
-      </w:r>
-      <w:r>
-        <w:rPr>
-          <w:rFonts w:ascii="Times New Roman" w:hAnsi="Times New Roman" w:cs="Times New Roman" w:hint="eastAsia"/>
-        </w:rPr>
-        <w:t xml:space="preserve">: </w:t>
-      </w:r>
-      <w:r>
-        <w:rPr>
-          <w:rFonts w:ascii="Times New Roman" w:hAnsi="Times New Roman" w:cs="Times New Roman" w:hint="eastAsia"/>
-        </w:rPr>
-        <w:t>brakes</w:t>
-      </w:r>
-    </w:p>
-    <w:p>
-      <w:pPr>
-        <w:rPr>
-          <w:rFonts w:ascii="Times New Roman" w:hAnsi="Times New Roman" w:cs="Times New Roman"/>
+      </w:pPr>
+      <w:r>
+        <w:rPr>
+          <w:rFonts w:ascii="Times New Roman" w:hAnsi="Times New Roman" w:cs="Times New Roman" w:hint="eastAsia"/>
           <w:b/>
           <w:bCs/>
           <w:i/>
           <w:iCs/>
-        </w:rPr>
-      </w:pPr>
-      <w:r>
-        <w:rPr>
-          <w:rFonts w:ascii="Times New Roman" w:hAnsi="Times New Roman" w:cs="Times New Roman" w:hint="eastAsia"/>
+          <w:sz w:val="24"/>
+          <w:szCs w:val="24"/>
+        </w:rPr>
+        <w:t>Section 1</w:t>
+      </w:r>
+    </w:p>
+    <w:p>
+      <w:pPr>
+        <w:rPr>
+          <w:rFonts w:ascii="Times New Roman" w:hAnsi="Times New Roman" w:cs="Times New Roman"/>
+        </w:rPr>
+      </w:pPr>
+      <w:r>
+        <w:rPr>
+          <w:rFonts w:ascii="Times New Roman" w:hAnsi="Times New Roman" w:cs="Times New Roman" w:hint="eastAsia"/>
+        </w:rPr>
+        <w:t>1. mini bus (</w:t>
+      </w:r>
+      <w:r>
+        <w:rPr>
+          <w:rFonts w:ascii="Times New Roman" w:hAnsi="Times New Roman" w:cs="Times New Roman"/>
+        </w:rPr>
+        <w:t>×</w:t>
+      </w:r>
+      <w:r>
+        <w:rPr>
+          <w:rFonts w:ascii="Times New Roman" w:hAnsi="Times New Roman" w:cs="Times New Roman" w:hint="eastAsia"/>
+        </w:rPr>
+        <w:t xml:space="preserve">)  a minibus.  Note </w:t>
+      </w:r>
+      <w:r>
+        <w:rPr>
+          <w:rFonts w:ascii="Times New Roman" w:hAnsi="Times New Roman" w:cs="Times New Roman" w:hint="eastAsia"/>
+        </w:rPr>
+        <w:t xml:space="preserve">that </w:t>
+      </w:r>
+      <w:r>
+        <w:rPr>
+          <w:rFonts w:ascii="Times New Roman" w:hAnsi="Times New Roman" w:cs="Times New Roman"/>
+        </w:rPr>
+        <w:t>‘</w:t>
+      </w:r>
+      <w:r>
+        <w:rPr>
+          <w:rFonts w:ascii="Times New Roman" w:hAnsi="Times New Roman" w:cs="Times New Roman" w:hint="eastAsia"/>
+        </w:rPr>
+        <w:t>minibus</w:t>
+      </w:r>
+      <w:r>
+        <w:rPr>
+          <w:rFonts w:ascii="Times New Roman" w:hAnsi="Times New Roman" w:cs="Times New Roman"/>
+        </w:rPr>
+        <w:t>’</w:t>
+      </w:r>
+      <w:r>
+        <w:rPr>
+          <w:rFonts w:ascii="Times New Roman" w:hAnsi="Times New Roman" w:cs="Times New Roman" w:hint="eastAsia"/>
+        </w:rPr>
+        <w:t xml:space="preserve"> is a single word.</w:t>
+      </w:r>
+    </w:p>
+    <w:p>
+      <w:pPr>
+        <w:rPr>
+          <w:rFonts w:ascii="Times New Roman" w:hAnsi="Times New Roman" w:cs="Times New Roman"/>
+        </w:rPr>
+      </w:pPr>
+      <w:r>
+        <w:rPr>
+          <w:rFonts w:ascii="Times New Roman" w:hAnsi="Times New Roman" w:cs="Times New Roman" w:hint="eastAsia"/>
+        </w:rPr>
+        <w:t>5. BC (</w:t>
+      </w:r>
+      <w:r>
+        <w:rPr>
+          <w:rFonts w:ascii="Times New Roman" w:hAnsi="Times New Roman" w:cs="Times New Roman"/>
+        </w:rPr>
+        <w:t>×</w:t>
+      </w:r>
+      <w:r>
+        <w:rPr>
+          <w:rFonts w:ascii="Times New Roman" w:hAnsi="Times New Roman" w:cs="Times New Roman" w:hint="eastAsia"/>
+        </w:rPr>
+        <w:t xml:space="preserve">) </w:t>
+      </w:r>
+      <w:r>
+        <w:rPr>
+          <w:rFonts w:ascii="Times New Roman" w:hAnsi="Times New Roman" w:cs="Times New Roman" w:hint="eastAsia"/>
+        </w:rPr>
+        <w:t xml:space="preserve"> </w:t>
+      </w:r>
+      <w:r>
+        <w:rPr>
+          <w:rFonts w:ascii="Times New Roman" w:hAnsi="Times New Roman" w:cs="Times New Roman" w:hint="eastAsia"/>
+        </w:rPr>
+        <w:t xml:space="preserve"> </w:t>
+      </w:r>
+      <w:r>
+        <w:rPr>
+          <w:rFonts w:ascii="Times New Roman" w:hAnsi="Times New Roman" w:cs="Times New Roman" w:hint="eastAsia"/>
+        </w:rPr>
+        <w:t>BD</w:t>
+      </w:r>
+      <w:r>
+        <w:rPr>
+          <w:rFonts w:ascii="Times New Roman" w:hAnsi="Times New Roman" w:cs="Times New Roman" w:hint="eastAsia"/>
+        </w:rPr>
+        <w:t xml:space="preserve"> </w:t>
+      </w:r>
+    </w:p>
+    <w:p>
+      <w:pPr>
+        <w:rPr>
+          <w:rFonts w:ascii="Times New Roman" w:hAnsi="Times New Roman" w:cs="Times New Roman"/>
+        </w:rPr>
+      </w:pPr>
+      <w:r>
+        <w:rPr>
+          <w:rFonts w:ascii="Times New Roman" w:hAnsi="Times New Roman" w:cs="Times New Roman" w:hint="eastAsia"/>
+        </w:rPr>
+        <w:t>Don</w:t>
+      </w:r>
+      <w:r>
+        <w:rPr>
+          <w:rFonts w:ascii="Times New Roman" w:hAnsi="Times New Roman" w:cs="Times New Roman"/>
+        </w:rPr>
+        <w:t>’</w:t>
+      </w:r>
+      <w:r>
+        <w:rPr>
+          <w:rFonts w:ascii="Times New Roman" w:hAnsi="Times New Roman" w:cs="Times New Roman" w:hint="eastAsia"/>
+        </w:rPr>
+        <w:t>t write any word you hear</w:t>
+      </w:r>
+      <w:r>
+        <w:rPr>
+          <w:rFonts w:ascii="Times New Roman" w:hAnsi="Times New Roman" w:cs="Times New Roman" w:hint="eastAsia"/>
+        </w:rPr>
+        <w:t xml:space="preserve">, because all the options will apprear in the conversaion. What you should do is to choose the correct answer. </w:t>
+      </w:r>
+      <w:r>
+        <w:rPr>
+          <w:rFonts w:ascii="Times New Roman" w:hAnsi="Times New Roman" w:cs="Times New Roman" w:hint="eastAsia"/>
+        </w:rPr>
+        <w:t>For instance, this question need you to select two kind of service included in the price, which means they are free if you</w:t>
+      </w:r>
+      <w:r>
+        <w:rPr>
+          <w:rFonts w:ascii="Times New Roman" w:hAnsi="Times New Roman" w:cs="Times New Roman" w:hint="eastAsia"/>
+        </w:rPr>
+        <w:t xml:space="preserve"> have</w:t>
+      </w:r>
+      <w:r>
+        <w:rPr>
+          <w:rFonts w:ascii="Times New Roman" w:hAnsi="Times New Roman" w:cs="Times New Roman" w:hint="eastAsia"/>
+        </w:rPr>
+        <w:t xml:space="preserve"> pa</w:t>
+      </w:r>
+      <w:r>
+        <w:rPr>
+          <w:rFonts w:ascii="Times New Roman" w:hAnsi="Times New Roman" w:cs="Times New Roman" w:hint="eastAsia"/>
+        </w:rPr>
+        <w:t>id</w:t>
+      </w:r>
+      <w:r>
+        <w:rPr>
+          <w:rFonts w:ascii="Times New Roman" w:hAnsi="Times New Roman" w:cs="Times New Roman" w:hint="eastAsia"/>
+        </w:rPr>
+        <w:t xml:space="preserve"> the tour. Note that attending some of the course</w:t>
+      </w:r>
+      <w:r>
+        <w:rPr>
+          <w:rFonts w:ascii="Times New Roman" w:hAnsi="Times New Roman" w:cs="Times New Roman" w:hint="eastAsia"/>
+        </w:rPr>
+        <w:t xml:space="preserve"> you</w:t>
+      </w:r>
+      <w:r>
+        <w:rPr>
+          <w:rFonts w:ascii="Times New Roman" w:hAnsi="Times New Roman" w:cs="Times New Roman" w:hint="eastAsia"/>
+        </w:rPr>
+        <w:t xml:space="preserve"> should </w:t>
+      </w:r>
+      <w:r>
+        <w:rPr>
+          <w:rFonts w:ascii="Times New Roman" w:hAnsi="Times New Roman" w:cs="Times New Roman" w:hint="eastAsia"/>
+        </w:rPr>
+        <w:t xml:space="preserve">need to </w:t>
+      </w:r>
+      <w:r>
+        <w:rPr>
+          <w:rFonts w:ascii="Times New Roman" w:hAnsi="Times New Roman" w:cs="Times New Roman" w:hint="eastAsia"/>
+        </w:rPr>
+        <w:t xml:space="preserve">pay </w:t>
+      </w:r>
+      <w:r>
+        <w:rPr>
+          <w:rFonts w:ascii="Times New Roman" w:hAnsi="Times New Roman" w:cs="Times New Roman" w:hint="eastAsia"/>
+        </w:rPr>
+        <w:t>extra money.</w:t>
+      </w:r>
+    </w:p>
+    <w:p>
+      <w:pPr>
+        <w:rPr>
+          <w:rFonts w:ascii="Times New Roman" w:hAnsi="Times New Roman" w:cs="Times New Roman"/>
+        </w:rPr>
+      </w:pPr>
+      <w:r>
+        <w:rPr>
+          <w:rFonts w:ascii="Times New Roman" w:hAnsi="Times New Roman" w:cs="Times New Roman" w:hint="eastAsia"/>
+        </w:rPr>
+        <w:t>7. 290 (</w:t>
+      </w:r>
+      <w:r>
+        <w:rPr>
+          <w:rFonts w:ascii="Times New Roman" w:hAnsi="Times New Roman" w:cs="Times New Roman"/>
+        </w:rPr>
+        <w:t>×</w:t>
+      </w:r>
+      <w:r>
+        <w:rPr>
+          <w:rFonts w:ascii="Times New Roman" w:hAnsi="Times New Roman" w:cs="Times New Roman" w:hint="eastAsia"/>
+        </w:rPr>
+        <w:t>)  280</w:t>
+      </w:r>
+      <w:r>
+        <w:rPr>
+          <w:rFonts w:ascii="Times New Roman" w:hAnsi="Times New Roman" w:cs="Times New Roman" w:hint="eastAsia"/>
+        </w:rPr>
+        <w:t xml:space="preserve"> </w:t>
+      </w:r>
+    </w:p>
+    <w:p>
+      <w:pPr>
+        <w:rPr>
+          <w:rFonts w:ascii="Times New Roman" w:hAnsi="Times New Roman" w:cs="Times New Roman"/>
           <w:b/>
           <w:bCs/>
           <w:i/>
           <w:iCs/>
-        </w:rPr>
-        <w:t>Section 3</w:t>
-      </w:r>
-    </w:p>
-    <w:p>
-      <w:pPr>
-        <w:rPr>
-          <w:rFonts w:ascii="Times New Roman" w:hAnsi="Times New Roman" w:cs="Times New Roman"/>
-        </w:rPr>
-      </w:pPr>
-      <w:r>
-        <w:rPr>
-          <w:rFonts w:ascii="Times New Roman" w:hAnsi="Times New Roman" w:cs="Times New Roman" w:hint="eastAsia"/>
-        </w:rPr>
-        <w:t>24</w:t>
-      </w:r>
-      <w:r>
-        <w:rPr>
-          <w:rFonts w:ascii="Times New Roman" w:hAnsi="Times New Roman" w:cs="Times New Roman" w:hint="eastAsia"/>
-        </w:rPr>
-        <w:t>,25 BC (</w:t>
-      </w:r>
-      <w:r>
-        <w:rPr>
-          <w:rFonts w:ascii="Times New Roman" w:hAnsi="Times New Roman" w:cs="Times New Roman"/>
-        </w:rPr>
-        <w:t>×</w:t>
-      </w:r>
-      <w:r>
-        <w:rPr>
-          <w:rFonts w:ascii="Times New Roman" w:hAnsi="Times New Roman" w:cs="Times New Roman" w:hint="eastAsia"/>
-        </w:rPr>
-        <w:t>) BD</w:t>
-      </w:r>
-      <w:r>
-        <w:rPr>
-          <w:rFonts w:ascii="Times New Roman" w:hAnsi="Times New Roman" w:cs="Times New Roman" w:hint="eastAsia"/>
-        </w:rPr>
-        <w:t xml:space="preserve"> (I knew the answer was D but select</w:t>
-      </w:r>
-      <w:r>
-        <w:rPr>
-          <w:rFonts w:ascii="Times New Roman" w:hAnsi="Times New Roman" w:cs="Times New Roman" w:hint="eastAsia"/>
-        </w:rPr>
-        <w:t>e</w:t>
-      </w:r>
-      <w:r>
-        <w:rPr>
-          <w:rFonts w:ascii="Times New Roman" w:hAnsi="Times New Roman" w:cs="Times New Roman" w:hint="eastAsia"/>
-        </w:rPr>
-        <w:t>d C!)</w:t>
-      </w:r>
-    </w:p>
-    <w:p>
-      <w:pPr>
-        <w:rPr>
-          <w:rFonts w:ascii="Times New Roman" w:hAnsi="Times New Roman" w:cs="Times New Roman"/>
-        </w:rPr>
-      </w:pPr>
-      <w:r>
-        <w:rPr>
-          <w:rFonts w:ascii="Times New Roman" w:hAnsi="Times New Roman" w:cs="Times New Roman" w:hint="eastAsia"/>
-        </w:rPr>
-        <w:t>26, ___  (</w:t>
-      </w:r>
-      <w:r>
-        <w:rPr>
-          <w:rFonts w:ascii="Times New Roman" w:hAnsi="Times New Roman" w:cs="Times New Roman"/>
-        </w:rPr>
-        <w:t>×</w:t>
-      </w:r>
-      <w:r>
-        <w:rPr>
-          <w:rFonts w:ascii="Times New Roman" w:hAnsi="Times New Roman" w:cs="Times New Roman" w:hint="eastAsia"/>
-        </w:rPr>
-        <w:t>) full-time</w:t>
-      </w:r>
-    </w:p>
-    <w:p>
-      <w:pPr>
-        <w:rPr>
-          <w:rFonts w:ascii="Times New Roman" w:hAnsi="Times New Roman" w:cs="Times New Roman"/>
-        </w:rPr>
-      </w:pPr>
-      <w:r>
-        <w:rPr>
-          <w:rFonts w:ascii="Times New Roman" w:hAnsi="Times New Roman" w:cs="Times New Roman" w:hint="eastAsia"/>
-        </w:rPr>
-        <w:t>27 short time (</w:t>
-      </w:r>
-      <w:r>
-        <w:rPr>
-          <w:rFonts w:ascii="Times New Roman" w:hAnsi="Times New Roman" w:cs="Times New Roman"/>
-        </w:rPr>
-        <w:t>×</w:t>
-      </w:r>
-      <w:r>
-        <w:rPr>
-          <w:rFonts w:ascii="Times New Roman" w:hAnsi="Times New Roman" w:cs="Times New Roman" w:hint="eastAsia"/>
-        </w:rPr>
-        <w:t>) a term</w:t>
-      </w:r>
-    </w:p>
-    <w:p>
-      <w:pPr>
-        <w:rPr>
-          <w:rFonts w:ascii="Times New Roman" w:hAnsi="Times New Roman" w:cs="Times New Roman"/>
-        </w:rPr>
-      </w:pPr>
-      <w:r>
-        <w:rPr>
-          <w:rFonts w:ascii="Times New Roman" w:hAnsi="Times New Roman" w:cs="Times New Roman" w:hint="eastAsia"/>
-        </w:rPr>
-        <w:t>29. ___ (</w:t>
-      </w:r>
-      <w:r>
-        <w:rPr>
-          <w:rFonts w:ascii="Times New Roman" w:hAnsi="Times New Roman" w:cs="Times New Roman"/>
-        </w:rPr>
-        <w:t>×</w:t>
-      </w:r>
-      <w:r>
-        <w:rPr>
-          <w:rFonts w:ascii="Times New Roman" w:hAnsi="Times New Roman" w:cs="Times New Roman" w:hint="eastAsia"/>
-        </w:rPr>
-        <w:t>) two modules</w:t>
-      </w:r>
-    </w:p>
-    <w:p>
-      <w:pPr>
-        <w:rPr>
-          <w:rFonts w:ascii="Times New Roman" w:hAnsi="Times New Roman" w:cs="Times New Roman"/>
-        </w:rPr>
-      </w:pPr>
-      <w:r>
-        <w:rPr>
-          <w:rFonts w:ascii="Times New Roman" w:hAnsi="Times New Roman" w:cs="Times New Roman" w:hint="eastAsia"/>
-        </w:rPr>
-        <w:t>30. ___(</w:t>
-      </w:r>
-      <w:r>
-        <w:rPr>
-          <w:rFonts w:ascii="Times New Roman" w:hAnsi="Times New Roman" w:cs="Times New Roman"/>
-        </w:rPr>
-        <w:t>×</w:t>
-      </w:r>
-      <w:r>
-        <w:rPr>
-          <w:rFonts w:ascii="Times New Roman" w:hAnsi="Times New Roman" w:cs="Times New Roman" w:hint="eastAsia"/>
-        </w:rPr>
-        <w:t>) a topic</w:t>
-      </w:r>
-    </w:p>
-    <w:p>
-      <w:pPr>
-        <w:rPr>
-          <w:rFonts w:ascii="Times New Roman" w:hAnsi="Times New Roman" w:cs="Times New Roman"/>
+          <w:sz w:val="24"/>
+          <w:szCs w:val="24"/>
+        </w:rPr>
+      </w:pPr>
+      <w:r>
+        <w:rPr>
+          <w:rFonts w:ascii="Times New Roman" w:hAnsi="Times New Roman" w:cs="Times New Roman" w:hint="eastAsia"/>
           <w:b/>
           <w:bCs/>
           <w:i/>
           <w:iCs/>
-        </w:rPr>
-      </w:pPr>
-      <w:r>
-        <w:rPr>
-          <w:rFonts w:ascii="Times New Roman" w:hAnsi="Times New Roman" w:cs="Times New Roman" w:hint="eastAsia"/>
+          <w:sz w:val="24"/>
+          <w:szCs w:val="24"/>
+        </w:rPr>
+        <w:t>Section 2</w:t>
+      </w:r>
+    </w:p>
+    <w:p>
+      <w:pPr>
+        <w:rPr>
+          <w:rFonts w:ascii="Times New Roman" w:hAnsi="Times New Roman" w:cs="Times New Roman"/>
+        </w:rPr>
+      </w:pPr>
+      <w:r>
+        <w:rPr>
+          <w:rFonts w:ascii="Times New Roman" w:hAnsi="Times New Roman" w:cs="Times New Roman" w:hint="eastAsia"/>
+        </w:rPr>
+        <w:t>12 breaks (</w:t>
+      </w:r>
+      <w:r>
+        <w:rPr>
+          <w:rFonts w:ascii="Times New Roman" w:hAnsi="Times New Roman" w:cs="Times New Roman"/>
+        </w:rPr>
+        <w:t>×</w:t>
+      </w:r>
+      <w:r>
+        <w:rPr>
+          <w:rFonts w:ascii="Times New Roman" w:hAnsi="Times New Roman" w:cs="Times New Roman" w:hint="eastAsia"/>
+        </w:rPr>
+        <w:t xml:space="preserve">) </w:t>
+      </w:r>
+      <w:r>
+        <w:rPr>
+          <w:rFonts w:ascii="Times New Roman" w:hAnsi="Times New Roman" w:cs="Times New Roman" w:hint="eastAsia"/>
+        </w:rPr>
+        <w:t xml:space="preserve">: </w:t>
+      </w:r>
+      <w:r>
+        <w:rPr>
+          <w:rFonts w:ascii="Times New Roman" w:hAnsi="Times New Roman" w:cs="Times New Roman" w:hint="eastAsia"/>
+        </w:rPr>
+        <w:t>brakes</w:t>
+      </w:r>
+    </w:p>
+    <w:p>
+      <w:pPr>
+        <w:rPr>
+          <w:rFonts w:ascii="Times New Roman" w:hAnsi="Times New Roman" w:cs="Times New Roman"/>
           <w:b/>
           <w:bCs/>
           <w:i/>
           <w:iCs/>
         </w:rPr>
+      </w:pPr>
+      <w:r>
+        <w:rPr>
+          <w:rFonts w:ascii="Times New Roman" w:hAnsi="Times New Roman" w:cs="Times New Roman" w:hint="eastAsia"/>
+          <w:b/>
+          <w:bCs/>
+          <w:i/>
+          <w:iCs/>
+        </w:rPr>
+        <w:t>Section 3</w:t>
+      </w:r>
+    </w:p>
+    <w:p>
+      <w:pPr>
+        <w:rPr>
+          <w:rFonts w:ascii="Times New Roman" w:hAnsi="Times New Roman" w:cs="Times New Roman"/>
+        </w:rPr>
+      </w:pPr>
+      <w:r>
+        <w:rPr>
+          <w:rFonts w:ascii="Times New Roman" w:hAnsi="Times New Roman" w:cs="Times New Roman" w:hint="eastAsia"/>
+        </w:rPr>
+        <w:t>24</w:t>
+      </w:r>
+      <w:r>
+        <w:rPr>
+          <w:rFonts w:ascii="Times New Roman" w:hAnsi="Times New Roman" w:cs="Times New Roman" w:hint="eastAsia"/>
+        </w:rPr>
+        <w:t>,25 BC (</w:t>
+      </w:r>
+      <w:r>
+        <w:rPr>
+          <w:rFonts w:ascii="Times New Roman" w:hAnsi="Times New Roman" w:cs="Times New Roman"/>
+        </w:rPr>
+        <w:t>×</w:t>
+      </w:r>
+      <w:r>
+        <w:rPr>
+          <w:rFonts w:ascii="Times New Roman" w:hAnsi="Times New Roman" w:cs="Times New Roman" w:hint="eastAsia"/>
+        </w:rPr>
+        <w:t>) BD</w:t>
+      </w:r>
+      <w:r>
+        <w:rPr>
+          <w:rFonts w:ascii="Times New Roman" w:hAnsi="Times New Roman" w:cs="Times New Roman" w:hint="eastAsia"/>
+        </w:rPr>
+        <w:t xml:space="preserve"> (I knew the answer was D but select</w:t>
+      </w:r>
+      <w:r>
+        <w:rPr>
+          <w:rFonts w:ascii="Times New Roman" w:hAnsi="Times New Roman" w:cs="Times New Roman" w:hint="eastAsia"/>
+        </w:rPr>
+        <w:t>e</w:t>
+      </w:r>
+      <w:r>
+        <w:rPr>
+          <w:rFonts w:ascii="Times New Roman" w:hAnsi="Times New Roman" w:cs="Times New Roman" w:hint="eastAsia"/>
+        </w:rPr>
+        <w:t>d C!)</w:t>
+      </w:r>
+    </w:p>
+    <w:p>
+      <w:pPr>
+        <w:rPr>
+          <w:rFonts w:ascii="Times New Roman" w:hAnsi="Times New Roman" w:cs="Times New Roman"/>
+        </w:rPr>
+      </w:pPr>
+      <w:r>
+        <w:rPr>
+          <w:rFonts w:ascii="Times New Roman" w:hAnsi="Times New Roman" w:cs="Times New Roman" w:hint="eastAsia"/>
+        </w:rPr>
+        <w:t>26, ___  (</w:t>
+      </w:r>
+      <w:r>
+        <w:rPr>
+          <w:rFonts w:ascii="Times New Roman" w:hAnsi="Times New Roman" w:cs="Times New Roman"/>
+        </w:rPr>
+        <w:t>×</w:t>
+      </w:r>
+      <w:r>
+        <w:rPr>
+          <w:rFonts w:ascii="Times New Roman" w:hAnsi="Times New Roman" w:cs="Times New Roman" w:hint="eastAsia"/>
+        </w:rPr>
+        <w:t>) full-time</w:t>
+      </w:r>
+    </w:p>
+    <w:p>
+      <w:pPr>
+        <w:rPr>
+          <w:rFonts w:ascii="Times New Roman" w:hAnsi="Times New Roman" w:cs="Times New Roman"/>
+        </w:rPr>
+      </w:pPr>
+      <w:r>
+        <w:rPr>
+          <w:rFonts w:ascii="Times New Roman" w:hAnsi="Times New Roman" w:cs="Times New Roman" w:hint="eastAsia"/>
+        </w:rPr>
+        <w:t>27 short time (</w:t>
+      </w:r>
+      <w:r>
+        <w:rPr>
+          <w:rFonts w:ascii="Times New Roman" w:hAnsi="Times New Roman" w:cs="Times New Roman"/>
+        </w:rPr>
+        <w:t>×</w:t>
+      </w:r>
+      <w:r>
+        <w:rPr>
+          <w:rFonts w:ascii="Times New Roman" w:hAnsi="Times New Roman" w:cs="Times New Roman" w:hint="eastAsia"/>
+        </w:rPr>
+        <w:t>) a term</w:t>
+      </w:r>
+    </w:p>
+    <w:p>
+      <w:pPr>
+        <w:rPr>
+          <w:rFonts w:ascii="Times New Roman" w:hAnsi="Times New Roman" w:cs="Times New Roman"/>
+        </w:rPr>
+      </w:pPr>
+      <w:r>
+        <w:rPr>
+          <w:rFonts w:ascii="Times New Roman" w:hAnsi="Times New Roman" w:cs="Times New Roman" w:hint="eastAsia"/>
+        </w:rPr>
+        <w:t>29. ___ (</w:t>
+      </w:r>
+      <w:r>
+        <w:rPr>
+          <w:rFonts w:ascii="Times New Roman" w:hAnsi="Times New Roman" w:cs="Times New Roman"/>
+        </w:rPr>
+        <w:t>×</w:t>
+      </w:r>
+      <w:r>
+        <w:rPr>
+          <w:rFonts w:ascii="Times New Roman" w:hAnsi="Times New Roman" w:cs="Times New Roman" w:hint="eastAsia"/>
+        </w:rPr>
+        <w:t>) two modules</w:t>
+      </w:r>
+    </w:p>
+    <w:p>
+      <w:pPr>
+        <w:rPr>
+          <w:rFonts w:ascii="Times New Roman" w:hAnsi="Times New Roman" w:cs="Times New Roman"/>
+        </w:rPr>
+      </w:pPr>
+      <w:r>
+        <w:rPr>
+          <w:rFonts w:ascii="Times New Roman" w:hAnsi="Times New Roman" w:cs="Times New Roman" w:hint="eastAsia"/>
+        </w:rPr>
+        <w:t>30. ___(</w:t>
+      </w:r>
+      <w:r>
+        <w:rPr>
+          <w:rFonts w:ascii="Times New Roman" w:hAnsi="Times New Roman" w:cs="Times New Roman"/>
+        </w:rPr>
+        <w:t>×</w:t>
+      </w:r>
+      <w:r>
+        <w:rPr>
+          <w:rFonts w:ascii="Times New Roman" w:hAnsi="Times New Roman" w:cs="Times New Roman" w:hint="eastAsia"/>
+        </w:rPr>
+        <w:t>) a topic</w:t>
+      </w:r>
+    </w:p>
+    <w:p>
+      <w:pPr>
+        <w:rPr>
+          <w:rFonts w:ascii="Times New Roman" w:hAnsi="Times New Roman" w:cs="Times New Roman"/>
+          <w:b/>
+          <w:bCs/>
+          <w:i/>
+          <w:iCs/>
+        </w:rPr>
+      </w:pPr>
+      <w:r>
+        <w:rPr>
+          <w:rFonts w:ascii="Times New Roman" w:hAnsi="Times New Roman" w:cs="Times New Roman" w:hint="eastAsia"/>
+          <w:b/>
+          <w:bCs/>
+          <w:i/>
+          <w:iCs/>
+        </w:rPr>
         <w:t>Section 4</w:t>
       </w:r>
     </w:p>
@@ -786,6 +1013,7 @@
         <w:rPr>
           <w:rFonts w:ascii="Times New Roman" w:hAnsi="Times New Roman" w:cs="Times New Roman" w:hint="eastAsia"/>
         </w:rPr>
+        <w:lastRenderedPageBreak/>
         <w:t>32. not care (</w:t>
       </w:r>
       <w:r>
@@ -948,7 +1176,6 @@
         <w:rPr>
           <w:rFonts w:ascii="Times New Roman" w:hAnsi="Times New Roman" w:cs="Times New Roman" w:hint="eastAsia"/>
         </w:rPr>
-        <w:lastRenderedPageBreak/>
         <w:t>40. low risk investments (</w:t>
       </w:r>
       <w:r>
@@ -1804,6 +2031,7 @@
           <w:i/>
           <w:iCs/>
         </w:rPr>
+        <w:lastRenderedPageBreak/>
         <w:t>Section 1</w:t>
       </w:r>
     </w:p>
@@ -1974,7 +2202,6 @@
           <w:i/>
           <w:iCs/>
         </w:rPr>
-        <w:lastRenderedPageBreak/>
         <w:t>Section 2</w:t>
       </w:r>
     </w:p>
@@ -2841,6 +3068,7 @@
           <w:sz w:val="24"/>
           <w:szCs w:val="24"/>
         </w:rPr>
+        <w:lastRenderedPageBreak/>
         <w:t>Test 4 Listening</w:t>
       </w:r>
     </w:p>
@@ -3069,7 +3297,6 @@
         <w:rPr>
           <w:rFonts w:ascii="Times New Roman" w:hAnsi="Times New Roman" w:cs="Times New Roman" w:hint="eastAsia"/>
         </w:rPr>
-        <w:lastRenderedPageBreak/>
         <w:t xml:space="preserve">When the speaker </w:t>
       </w:r>
       <w:r>
@@ -3852,6 +4079,7 @@
         <w:rPr>
           <w:rFonts w:ascii="Times New Roman" w:hAnsi="Times New Roman" w:cs="Times New Roman" w:hint="eastAsia"/>
         </w:rPr>
+        <w:lastRenderedPageBreak/>
         <w:t>34, B (</w:t>
       </w:r>
       <w:r>
@@ -4042,7 +4270,6 @@
         <w:rPr>
           <w:rFonts w:ascii="Times New Roman" w:hAnsi="Times New Roman" w:cs="Times New Roman" w:hint="eastAsia"/>
         </w:rPr>
-        <w:lastRenderedPageBreak/>
         <w:t>38, B (</w:t>
       </w:r>
       <w:r>
@@ -4806,6 +5033,7 @@
         <w:rPr>
           <w:rFonts w:ascii="Times New Roman" w:hAnsi="Times New Roman" w:cs="Times New Roman"/>
         </w:rPr>
+        <w:lastRenderedPageBreak/>
         <w:br/>
       </w:r>
       <w:r>
@@ -4941,7 +5169,6 @@
           <w:sz w:val="24"/>
           <w:szCs w:val="24"/>
         </w:rPr>
-        <w:lastRenderedPageBreak/>
         <w:t>Test 2</w:t>
       </w:r>
       <w:r>
@@ -5460,6 +5687,7 @@
           <w:sz w:val="24"/>
           <w:szCs w:val="24"/>
         </w:rPr>
+        <w:lastRenderedPageBreak/>
         <w:t>Section 3</w:t>
       </w:r>
     </w:p>
@@ -5633,7 +5861,6 @@
           <w:sz w:val="24"/>
           <w:szCs w:val="24"/>
         </w:rPr>
-        <w:lastRenderedPageBreak/>
         <w:t xml:space="preserve">Section 4 </w:t>
       </w:r>
     </w:p>
@@ -6284,6 +6511,7 @@
         <w:rPr>
           <w:rFonts w:ascii="Times New Roman" w:hAnsi="Times New Roman" w:cs="Times New Roman" w:hint="eastAsia"/>
         </w:rPr>
+        <w:lastRenderedPageBreak/>
         <w:t>11, A  (x)  C</w:t>
       </w:r>
       <w:r>
@@ -6525,7 +6753,6 @@
           <w:sz w:val="28"/>
           <w:szCs w:val="24"/>
         </w:rPr>
-        <w:lastRenderedPageBreak/>
         <w:t>Section 3</w:t>
       </w:r>
     </w:p>
@@ -7365,7 +7592,6 @@
         <w:rPr>
           <w:rFonts w:ascii="Times New Roman" w:hAnsi="Times New Roman" w:cs="Times New Roman" w:hint="eastAsia"/>
         </w:rPr>
-        <w:lastRenderedPageBreak/>
         <w:t>5. a ten-minute  (x)  10 minutes</w:t>
       </w:r>
       <w:r>
@@ -8241,6 +8467,7 @@
           <w:sz w:val="24"/>
           <w:szCs w:val="24"/>
         </w:rPr>
+        <w:lastRenderedPageBreak/>
         <w:t xml:space="preserve">Section 4 </w:t>
       </w:r>
     </w:p>
@@ -8414,7 +8641,6 @@
         <w:rPr>
           <w:rFonts w:ascii="Times New Roman" w:hAnsi="Times New Roman" w:cs="Times New Roman" w:hint="eastAsia"/>
         </w:rPr>
-        <w:lastRenderedPageBreak/>
         <w:t>37. ____ (x) prince</w:t>
       </w:r>
     </w:p>
@@ -9312,7 +9538,7 @@
   <a:extraClrSchemeLst/>
   <a:extLst>
     <a:ext uri="{05A4C25C-085E-4340-85A3-A5531E510DB2}">
-      <thm15:themeFamily xmlns="" xmlns:thm15="http://schemas.microsoft.com/office/thememl/2012/main" name="Office Theme" id="{62F939B6-93AF-4DB8-9C6B-D6C7DFDC589F}" vid="{4A3C46E8-61CC-4603-A589-7422A47A8E4A}"/>
+      <thm15:themeFamily xmlns:thm15="http://schemas.microsoft.com/office/thememl/2012/main" xmlns="" name="Office Theme" id="{62F939B6-93AF-4DB8-9C6B-D6C7DFDC589F}" vid="{4A3C46E8-61CC-4603-A589-7422A47A8E4A}"/>
     </a:ext>
   </a:extLst>
 </a:theme>

</xml_diff>

<commit_message>
upate notes of listening test
</commit_message>
<xml_diff>
--- a/IELTS Notes/Listening Test And Analyses..docx
+++ b/IELTS Notes/Listening Test And Analyses..docx
@@ -60,41 +60,39 @@
       <w:pPr>
         <w:outlineLvl w:val="2"/>
         <w:rPr>
+          <w:rFonts w:ascii="Times New Roman" w:hAnsi="Times New Roman" w:cs="Times New Roman" w:hint="eastAsia"/>
+          <w:b/>
+          <w:bCs/>
+        </w:rPr>
+      </w:pPr>
+      <w:r>
+        <w:rPr>
           <w:rFonts w:ascii="Times New Roman" w:hAnsi="Times New Roman" w:cs="Times New Roman"/>
           <w:b/>
           <w:bCs/>
           <w:sz w:val="24"/>
           <w:szCs w:val="24"/>
         </w:rPr>
-      </w:pPr>
-      <w:r>
-        <w:rPr>
-          <w:rFonts w:ascii="Times New Roman" w:hAnsi="Times New Roman" w:cs="Times New Roman"/>
+        <w:t xml:space="preserve">Test </w:t>
+      </w:r>
+      <w:r>
+        <w:rPr>
+          <w:rFonts w:ascii="Times New Roman" w:hAnsi="Times New Roman" w:cs="Times New Roman" w:hint="eastAsia"/>
           <w:b/>
           <w:bCs/>
           <w:sz w:val="24"/>
           <w:szCs w:val="24"/>
         </w:rPr>
-        <w:t xml:space="preserve">Test </w:t>
-      </w:r>
-      <w:r>
-        <w:rPr>
-          <w:rFonts w:ascii="Times New Roman" w:hAnsi="Times New Roman" w:cs="Times New Roman" w:hint="eastAsia"/>
+        <w:t>1</w:t>
+      </w:r>
+      <w:r>
+        <w:rPr>
+          <w:rFonts w:ascii="Times New Roman" w:hAnsi="Times New Roman" w:cs="Times New Roman"/>
           <w:b/>
           <w:bCs/>
           <w:sz w:val="24"/>
           <w:szCs w:val="24"/>
         </w:rPr>
-        <w:t>1</w:t>
-      </w:r>
-      <w:r>
-        <w:rPr>
-          <w:rFonts w:ascii="Times New Roman" w:hAnsi="Times New Roman" w:cs="Times New Roman"/>
-          <w:b/>
-          <w:bCs/>
-          <w:sz w:val="24"/>
-          <w:szCs w:val="24"/>
-        </w:rPr>
         <w:t xml:space="preserve"> </w:t>
       </w:r>
       <w:r>
@@ -109,7 +107,7 @@
     <w:p>
       <w:pPr>
         <w:rPr>
-          <w:rFonts w:ascii="Times New Roman" w:hAnsi="Times New Roman" w:cs="Times New Roman"/>
+          <w:rFonts w:ascii="Times New Roman" w:hAnsi="Times New Roman" w:cs="Times New Roman" w:hint="eastAsia"/>
           <w:b/>
           <w:bCs/>
           <w:i/>
@@ -118,9 +116,10 @@
           <w:szCs w:val="24"/>
         </w:rPr>
       </w:pPr>
-      <w:r>
-        <w:rPr>
-          <w:rFonts w:ascii="Times New Roman" w:hAnsi="Times New Roman" w:cs="Times New Roman"/>
+      <w:bookmarkStart w:id="0" w:name="_GoBack"/>
+      <w:r>
+        <w:rPr>
+          <w:rFonts w:ascii="Times New Roman" w:hAnsi="Times New Roman" w:cs="Times New Roman" w:hint="eastAsia"/>
           <w:b/>
           <w:bCs/>
           <w:i/>
@@ -128,11 +127,78 @@
           <w:sz w:val="24"/>
           <w:szCs w:val="24"/>
         </w:rPr>
-        <w:t xml:space="preserve">Section </w:t>
-      </w:r>
-      <w:r>
-        <w:rPr>
-          <w:rFonts w:ascii="Times New Roman" w:hAnsi="Times New Roman" w:cs="Times New Roman" w:hint="eastAsia"/>
+        <w:t>Section 1</w:t>
+      </w:r>
+    </w:p>
+    <w:bookmarkEnd w:id="0"/>
+    <w:p>
+      <w:pPr>
+        <w:rPr>
+          <w:rFonts w:ascii="Times New Roman" w:hAnsi="Times New Roman" w:cs="Times New Roman"/>
+          <w:bCs/>
+          <w:sz w:val="24"/>
+          <w:szCs w:val="24"/>
+        </w:rPr>
+      </w:pPr>
+      <w:r>
+        <w:rPr>
+          <w:rFonts w:ascii="Times New Roman" w:hAnsi="Times New Roman" w:cs="Times New Roman" w:hint="eastAsia"/>
+          <w:bCs/>
+          <w:sz w:val="24"/>
+          <w:szCs w:val="24"/>
+        </w:rPr>
+        <w:t xml:space="preserve">21.  Although I chose the correct answer, I still want to take a </w:t>
+      </w:r>
+      <w:r>
+        <w:rPr>
+          <w:rFonts w:ascii="Times New Roman" w:hAnsi="Times New Roman" w:cs="Times New Roman" w:hint="eastAsia"/>
+          <w:bCs/>
+          <w:sz w:val="24"/>
+          <w:szCs w:val="24"/>
+        </w:rPr>
+        <w:t>note in order to warn myself about the trap</w:t>
+      </w:r>
+      <w:r>
+        <w:rPr>
+          <w:rFonts w:ascii="Times New Roman" w:hAnsi="Times New Roman" w:cs="Times New Roman" w:hint="eastAsia"/>
+          <w:bCs/>
+          <w:sz w:val="24"/>
+          <w:szCs w:val="24"/>
+        </w:rPr>
+        <w:t>.</w:t>
+      </w:r>
+      <w:r>
+        <w:rPr>
+          <w:rFonts w:ascii="Times New Roman" w:hAnsi="Times New Roman" w:cs="Times New Roman"/>
+          <w:bCs/>
+          <w:sz w:val="24"/>
+          <w:szCs w:val="24"/>
+        </w:rPr>
+        <w:br/>
+      </w:r>
+      <w:r>
+        <w:rPr>
+          <w:rFonts w:ascii="Times New Roman" w:hAnsi="Times New Roman" w:cs="Times New Roman" w:hint="eastAsia"/>
+          <w:bCs/>
+          <w:sz w:val="24"/>
+          <w:szCs w:val="24"/>
+        </w:rPr>
+        <w:t xml:space="preserve">Melanie said that </w:t>
+      </w:r>
+      <w:r>
+        <w:rPr>
+          <w:rFonts w:ascii="Times New Roman" w:hAnsi="Times New Roman" w:cs="Times New Roman" w:hint="eastAsia"/>
+          <w:bCs/>
+          <w:sz w:val="24"/>
+          <w:szCs w:val="24"/>
+        </w:rPr>
+        <w:t>she spent time on the assignment of another course which is a really big one.</w:t>
+      </w:r>
+    </w:p>
+    <w:p>
+      <w:pPr>
+        <w:rPr>
+          <w:rFonts w:ascii="Times New Roman" w:hAnsi="Times New Roman" w:cs="Times New Roman"/>
           <w:b/>
           <w:bCs/>
           <w:i/>
@@ -140,183 +206,8 @@
           <w:sz w:val="24"/>
           <w:szCs w:val="24"/>
         </w:rPr>
-        <w:t>4</w:t>
-      </w:r>
-    </w:p>
-    <w:p>
-      <w:pPr>
-        <w:rPr>
-          <w:rFonts w:ascii="Times New Roman" w:hAnsi="Times New Roman" w:cs="Times New Roman" w:hint="eastAsia"/>
-        </w:rPr>
-      </w:pPr>
-      <w:r>
-        <w:rPr>
-          <w:rFonts w:ascii="Times New Roman" w:hAnsi="Times New Roman" w:cs="Times New Roman" w:hint="eastAsia"/>
-        </w:rPr>
-        <w:t>31. city (x)  cities</w:t>
-      </w:r>
-      <w:r>
-        <w:rPr>
-          <w:rFonts w:ascii="Times New Roman" w:hAnsi="Times New Roman" w:cs="Times New Roman"/>
-        </w:rPr>
-        <w:br/>
-      </w:r>
-      <w:r>
-        <w:rPr>
-          <w:rFonts w:ascii="Times New Roman" w:hAnsi="Times New Roman" w:cs="Times New Roman" w:hint="eastAsia"/>
-        </w:rPr>
-        <w:t xml:space="preserve">It is </w:t>
-      </w:r>
-      <w:r>
-        <w:rPr>
-          <w:rFonts w:ascii="Times New Roman" w:hAnsi="Times New Roman" w:cs="Times New Roman" w:hint="eastAsia"/>
-        </w:rPr>
-        <w:t xml:space="preserve">a </w:t>
-      </w:r>
-      <w:r>
-        <w:rPr>
-          <w:rFonts w:ascii="Times New Roman" w:hAnsi="Times New Roman" w:cs="Times New Roman" w:hint="eastAsia"/>
-        </w:rPr>
-        <w:t>plural</w:t>
-      </w:r>
-      <w:r>
-        <w:rPr>
-          <w:rFonts w:ascii="Times New Roman" w:hAnsi="Times New Roman" w:cs="Times New Roman" w:hint="eastAsia"/>
-        </w:rPr>
-        <w:t>.</w:t>
-      </w:r>
-    </w:p>
-    <w:p>
-      <w:pPr>
-        <w:rPr>
-          <w:rFonts w:ascii="Times New Roman" w:hAnsi="Times New Roman" w:cs="Times New Roman" w:hint="eastAsia"/>
-        </w:rPr>
-      </w:pPr>
-      <w:r>
-        <w:rPr>
-          <w:rFonts w:ascii="Times New Roman" w:hAnsi="Times New Roman" w:cs="Times New Roman" w:hint="eastAsia"/>
-        </w:rPr>
-        <w:t>38. filter and reduce  (x)  considerably reduce/filter</w:t>
-      </w:r>
-      <w:r>
-        <w:rPr>
-          <w:rFonts w:ascii="Times New Roman" w:hAnsi="Times New Roman" w:cs="Times New Roman"/>
-        </w:rPr>
-        <w:br/>
-      </w:r>
-      <w:r>
-        <w:rPr>
-          <w:rFonts w:ascii="Times New Roman" w:hAnsi="Times New Roman" w:cs="Times New Roman" w:hint="eastAsia"/>
-        </w:rPr>
-        <w:t xml:space="preserve">No more than three words are allowed. </w:t>
-      </w:r>
-      <w:r>
-        <w:rPr>
-          <w:rFonts w:ascii="Times New Roman" w:hAnsi="Times New Roman" w:cs="Times New Roman" w:hint="eastAsia"/>
-        </w:rPr>
-        <w:t xml:space="preserve">Either </w:t>
-      </w:r>
-      <w:r>
-        <w:rPr>
-          <w:rFonts w:ascii="Times New Roman" w:hAnsi="Times New Roman" w:cs="Times New Roman"/>
-        </w:rPr>
-        <w:t>‘</w:t>
-      </w:r>
-      <w:r>
-        <w:rPr>
-          <w:rFonts w:ascii="Times New Roman" w:hAnsi="Times New Roman" w:cs="Times New Roman" w:hint="eastAsia"/>
-        </w:rPr>
-        <w:t>filter</w:t>
-      </w:r>
-      <w:r>
-        <w:rPr>
-          <w:rFonts w:ascii="Times New Roman" w:hAnsi="Times New Roman" w:cs="Times New Roman"/>
-        </w:rPr>
-        <w:t>’</w:t>
-      </w:r>
-      <w:r>
-        <w:rPr>
-          <w:rFonts w:ascii="Times New Roman" w:hAnsi="Times New Roman" w:cs="Times New Roman" w:hint="eastAsia"/>
-        </w:rPr>
-        <w:t xml:space="preserve"> or </w:t>
-      </w:r>
-      <w:r>
-        <w:rPr>
-          <w:rFonts w:ascii="Times New Roman" w:hAnsi="Times New Roman" w:cs="Times New Roman"/>
-        </w:rPr>
-        <w:t>‘</w:t>
-      </w:r>
-      <w:r>
-        <w:rPr>
-          <w:rFonts w:ascii="Times New Roman" w:hAnsi="Times New Roman" w:cs="Times New Roman" w:hint="eastAsia"/>
-        </w:rPr>
-        <w:t>reduce</w:t>
-      </w:r>
-      <w:r>
-        <w:rPr>
-          <w:rFonts w:ascii="Times New Roman" w:hAnsi="Times New Roman" w:cs="Times New Roman"/>
-        </w:rPr>
-        <w:t>’</w:t>
-      </w:r>
-      <w:r>
-        <w:rPr>
-          <w:rFonts w:ascii="Times New Roman" w:hAnsi="Times New Roman" w:cs="Times New Roman" w:hint="eastAsia"/>
-        </w:rPr>
-        <w:t xml:space="preserve"> is correct and d</w:t>
-      </w:r>
-      <w:bookmarkStart w:id="0" w:name="_GoBack"/>
-      <w:bookmarkEnd w:id="0"/>
-      <w:r>
-        <w:rPr>
-          <w:rFonts w:ascii="Times New Roman" w:hAnsi="Times New Roman" w:cs="Times New Roman" w:hint="eastAsia"/>
-        </w:rPr>
-        <w:t>on</w:t>
-      </w:r>
-      <w:r>
-        <w:rPr>
-          <w:rFonts w:ascii="Times New Roman" w:hAnsi="Times New Roman" w:cs="Times New Roman"/>
-        </w:rPr>
-        <w:t>’</w:t>
-      </w:r>
-      <w:r>
-        <w:rPr>
-          <w:rFonts w:ascii="Times New Roman" w:hAnsi="Times New Roman" w:cs="Times New Roman" w:hint="eastAsia"/>
-        </w:rPr>
-        <w:t xml:space="preserve">t forget modifers. </w:t>
-      </w:r>
-    </w:p>
-    <w:p>
-      <w:pPr>
-        <w:outlineLvl w:val="2"/>
-        <w:rPr>
-          <w:rFonts w:ascii="Times New Roman" w:hAnsi="Times New Roman" w:cs="Times New Roman"/>
-          <w:b/>
-          <w:bCs/>
-          <w:sz w:val="24"/>
-          <w:szCs w:val="24"/>
-        </w:rPr>
-      </w:pPr>
-      <w:r>
-        <w:rPr>
-          <w:rFonts w:ascii="Times New Roman" w:hAnsi="Times New Roman" w:cs="Times New Roman"/>
-          <w:b/>
-          <w:bCs/>
-          <w:sz w:val="24"/>
-          <w:szCs w:val="24"/>
-        </w:rPr>
-        <w:t xml:space="preserve">Test 3 </w:t>
-      </w:r>
-      <w:r>
-        <w:rPr>
-          <w:rFonts w:ascii="Times New Roman" w:hAnsi="Times New Roman" w:cs="Times New Roman"/>
-          <w:b/>
-          <w:bCs/>
-        </w:rPr>
-        <w:t>Listening</w:t>
-      </w:r>
-    </w:p>
-    <w:p>
-      <w:pPr>
+      </w:pPr>
+      <w:r>
         <w:rPr>
           <w:rFonts w:ascii="Times New Roman" w:hAnsi="Times New Roman" w:cs="Times New Roman"/>
           <w:b/>
@@ -326,10 +217,11 @@
           <w:sz w:val="24"/>
           <w:szCs w:val="24"/>
         </w:rPr>
-      </w:pPr>
-      <w:r>
-        <w:rPr>
-          <w:rFonts w:ascii="Times New Roman" w:hAnsi="Times New Roman" w:cs="Times New Roman"/>
+        <w:t xml:space="preserve">Section </w:t>
+      </w:r>
+      <w:r>
+        <w:rPr>
+          <w:rFonts w:ascii="Times New Roman" w:hAnsi="Times New Roman" w:cs="Times New Roman" w:hint="eastAsia"/>
           <w:b/>
           <w:bCs/>
           <w:i/>
@@ -337,91 +229,20 @@
           <w:sz w:val="24"/>
           <w:szCs w:val="24"/>
         </w:rPr>
-        <w:t>Section 4</w:t>
-      </w:r>
-    </w:p>
-    <w:p>
-      <w:pPr>
-        <w:rPr>
-          <w:rFonts w:ascii="Times New Roman" w:hAnsi="Times New Roman" w:cs="Times New Roman"/>
-        </w:rPr>
-      </w:pPr>
-      <w:r>
-        <w:rPr>
-          <w:rFonts w:ascii="Times New Roman" w:hAnsi="Times New Roman" w:cs="Times New Roman"/>
-        </w:rPr>
-        <w:t xml:space="preserve">32. </w:t>
-      </w:r>
-      <w:r>
-        <w:rPr>
-          <w:rFonts w:ascii="Times New Roman" w:hAnsi="Times New Roman" w:cs="Times New Roman"/>
-          <w:strike/>
-        </w:rPr>
-        <w:t>2000</w:t>
-      </w:r>
-      <w:r>
-        <w:rPr>
-          <w:rFonts w:ascii="Times New Roman" w:hAnsi="Times New Roman" w:cs="Times New Roman"/>
-        </w:rPr>
-        <w:t xml:space="preserve"> (approximately</w:t>
-      </w:r>
-      <w:r>
-        <w:rPr>
-          <w:rFonts w:ascii="Times New Roman" w:hAnsi="Times New Roman" w:cs="Times New Roman"/>
-        </w:rPr>
-        <w:t xml:space="preserve"> 2000</w:t>
-      </w:r>
-      <w:r>
-        <w:rPr>
-          <w:rFonts w:ascii="Times New Roman" w:hAnsi="Times New Roman" w:cs="Times New Roman"/>
-        </w:rPr>
-        <w:t>)</w:t>
-      </w:r>
-    </w:p>
-    <w:p>
-      <w:pPr>
-        <w:rPr>
-          <w:rFonts w:ascii="Times New Roman" w:hAnsi="Times New Roman" w:cs="Times New Roman"/>
-        </w:rPr>
-      </w:pPr>
-      <w:r>
-        <w:rPr>
-          <w:rFonts w:ascii="Times New Roman" w:hAnsi="Times New Roman" w:cs="Times New Roman"/>
-        </w:rPr>
-        <w:t xml:space="preserve">34. </w:t>
-      </w:r>
-      <w:r>
-        <w:rPr>
-          <w:rFonts w:ascii="Times New Roman" w:hAnsi="Times New Roman" w:cs="Times New Roman"/>
-          <w:strike/>
-        </w:rPr>
-        <w:t xml:space="preserve">hall of residents. </w:t>
-      </w:r>
-      <w:r>
-        <w:rPr>
-          <w:rFonts w:ascii="Times New Roman" w:hAnsi="Times New Roman" w:cs="Times New Roman"/>
-        </w:rPr>
-        <w:t xml:space="preserve"> halls of residence</w:t>
-      </w:r>
-      <w:r>
-        <w:rPr>
-          <w:rFonts w:ascii="Times New Roman" w:hAnsi="Times New Roman" w:cs="Times New Roman" w:hint="eastAsia"/>
-        </w:rPr>
-        <w:t>(BrE) = dormitory (AmE)</w:t>
-      </w:r>
-      <w:bookmarkStart w:id="1" w:name="_Hlk183599797"/>
-    </w:p>
-    <w:p>
-      <w:pPr>
-        <w:rPr>
-          <w:rFonts w:ascii="Times New Roman" w:hAnsi="Times New Roman" w:cs="Times New Roman"/>
-        </w:rPr>
-      </w:pPr>
-      <w:r>
-        <w:rPr>
-          <w:rFonts w:ascii="Times New Roman" w:hAnsi="Times New Roman" w:cs="Times New Roman" w:hint="eastAsia"/>
-        </w:rPr>
-        <w:t xml:space="preserve">hall/halls of residence: </w:t>
+        <w:t>4</w:t>
+      </w:r>
+    </w:p>
+    <w:p>
+      <w:pPr>
+        <w:rPr>
+          <w:rFonts w:ascii="Times New Roman" w:hAnsi="Times New Roman" w:cs="Times New Roman"/>
+        </w:rPr>
+      </w:pPr>
+      <w:r>
+        <w:rPr>
+          <w:rFonts w:ascii="Times New Roman" w:hAnsi="Times New Roman" w:cs="Times New Roman" w:hint="eastAsia"/>
+        </w:rPr>
+        <w:t>31. city (x)  cities</w:t>
       </w:r>
       <w:r>
         <w:rPr>
@@ -433,48 +254,122 @@
         <w:rPr>
           <w:rFonts w:ascii="Times New Roman" w:hAnsi="Times New Roman" w:cs="Times New Roman" w:hint="eastAsia"/>
         </w:rPr>
-        <w:t>a building for university or college students to live in.</w:t>
-      </w:r>
-      <w:r>
-        <w:rPr>
-          <w:rFonts w:ascii="Times New Roman" w:hAnsi="Times New Roman" w:cs="Times New Roman" w:hint="eastAsia"/>
-        </w:rPr>
-        <w:t xml:space="preserve"> (</w:t>
-      </w:r>
-      <w:r>
-        <w:rPr>
-          <w:rFonts w:ascii="Times New Roman" w:hAnsi="Times New Roman" w:cs="Times New Roman" w:hint="eastAsia"/>
-        </w:rPr>
-        <w:t>学生宿舍</w:t>
-      </w:r>
-      <w:r>
-        <w:rPr>
-          <w:rFonts w:ascii="Times New Roman" w:hAnsi="Times New Roman" w:cs="Times New Roman" w:hint="eastAsia"/>
-        </w:rPr>
-        <w:t>)</w:t>
-      </w:r>
-    </w:p>
-    <w:bookmarkEnd w:id="1"/>
-    <w:p>
-      <w:pPr>
-        <w:outlineLvl w:val="1"/>
-        <w:rPr>
-          <w:rFonts w:ascii="Times New Roman" w:hAnsi="Times New Roman" w:cs="Times New Roman"/>
-          <w:b/>
-          <w:bCs/>
-          <w:sz w:val="28"/>
-          <w:szCs w:val="28"/>
-        </w:rPr>
-      </w:pPr>
-      <w:r>
-        <w:rPr>
-          <w:rFonts w:ascii="Times New Roman" w:hAnsi="Times New Roman" w:cs="Times New Roman" w:hint="eastAsia"/>
-          <w:b/>
-          <w:bCs/>
-          <w:sz w:val="28"/>
-          <w:szCs w:val="28"/>
-        </w:rPr>
-        <w:t>Cambridge IETLS 5</w:t>
+        <w:t xml:space="preserve">It is </w:t>
+      </w:r>
+      <w:r>
+        <w:rPr>
+          <w:rFonts w:ascii="Times New Roman" w:hAnsi="Times New Roman" w:cs="Times New Roman" w:hint="eastAsia"/>
+        </w:rPr>
+        <w:t xml:space="preserve">a </w:t>
+      </w:r>
+      <w:r>
+        <w:rPr>
+          <w:rFonts w:ascii="Times New Roman" w:hAnsi="Times New Roman" w:cs="Times New Roman" w:hint="eastAsia"/>
+        </w:rPr>
+        <w:t>plural</w:t>
+      </w:r>
+      <w:r>
+        <w:rPr>
+          <w:rFonts w:ascii="Times New Roman" w:hAnsi="Times New Roman" w:cs="Times New Roman" w:hint="eastAsia"/>
+        </w:rPr>
+        <w:t>.</w:t>
+      </w:r>
+    </w:p>
+    <w:p>
+      <w:pPr>
+        <w:rPr>
+          <w:rFonts w:ascii="Times New Roman" w:hAnsi="Times New Roman" w:cs="Times New Roman"/>
+        </w:rPr>
+      </w:pPr>
+      <w:r>
+        <w:rPr>
+          <w:rFonts w:ascii="Times New Roman" w:hAnsi="Times New Roman" w:cs="Times New Roman" w:hint="eastAsia"/>
+        </w:rPr>
+        <w:t>38. filter and reduce  (x)  considerably reduce/filter</w:t>
+      </w:r>
+      <w:r>
+        <w:rPr>
+          <w:rFonts w:ascii="Times New Roman" w:hAnsi="Times New Roman" w:cs="Times New Roman"/>
+        </w:rPr>
+        <w:br/>
+      </w:r>
+      <w:r>
+        <w:rPr>
+          <w:rFonts w:ascii="Times New Roman" w:hAnsi="Times New Roman" w:cs="Times New Roman" w:hint="eastAsia"/>
+        </w:rPr>
+        <w:t xml:space="preserve">No more than three words are allowed. </w:t>
+      </w:r>
+      <w:r>
+        <w:rPr>
+          <w:rFonts w:ascii="Times New Roman" w:hAnsi="Times New Roman" w:cs="Times New Roman" w:hint="eastAsia"/>
+        </w:rPr>
+        <w:t xml:space="preserve">Either </w:t>
+      </w:r>
+      <w:r>
+        <w:rPr>
+          <w:rFonts w:ascii="Times New Roman" w:hAnsi="Times New Roman" w:cs="Times New Roman"/>
+        </w:rPr>
+        <w:t>‘</w:t>
+      </w:r>
+      <w:r>
+        <w:rPr>
+          <w:rFonts w:ascii="Times New Roman" w:hAnsi="Times New Roman" w:cs="Times New Roman" w:hint="eastAsia"/>
+        </w:rPr>
+        <w:t>filter</w:t>
+      </w:r>
+      <w:r>
+        <w:rPr>
+          <w:rFonts w:ascii="Times New Roman" w:hAnsi="Times New Roman" w:cs="Times New Roman"/>
+        </w:rPr>
+        <w:t>’</w:t>
+      </w:r>
+      <w:r>
+        <w:rPr>
+          <w:rFonts w:ascii="Times New Roman" w:hAnsi="Times New Roman" w:cs="Times New Roman" w:hint="eastAsia"/>
+        </w:rPr>
+        <w:t xml:space="preserve"> or </w:t>
+      </w:r>
+      <w:r>
+        <w:rPr>
+          <w:rFonts w:ascii="Times New Roman" w:hAnsi="Times New Roman" w:cs="Times New Roman"/>
+        </w:rPr>
+        <w:t>‘</w:t>
+      </w:r>
+      <w:r>
+        <w:rPr>
+          <w:rFonts w:ascii="Times New Roman" w:hAnsi="Times New Roman" w:cs="Times New Roman" w:hint="eastAsia"/>
+        </w:rPr>
+        <w:t>reduce</w:t>
+      </w:r>
+      <w:r>
+        <w:rPr>
+          <w:rFonts w:ascii="Times New Roman" w:hAnsi="Times New Roman" w:cs="Times New Roman"/>
+        </w:rPr>
+        <w:t>’</w:t>
+      </w:r>
+      <w:r>
+        <w:rPr>
+          <w:rFonts w:ascii="Times New Roman" w:hAnsi="Times New Roman" w:cs="Times New Roman" w:hint="eastAsia"/>
+        </w:rPr>
+        <w:t xml:space="preserve"> is correct and d</w:t>
+      </w:r>
+      <w:r>
+        <w:rPr>
+          <w:rFonts w:ascii="Times New Roman" w:hAnsi="Times New Roman" w:cs="Times New Roman" w:hint="eastAsia"/>
+        </w:rPr>
+        <w:t>on</w:t>
+      </w:r>
+      <w:r>
+        <w:rPr>
+          <w:rFonts w:ascii="Times New Roman" w:hAnsi="Times New Roman" w:cs="Times New Roman"/>
+        </w:rPr>
+        <w:t>’</w:t>
+      </w:r>
+      <w:r>
+        <w:rPr>
+          <w:rFonts w:ascii="Times New Roman" w:hAnsi="Times New Roman" w:cs="Times New Roman" w:hint="eastAsia"/>
+        </w:rPr>
+        <w:t xml:space="preserve">t forget modifers. </w:t>
       </w:r>
     </w:p>
     <w:p>
@@ -490,13 +385,21 @@
       </w:pPr>
       <w:r>
         <w:rPr>
-          <w:rFonts w:ascii="Times New Roman" w:hAnsi="Times New Roman" w:cs="Times New Roman" w:hint="eastAsia"/>
+          <w:rFonts w:ascii="Times New Roman" w:hAnsi="Times New Roman" w:cs="Times New Roman"/>
           <w:b/>
           <w:bCs/>
           <w:sz w:val="24"/>
           <w:szCs w:val="24"/>
         </w:rPr>
-        <w:t>Test 1 Listening</w:t>
+        <w:t xml:space="preserve">Test 3 </w:t>
+      </w:r>
+      <w:r>
+        <w:rPr>
+          <w:rFonts w:ascii="Times New Roman" w:hAnsi="Times New Roman" w:cs="Times New Roman"/>
+          <w:b/>
+          <w:bCs/>
+        </w:rPr>
+        <w:t>Listening</w:t>
       </w:r>
     </w:p>
     <w:p>
@@ -513,7 +416,7 @@
       </w:pPr>
       <w:r>
         <w:rPr>
-          <w:rFonts w:ascii="Times New Roman" w:hAnsi="Times New Roman" w:cs="Times New Roman" w:hint="eastAsia"/>
+          <w:rFonts w:ascii="Times New Roman" w:hAnsi="Times New Roman" w:cs="Times New Roman"/>
           <w:b/>
           <w:bCs/>
           <w:i/>
@@ -521,233 +424,166 @@
           <w:sz w:val="24"/>
           <w:szCs w:val="24"/>
         </w:rPr>
-        <w:t>Section 1</w:t>
-      </w:r>
-    </w:p>
-    <w:p>
-      <w:pPr>
-        <w:rPr>
-          <w:rFonts w:ascii="Times New Roman" w:hAnsi="Times New Roman" w:cs="Times New Roman"/>
-        </w:rPr>
-      </w:pPr>
-      <w:r>
-        <w:rPr>
-          <w:rFonts w:ascii="Times New Roman" w:hAnsi="Times New Roman" w:cs="Times New Roman" w:hint="eastAsia"/>
-        </w:rPr>
-        <w:t>1. mini bus (</w:t>
-      </w:r>
-      <w:r>
-        <w:rPr>
-          <w:rFonts w:ascii="Times New Roman" w:hAnsi="Times New Roman" w:cs="Times New Roman"/>
-        </w:rPr>
-        <w:t>×</w:t>
-      </w:r>
-      <w:r>
-        <w:rPr>
-          <w:rFonts w:ascii="Times New Roman" w:hAnsi="Times New Roman" w:cs="Times New Roman" w:hint="eastAsia"/>
-        </w:rPr>
-        <w:t xml:space="preserve">)  a minibus.  Note </w:t>
-      </w:r>
-      <w:r>
-        <w:rPr>
-          <w:rFonts w:ascii="Times New Roman" w:hAnsi="Times New Roman" w:cs="Times New Roman" w:hint="eastAsia"/>
-        </w:rPr>
-        <w:t xml:space="preserve">that </w:t>
-      </w:r>
-      <w:r>
-        <w:rPr>
-          <w:rFonts w:ascii="Times New Roman" w:hAnsi="Times New Roman" w:cs="Times New Roman"/>
-        </w:rPr>
-        <w:t>‘</w:t>
-      </w:r>
-      <w:r>
-        <w:rPr>
-          <w:rFonts w:ascii="Times New Roman" w:hAnsi="Times New Roman" w:cs="Times New Roman" w:hint="eastAsia"/>
-        </w:rPr>
-        <w:t>minibus</w:t>
-      </w:r>
-      <w:r>
-        <w:rPr>
-          <w:rFonts w:ascii="Times New Roman" w:hAnsi="Times New Roman" w:cs="Times New Roman"/>
-        </w:rPr>
-        <w:t>’</w:t>
-      </w:r>
-      <w:r>
-        <w:rPr>
-          <w:rFonts w:ascii="Times New Roman" w:hAnsi="Times New Roman" w:cs="Times New Roman" w:hint="eastAsia"/>
-        </w:rPr>
-        <w:t xml:space="preserve"> is a single word.</w:t>
-      </w:r>
-    </w:p>
-    <w:p>
-      <w:pPr>
-        <w:rPr>
-          <w:rFonts w:ascii="Times New Roman" w:hAnsi="Times New Roman" w:cs="Times New Roman"/>
-        </w:rPr>
-      </w:pPr>
-      <w:r>
-        <w:rPr>
-          <w:rFonts w:ascii="Times New Roman" w:hAnsi="Times New Roman" w:cs="Times New Roman" w:hint="eastAsia"/>
-        </w:rPr>
-        <w:t>5. BC (</w:t>
-      </w:r>
-      <w:r>
-        <w:rPr>
-          <w:rFonts w:ascii="Times New Roman" w:hAnsi="Times New Roman" w:cs="Times New Roman"/>
-        </w:rPr>
-        <w:t>×</w:t>
-      </w:r>
-      <w:r>
-        <w:rPr>
-          <w:rFonts w:ascii="Times New Roman" w:hAnsi="Times New Roman" w:cs="Times New Roman" w:hint="eastAsia"/>
-        </w:rPr>
-        <w:t xml:space="preserve">) </w:t>
-      </w:r>
-      <w:r>
-        <w:rPr>
-          <w:rFonts w:ascii="Times New Roman" w:hAnsi="Times New Roman" w:cs="Times New Roman" w:hint="eastAsia"/>
-        </w:rPr>
-        <w:t xml:space="preserve"> </w:t>
-      </w:r>
-      <w:r>
-        <w:rPr>
-          <w:rFonts w:ascii="Times New Roman" w:hAnsi="Times New Roman" w:cs="Times New Roman" w:hint="eastAsia"/>
-        </w:rPr>
-        <w:t xml:space="preserve"> </w:t>
-      </w:r>
-      <w:r>
-        <w:rPr>
-          <w:rFonts w:ascii="Times New Roman" w:hAnsi="Times New Roman" w:cs="Times New Roman" w:hint="eastAsia"/>
-        </w:rPr>
-        <w:t>BD</w:t>
-      </w:r>
-      <w:r>
-        <w:rPr>
-          <w:rFonts w:ascii="Times New Roman" w:hAnsi="Times New Roman" w:cs="Times New Roman" w:hint="eastAsia"/>
-        </w:rPr>
-        <w:t xml:space="preserve"> </w:t>
-      </w:r>
-    </w:p>
-    <w:p>
-      <w:pPr>
-        <w:rPr>
-          <w:rFonts w:ascii="Times New Roman" w:hAnsi="Times New Roman" w:cs="Times New Roman"/>
-        </w:rPr>
-      </w:pPr>
-      <w:r>
-        <w:rPr>
-          <w:rFonts w:ascii="Times New Roman" w:hAnsi="Times New Roman" w:cs="Times New Roman" w:hint="eastAsia"/>
-        </w:rPr>
-        <w:t>Don</w:t>
-      </w:r>
-      <w:r>
-        <w:rPr>
-          <w:rFonts w:ascii="Times New Roman" w:hAnsi="Times New Roman" w:cs="Times New Roman"/>
-        </w:rPr>
-        <w:t>’</w:t>
-      </w:r>
-      <w:r>
-        <w:rPr>
-          <w:rFonts w:ascii="Times New Roman" w:hAnsi="Times New Roman" w:cs="Times New Roman" w:hint="eastAsia"/>
-        </w:rPr>
-        <w:t>t write any word you hear</w:t>
-      </w:r>
-      <w:r>
-        <w:rPr>
-          <w:rFonts w:ascii="Times New Roman" w:hAnsi="Times New Roman" w:cs="Times New Roman" w:hint="eastAsia"/>
-        </w:rPr>
-        <w:t xml:space="preserve">, because all the options will apprear in the conversaion. What you should do is to choose the correct answer. </w:t>
-      </w:r>
-      <w:r>
-        <w:rPr>
-          <w:rFonts w:ascii="Times New Roman" w:hAnsi="Times New Roman" w:cs="Times New Roman" w:hint="eastAsia"/>
-        </w:rPr>
-        <w:t>For instance, this question need you to select two kind of service included in the price, which means they are free if you</w:t>
-      </w:r>
-      <w:r>
-        <w:rPr>
-          <w:rFonts w:ascii="Times New Roman" w:hAnsi="Times New Roman" w:cs="Times New Roman" w:hint="eastAsia"/>
-        </w:rPr>
-        <w:t xml:space="preserve"> have</w:t>
-      </w:r>
-      <w:r>
-        <w:rPr>
-          <w:rFonts w:ascii="Times New Roman" w:hAnsi="Times New Roman" w:cs="Times New Roman" w:hint="eastAsia"/>
-        </w:rPr>
-        <w:t xml:space="preserve"> pa</w:t>
-      </w:r>
-      <w:r>
-        <w:rPr>
-          <w:rFonts w:ascii="Times New Roman" w:hAnsi="Times New Roman" w:cs="Times New Roman" w:hint="eastAsia"/>
-        </w:rPr>
-        <w:t>id</w:t>
-      </w:r>
-      <w:r>
-        <w:rPr>
-          <w:rFonts w:ascii="Times New Roman" w:hAnsi="Times New Roman" w:cs="Times New Roman" w:hint="eastAsia"/>
-        </w:rPr>
-        <w:t xml:space="preserve"> the tour. Note that attending some of the course</w:t>
-      </w:r>
-      <w:r>
-        <w:rPr>
-          <w:rFonts w:ascii="Times New Roman" w:hAnsi="Times New Roman" w:cs="Times New Roman" w:hint="eastAsia"/>
-        </w:rPr>
-        <w:t xml:space="preserve"> you</w:t>
-      </w:r>
-      <w:r>
-        <w:rPr>
-          <w:rFonts w:ascii="Times New Roman" w:hAnsi="Times New Roman" w:cs="Times New Roman" w:hint="eastAsia"/>
-        </w:rPr>
-        <w:t xml:space="preserve"> should </w:t>
-      </w:r>
-      <w:r>
-        <w:rPr>
-          <w:rFonts w:ascii="Times New Roman" w:hAnsi="Times New Roman" w:cs="Times New Roman" w:hint="eastAsia"/>
-        </w:rPr>
-        <w:t xml:space="preserve">need to </w:t>
-      </w:r>
-      <w:r>
-        <w:rPr>
-          <w:rFonts w:ascii="Times New Roman" w:hAnsi="Times New Roman" w:cs="Times New Roman" w:hint="eastAsia"/>
-        </w:rPr>
-        <w:t xml:space="preserve">pay </w:t>
-      </w:r>
-      <w:r>
-        <w:rPr>
-          <w:rFonts w:ascii="Times New Roman" w:hAnsi="Times New Roman" w:cs="Times New Roman" w:hint="eastAsia"/>
-        </w:rPr>
-        <w:t>extra money.</w:t>
-      </w:r>
-    </w:p>
-    <w:p>
-      <w:pPr>
-        <w:rPr>
-          <w:rFonts w:ascii="Times New Roman" w:hAnsi="Times New Roman" w:cs="Times New Roman"/>
-        </w:rPr>
-      </w:pPr>
-      <w:r>
-        <w:rPr>
-          <w:rFonts w:ascii="Times New Roman" w:hAnsi="Times New Roman" w:cs="Times New Roman" w:hint="eastAsia"/>
-        </w:rPr>
-        <w:t>7. 290 (</w:t>
-      </w:r>
-      <w:r>
-        <w:rPr>
-          <w:rFonts w:ascii="Times New Roman" w:hAnsi="Times New Roman" w:cs="Times New Roman"/>
-        </w:rPr>
-        <w:t>×</w:t>
-      </w:r>
-      <w:r>
-        <w:rPr>
-          <w:rFonts w:ascii="Times New Roman" w:hAnsi="Times New Roman" w:cs="Times New Roman" w:hint="eastAsia"/>
-        </w:rPr>
-        <w:t>)  280</w:t>
-      </w:r>
-      <w:r>
-        <w:rPr>
-          <w:rFonts w:ascii="Times New Roman" w:hAnsi="Times New Roman" w:cs="Times New Roman" w:hint="eastAsia"/>
-        </w:rPr>
-        <w:t xml:space="preserve"> </w:t>
+        <w:t>Section 4</w:t>
+      </w:r>
+    </w:p>
+    <w:p>
+      <w:pPr>
+        <w:rPr>
+          <w:rFonts w:ascii="Times New Roman" w:hAnsi="Times New Roman" w:cs="Times New Roman"/>
+        </w:rPr>
+      </w:pPr>
+      <w:r>
+        <w:rPr>
+          <w:rFonts w:ascii="Times New Roman" w:hAnsi="Times New Roman" w:cs="Times New Roman"/>
+        </w:rPr>
+        <w:t xml:space="preserve">32. </w:t>
+      </w:r>
+      <w:r>
+        <w:rPr>
+          <w:rFonts w:ascii="Times New Roman" w:hAnsi="Times New Roman" w:cs="Times New Roman"/>
+          <w:strike/>
+        </w:rPr>
+        <w:t>2000</w:t>
+      </w:r>
+      <w:r>
+        <w:rPr>
+          <w:rFonts w:ascii="Times New Roman" w:hAnsi="Times New Roman" w:cs="Times New Roman"/>
+        </w:rPr>
+        <w:t xml:space="preserve"> (approximately</w:t>
+      </w:r>
+      <w:r>
+        <w:rPr>
+          <w:rFonts w:ascii="Times New Roman" w:hAnsi="Times New Roman" w:cs="Times New Roman"/>
+        </w:rPr>
+        <w:t xml:space="preserve"> 2000</w:t>
+      </w:r>
+      <w:r>
+        <w:rPr>
+          <w:rFonts w:ascii="Times New Roman" w:hAnsi="Times New Roman" w:cs="Times New Roman"/>
+        </w:rPr>
+        <w:t>)</w:t>
+      </w:r>
+    </w:p>
+    <w:p>
+      <w:pPr>
+        <w:rPr>
+          <w:rFonts w:ascii="Times New Roman" w:hAnsi="Times New Roman" w:cs="Times New Roman"/>
+        </w:rPr>
+      </w:pPr>
+      <w:r>
+        <w:rPr>
+          <w:rFonts w:ascii="Times New Roman" w:hAnsi="Times New Roman" w:cs="Times New Roman"/>
+        </w:rPr>
+        <w:t xml:space="preserve">34. </w:t>
+      </w:r>
+      <w:r>
+        <w:rPr>
+          <w:rFonts w:ascii="Times New Roman" w:hAnsi="Times New Roman" w:cs="Times New Roman"/>
+          <w:strike/>
+        </w:rPr>
+        <w:t xml:space="preserve">hall of residents. </w:t>
+      </w:r>
+      <w:r>
+        <w:rPr>
+          <w:rFonts w:ascii="Times New Roman" w:hAnsi="Times New Roman" w:cs="Times New Roman"/>
+        </w:rPr>
+        <w:t xml:space="preserve"> halls of residence</w:t>
+      </w:r>
+      <w:r>
+        <w:rPr>
+          <w:rFonts w:ascii="Times New Roman" w:hAnsi="Times New Roman" w:cs="Times New Roman" w:hint="eastAsia"/>
+        </w:rPr>
+        <w:t>(BrE) = dormitory (AmE)</w:t>
+      </w:r>
+      <w:bookmarkStart w:id="1" w:name="_Hlk183599797"/>
+    </w:p>
+    <w:p>
+      <w:pPr>
+        <w:rPr>
+          <w:rFonts w:ascii="Times New Roman" w:hAnsi="Times New Roman" w:cs="Times New Roman"/>
+        </w:rPr>
+      </w:pPr>
+      <w:r>
+        <w:rPr>
+          <w:rFonts w:ascii="Times New Roman" w:hAnsi="Times New Roman" w:cs="Times New Roman" w:hint="eastAsia"/>
+        </w:rPr>
+        <w:t xml:space="preserve">hall/halls of residence: </w:t>
+      </w:r>
+      <w:r>
+        <w:rPr>
+          <w:rFonts w:ascii="Times New Roman" w:hAnsi="Times New Roman" w:cs="Times New Roman"/>
+        </w:rPr>
+        <w:br/>
+      </w:r>
+      <w:r>
+        <w:rPr>
+          <w:rFonts w:ascii="Times New Roman" w:hAnsi="Times New Roman" w:cs="Times New Roman" w:hint="eastAsia"/>
+        </w:rPr>
+        <w:t>a building for university or college students to live in.</w:t>
+      </w:r>
+      <w:r>
+        <w:rPr>
+          <w:rFonts w:ascii="Times New Roman" w:hAnsi="Times New Roman" w:cs="Times New Roman" w:hint="eastAsia"/>
+        </w:rPr>
+        <w:t xml:space="preserve"> (</w:t>
+      </w:r>
+      <w:r>
+        <w:rPr>
+          <w:rFonts w:ascii="Times New Roman" w:hAnsi="Times New Roman" w:cs="Times New Roman" w:hint="eastAsia"/>
+        </w:rPr>
+        <w:t>学生宿舍</w:t>
+      </w:r>
+      <w:r>
+        <w:rPr>
+          <w:rFonts w:ascii="Times New Roman" w:hAnsi="Times New Roman" w:cs="Times New Roman" w:hint="eastAsia"/>
+        </w:rPr>
+        <w:t>)</w:t>
+      </w:r>
+    </w:p>
+    <w:bookmarkEnd w:id="1"/>
+    <w:p>
+      <w:pPr>
+        <w:outlineLvl w:val="1"/>
+        <w:rPr>
+          <w:rFonts w:ascii="Times New Roman" w:hAnsi="Times New Roman" w:cs="Times New Roman"/>
+          <w:b/>
+          <w:bCs/>
+          <w:sz w:val="28"/>
+          <w:szCs w:val="28"/>
+        </w:rPr>
+      </w:pPr>
+      <w:r>
+        <w:rPr>
+          <w:rFonts w:ascii="Times New Roman" w:hAnsi="Times New Roman" w:cs="Times New Roman" w:hint="eastAsia"/>
+          <w:b/>
+          <w:bCs/>
+          <w:sz w:val="28"/>
+          <w:szCs w:val="28"/>
+        </w:rPr>
+        <w:t>Cambridge IETLS 5</w:t>
+      </w:r>
+    </w:p>
+    <w:p>
+      <w:pPr>
+        <w:outlineLvl w:val="2"/>
+        <w:rPr>
+          <w:rFonts w:ascii="Times New Roman" w:hAnsi="Times New Roman" w:cs="Times New Roman"/>
+          <w:b/>
+          <w:bCs/>
+          <w:sz w:val="24"/>
+          <w:szCs w:val="24"/>
+        </w:rPr>
+      </w:pPr>
+      <w:r>
+        <w:rPr>
+          <w:rFonts w:ascii="Times New Roman" w:hAnsi="Times New Roman" w:cs="Times New Roman" w:hint="eastAsia"/>
+          <w:b/>
+          <w:bCs/>
+          <w:sz w:val="24"/>
+          <w:szCs w:val="24"/>
+        </w:rPr>
+        <w:t>Test 1 Listening</w:t>
       </w:r>
     </w:p>
     <w:p>
@@ -772,20 +608,20 @@
           <w:sz w:val="24"/>
           <w:szCs w:val="24"/>
         </w:rPr>
-        <w:t>Section 2</w:t>
-      </w:r>
-    </w:p>
-    <w:p>
-      <w:pPr>
-        <w:rPr>
-          <w:rFonts w:ascii="Times New Roman" w:hAnsi="Times New Roman" w:cs="Times New Roman"/>
-        </w:rPr>
-      </w:pPr>
-      <w:r>
-        <w:rPr>
-          <w:rFonts w:ascii="Times New Roman" w:hAnsi="Times New Roman" w:cs="Times New Roman" w:hint="eastAsia"/>
-        </w:rPr>
-        <w:t>12 breaks (</w:t>
+        <w:t>Section 1</w:t>
+      </w:r>
+    </w:p>
+    <w:p>
+      <w:pPr>
+        <w:rPr>
+          <w:rFonts w:ascii="Times New Roman" w:hAnsi="Times New Roman" w:cs="Times New Roman"/>
+        </w:rPr>
+      </w:pPr>
+      <w:r>
+        <w:rPr>
+          <w:rFonts w:ascii="Times New Roman" w:hAnsi="Times New Roman" w:cs="Times New Roman" w:hint="eastAsia"/>
+        </w:rPr>
+        <w:t>1. mini bus (</w:t>
       </w:r>
       <w:r>
         <w:rPr>
@@ -797,19 +633,208 @@
         <w:rPr>
           <w:rFonts w:ascii="Times New Roman" w:hAnsi="Times New Roman" w:cs="Times New Roman" w:hint="eastAsia"/>
         </w:rPr>
+        <w:t xml:space="preserve">)  a minibus.  Note </w:t>
+      </w:r>
+      <w:r>
+        <w:rPr>
+          <w:rFonts w:ascii="Times New Roman" w:hAnsi="Times New Roman" w:cs="Times New Roman" w:hint="eastAsia"/>
+        </w:rPr>
+        <w:t xml:space="preserve">that </w:t>
+      </w:r>
+      <w:r>
+        <w:rPr>
+          <w:rFonts w:ascii="Times New Roman" w:hAnsi="Times New Roman" w:cs="Times New Roman"/>
+        </w:rPr>
+        <w:t>‘</w:t>
+      </w:r>
+      <w:r>
+        <w:rPr>
+          <w:rFonts w:ascii="Times New Roman" w:hAnsi="Times New Roman" w:cs="Times New Roman" w:hint="eastAsia"/>
+        </w:rPr>
+        <w:t>minibus</w:t>
+      </w:r>
+      <w:r>
+        <w:rPr>
+          <w:rFonts w:ascii="Times New Roman" w:hAnsi="Times New Roman" w:cs="Times New Roman"/>
+        </w:rPr>
+        <w:t>’</w:t>
+      </w:r>
+      <w:r>
+        <w:rPr>
+          <w:rFonts w:ascii="Times New Roman" w:hAnsi="Times New Roman" w:cs="Times New Roman" w:hint="eastAsia"/>
+        </w:rPr>
+        <w:t xml:space="preserve"> is a single word.</w:t>
+      </w:r>
+    </w:p>
+    <w:p>
+      <w:pPr>
+        <w:rPr>
+          <w:rFonts w:ascii="Times New Roman" w:hAnsi="Times New Roman" w:cs="Times New Roman"/>
+        </w:rPr>
+      </w:pPr>
+      <w:r>
+        <w:rPr>
+          <w:rFonts w:ascii="Times New Roman" w:hAnsi="Times New Roman" w:cs="Times New Roman" w:hint="eastAsia"/>
+        </w:rPr>
+        <w:t>5. BC (</w:t>
+      </w:r>
+      <w:r>
+        <w:rPr>
+          <w:rFonts w:ascii="Times New Roman" w:hAnsi="Times New Roman" w:cs="Times New Roman"/>
+        </w:rPr>
+        <w:t>×</w:t>
+      </w:r>
+      <w:r>
+        <w:rPr>
+          <w:rFonts w:ascii="Times New Roman" w:hAnsi="Times New Roman" w:cs="Times New Roman" w:hint="eastAsia"/>
+        </w:rPr>
         <w:t xml:space="preserve">) </w:t>
       </w:r>
       <w:r>
         <w:rPr>
           <w:rFonts w:ascii="Times New Roman" w:hAnsi="Times New Roman" w:cs="Times New Roman" w:hint="eastAsia"/>
         </w:rPr>
-        <w:t xml:space="preserve">: </w:t>
-      </w:r>
-      <w:r>
-        <w:rPr>
-          <w:rFonts w:ascii="Times New Roman" w:hAnsi="Times New Roman" w:cs="Times New Roman" w:hint="eastAsia"/>
-        </w:rPr>
-        <w:t>brakes</w:t>
+        <w:t xml:space="preserve"> </w:t>
+      </w:r>
+      <w:r>
+        <w:rPr>
+          <w:rFonts w:ascii="Times New Roman" w:hAnsi="Times New Roman" w:cs="Times New Roman" w:hint="eastAsia"/>
+        </w:rPr>
+        <w:t xml:space="preserve"> </w:t>
+      </w:r>
+      <w:r>
+        <w:rPr>
+          <w:rFonts w:ascii="Times New Roman" w:hAnsi="Times New Roman" w:cs="Times New Roman" w:hint="eastAsia"/>
+        </w:rPr>
+        <w:t>BD</w:t>
+      </w:r>
+      <w:r>
+        <w:rPr>
+          <w:rFonts w:ascii="Times New Roman" w:hAnsi="Times New Roman" w:cs="Times New Roman" w:hint="eastAsia"/>
+        </w:rPr>
+        <w:t xml:space="preserve"> </w:t>
+      </w:r>
+    </w:p>
+    <w:p>
+      <w:pPr>
+        <w:rPr>
+          <w:rFonts w:ascii="Times New Roman" w:hAnsi="Times New Roman" w:cs="Times New Roman"/>
+        </w:rPr>
+      </w:pPr>
+      <w:r>
+        <w:rPr>
+          <w:rFonts w:ascii="Times New Roman" w:hAnsi="Times New Roman" w:cs="Times New Roman" w:hint="eastAsia"/>
+        </w:rPr>
+        <w:t>Don</w:t>
+      </w:r>
+      <w:r>
+        <w:rPr>
+          <w:rFonts w:ascii="Times New Roman" w:hAnsi="Times New Roman" w:cs="Times New Roman"/>
+        </w:rPr>
+        <w:t>’</w:t>
+      </w:r>
+      <w:r>
+        <w:rPr>
+          <w:rFonts w:ascii="Times New Roman" w:hAnsi="Times New Roman" w:cs="Times New Roman" w:hint="eastAsia"/>
+        </w:rPr>
+        <w:t>t write any word you hear</w:t>
+      </w:r>
+      <w:r>
+        <w:rPr>
+          <w:rFonts w:ascii="Times New Roman" w:hAnsi="Times New Roman" w:cs="Times New Roman" w:hint="eastAsia"/>
+        </w:rPr>
+        <w:t xml:space="preserve">, because all the options will apprear in the conversaion. What you should do is to choose the correct answer. </w:t>
+      </w:r>
+      <w:r>
+        <w:rPr>
+          <w:rFonts w:ascii="Times New Roman" w:hAnsi="Times New Roman" w:cs="Times New Roman" w:hint="eastAsia"/>
+        </w:rPr>
+        <w:t>For instance, this question need you to select two kind of service included in the price, which means they are free if you</w:t>
+      </w:r>
+      <w:r>
+        <w:rPr>
+          <w:rFonts w:ascii="Times New Roman" w:hAnsi="Times New Roman" w:cs="Times New Roman" w:hint="eastAsia"/>
+        </w:rPr>
+        <w:t xml:space="preserve"> have</w:t>
+      </w:r>
+      <w:r>
+        <w:rPr>
+          <w:rFonts w:ascii="Times New Roman" w:hAnsi="Times New Roman" w:cs="Times New Roman" w:hint="eastAsia"/>
+        </w:rPr>
+        <w:t xml:space="preserve"> pa</w:t>
+      </w:r>
+      <w:r>
+        <w:rPr>
+          <w:rFonts w:ascii="Times New Roman" w:hAnsi="Times New Roman" w:cs="Times New Roman" w:hint="eastAsia"/>
+        </w:rPr>
+        <w:t>id</w:t>
+      </w:r>
+      <w:r>
+        <w:rPr>
+          <w:rFonts w:ascii="Times New Roman" w:hAnsi="Times New Roman" w:cs="Times New Roman" w:hint="eastAsia"/>
+        </w:rPr>
+        <w:t xml:space="preserve"> the tour. Note that attending some of the course</w:t>
+      </w:r>
+      <w:r>
+        <w:rPr>
+          <w:rFonts w:ascii="Times New Roman" w:hAnsi="Times New Roman" w:cs="Times New Roman" w:hint="eastAsia"/>
+        </w:rPr>
+        <w:t xml:space="preserve"> you</w:t>
+      </w:r>
+      <w:r>
+        <w:rPr>
+          <w:rFonts w:ascii="Times New Roman" w:hAnsi="Times New Roman" w:cs="Times New Roman" w:hint="eastAsia"/>
+        </w:rPr>
+        <w:t xml:space="preserve"> should </w:t>
+      </w:r>
+      <w:r>
+        <w:rPr>
+          <w:rFonts w:ascii="Times New Roman" w:hAnsi="Times New Roman" w:cs="Times New Roman" w:hint="eastAsia"/>
+        </w:rPr>
+        <w:t xml:space="preserve">need to </w:t>
+      </w:r>
+      <w:r>
+        <w:rPr>
+          <w:rFonts w:ascii="Times New Roman" w:hAnsi="Times New Roman" w:cs="Times New Roman" w:hint="eastAsia"/>
+        </w:rPr>
+        <w:t xml:space="preserve">pay </w:t>
+      </w:r>
+      <w:r>
+        <w:rPr>
+          <w:rFonts w:ascii="Times New Roman" w:hAnsi="Times New Roman" w:cs="Times New Roman" w:hint="eastAsia"/>
+        </w:rPr>
+        <w:t>extra money.</w:t>
+      </w:r>
+    </w:p>
+    <w:p>
+      <w:pPr>
+        <w:rPr>
+          <w:rFonts w:ascii="Times New Roman" w:hAnsi="Times New Roman" w:cs="Times New Roman"/>
+        </w:rPr>
+      </w:pPr>
+      <w:r>
+        <w:rPr>
+          <w:rFonts w:ascii="Times New Roman" w:hAnsi="Times New Roman" w:cs="Times New Roman" w:hint="eastAsia"/>
+        </w:rPr>
+        <w:t>7. 290 (</w:t>
+      </w:r>
+      <w:r>
+        <w:rPr>
+          <w:rFonts w:ascii="Times New Roman" w:hAnsi="Times New Roman" w:cs="Times New Roman"/>
+        </w:rPr>
+        <w:t>×</w:t>
+      </w:r>
+      <w:r>
+        <w:rPr>
+          <w:rFonts w:ascii="Times New Roman" w:hAnsi="Times New Roman" w:cs="Times New Roman" w:hint="eastAsia"/>
+        </w:rPr>
+        <w:t>)  280</w:t>
+      </w:r>
+      <w:r>
+        <w:rPr>
+          <w:rFonts w:ascii="Times New Roman" w:hAnsi="Times New Roman" w:cs="Times New Roman" w:hint="eastAsia"/>
+        </w:rPr>
+        <w:t xml:space="preserve"> </w:t>
       </w:r>
     </w:p>
     <w:p>
@@ -820,6 +845,8 @@
           <w:bCs/>
           <w:i/>
           <w:iCs/>
+          <w:sz w:val="24"/>
+          <w:szCs w:val="24"/>
         </w:rPr>
       </w:pPr>
       <w:r>
@@ -829,27 +856,23 @@
           <w:bCs/>
           <w:i/>
           <w:iCs/>
-        </w:rPr>
-        <w:t>Section 3</w:t>
-      </w:r>
-    </w:p>
-    <w:p>
-      <w:pPr>
-        <w:rPr>
-          <w:rFonts w:ascii="Times New Roman" w:hAnsi="Times New Roman" w:cs="Times New Roman"/>
-        </w:rPr>
-      </w:pPr>
-      <w:r>
-        <w:rPr>
-          <w:rFonts w:ascii="Times New Roman" w:hAnsi="Times New Roman" w:cs="Times New Roman" w:hint="eastAsia"/>
-        </w:rPr>
-        <w:t>24</w:t>
-      </w:r>
-      <w:r>
-        <w:rPr>
-          <w:rFonts w:ascii="Times New Roman" w:hAnsi="Times New Roman" w:cs="Times New Roman" w:hint="eastAsia"/>
-        </w:rPr>
-        <w:t>,25 BC (</w:t>
+          <w:sz w:val="24"/>
+          <w:szCs w:val="24"/>
+        </w:rPr>
+        <w:t>Section 2</w:t>
+      </w:r>
+    </w:p>
+    <w:p>
+      <w:pPr>
+        <w:rPr>
+          <w:rFonts w:ascii="Times New Roman" w:hAnsi="Times New Roman" w:cs="Times New Roman"/>
+        </w:rPr>
+      </w:pPr>
+      <w:r>
+        <w:rPr>
+          <w:rFonts w:ascii="Times New Roman" w:hAnsi="Times New Roman" w:cs="Times New Roman" w:hint="eastAsia"/>
+        </w:rPr>
+        <w:t>12 breaks (</w:t>
       </w:r>
       <w:r>
         <w:rPr>
@@ -861,125 +884,19 @@
         <w:rPr>
           <w:rFonts w:ascii="Times New Roman" w:hAnsi="Times New Roman" w:cs="Times New Roman" w:hint="eastAsia"/>
         </w:rPr>
-        <w:t>) BD</w:t>
-      </w:r>
-      <w:r>
-        <w:rPr>
-          <w:rFonts w:ascii="Times New Roman" w:hAnsi="Times New Roman" w:cs="Times New Roman" w:hint="eastAsia"/>
-        </w:rPr>
-        <w:t xml:space="preserve"> (I knew the answer was D but select</w:t>
-      </w:r>
-      <w:r>
-        <w:rPr>
-          <w:rFonts w:ascii="Times New Roman" w:hAnsi="Times New Roman" w:cs="Times New Roman" w:hint="eastAsia"/>
-        </w:rPr>
-        <w:t>e</w:t>
-      </w:r>
-      <w:r>
-        <w:rPr>
-          <w:rFonts w:ascii="Times New Roman" w:hAnsi="Times New Roman" w:cs="Times New Roman" w:hint="eastAsia"/>
-        </w:rPr>
-        <w:t>d C!)</w:t>
-      </w:r>
-    </w:p>
-    <w:p>
-      <w:pPr>
-        <w:rPr>
-          <w:rFonts w:ascii="Times New Roman" w:hAnsi="Times New Roman" w:cs="Times New Roman"/>
-        </w:rPr>
-      </w:pPr>
-      <w:r>
-        <w:rPr>
-          <w:rFonts w:ascii="Times New Roman" w:hAnsi="Times New Roman" w:cs="Times New Roman" w:hint="eastAsia"/>
-        </w:rPr>
-        <w:t>26, ___  (</w:t>
-      </w:r>
-      <w:r>
-        <w:rPr>
-          <w:rFonts w:ascii="Times New Roman" w:hAnsi="Times New Roman" w:cs="Times New Roman"/>
-        </w:rPr>
-        <w:t>×</w:t>
-      </w:r>
-      <w:r>
-        <w:rPr>
-          <w:rFonts w:ascii="Times New Roman" w:hAnsi="Times New Roman" w:cs="Times New Roman" w:hint="eastAsia"/>
-        </w:rPr>
-        <w:t>) full-time</w:t>
-      </w:r>
-    </w:p>
-    <w:p>
-      <w:pPr>
-        <w:rPr>
-          <w:rFonts w:ascii="Times New Roman" w:hAnsi="Times New Roman" w:cs="Times New Roman"/>
-        </w:rPr>
-      </w:pPr>
-      <w:r>
-        <w:rPr>
-          <w:rFonts w:ascii="Times New Roman" w:hAnsi="Times New Roman" w:cs="Times New Roman" w:hint="eastAsia"/>
-        </w:rPr>
-        <w:t>27 short time (</w:t>
-      </w:r>
-      <w:r>
-        <w:rPr>
-          <w:rFonts w:ascii="Times New Roman" w:hAnsi="Times New Roman" w:cs="Times New Roman"/>
-        </w:rPr>
-        <w:t>×</w:t>
-      </w:r>
-      <w:r>
-        <w:rPr>
-          <w:rFonts w:ascii="Times New Roman" w:hAnsi="Times New Roman" w:cs="Times New Roman" w:hint="eastAsia"/>
-        </w:rPr>
-        <w:t>) a term</w:t>
-      </w:r>
-    </w:p>
-    <w:p>
-      <w:pPr>
-        <w:rPr>
-          <w:rFonts w:ascii="Times New Roman" w:hAnsi="Times New Roman" w:cs="Times New Roman"/>
-        </w:rPr>
-      </w:pPr>
-      <w:r>
-        <w:rPr>
-          <w:rFonts w:ascii="Times New Roman" w:hAnsi="Times New Roman" w:cs="Times New Roman" w:hint="eastAsia"/>
-        </w:rPr>
-        <w:t>29. ___ (</w:t>
-      </w:r>
-      <w:r>
-        <w:rPr>
-          <w:rFonts w:ascii="Times New Roman" w:hAnsi="Times New Roman" w:cs="Times New Roman"/>
-        </w:rPr>
-        <w:t>×</w:t>
-      </w:r>
-      <w:r>
-        <w:rPr>
-          <w:rFonts w:ascii="Times New Roman" w:hAnsi="Times New Roman" w:cs="Times New Roman" w:hint="eastAsia"/>
-        </w:rPr>
-        <w:t>) two modules</w:t>
-      </w:r>
-    </w:p>
-    <w:p>
-      <w:pPr>
-        <w:rPr>
-          <w:rFonts w:ascii="Times New Roman" w:hAnsi="Times New Roman" w:cs="Times New Roman"/>
-        </w:rPr>
-      </w:pPr>
-      <w:r>
-        <w:rPr>
-          <w:rFonts w:ascii="Times New Roman" w:hAnsi="Times New Roman" w:cs="Times New Roman" w:hint="eastAsia"/>
-        </w:rPr>
-        <w:t>30. ___(</w:t>
-      </w:r>
-      <w:r>
-        <w:rPr>
-          <w:rFonts w:ascii="Times New Roman" w:hAnsi="Times New Roman" w:cs="Times New Roman"/>
-        </w:rPr>
-        <w:t>×</w:t>
-      </w:r>
-      <w:r>
-        <w:rPr>
-          <w:rFonts w:ascii="Times New Roman" w:hAnsi="Times New Roman" w:cs="Times New Roman" w:hint="eastAsia"/>
-        </w:rPr>
-        <w:t>) a topic</w:t>
+        <w:t xml:space="preserve">) </w:t>
+      </w:r>
+      <w:r>
+        <w:rPr>
+          <w:rFonts w:ascii="Times New Roman" w:hAnsi="Times New Roman" w:cs="Times New Roman" w:hint="eastAsia"/>
+        </w:rPr>
+        <w:t xml:space="preserve">: </w:t>
+      </w:r>
+      <w:r>
+        <w:rPr>
+          <w:rFonts w:ascii="Times New Roman" w:hAnsi="Times New Roman" w:cs="Times New Roman" w:hint="eastAsia"/>
+        </w:rPr>
+        <w:t>brakes</w:t>
       </w:r>
     </w:p>
     <w:p>
@@ -1000,6 +917,177 @@
           <w:i/>
           <w:iCs/>
         </w:rPr>
+        <w:t>Section 3</w:t>
+      </w:r>
+    </w:p>
+    <w:p>
+      <w:pPr>
+        <w:rPr>
+          <w:rFonts w:ascii="Times New Roman" w:hAnsi="Times New Roman" w:cs="Times New Roman"/>
+        </w:rPr>
+      </w:pPr>
+      <w:r>
+        <w:rPr>
+          <w:rFonts w:ascii="Times New Roman" w:hAnsi="Times New Roman" w:cs="Times New Roman" w:hint="eastAsia"/>
+        </w:rPr>
+        <w:t>24</w:t>
+      </w:r>
+      <w:r>
+        <w:rPr>
+          <w:rFonts w:ascii="Times New Roman" w:hAnsi="Times New Roman" w:cs="Times New Roman" w:hint="eastAsia"/>
+        </w:rPr>
+        <w:t>,25 BC (</w:t>
+      </w:r>
+      <w:r>
+        <w:rPr>
+          <w:rFonts w:ascii="Times New Roman" w:hAnsi="Times New Roman" w:cs="Times New Roman"/>
+        </w:rPr>
+        <w:t>×</w:t>
+      </w:r>
+      <w:r>
+        <w:rPr>
+          <w:rFonts w:ascii="Times New Roman" w:hAnsi="Times New Roman" w:cs="Times New Roman" w:hint="eastAsia"/>
+        </w:rPr>
+        <w:t>) BD</w:t>
+      </w:r>
+      <w:r>
+        <w:rPr>
+          <w:rFonts w:ascii="Times New Roman" w:hAnsi="Times New Roman" w:cs="Times New Roman" w:hint="eastAsia"/>
+        </w:rPr>
+        <w:t xml:space="preserve"> (I knew the answer was D but select</w:t>
+      </w:r>
+      <w:r>
+        <w:rPr>
+          <w:rFonts w:ascii="Times New Roman" w:hAnsi="Times New Roman" w:cs="Times New Roman" w:hint="eastAsia"/>
+        </w:rPr>
+        <w:t>e</w:t>
+      </w:r>
+      <w:r>
+        <w:rPr>
+          <w:rFonts w:ascii="Times New Roman" w:hAnsi="Times New Roman" w:cs="Times New Roman" w:hint="eastAsia"/>
+        </w:rPr>
+        <w:t>d C!)</w:t>
+      </w:r>
+    </w:p>
+    <w:p>
+      <w:pPr>
+        <w:rPr>
+          <w:rFonts w:ascii="Times New Roman" w:hAnsi="Times New Roman" w:cs="Times New Roman"/>
+        </w:rPr>
+      </w:pPr>
+      <w:r>
+        <w:rPr>
+          <w:rFonts w:ascii="Times New Roman" w:hAnsi="Times New Roman" w:cs="Times New Roman" w:hint="eastAsia"/>
+        </w:rPr>
+        <w:lastRenderedPageBreak/>
+        <w:t>26, ___  (</w:t>
+      </w:r>
+      <w:r>
+        <w:rPr>
+          <w:rFonts w:ascii="Times New Roman" w:hAnsi="Times New Roman" w:cs="Times New Roman"/>
+        </w:rPr>
+        <w:t>×</w:t>
+      </w:r>
+      <w:r>
+        <w:rPr>
+          <w:rFonts w:ascii="Times New Roman" w:hAnsi="Times New Roman" w:cs="Times New Roman" w:hint="eastAsia"/>
+        </w:rPr>
+        <w:t>) full-time</w:t>
+      </w:r>
+    </w:p>
+    <w:p>
+      <w:pPr>
+        <w:rPr>
+          <w:rFonts w:ascii="Times New Roman" w:hAnsi="Times New Roman" w:cs="Times New Roman"/>
+        </w:rPr>
+      </w:pPr>
+      <w:r>
+        <w:rPr>
+          <w:rFonts w:ascii="Times New Roman" w:hAnsi="Times New Roman" w:cs="Times New Roman" w:hint="eastAsia"/>
+        </w:rPr>
+        <w:t>27 short time (</w:t>
+      </w:r>
+      <w:r>
+        <w:rPr>
+          <w:rFonts w:ascii="Times New Roman" w:hAnsi="Times New Roman" w:cs="Times New Roman"/>
+        </w:rPr>
+        <w:t>×</w:t>
+      </w:r>
+      <w:r>
+        <w:rPr>
+          <w:rFonts w:ascii="Times New Roman" w:hAnsi="Times New Roman" w:cs="Times New Roman" w:hint="eastAsia"/>
+        </w:rPr>
+        <w:t>) a term</w:t>
+      </w:r>
+    </w:p>
+    <w:p>
+      <w:pPr>
+        <w:rPr>
+          <w:rFonts w:ascii="Times New Roman" w:hAnsi="Times New Roman" w:cs="Times New Roman"/>
+        </w:rPr>
+      </w:pPr>
+      <w:r>
+        <w:rPr>
+          <w:rFonts w:ascii="Times New Roman" w:hAnsi="Times New Roman" w:cs="Times New Roman" w:hint="eastAsia"/>
+        </w:rPr>
+        <w:t>29. ___ (</w:t>
+      </w:r>
+      <w:r>
+        <w:rPr>
+          <w:rFonts w:ascii="Times New Roman" w:hAnsi="Times New Roman" w:cs="Times New Roman"/>
+        </w:rPr>
+        <w:t>×</w:t>
+      </w:r>
+      <w:r>
+        <w:rPr>
+          <w:rFonts w:ascii="Times New Roman" w:hAnsi="Times New Roman" w:cs="Times New Roman" w:hint="eastAsia"/>
+        </w:rPr>
+        <w:t>) two modules</w:t>
+      </w:r>
+    </w:p>
+    <w:p>
+      <w:pPr>
+        <w:rPr>
+          <w:rFonts w:ascii="Times New Roman" w:hAnsi="Times New Roman" w:cs="Times New Roman"/>
+        </w:rPr>
+      </w:pPr>
+      <w:r>
+        <w:rPr>
+          <w:rFonts w:ascii="Times New Roman" w:hAnsi="Times New Roman" w:cs="Times New Roman" w:hint="eastAsia"/>
+        </w:rPr>
+        <w:t>30. ___(</w:t>
+      </w:r>
+      <w:r>
+        <w:rPr>
+          <w:rFonts w:ascii="Times New Roman" w:hAnsi="Times New Roman" w:cs="Times New Roman"/>
+        </w:rPr>
+        <w:t>×</w:t>
+      </w:r>
+      <w:r>
+        <w:rPr>
+          <w:rFonts w:ascii="Times New Roman" w:hAnsi="Times New Roman" w:cs="Times New Roman" w:hint="eastAsia"/>
+        </w:rPr>
+        <w:t>) a topic</w:t>
+      </w:r>
+    </w:p>
+    <w:p>
+      <w:pPr>
+        <w:rPr>
+          <w:rFonts w:ascii="Times New Roman" w:hAnsi="Times New Roman" w:cs="Times New Roman"/>
+          <w:b/>
+          <w:bCs/>
+          <w:i/>
+          <w:iCs/>
+        </w:rPr>
+      </w:pPr>
+      <w:r>
+        <w:rPr>
+          <w:rFonts w:ascii="Times New Roman" w:hAnsi="Times New Roman" w:cs="Times New Roman" w:hint="eastAsia"/>
+          <w:b/>
+          <w:bCs/>
+          <w:i/>
+          <w:iCs/>
+        </w:rPr>
         <w:t>Section 4</w:t>
       </w:r>
     </w:p>
@@ -1013,7 +1101,6 @@
         <w:rPr>
           <w:rFonts w:ascii="Times New Roman" w:hAnsi="Times New Roman" w:cs="Times New Roman" w:hint="eastAsia"/>
         </w:rPr>
-        <w:lastRenderedPageBreak/>
         <w:t>32. not care (</w:t>
       </w:r>
       <w:r>
@@ -1878,6 +1965,7 @@
         <w:rPr>
           <w:rFonts w:ascii="Times New Roman" w:hAnsi="Times New Roman" w:cs="Times New Roman" w:hint="eastAsia"/>
         </w:rPr>
+        <w:lastRenderedPageBreak/>
         <w:t>36, ____(</w:t>
       </w:r>
       <w:r>
@@ -2031,7 +2119,6 @@
           <w:i/>
           <w:iCs/>
         </w:rPr>
-        <w:lastRenderedPageBreak/>
         <w:t>Section 1</w:t>
       </w:r>
     </w:p>
@@ -2867,6 +2954,7 @@
         <w:rPr>
           <w:rFonts w:ascii="Times New Roman" w:hAnsi="Times New Roman" w:cs="Times New Roman" w:hint="eastAsia"/>
         </w:rPr>
+        <w:lastRenderedPageBreak/>
         <w:t>Two millions of glass is thrown away, but only 500,000 tons of that is recycled.</w:t>
       </w:r>
       <w:r>
@@ -3068,7 +3156,6 @@
           <w:sz w:val="24"/>
           <w:szCs w:val="24"/>
         </w:rPr>
-        <w:lastRenderedPageBreak/>
         <w:t>Test 4 Listening</w:t>
       </w:r>
     </w:p>
@@ -3938,6 +4025,7 @@
         <w:rPr>
           <w:rFonts w:ascii="Times New Roman" w:hAnsi="Times New Roman" w:cs="Times New Roman" w:hint="eastAsia"/>
         </w:rPr>
+        <w:lastRenderedPageBreak/>
         <w:t xml:space="preserve">30, D </w:t>
       </w:r>
       <w:r>
@@ -4079,7 +4167,6 @@
         <w:rPr>
           <w:rFonts w:ascii="Times New Roman" w:hAnsi="Times New Roman" w:cs="Times New Roman" w:hint="eastAsia"/>
         </w:rPr>
-        <w:lastRenderedPageBreak/>
         <w:t>34, B (</w:t>
       </w:r>
       <w:r>
@@ -4869,6 +4956,7 @@
         <w:rPr>
           <w:rFonts w:ascii="Times New Roman" w:hAnsi="Times New Roman" w:cs="Times New Roman" w:hint="eastAsia"/>
         </w:rPr>
+        <w:lastRenderedPageBreak/>
         <w:t>12. ____</w:t>
       </w:r>
       <w:r>
@@ -5033,7 +5121,6 @@
         <w:rPr>
           <w:rFonts w:ascii="Times New Roman" w:hAnsi="Times New Roman" w:cs="Times New Roman"/>
         </w:rPr>
-        <w:lastRenderedPageBreak/>
         <w:br/>
       </w:r>
       <w:r>
@@ -5604,6 +5691,7 @@
         <w:rPr>
           <w:rFonts w:ascii="Times New Roman" w:hAnsi="Times New Roman" w:cs="Times New Roman" w:hint="eastAsia"/>
         </w:rPr>
+        <w:lastRenderedPageBreak/>
         <w:t>C. a climbing wall</w:t>
       </w:r>
     </w:p>
@@ -5687,7 +5775,6 @@
           <w:sz w:val="24"/>
           <w:szCs w:val="24"/>
         </w:rPr>
-        <w:lastRenderedPageBreak/>
         <w:t>Section 3</w:t>
       </w:r>
     </w:p>
@@ -6338,6 +6425,7 @@
         <w:rPr>
           <w:rFonts w:ascii="Times New Roman" w:hAnsi="Times New Roman" w:cs="Times New Roman" w:hint="eastAsia"/>
         </w:rPr>
+        <w:lastRenderedPageBreak/>
         <w:t xml:space="preserve">The man spoke </w:t>
       </w:r>
       <w:r>
@@ -6511,7 +6599,6 @@
         <w:rPr>
           <w:rFonts w:ascii="Times New Roman" w:hAnsi="Times New Roman" w:cs="Times New Roman" w:hint="eastAsia"/>
         </w:rPr>
-        <w:lastRenderedPageBreak/>
         <w:t>11, A  (x)  C</w:t>
       </w:r>
       <w:r>
@@ -7306,6 +7393,7 @@
         <w:rPr>
           <w:rFonts w:ascii="Times New Roman" w:hAnsi="Times New Roman" w:cs="Times New Roman" w:hint="eastAsia"/>
         </w:rPr>
+        <w:lastRenderedPageBreak/>
         <w:t>34. A  (x)  B</w:t>
       </w:r>
       <w:r>
@@ -8271,6 +8359,7 @@
         <w:rPr>
           <w:rFonts w:ascii="Times New Roman" w:hAnsi="Times New Roman" w:cs="Times New Roman" w:hint="eastAsia"/>
         </w:rPr>
+        <w:lastRenderedPageBreak/>
         <w:t>23. ____  (x) secondary</w:t>
       </w:r>
     </w:p>
@@ -8467,7 +8556,6 @@
           <w:sz w:val="24"/>
           <w:szCs w:val="24"/>
         </w:rPr>
-        <w:lastRenderedPageBreak/>
         <w:t xml:space="preserve">Section 4 </w:t>
       </w:r>
     </w:p>
@@ -9538,7 +9626,7 @@
   <a:extraClrSchemeLst/>
   <a:extLst>
     <a:ext uri="{05A4C25C-085E-4340-85A3-A5531E510DB2}">
-      <thm15:themeFamily xmlns:thm15="http://schemas.microsoft.com/office/thememl/2012/main" xmlns="" name="Office Theme" id="{62F939B6-93AF-4DB8-9C6B-D6C7DFDC589F}" vid="{4A3C46E8-61CC-4603-A589-7422A47A8E4A}"/>
+      <thm15:themeFamily xmlns="" xmlns:thm15="http://schemas.microsoft.com/office/thememl/2012/main" name="Office Theme" id="{62F939B6-93AF-4DB8-9C6B-D6C7DFDC589F}" vid="{4A3C46E8-61CC-4603-A589-7422A47A8E4A}"/>
     </a:ext>
   </a:extLst>
 </a:theme>

</xml_diff>

<commit_message>
noteso of Cambridge IELTS 4 Test 2 Reading and Listening
</commit_message>
<xml_diff>
--- a/IELTS Notes/Listening Test And Analyses..docx
+++ b/IELTS Notes/Listening Test And Analyses..docx
@@ -60,7 +60,7 @@
       <w:pPr>
         <w:outlineLvl w:val="2"/>
         <w:rPr>
-          <w:rFonts w:ascii="Times New Roman" w:hAnsi="Times New Roman" w:cs="Times New Roman" w:hint="eastAsia"/>
+          <w:rFonts w:ascii="Times New Roman" w:hAnsi="Times New Roman" w:cs="Times New Roman"/>
           <w:b/>
           <w:bCs/>
         </w:rPr>
@@ -107,7 +107,7 @@
     <w:p>
       <w:pPr>
         <w:rPr>
-          <w:rFonts w:ascii="Times New Roman" w:hAnsi="Times New Roman" w:cs="Times New Roman" w:hint="eastAsia"/>
+          <w:rFonts w:ascii="Times New Roman" w:hAnsi="Times New Roman" w:cs="Times New Roman"/>
           <w:b/>
           <w:bCs/>
           <w:i/>
@@ -116,7 +116,6 @@
           <w:szCs w:val="24"/>
         </w:rPr>
       </w:pPr>
-      <w:bookmarkStart w:id="0" w:name="_GoBack"/>
       <w:r>
         <w:rPr>
           <w:rFonts w:ascii="Times New Roman" w:hAnsi="Times New Roman" w:cs="Times New Roman" w:hint="eastAsia"/>
@@ -130,7 +129,6 @@
         <w:t>Section 1</w:t>
       </w:r>
     </w:p>
-    <w:bookmarkEnd w:id="0"/>
     <w:p>
       <w:pPr>
         <w:rPr>
@@ -278,7 +276,7 @@
     <w:p>
       <w:pPr>
         <w:rPr>
-          <w:rFonts w:ascii="Times New Roman" w:hAnsi="Times New Roman" w:cs="Times New Roman"/>
+          <w:rFonts w:ascii="Times New Roman" w:hAnsi="Times New Roman" w:cs="Times New Roman" w:hint="eastAsia"/>
         </w:rPr>
       </w:pPr>
       <w:r>
@@ -379,19 +377,37 @@
           <w:rFonts w:ascii="Times New Roman" w:hAnsi="Times New Roman" w:cs="Times New Roman"/>
           <w:b/>
           <w:bCs/>
-          <w:sz w:val="24"/>
-          <w:szCs w:val="24"/>
-        </w:rPr>
-      </w:pPr>
-      <w:r>
-        <w:rPr>
-          <w:rFonts w:ascii="Times New Roman" w:hAnsi="Times New Roman" w:cs="Times New Roman"/>
-          <w:b/>
-          <w:bCs/>
-          <w:sz w:val="24"/>
-          <w:szCs w:val="24"/>
-        </w:rPr>
-        <w:t xml:space="preserve">Test 3 </w:t>
+        </w:rPr>
+      </w:pPr>
+      <w:r>
+        <w:rPr>
+          <w:rFonts w:ascii="Times New Roman" w:hAnsi="Times New Roman" w:cs="Times New Roman"/>
+          <w:b/>
+          <w:bCs/>
+          <w:sz w:val="24"/>
+          <w:szCs w:val="24"/>
+        </w:rPr>
+        <w:t xml:space="preserve">Test </w:t>
+      </w:r>
+      <w:r>
+        <w:rPr>
+          <w:rFonts w:ascii="Times New Roman" w:hAnsi="Times New Roman" w:cs="Times New Roman" w:hint="eastAsia"/>
+          <w:b/>
+          <w:bCs/>
+          <w:sz w:val="24"/>
+          <w:szCs w:val="24"/>
+        </w:rPr>
+        <w:t>2</w:t>
+      </w:r>
+      <w:r>
+        <w:rPr>
+          <w:rFonts w:ascii="Times New Roman" w:hAnsi="Times New Roman" w:cs="Times New Roman"/>
+          <w:b/>
+          <w:bCs/>
+          <w:sz w:val="24"/>
+          <w:szCs w:val="24"/>
+        </w:rPr>
+        <w:t xml:space="preserve"> </w:t>
       </w:r>
       <w:r>
         <w:rPr>
@@ -416,7 +432,7 @@
       </w:pPr>
       <w:r>
         <w:rPr>
-          <w:rFonts w:ascii="Times New Roman" w:hAnsi="Times New Roman" w:cs="Times New Roman"/>
+          <w:rFonts w:ascii="Times New Roman" w:hAnsi="Times New Roman" w:cs="Times New Roman" w:hint="eastAsia"/>
           <w:b/>
           <w:bCs/>
           <w:i/>
@@ -424,6 +440,394 @@
           <w:sz w:val="24"/>
           <w:szCs w:val="24"/>
         </w:rPr>
+        <w:t xml:space="preserve">Section </w:t>
+      </w:r>
+      <w:r>
+        <w:rPr>
+          <w:rFonts w:ascii="Times New Roman" w:hAnsi="Times New Roman" w:cs="Times New Roman" w:hint="eastAsia"/>
+          <w:b/>
+          <w:bCs/>
+          <w:i/>
+          <w:iCs/>
+          <w:sz w:val="24"/>
+          <w:szCs w:val="24"/>
+        </w:rPr>
+        <w:t>3</w:t>
+      </w:r>
+    </w:p>
+    <w:p>
+      <w:pPr>
+        <w:rPr>
+          <w:rFonts w:ascii="Times New Roman" w:hAnsi="Times New Roman" w:cs="Times New Roman" w:hint="eastAsia"/>
+          <w:bCs/>
+          <w:sz w:val="24"/>
+          <w:szCs w:val="24"/>
+        </w:rPr>
+      </w:pPr>
+      <w:r>
+        <w:rPr>
+          <w:rFonts w:ascii="Times New Roman" w:hAnsi="Times New Roman" w:cs="Times New Roman" w:hint="eastAsia"/>
+          <w:bCs/>
+          <w:sz w:val="24"/>
+          <w:szCs w:val="24"/>
+        </w:rPr>
+        <w:t>25-56. B, E (x)  B,C</w:t>
+      </w:r>
+    </w:p>
+    <w:p>
+      <w:pPr>
+        <w:rPr>
+          <w:rFonts w:ascii="Times New Roman" w:hAnsi="Times New Roman" w:cs="Times New Roman" w:hint="eastAsia"/>
+          <w:bCs/>
+          <w:sz w:val="24"/>
+          <w:szCs w:val="24"/>
+        </w:rPr>
+      </w:pPr>
+      <w:r>
+        <w:rPr>
+          <w:rFonts w:ascii="Times New Roman" w:hAnsi="Times New Roman" w:cs="Times New Roman" w:hint="eastAsia"/>
+          <w:bCs/>
+          <w:sz w:val="24"/>
+          <w:szCs w:val="24"/>
+        </w:rPr>
+        <w:t>Option E hasn</w:t>
+      </w:r>
+      <w:r>
+        <w:rPr>
+          <w:rFonts w:ascii="Times New Roman" w:hAnsi="Times New Roman" w:cs="Times New Roman"/>
+          <w:bCs/>
+          <w:sz w:val="24"/>
+          <w:szCs w:val="24"/>
+        </w:rPr>
+        <w:t>’</w:t>
+      </w:r>
+      <w:r>
+        <w:rPr>
+          <w:rFonts w:ascii="Times New Roman" w:hAnsi="Times New Roman" w:cs="Times New Roman" w:hint="eastAsia"/>
+          <w:bCs/>
+          <w:sz w:val="24"/>
+          <w:szCs w:val="24"/>
+        </w:rPr>
+        <w:t xml:space="preserve">t been mentioned. </w:t>
+      </w:r>
+      <w:r>
+        <w:rPr>
+          <w:rFonts w:ascii="Times New Roman" w:hAnsi="Times New Roman" w:cs="Times New Roman" w:hint="eastAsia"/>
+          <w:bCs/>
+          <w:sz w:val="24"/>
+          <w:szCs w:val="24"/>
+        </w:rPr>
+        <w:t>Don</w:t>
+      </w:r>
+      <w:r>
+        <w:rPr>
+          <w:rFonts w:ascii="Times New Roman" w:hAnsi="Times New Roman" w:cs="Times New Roman"/>
+          <w:bCs/>
+          <w:sz w:val="24"/>
+          <w:szCs w:val="24"/>
+        </w:rPr>
+        <w:t>’</w:t>
+      </w:r>
+      <w:r>
+        <w:rPr>
+          <w:rFonts w:ascii="Times New Roman" w:hAnsi="Times New Roman" w:cs="Times New Roman" w:hint="eastAsia"/>
+          <w:bCs/>
+          <w:sz w:val="24"/>
+          <w:szCs w:val="24"/>
+        </w:rPr>
+        <w:t xml:space="preserve">t </w:t>
+      </w:r>
+      <w:r>
+        <w:rPr>
+          <w:rFonts w:ascii="Times New Roman" w:hAnsi="Times New Roman" w:cs="Times New Roman" w:hint="eastAsia"/>
+          <w:bCs/>
+          <w:sz w:val="24"/>
+          <w:szCs w:val="24"/>
+        </w:rPr>
+        <w:t xml:space="preserve">just </w:t>
+      </w:r>
+      <w:r>
+        <w:rPr>
+          <w:rFonts w:ascii="Times New Roman" w:hAnsi="Times New Roman" w:cs="Times New Roman" w:hint="eastAsia"/>
+          <w:bCs/>
+          <w:sz w:val="24"/>
+          <w:szCs w:val="24"/>
+        </w:rPr>
+        <w:t>flick thro</w:t>
+      </w:r>
+      <w:r>
+        <w:rPr>
+          <w:rFonts w:ascii="Times New Roman" w:hAnsi="Times New Roman" w:cs="Times New Roman" w:hint="eastAsia"/>
+          <w:bCs/>
+          <w:sz w:val="24"/>
+          <w:szCs w:val="24"/>
+        </w:rPr>
+        <w:t>u</w:t>
+      </w:r>
+      <w:r>
+        <w:rPr>
+          <w:rFonts w:ascii="Times New Roman" w:hAnsi="Times New Roman" w:cs="Times New Roman" w:hint="eastAsia"/>
+          <w:bCs/>
+          <w:sz w:val="24"/>
+          <w:szCs w:val="24"/>
+        </w:rPr>
+        <w:t>gh options but r</w:t>
+      </w:r>
+      <w:r>
+        <w:rPr>
+          <w:rFonts w:ascii="Times New Roman" w:hAnsi="Times New Roman" w:cs="Times New Roman" w:hint="eastAsia"/>
+          <w:bCs/>
+          <w:sz w:val="24"/>
+          <w:szCs w:val="24"/>
+        </w:rPr>
+        <w:t xml:space="preserve">ead all </w:t>
+      </w:r>
+      <w:r>
+        <w:rPr>
+          <w:rFonts w:ascii="Times New Roman" w:hAnsi="Times New Roman" w:cs="Times New Roman" w:hint="eastAsia"/>
+          <w:bCs/>
+          <w:sz w:val="24"/>
+          <w:szCs w:val="24"/>
+        </w:rPr>
+        <w:t xml:space="preserve">of them </w:t>
+      </w:r>
+      <w:r>
+        <w:rPr>
+          <w:rFonts w:ascii="Times New Roman" w:hAnsi="Times New Roman" w:cs="Times New Roman" w:hint="eastAsia"/>
+          <w:bCs/>
+          <w:sz w:val="24"/>
+          <w:szCs w:val="24"/>
+        </w:rPr>
+        <w:t>and try to understand them</w:t>
+      </w:r>
+      <w:r>
+        <w:rPr>
+          <w:rFonts w:ascii="Times New Roman" w:hAnsi="Times New Roman" w:cs="Times New Roman" w:hint="eastAsia"/>
+          <w:bCs/>
+          <w:sz w:val="24"/>
+          <w:szCs w:val="24"/>
+        </w:rPr>
+        <w:t xml:space="preserve"> in the short given time</w:t>
+      </w:r>
+      <w:r>
+        <w:rPr>
+          <w:rFonts w:ascii="Times New Roman" w:hAnsi="Times New Roman" w:cs="Times New Roman" w:hint="eastAsia"/>
+          <w:bCs/>
+          <w:sz w:val="24"/>
+          <w:szCs w:val="24"/>
+        </w:rPr>
+        <w:t xml:space="preserve"> </w:t>
+      </w:r>
+      <w:r>
+        <w:rPr>
+          <w:rFonts w:ascii="Times New Roman" w:hAnsi="Times New Roman" w:cs="Times New Roman" w:hint="eastAsia"/>
+          <w:bCs/>
+          <w:sz w:val="24"/>
+          <w:szCs w:val="24"/>
+        </w:rPr>
+        <w:t>if you can.</w:t>
+      </w:r>
+      <w:r>
+        <w:rPr>
+          <w:rFonts w:ascii="Times New Roman" w:hAnsi="Times New Roman" w:cs="Times New Roman" w:hint="eastAsia"/>
+          <w:bCs/>
+          <w:sz w:val="24"/>
+          <w:szCs w:val="24"/>
+        </w:rPr>
+        <w:t xml:space="preserve"> </w:t>
+      </w:r>
+    </w:p>
+    <w:p>
+      <w:pPr>
+        <w:rPr>
+          <w:rFonts w:ascii="Times New Roman" w:hAnsi="Times New Roman" w:cs="Times New Roman" w:hint="eastAsia"/>
+          <w:bCs/>
+          <w:sz w:val="24"/>
+          <w:szCs w:val="24"/>
+        </w:rPr>
+      </w:pPr>
+      <w:r>
+        <w:rPr>
+          <w:rFonts w:ascii="Times New Roman" w:hAnsi="Times New Roman" w:cs="Times New Roman" w:hint="eastAsia"/>
+          <w:bCs/>
+          <w:sz w:val="24"/>
+          <w:szCs w:val="24"/>
+        </w:rPr>
+        <w:t xml:space="preserve">Keep on listening. The female student then said, </w:t>
+      </w:r>
+      <w:r>
+        <w:rPr>
+          <w:rFonts w:ascii="Times New Roman" w:hAnsi="Times New Roman" w:cs="Times New Roman"/>
+          <w:bCs/>
+          <w:sz w:val="24"/>
+          <w:szCs w:val="24"/>
+        </w:rPr>
+        <w:t>“</w:t>
+      </w:r>
+      <w:r>
+        <w:rPr>
+          <w:rFonts w:ascii="Times New Roman" w:hAnsi="Times New Roman" w:cs="Times New Roman" w:hint="eastAsia"/>
+          <w:bCs/>
+          <w:sz w:val="24"/>
+          <w:szCs w:val="24"/>
+        </w:rPr>
+        <w:t>Another</w:t>
+      </w:r>
+      <w:r>
+        <w:rPr>
+          <w:rFonts w:ascii="Times New Roman" w:hAnsi="Times New Roman" w:cs="Times New Roman" w:hint="eastAsia"/>
+          <w:bCs/>
+          <w:sz w:val="24"/>
+          <w:szCs w:val="24"/>
+        </w:rPr>
+        <w:t xml:space="preserve"> drawback</w:t>
+      </w:r>
+      <w:r>
+        <w:rPr>
+          <w:rFonts w:ascii="Times New Roman" w:hAnsi="Times New Roman" w:cs="Times New Roman" w:hint="eastAsia"/>
+          <w:bCs/>
+          <w:sz w:val="24"/>
+          <w:szCs w:val="24"/>
+        </w:rPr>
+        <w:t xml:space="preserve"> I remember...</w:t>
+      </w:r>
+      <w:r>
+        <w:rPr>
+          <w:rFonts w:ascii="Times New Roman" w:hAnsi="Times New Roman" w:cs="Times New Roman"/>
+          <w:bCs/>
+          <w:sz w:val="24"/>
+          <w:szCs w:val="24"/>
+        </w:rPr>
+        <w:t>”</w:t>
+      </w:r>
+      <w:r>
+        <w:rPr>
+          <w:rFonts w:ascii="Times New Roman" w:hAnsi="Times New Roman" w:cs="Times New Roman" w:hint="eastAsia"/>
+          <w:bCs/>
+          <w:sz w:val="24"/>
+          <w:szCs w:val="24"/>
+        </w:rPr>
+        <w:t>. Then we can find the second answer.</w:t>
+      </w:r>
+      <w:bookmarkStart w:id="0" w:name="_GoBack"/>
+      <w:bookmarkEnd w:id="0"/>
+    </w:p>
+    <w:p>
+      <w:pPr>
+        <w:rPr>
+          <w:rFonts w:ascii="Times New Roman" w:hAnsi="Times New Roman" w:cs="Times New Roman"/>
+          <w:bCs/>
+          <w:sz w:val="24"/>
+          <w:szCs w:val="24"/>
+        </w:rPr>
+      </w:pPr>
+      <w:r>
+        <w:rPr>
+          <w:rFonts w:ascii="Times New Roman" w:hAnsi="Times New Roman" w:cs="Times New Roman" w:hint="eastAsia"/>
+          <w:bCs/>
+          <w:sz w:val="24"/>
+          <w:szCs w:val="24"/>
+        </w:rPr>
+        <w:t>27. Meahta (x)  Mehta</w:t>
+      </w:r>
+    </w:p>
+    <w:p>
+      <w:pPr>
+        <w:rPr>
+          <w:rFonts w:ascii="Times New Roman" w:hAnsi="Times New Roman" w:cs="Times New Roman" w:hint="eastAsia"/>
+        </w:rPr>
+      </w:pPr>
+      <w:r>
+        <w:rPr>
+          <w:rFonts w:ascii="Times New Roman" w:hAnsi="Times New Roman" w:cs="Times New Roman" w:hint="eastAsia"/>
+        </w:rPr>
+        <w:t>29. _____ (x)  London University (Press)</w:t>
+      </w:r>
+    </w:p>
+    <w:p>
+      <w:pPr>
+        <w:rPr>
+          <w:rFonts w:ascii="Times New Roman" w:hAnsi="Times New Roman" w:cs="Times New Roman" w:hint="eastAsia"/>
+        </w:rPr>
+      </w:pPr>
+      <w:r>
+        <w:rPr>
+          <w:rFonts w:ascii="Times New Roman" w:hAnsi="Times New Roman" w:cs="Times New Roman" w:hint="eastAsia"/>
+        </w:rPr>
+        <w:t>The reason that I didn</w:t>
+      </w:r>
+      <w:r>
+        <w:rPr>
+          <w:rFonts w:ascii="Times New Roman" w:hAnsi="Times New Roman" w:cs="Times New Roman"/>
+        </w:rPr>
+        <w:t>’</w:t>
+      </w:r>
+      <w:r>
+        <w:rPr>
+          <w:rFonts w:ascii="Times New Roman" w:hAnsi="Times New Roman" w:cs="Times New Roman" w:hint="eastAsia"/>
+        </w:rPr>
+        <w:t xml:space="preserve">t hear the answer, which come quickly, is that I was busy writing the previous answer so that I was not able to hear it. </w:t>
+      </w:r>
+    </w:p>
+    <w:p>
+      <w:pPr>
+        <w:rPr>
+          <w:rFonts w:ascii="Times New Roman" w:hAnsi="Times New Roman" w:cs="Times New Roman"/>
+        </w:rPr>
+      </w:pPr>
+    </w:p>
+    <w:p>
+      <w:pPr>
+        <w:outlineLvl w:val="2"/>
+        <w:rPr>
+          <w:rFonts w:ascii="Times New Roman" w:hAnsi="Times New Roman" w:cs="Times New Roman"/>
+          <w:b/>
+          <w:bCs/>
+          <w:sz w:val="24"/>
+          <w:szCs w:val="24"/>
+        </w:rPr>
+      </w:pPr>
+      <w:r>
+        <w:rPr>
+          <w:rFonts w:ascii="Times New Roman" w:hAnsi="Times New Roman" w:cs="Times New Roman"/>
+          <w:b/>
+          <w:bCs/>
+          <w:sz w:val="24"/>
+          <w:szCs w:val="24"/>
+        </w:rPr>
+        <w:t xml:space="preserve">Test 3 </w:t>
+      </w:r>
+      <w:r>
+        <w:rPr>
+          <w:rFonts w:ascii="Times New Roman" w:hAnsi="Times New Roman" w:cs="Times New Roman"/>
+          <w:b/>
+          <w:bCs/>
+        </w:rPr>
+        <w:t>Listening</w:t>
+      </w:r>
+    </w:p>
+    <w:p>
+      <w:pPr>
+        <w:rPr>
+          <w:rFonts w:ascii="Times New Roman" w:hAnsi="Times New Roman" w:cs="Times New Roman"/>
+          <w:b/>
+          <w:bCs/>
+          <w:i/>
+          <w:iCs/>
+          <w:sz w:val="24"/>
+          <w:szCs w:val="24"/>
+        </w:rPr>
+      </w:pPr>
+      <w:r>
+        <w:rPr>
+          <w:rFonts w:ascii="Times New Roman" w:hAnsi="Times New Roman" w:cs="Times New Roman"/>
+          <w:b/>
+          <w:bCs/>
+          <w:i/>
+          <w:iCs/>
+          <w:sz w:val="24"/>
+          <w:szCs w:val="24"/>
+        </w:rPr>
         <w:t>Section 4</w:t>
       </w:r>
     </w:p>
@@ -608,6 +1012,7 @@
           <w:sz w:val="24"/>
           <w:szCs w:val="24"/>
         </w:rPr>
+        <w:lastRenderedPageBreak/>
         <w:t>Section 1</w:t>
       </w:r>
     </w:p>
@@ -979,7 +1384,6 @@
         <w:rPr>
           <w:rFonts w:ascii="Times New Roman" w:hAnsi="Times New Roman" w:cs="Times New Roman" w:hint="eastAsia"/>
         </w:rPr>
-        <w:lastRenderedPageBreak/>
         <w:t>26, ___  (</w:t>
       </w:r>
       <w:r>
@@ -1621,6 +2025,7 @@
         <w:rPr>
           <w:rFonts w:ascii="Times New Roman" w:hAnsi="Times New Roman" w:cs="Times New Roman" w:hint="eastAsia"/>
         </w:rPr>
+        <w:lastRenderedPageBreak/>
         <w:t>6, 40 (x) 48</w:t>
       </w:r>
     </w:p>
@@ -1965,7 +2370,6 @@
         <w:rPr>
           <w:rFonts w:ascii="Times New Roman" w:hAnsi="Times New Roman" w:cs="Times New Roman" w:hint="eastAsia"/>
         </w:rPr>
-        <w:lastRenderedPageBreak/>
         <w:t>36, ____(</w:t>
       </w:r>
       <w:r>
@@ -2648,6 +3052,7 @@
         <w:rPr>
           <w:rFonts w:ascii="Times New Roman" w:hAnsi="Times New Roman" w:cs="Times New Roman" w:hint="eastAsia"/>
         </w:rPr>
+        <w:lastRenderedPageBreak/>
         <w:t>27, long group discussion (</w:t>
       </w:r>
       <w:r>
@@ -2954,7 +3359,6 @@
         <w:rPr>
           <w:rFonts w:ascii="Times New Roman" w:hAnsi="Times New Roman" w:cs="Times New Roman" w:hint="eastAsia"/>
         </w:rPr>
-        <w:lastRenderedPageBreak/>
         <w:t>Two millions of glass is thrown away, but only 500,000 tons of that is recycled.</w:t>
       </w:r>
       <w:r>
@@ -3732,6 +4136,7 @@
         <w:rPr>
           <w:rFonts w:ascii="Times New Roman" w:hAnsi="Times New Roman" w:cs="Times New Roman" w:hint="eastAsia"/>
         </w:rPr>
+        <w:lastRenderedPageBreak/>
         <w:t>15, __________</w:t>
       </w:r>
       <w:r>
@@ -4025,7 +4430,6 @@
         <w:rPr>
           <w:rFonts w:ascii="Times New Roman" w:hAnsi="Times New Roman" w:cs="Times New Roman" w:hint="eastAsia"/>
         </w:rPr>
-        <w:lastRenderedPageBreak/>
         <w:t xml:space="preserve">30, D </w:t>
       </w:r>
       <w:r>
@@ -4539,6 +4943,7 @@
         <w:rPr>
           <w:rFonts w:ascii="Times New Roman" w:hAnsi="Times New Roman" w:cs="Times New Roman" w:hint="eastAsia"/>
         </w:rPr>
+        <w:lastRenderedPageBreak/>
         <w:t>keep-fit studio</w:t>
       </w:r>
       <w:r>
@@ -4956,7 +5361,6 @@
         <w:rPr>
           <w:rFonts w:ascii="Times New Roman" w:hAnsi="Times New Roman" w:cs="Times New Roman" w:hint="eastAsia"/>
         </w:rPr>
-        <w:lastRenderedPageBreak/>
         <w:t>12. ____</w:t>
       </w:r>
       <w:r>
@@ -5447,6 +5851,7 @@
         <w:rPr>
           <w:rFonts w:ascii="Times New Roman" w:hAnsi="Times New Roman" w:cs="Times New Roman" w:hint="eastAsia"/>
         </w:rPr>
+        <w:lastRenderedPageBreak/>
         <w:t>11. King Streets (x)  King Street</w:t>
       </w:r>
       <w:r>
@@ -5691,7 +6096,6 @@
         <w:rPr>
           <w:rFonts w:ascii="Times New Roman" w:hAnsi="Times New Roman" w:cs="Times New Roman" w:hint="eastAsia"/>
         </w:rPr>
-        <w:lastRenderedPageBreak/>
         <w:t>C. a climbing wall</w:t>
       </w:r>
     </w:p>
@@ -6154,6 +6558,7 @@
         <w:rPr>
           <w:rFonts w:ascii="Times New Roman" w:hAnsi="Times New Roman" w:cs="Times New Roman" w:hint="eastAsia"/>
         </w:rPr>
+        <w:lastRenderedPageBreak/>
         <w:t xml:space="preserve">N.B. There are double </w:t>
       </w:r>
       <w:r>
@@ -6425,7 +6830,6 @@
         <w:rPr>
           <w:rFonts w:ascii="Times New Roman" w:hAnsi="Times New Roman" w:cs="Times New Roman" w:hint="eastAsia"/>
         </w:rPr>
-        <w:lastRenderedPageBreak/>
         <w:t xml:space="preserve">The man spoke </w:t>
       </w:r>
       <w:r>
@@ -7121,6 +7525,7 @@
         <w:rPr>
           <w:rFonts w:ascii="Times New Roman" w:hAnsi="Times New Roman" w:cs="Times New Roman" w:hint="eastAsia"/>
         </w:rPr>
+        <w:lastRenderedPageBreak/>
         <w:t>29. Opera House (x) Club</w:t>
       </w:r>
       <w:r>
@@ -7393,7 +7798,6 @@
         <w:rPr>
           <w:rFonts w:ascii="Times New Roman" w:hAnsi="Times New Roman" w:cs="Times New Roman" w:hint="eastAsia"/>
         </w:rPr>
-        <w:lastRenderedPageBreak/>
         <w:t>34. A  (x)  B</w:t>
       </w:r>
       <w:r>
@@ -8076,7 +8480,14 @@
         <w:rPr>
           <w:rFonts w:ascii="Times New Roman" w:hAnsi="Times New Roman" w:cs="Times New Roman" w:hint="eastAsia"/>
         </w:rPr>
-        <w:t xml:space="preserve"> Normaly, there are letters in the name of route of bus in </w:t>
+        <w:t xml:space="preserve"> Normaly, there are letters in the </w:t>
+      </w:r>
+      <w:r>
+        <w:rPr>
+          <w:rFonts w:ascii="Times New Roman" w:hAnsi="Times New Roman" w:cs="Times New Roman" w:hint="eastAsia"/>
+        </w:rPr>
+        <w:lastRenderedPageBreak/>
+        <w:t xml:space="preserve">name of route of bus in </w:t>
       </w:r>
       <w:r>
         <w:rPr>
@@ -8359,7 +8770,6 @@
         <w:rPr>
           <w:rFonts w:ascii="Times New Roman" w:hAnsi="Times New Roman" w:cs="Times New Roman" w:hint="eastAsia"/>
         </w:rPr>
-        <w:lastRenderedPageBreak/>
         <w:t>23. ____  (x) secondary</w:t>
       </w:r>
     </w:p>
@@ -9626,7 +10036,7 @@
   <a:extraClrSchemeLst/>
   <a:extLst>
     <a:ext uri="{05A4C25C-085E-4340-85A3-A5531E510DB2}">
-      <thm15:themeFamily xmlns="" xmlns:thm15="http://schemas.microsoft.com/office/thememl/2012/main" name="Office Theme" id="{62F939B6-93AF-4DB8-9C6B-D6C7DFDC589F}" vid="{4A3C46E8-61CC-4603-A589-7422A47A8E4A}"/>
+      <thm15:themeFamily xmlns:thm15="http://schemas.microsoft.com/office/thememl/2012/main" xmlns="" name="Office Theme" id="{62F939B6-93AF-4DB8-9C6B-D6C7DFDC589F}" vid="{4A3C46E8-61CC-4603-A589-7422A47A8E4A}"/>
     </a:ext>
   </a:extLst>
 </a:theme>

</xml_diff>

<commit_message>
a journal of Tue. 29 April 2025
</commit_message>
<xml_diff>
--- a/IELTS Notes/Listening Test And Analyses..docx
+++ b/IELTS Notes/Listening Test And Analyses..docx
@@ -1228,8 +1228,6 @@
         </w:rPr>
         <w:t xml:space="preserve"> is also correct. </w:t>
       </w:r>
-      <w:bookmarkStart w:id="0" w:name="_GoBack"/>
-      <w:bookmarkEnd w:id="0"/>
     </w:p>
     <w:p>
       <w:pPr>
@@ -1332,19 +1330,19 @@
         </w:rPr>
         <w:t>(BrE) = dormitory (AmE)</w:t>
       </w:r>
-      <w:bookmarkStart w:id="1" w:name="_Hlk183599797"/>
-    </w:p>
-    <w:p>
-      <w:pPr>
-        <w:rPr>
-          <w:rFonts w:ascii="Times New Roman" w:hAnsi="Times New Roman" w:cs="Times New Roman"/>
-        </w:rPr>
-      </w:pPr>
-      <w:r>
-        <w:rPr>
-          <w:rFonts w:ascii="Times New Roman" w:hAnsi="Times New Roman" w:cs="Times New Roman" w:hint="eastAsia"/>
-        </w:rPr>
-        <w:t xml:space="preserve">hall/halls of residence: </w:t>
+      <w:bookmarkStart w:id="0" w:name="_Hlk183599797"/>
+    </w:p>
+    <w:p>
+      <w:pPr>
+        <w:rPr>
+          <w:rFonts w:ascii="Times New Roman" w:hAnsi="Times New Roman" w:cs="Times New Roman" w:hint="eastAsia"/>
+        </w:rPr>
+      </w:pPr>
+      <w:r>
+        <w:rPr>
+          <w:rFonts w:ascii="Times New Roman" w:hAnsi="Times New Roman" w:cs="Times New Roman" w:hint="eastAsia"/>
+        </w:rPr>
+        <w:t>hall/halls of residence:</w:t>
       </w:r>
       <w:r>
         <w:rPr>
@@ -1376,8 +1374,85 @@
         </w:rPr>
         <w:t>)</w:t>
       </w:r>
-    </w:p>
-    <w:bookmarkEnd w:id="1"/>
+      <w:r>
+        <w:rPr>
+          <w:rFonts w:ascii="Times New Roman" w:hAnsi="Times New Roman" w:cs="Times New Roman"/>
+        </w:rPr>
+        <w:br/>
+      </w:r>
+      <w:r>
+        <w:rPr>
+          <w:rFonts w:ascii="Times New Roman" w:hAnsi="Times New Roman" w:cs="Times New Roman" w:hint="eastAsia"/>
+        </w:rPr>
+        <w:t xml:space="preserve">Note that the </w:t>
+      </w:r>
+      <w:r>
+        <w:rPr>
+          <w:rFonts w:ascii="Times New Roman" w:hAnsi="Times New Roman" w:cs="Times New Roman"/>
+        </w:rPr>
+        <w:t>“</w:t>
+      </w:r>
+      <w:r>
+        <w:rPr>
+          <w:rFonts w:ascii="Times New Roman" w:hAnsi="Times New Roman" w:cs="Times New Roman" w:hint="eastAsia"/>
+        </w:rPr>
+        <w:t>halls</w:t>
+      </w:r>
+      <w:r>
+        <w:rPr>
+          <w:rFonts w:ascii="Times New Roman" w:hAnsi="Times New Roman" w:cs="Times New Roman"/>
+        </w:rPr>
+        <w:t>”</w:t>
+      </w:r>
+      <w:r>
+        <w:rPr>
+          <w:rFonts w:ascii="Times New Roman" w:hAnsi="Times New Roman" w:cs="Times New Roman" w:hint="eastAsia"/>
+        </w:rPr>
+        <w:t xml:space="preserve">  is plural.</w:t>
+      </w:r>
+    </w:p>
+    <w:p>
+      <w:pPr>
+        <w:rPr>
+          <w:rFonts w:ascii="Times New Roman" w:hAnsi="Times New Roman" w:cs="Times New Roman" w:hint="eastAsia"/>
+        </w:rPr>
+      </w:pPr>
+      <w:r>
+        <w:rPr>
+          <w:rFonts w:ascii="Times New Roman" w:hAnsi="Times New Roman" w:cs="Times New Roman" w:hint="eastAsia"/>
+        </w:rPr>
+        <w:t>38. C, F (x) D, F</w:t>
+      </w:r>
+    </w:p>
+    <w:p>
+      <w:pPr>
+        <w:rPr>
+          <w:rFonts w:ascii="Times New Roman" w:hAnsi="Times New Roman" w:cs="Times New Roman" w:hint="eastAsia"/>
+        </w:rPr>
+      </w:pPr>
+      <w:r>
+        <w:rPr>
+          <w:rFonts w:ascii="Times New Roman" w:hAnsi="Times New Roman" w:cs="Times New Roman" w:hint="eastAsia"/>
+        </w:rPr>
+        <w:t xml:space="preserve">What the reresentative said was a small gym, option C is a student health centre, while option D is a mini fitness centre which is more appropriate. </w:t>
+      </w:r>
+      <w:bookmarkStart w:id="1" w:name="_GoBack"/>
+      <w:bookmarkEnd w:id="1"/>
+    </w:p>
+    <w:p>
+      <w:pPr>
+        <w:rPr>
+          <w:rFonts w:ascii="Times New Roman" w:hAnsi="Times New Roman" w:cs="Times New Roman" w:hint="eastAsia"/>
+        </w:rPr>
+      </w:pPr>
+      <w:r>
+        <w:rPr>
+          <w:rFonts w:ascii="Times New Roman" w:hAnsi="Times New Roman" w:cs="Times New Roman" w:hint="eastAsia"/>
+        </w:rPr>
+        <w:t xml:space="preserve"> </w:t>
+      </w:r>
+    </w:p>
+    <w:bookmarkEnd w:id="0"/>
     <w:p>
       <w:pPr>
         <w:outlineLvl w:val="1"/>
@@ -1890,6 +1965,7 @@
         <w:rPr>
           <w:rFonts w:ascii="Times New Roman" w:hAnsi="Times New Roman" w:cs="Times New Roman" w:hint="eastAsia"/>
         </w:rPr>
+        <w:lastRenderedPageBreak/>
         <w:t>30. ___(</w:t>
       </w:r>
       <w:r>
@@ -1998,7 +2074,6 @@
         <w:rPr>
           <w:rFonts w:ascii="Times New Roman" w:hAnsi="Times New Roman" w:cs="Times New Roman" w:hint="eastAsia"/>
         </w:rPr>
-        <w:lastRenderedPageBreak/>
         <w:t>36. ___ (</w:t>
       </w:r>
       <w:r>
@@ -2876,6 +2951,7 @@
         <w:rPr>
           <w:rFonts w:ascii="Times New Roman" w:hAnsi="Times New Roman" w:cs="Times New Roman" w:hint="eastAsia"/>
         </w:rPr>
+        <w:lastRenderedPageBreak/>
         <w:t>40, ____(</w:t>
       </w:r>
       <w:r>
@@ -3028,7 +3104,6 @@
         <w:rPr>
           <w:rFonts w:ascii="Times New Roman" w:hAnsi="Times New Roman" w:cs="Times New Roman" w:hint="eastAsia"/>
         </w:rPr>
-        <w:lastRenderedPageBreak/>
         <w:t>7</w:t>
       </w:r>
       <w:r>
@@ -3906,6 +3981,7 @@
         <w:rPr>
           <w:rFonts w:ascii="Times New Roman" w:hAnsi="Times New Roman" w:cs="Times New Roman" w:hint="eastAsia"/>
         </w:rPr>
+        <w:lastRenderedPageBreak/>
         <w:t>38, plastic bottles (</w:t>
       </w:r>
       <w:r>
@@ -4025,7 +4101,6 @@
         <w:rPr>
           <w:rFonts w:ascii="Times New Roman" w:hAnsi="Times New Roman" w:cs="Times New Roman" w:hint="eastAsia"/>
         </w:rPr>
-        <w:lastRenderedPageBreak/>
         <w:t xml:space="preserve">1, </w:t>
       </w:r>
       <w:r>
@@ -4940,6 +5015,7 @@
           <w:sz w:val="28"/>
           <w:szCs w:val="28"/>
         </w:rPr>
+        <w:lastRenderedPageBreak/>
         <w:t>Section 4</w:t>
       </w:r>
     </w:p>
@@ -5070,7 +5146,6 @@
         <w:rPr>
           <w:rFonts w:ascii="Times New Roman" w:hAnsi="Times New Roman" w:cs="Times New Roman" w:hint="eastAsia"/>
         </w:rPr>
-        <w:lastRenderedPageBreak/>
         <w:t>35, __ (</w:t>
       </w:r>
       <w:r>
@@ -5913,6 +5988,7 @@
         <w:rPr>
           <w:rFonts w:ascii="Times New Roman" w:hAnsi="Times New Roman" w:cs="Times New Roman" w:hint="eastAsia"/>
         </w:rPr>
+        <w:lastRenderedPageBreak/>
         <w:t xml:space="preserve">16. ____ </w:t>
       </w:r>
       <w:r>
@@ -5981,7 +6057,6 @@
         <w:rPr>
           <w:rFonts w:ascii="Times New Roman" w:hAnsi="Times New Roman" w:cs="Times New Roman" w:hint="eastAsia"/>
         </w:rPr>
-        <w:lastRenderedPageBreak/>
         <w:t xml:space="preserve">21. </w:t>
       </w:r>
       <w:r>
@@ -6572,6 +6647,7 @@
         <w:rPr>
           <w:rFonts w:ascii="Times New Roman" w:hAnsi="Times New Roman" w:cs="Times New Roman" w:hint="eastAsia"/>
         </w:rPr>
+        <w:lastRenderedPageBreak/>
         <w:t>F. a castle (a zoo built on the park land of an old castle)</w:t>
       </w:r>
     </w:p>
@@ -6623,7 +6699,6 @@
         <w:rPr>
           <w:rFonts w:ascii="Times New Roman" w:hAnsi="Times New Roman" w:cs="Times New Roman" w:hint="eastAsia"/>
         </w:rPr>
-        <w:lastRenderedPageBreak/>
         <w:t xml:space="preserve">21. catalogs/catalogues </w:t>
       </w:r>
       <w:r>
@@ -7372,6 +7447,7 @@
         <w:rPr>
           <w:rFonts w:ascii="Times New Roman" w:hAnsi="Times New Roman" w:cs="Times New Roman" w:hint="eastAsia"/>
         </w:rPr>
+        <w:lastRenderedPageBreak/>
         <w:t>I didn</w:t>
       </w:r>
       <w:r>
@@ -7466,7 +7542,6 @@
         <w:rPr>
           <w:rFonts w:ascii="Times New Roman" w:hAnsi="Times New Roman" w:cs="Times New Roman" w:hint="eastAsia"/>
         </w:rPr>
-        <w:lastRenderedPageBreak/>
         <w:t>16, E  (x)  B</w:t>
       </w:r>
       <w:r>
@@ -8333,6 +8408,7 @@
         <w:rPr>
           <w:rFonts w:ascii="Times New Roman" w:hAnsi="Times New Roman" w:cs="Times New Roman" w:hint="eastAsia"/>
         </w:rPr>
+        <w:lastRenderedPageBreak/>
         <w:t>40. top  (x) tops</w:t>
       </w:r>
       <w:r>
@@ -8417,7 +8493,6 @@
           <w:sz w:val="24"/>
           <w:szCs w:val="24"/>
         </w:rPr>
-        <w:lastRenderedPageBreak/>
         <w:t>Section 1</w:t>
       </w:r>
     </w:p>
@@ -9366,6 +9441,7 @@
         <w:rPr>
           <w:rFonts w:ascii="Times New Roman" w:hAnsi="Times New Roman" w:cs="Times New Roman" w:hint="eastAsia"/>
         </w:rPr>
+        <w:lastRenderedPageBreak/>
         <w:t>27. one month  (x)  7 working days</w:t>
       </w:r>
     </w:p>
@@ -9417,7 +9493,6 @@
         <w:rPr>
           <w:rFonts w:ascii="Times New Roman" w:hAnsi="Times New Roman" w:cs="Times New Roman" w:hint="eastAsia"/>
         </w:rPr>
-        <w:lastRenderedPageBreak/>
         <w:t>34. A  (x)  C</w:t>
       </w:r>
       <w:r>
@@ -10462,7 +10537,7 @@
   <a:extraClrSchemeLst/>
   <a:extLst>
     <a:ext uri="{05A4C25C-085E-4340-85A3-A5531E510DB2}">
-      <thm15:themeFamily xmlns="" xmlns:thm15="http://schemas.microsoft.com/office/thememl/2012/main" name="Office Theme" id="{62F939B6-93AF-4DB8-9C6B-D6C7DFDC589F}" vid="{4A3C46E8-61CC-4603-A589-7422A47A8E4A}"/>
+      <thm15:themeFamily xmlns:thm15="http://schemas.microsoft.com/office/thememl/2012/main" xmlns="" name="Office Theme" id="{62F939B6-93AF-4DB8-9C6B-D6C7DFDC589F}" vid="{4A3C46E8-61CC-4603-A589-7422A47A8E4A}"/>
     </a:ext>
   </a:extLst>
 </a:theme>

</xml_diff>

<commit_message>
review listening: test 4 of Cabbridge 4
</commit_message>
<xml_diff>
--- a/IELTS Notes/Listening Test And Analyses..docx
+++ b/IELTS Notes/Listening Test And Analyses..docx
@@ -175,7 +175,7 @@
     <w:p>
       <w:pPr>
         <w:rPr>
-          <w:rFonts w:ascii="Times New Roman" w:hAnsi="Times New Roman" w:cs="Times New Roman"/>
+          <w:rFonts w:ascii="Times New Roman" w:hAnsi="Times New Roman" w:cs="Times New Roman" w:hint="eastAsia"/>
         </w:rPr>
       </w:pPr>
       <w:r>
@@ -213,29 +213,6 @@
           <w:rFonts w:ascii="Times New Roman" w:hAnsi="Times New Roman" w:cs="Times New Roman" w:hint="eastAsia"/>
         </w:rPr>
         <w:t>)</w:t>
-      </w:r>
-    </w:p>
-    <w:bookmarkEnd w:id="0"/>
-    <w:p>
-      <w:pPr>
-        <w:outlineLvl w:val="1"/>
-        <w:rPr>
-          <w:rFonts w:ascii="Times New Roman" w:hAnsi="Times New Roman" w:cs="Times New Roman"/>
-          <w:b/>
-          <w:bCs/>
-          <w:sz w:val="28"/>
-          <w:szCs w:val="28"/>
-        </w:rPr>
-      </w:pPr>
-      <w:r>
-        <w:rPr>
-          <w:rFonts w:ascii="Times New Roman" w:hAnsi="Times New Roman" w:cs="Times New Roman" w:hint="eastAsia"/>
-          <w:b/>
-          <w:bCs/>
-          <w:sz w:val="28"/>
-          <w:szCs w:val="28"/>
-        </w:rPr>
-        <w:t>Cambridge IETLS 5</w:t>
       </w:r>
     </w:p>
     <w:p>
@@ -251,13 +228,41 @@
       </w:pPr>
       <w:r>
         <w:rPr>
-          <w:rFonts w:ascii="Times New Roman" w:hAnsi="Times New Roman" w:cs="Times New Roman" w:hint="eastAsia"/>
+          <w:rFonts w:ascii="Times New Roman" w:hAnsi="Times New Roman" w:cs="Times New Roman"/>
           <w:b/>
           <w:bCs/>
           <w:sz w:val="24"/>
           <w:szCs w:val="24"/>
         </w:rPr>
-        <w:t>Test 1 Listening</w:t>
+        <w:t xml:space="preserve">Test </w:t>
+      </w:r>
+      <w:r>
+        <w:rPr>
+          <w:rFonts w:ascii="Times New Roman" w:hAnsi="Times New Roman" w:cs="Times New Roman" w:hint="eastAsia"/>
+          <w:b/>
+          <w:bCs/>
+          <w:sz w:val="24"/>
+          <w:szCs w:val="24"/>
+        </w:rPr>
+        <w:t>4</w:t>
+      </w:r>
+      <w:r>
+        <w:rPr>
+          <w:rFonts w:ascii="Times New Roman" w:hAnsi="Times New Roman" w:cs="Times New Roman"/>
+          <w:b/>
+          <w:bCs/>
+          <w:sz w:val="24"/>
+          <w:szCs w:val="24"/>
+        </w:rPr>
+        <w:t xml:space="preserve"> </w:t>
+      </w:r>
+      <w:r>
+        <w:rPr>
+          <w:rFonts w:ascii="Times New Roman" w:hAnsi="Times New Roman" w:cs="Times New Roman"/>
+          <w:b/>
+          <w:bCs/>
+        </w:rPr>
+        <w:t>Listening</w:t>
       </w:r>
     </w:p>
     <w:p>
@@ -274,7 +279,7 @@
       </w:pPr>
       <w:r>
         <w:rPr>
-          <w:rFonts w:ascii="Times New Roman" w:hAnsi="Times New Roman" w:cs="Times New Roman" w:hint="eastAsia"/>
+          <w:rFonts w:ascii="Times New Roman" w:hAnsi="Times New Roman" w:cs="Times New Roman"/>
           <w:b/>
           <w:bCs/>
           <w:i/>
@@ -282,254 +287,11 @@
           <w:sz w:val="24"/>
           <w:szCs w:val="24"/>
         </w:rPr>
-        <w:t>Section 1</w:t>
-      </w:r>
-    </w:p>
-    <w:p>
-      <w:pPr>
-        <w:rPr>
-          <w:rFonts w:ascii="Times New Roman" w:hAnsi="Times New Roman" w:cs="Times New Roman" w:hint="eastAsia"/>
-        </w:rPr>
-      </w:pPr>
-      <w:r>
-        <w:rPr>
-          <w:rFonts w:ascii="Times New Roman" w:hAnsi="Times New Roman" w:cs="Times New Roman" w:hint="eastAsia"/>
-        </w:rPr>
-        <w:t>1. mini bus (</w:t>
-      </w:r>
-      <w:r>
-        <w:rPr>
-          <w:rFonts w:ascii="Times New Roman" w:hAnsi="Times New Roman" w:cs="Times New Roman"/>
-        </w:rPr>
-        <w:t>×</w:t>
-      </w:r>
-      <w:r>
-        <w:rPr>
-          <w:rFonts w:ascii="Times New Roman" w:hAnsi="Times New Roman" w:cs="Times New Roman" w:hint="eastAsia"/>
-        </w:rPr>
-        <w:t xml:space="preserve">)  a minibus.  </w:t>
-      </w:r>
-    </w:p>
-    <w:p>
-      <w:pPr>
-        <w:rPr>
-          <w:rFonts w:ascii="Times New Roman" w:hAnsi="Times New Roman" w:cs="Times New Roman"/>
-        </w:rPr>
-      </w:pPr>
-      <w:bookmarkStart w:id="1" w:name="_GoBack"/>
-      <w:bookmarkEnd w:id="1"/>
-      <w:r>
-        <w:rPr>
-          <w:rFonts w:ascii="Times New Roman" w:hAnsi="Times New Roman" w:cs="Times New Roman" w:hint="eastAsia"/>
-        </w:rPr>
-        <w:t xml:space="preserve">Note </w:t>
-      </w:r>
-      <w:r>
-        <w:rPr>
-          <w:rFonts w:ascii="Times New Roman" w:hAnsi="Times New Roman" w:cs="Times New Roman" w:hint="eastAsia"/>
-        </w:rPr>
-        <w:t xml:space="preserve">that </w:t>
-      </w:r>
-      <w:r>
-        <w:rPr>
-          <w:rFonts w:ascii="Times New Roman" w:hAnsi="Times New Roman" w:cs="Times New Roman"/>
-        </w:rPr>
-        <w:t>‘</w:t>
-      </w:r>
-      <w:r>
-        <w:rPr>
-          <w:rFonts w:ascii="Times New Roman" w:hAnsi="Times New Roman" w:cs="Times New Roman" w:hint="eastAsia"/>
-        </w:rPr>
-        <w:t>minibus</w:t>
-      </w:r>
-      <w:r>
-        <w:rPr>
-          <w:rFonts w:ascii="Times New Roman" w:hAnsi="Times New Roman" w:cs="Times New Roman"/>
-        </w:rPr>
-        <w:t>’</w:t>
-      </w:r>
-      <w:r>
-        <w:rPr>
-          <w:rFonts w:ascii="Times New Roman" w:hAnsi="Times New Roman" w:cs="Times New Roman" w:hint="eastAsia"/>
-        </w:rPr>
-        <w:t xml:space="preserve"> is a single word.</w:t>
-      </w:r>
-    </w:p>
-    <w:p>
-      <w:pPr>
-        <w:rPr>
-          <w:rFonts w:ascii="Times New Roman" w:hAnsi="Times New Roman" w:cs="Times New Roman"/>
-        </w:rPr>
-      </w:pPr>
-      <w:r>
-        <w:rPr>
-          <w:rFonts w:ascii="Times New Roman" w:hAnsi="Times New Roman" w:cs="Times New Roman" w:hint="eastAsia"/>
-        </w:rPr>
-        <w:t>5. BC (</w:t>
-      </w:r>
-      <w:r>
-        <w:rPr>
-          <w:rFonts w:ascii="Times New Roman" w:hAnsi="Times New Roman" w:cs="Times New Roman"/>
-        </w:rPr>
-        <w:t>×</w:t>
-      </w:r>
-      <w:r>
-        <w:rPr>
-          <w:rFonts w:ascii="Times New Roman" w:hAnsi="Times New Roman" w:cs="Times New Roman" w:hint="eastAsia"/>
-        </w:rPr>
-        <w:t xml:space="preserve">) </w:t>
-      </w:r>
-      <w:r>
-        <w:rPr>
-          <w:rFonts w:ascii="Times New Roman" w:hAnsi="Times New Roman" w:cs="Times New Roman" w:hint="eastAsia"/>
-        </w:rPr>
-        <w:t xml:space="preserve"> </w:t>
-      </w:r>
-      <w:r>
-        <w:rPr>
-          <w:rFonts w:ascii="Times New Roman" w:hAnsi="Times New Roman" w:cs="Times New Roman" w:hint="eastAsia"/>
-        </w:rPr>
-        <w:t xml:space="preserve"> </w:t>
-      </w:r>
-      <w:r>
-        <w:rPr>
-          <w:rFonts w:ascii="Times New Roman" w:hAnsi="Times New Roman" w:cs="Times New Roman" w:hint="eastAsia"/>
-        </w:rPr>
-        <w:t>BD</w:t>
-      </w:r>
-      <w:r>
-        <w:rPr>
-          <w:rFonts w:ascii="Times New Roman" w:hAnsi="Times New Roman" w:cs="Times New Roman" w:hint="eastAsia"/>
-        </w:rPr>
-        <w:t xml:space="preserve"> </w:t>
-      </w:r>
-    </w:p>
-    <w:p>
-      <w:pPr>
-        <w:rPr>
-          <w:rFonts w:ascii="Times New Roman" w:hAnsi="Times New Roman" w:cs="Times New Roman"/>
-        </w:rPr>
-      </w:pPr>
-      <w:r>
-        <w:rPr>
-          <w:rFonts w:ascii="Times New Roman" w:hAnsi="Times New Roman" w:cs="Times New Roman" w:hint="eastAsia"/>
-        </w:rPr>
-        <w:t>Don</w:t>
-      </w:r>
-      <w:r>
-        <w:rPr>
-          <w:rFonts w:ascii="Times New Roman" w:hAnsi="Times New Roman" w:cs="Times New Roman"/>
-        </w:rPr>
-        <w:t>’</w:t>
-      </w:r>
-      <w:r>
-        <w:rPr>
-          <w:rFonts w:ascii="Times New Roman" w:hAnsi="Times New Roman" w:cs="Times New Roman" w:hint="eastAsia"/>
-        </w:rPr>
-        <w:t>t write any word you hear</w:t>
-      </w:r>
-      <w:r>
-        <w:rPr>
-          <w:rFonts w:ascii="Times New Roman" w:hAnsi="Times New Roman" w:cs="Times New Roman" w:hint="eastAsia"/>
-        </w:rPr>
-        <w:t xml:space="preserve">, because all the options will apprear in the conversaion. What you should do is to choose the correct answer. </w:t>
-      </w:r>
-      <w:r>
-        <w:rPr>
-          <w:rFonts w:ascii="Times New Roman" w:hAnsi="Times New Roman" w:cs="Times New Roman" w:hint="eastAsia"/>
-        </w:rPr>
-        <w:t>For instance, this question need you to select two kind of service included in the price, which means they are free if you</w:t>
-      </w:r>
-      <w:r>
-        <w:rPr>
-          <w:rFonts w:ascii="Times New Roman" w:hAnsi="Times New Roman" w:cs="Times New Roman" w:hint="eastAsia"/>
-        </w:rPr>
-        <w:t xml:space="preserve"> have</w:t>
-      </w:r>
-      <w:r>
-        <w:rPr>
-          <w:rFonts w:ascii="Times New Roman" w:hAnsi="Times New Roman" w:cs="Times New Roman" w:hint="eastAsia"/>
-        </w:rPr>
-        <w:t xml:space="preserve"> pa</w:t>
-      </w:r>
-      <w:r>
-        <w:rPr>
-          <w:rFonts w:ascii="Times New Roman" w:hAnsi="Times New Roman" w:cs="Times New Roman" w:hint="eastAsia"/>
-        </w:rPr>
-        <w:t>id</w:t>
-      </w:r>
-      <w:r>
-        <w:rPr>
-          <w:rFonts w:ascii="Times New Roman" w:hAnsi="Times New Roman" w:cs="Times New Roman" w:hint="eastAsia"/>
-        </w:rPr>
-        <w:t xml:space="preserve"> the tour. Note that attending some of the course</w:t>
-      </w:r>
-      <w:r>
-        <w:rPr>
-          <w:rFonts w:ascii="Times New Roman" w:hAnsi="Times New Roman" w:cs="Times New Roman" w:hint="eastAsia"/>
-        </w:rPr>
-        <w:t xml:space="preserve"> you</w:t>
-      </w:r>
-      <w:r>
-        <w:rPr>
-          <w:rFonts w:ascii="Times New Roman" w:hAnsi="Times New Roman" w:cs="Times New Roman" w:hint="eastAsia"/>
-        </w:rPr>
-        <w:t xml:space="preserve"> should </w:t>
-      </w:r>
-      <w:r>
-        <w:rPr>
-          <w:rFonts w:ascii="Times New Roman" w:hAnsi="Times New Roman" w:cs="Times New Roman" w:hint="eastAsia"/>
-        </w:rPr>
-        <w:t xml:space="preserve">need to </w:t>
-      </w:r>
-      <w:r>
-        <w:rPr>
-          <w:rFonts w:ascii="Times New Roman" w:hAnsi="Times New Roman" w:cs="Times New Roman" w:hint="eastAsia"/>
-        </w:rPr>
-        <w:t xml:space="preserve">pay </w:t>
-      </w:r>
-      <w:r>
-        <w:rPr>
-          <w:rFonts w:ascii="Times New Roman" w:hAnsi="Times New Roman" w:cs="Times New Roman" w:hint="eastAsia"/>
-        </w:rPr>
-        <w:t>extra money.</w:t>
-      </w:r>
-    </w:p>
-    <w:p>
-      <w:pPr>
-        <w:rPr>
-          <w:rFonts w:ascii="Times New Roman" w:hAnsi="Times New Roman" w:cs="Times New Roman"/>
-        </w:rPr>
-      </w:pPr>
-      <w:r>
-        <w:rPr>
-          <w:rFonts w:ascii="Times New Roman" w:hAnsi="Times New Roman" w:cs="Times New Roman" w:hint="eastAsia"/>
-        </w:rPr>
-        <w:t>7. 290 (</w:t>
-      </w:r>
-      <w:r>
-        <w:rPr>
-          <w:rFonts w:ascii="Times New Roman" w:hAnsi="Times New Roman" w:cs="Times New Roman"/>
-        </w:rPr>
-        <w:t>×</w:t>
-      </w:r>
-      <w:r>
-        <w:rPr>
-          <w:rFonts w:ascii="Times New Roman" w:hAnsi="Times New Roman" w:cs="Times New Roman" w:hint="eastAsia"/>
-        </w:rPr>
-        <w:t>)  280</w:t>
-      </w:r>
-      <w:r>
-        <w:rPr>
-          <w:rFonts w:ascii="Times New Roman" w:hAnsi="Times New Roman" w:cs="Times New Roman" w:hint="eastAsia"/>
-        </w:rPr>
-        <w:t xml:space="preserve"> </w:t>
-      </w:r>
-    </w:p>
-    <w:p>
-      <w:pPr>
-        <w:rPr>
-          <w:rFonts w:ascii="Times New Roman" w:hAnsi="Times New Roman" w:cs="Times New Roman"/>
+        <w:t xml:space="preserve">Section </w:t>
+      </w:r>
+      <w:r>
+        <w:rPr>
+          <w:rFonts w:ascii="Times New Roman" w:hAnsi="Times New Roman" w:cs="Times New Roman" w:hint="eastAsia"/>
           <w:b/>
           <w:bCs/>
           <w:i/>
@@ -537,10 +299,410 @@
           <w:sz w:val="24"/>
           <w:szCs w:val="24"/>
         </w:rPr>
-      </w:pPr>
-      <w:r>
-        <w:rPr>
-          <w:rFonts w:ascii="Times New Roman" w:hAnsi="Times New Roman" w:cs="Times New Roman" w:hint="eastAsia"/>
+        <w:t>2</w:t>
+      </w:r>
+    </w:p>
+    <w:p>
+      <w:pPr>
+        <w:rPr>
+          <w:rFonts w:ascii="Times New Roman" w:hAnsi="Times New Roman" w:cs="Times New Roman" w:hint="eastAsia"/>
+        </w:rPr>
+      </w:pPr>
+      <w:r>
+        <w:rPr>
+          <w:rFonts w:ascii="Times New Roman" w:hAnsi="Times New Roman" w:cs="Times New Roman" w:hint="eastAsia"/>
+        </w:rPr>
+        <w:t>13</w:t>
+      </w:r>
+      <w:r>
+        <w:rPr>
+          <w:rFonts w:ascii="Times New Roman" w:hAnsi="Times New Roman" w:cs="Times New Roman"/>
+        </w:rPr>
+        <w:t xml:space="preserve">. </w:t>
+      </w:r>
+      <w:r>
+        <w:rPr>
+          <w:rFonts w:ascii="Times New Roman" w:hAnsi="Times New Roman" w:cs="Times New Roman" w:hint="eastAsia"/>
+          <w:strike/>
+        </w:rPr>
+        <w:t>B</w:t>
+      </w:r>
+      <w:r>
+        <w:rPr>
+          <w:rFonts w:ascii="Times New Roman" w:hAnsi="Times New Roman" w:cs="Times New Roman" w:hint="eastAsia"/>
+        </w:rPr>
+        <w:t xml:space="preserve"> </w:t>
+      </w:r>
+      <w:r>
+        <w:rPr>
+          <w:rFonts w:ascii="Times New Roman" w:hAnsi="Times New Roman" w:cs="Times New Roman"/>
+        </w:rPr>
+        <w:t>(</w:t>
+      </w:r>
+      <w:r>
+        <w:rPr>
+          <w:rFonts w:ascii="Times New Roman" w:hAnsi="Times New Roman" w:cs="Times New Roman" w:hint="eastAsia"/>
+        </w:rPr>
+        <w:t>A</w:t>
+      </w:r>
+      <w:r>
+        <w:rPr>
+          <w:rFonts w:ascii="Times New Roman" w:hAnsi="Times New Roman" w:cs="Times New Roman"/>
+        </w:rPr>
+        <w:t>)</w:t>
+      </w:r>
+    </w:p>
+    <w:p>
+      <w:pPr>
+        <w:rPr>
+          <w:rFonts w:ascii="Times New Roman" w:hAnsi="Times New Roman" w:cs="Times New Roman"/>
+        </w:rPr>
+      </w:pPr>
+      <w:r>
+        <w:rPr>
+          <w:rFonts w:ascii="Times New Roman" w:hAnsi="Times New Roman" w:cs="Times New Roman" w:hint="eastAsia"/>
+        </w:rPr>
+        <w:t xml:space="preserve">B is wrong because the </w:t>
+      </w:r>
+      <w:r>
+        <w:rPr>
+          <w:rFonts w:ascii="Times New Roman" w:hAnsi="Times New Roman" w:cs="Times New Roman" w:hint="eastAsia"/>
+        </w:rPr>
+        <w:t>receptionist didn</w:t>
+      </w:r>
+      <w:r>
+        <w:rPr>
+          <w:rFonts w:ascii="Times New Roman" w:hAnsi="Times New Roman" w:cs="Times New Roman"/>
+        </w:rPr>
+        <w:t>’</w:t>
+      </w:r>
+      <w:r>
+        <w:rPr>
+          <w:rFonts w:ascii="Times New Roman" w:hAnsi="Times New Roman" w:cs="Times New Roman" w:hint="eastAsia"/>
+        </w:rPr>
+        <w:t xml:space="preserve">t say that the guides were local. </w:t>
+      </w:r>
+    </w:p>
+    <w:p>
+      <w:pPr>
+        <w:rPr>
+          <w:rFonts w:ascii="Times New Roman" w:hAnsi="Times New Roman" w:cs="Times New Roman" w:hint="eastAsia"/>
+        </w:rPr>
+      </w:pPr>
+      <w:r>
+        <w:rPr>
+          <w:rFonts w:ascii="Times New Roman" w:hAnsi="Times New Roman" w:cs="Times New Roman" w:hint="eastAsia"/>
+        </w:rPr>
+        <w:t>Section 3</w:t>
+      </w:r>
+    </w:p>
+    <w:p>
+      <w:pPr>
+        <w:rPr>
+          <w:rFonts w:ascii="Times New Roman" w:hAnsi="Times New Roman" w:cs="Times New Roman" w:hint="eastAsia"/>
+        </w:rPr>
+      </w:pPr>
+      <w:r>
+        <w:rPr>
+          <w:rFonts w:ascii="Times New Roman" w:hAnsi="Times New Roman" w:cs="Times New Roman" w:hint="eastAsia"/>
+        </w:rPr>
+        <w:t xml:space="preserve">21. 20 </w:t>
+      </w:r>
+      <w:r>
+        <w:rPr>
+          <w:rFonts w:ascii="Times New Roman" w:hAnsi="Times New Roman" w:cs="Times New Roman" w:hint="eastAsia"/>
+          <w:strike/>
+        </w:rPr>
+        <w:t xml:space="preserve">ballons </w:t>
+      </w:r>
+      <w:r>
+        <w:rPr>
+          <w:rFonts w:ascii="Times New Roman" w:hAnsi="Times New Roman" w:cs="Times New Roman" w:hint="eastAsia"/>
+        </w:rPr>
+        <w:t xml:space="preserve">(x)  20 </w:t>
+      </w:r>
+      <w:r>
+        <w:rPr>
+          <w:rFonts w:ascii="Times New Roman" w:hAnsi="Times New Roman" w:cs="Times New Roman" w:hint="eastAsia"/>
+          <w:b/>
+        </w:rPr>
+        <w:t>balloons</w:t>
+      </w:r>
+      <w:r>
+        <w:rPr>
+          <w:rFonts w:ascii="Times New Roman" w:hAnsi="Times New Roman" w:cs="Times New Roman" w:hint="eastAsia"/>
+        </w:rPr>
+        <w:t>.</w:t>
+      </w:r>
+    </w:p>
+    <w:p>
+      <w:pPr>
+        <w:rPr>
+          <w:rFonts w:ascii="Times New Roman" w:hAnsi="Times New Roman" w:cs="Times New Roman" w:hint="eastAsia"/>
+        </w:rPr>
+      </w:pPr>
+      <w:r>
+        <w:rPr>
+          <w:rFonts w:ascii="Times New Roman" w:hAnsi="Times New Roman" w:cs="Times New Roman" w:hint="eastAsia"/>
+          <w:strike/>
+        </w:rPr>
+        <w:t>ballons</w:t>
+      </w:r>
+      <w:r>
+        <w:rPr>
+          <w:rFonts w:ascii="Times New Roman" w:hAnsi="Times New Roman" w:cs="Times New Roman" w:hint="eastAsia"/>
+        </w:rPr>
+        <w:t xml:space="preserve"> : </w:t>
+      </w:r>
+      <w:r>
+        <w:rPr>
+          <w:rFonts w:ascii="Times New Roman" w:hAnsi="Times New Roman" w:cs="Times New Roman" w:hint="eastAsia"/>
+        </w:rPr>
+        <w:t>a</w:t>
+      </w:r>
+      <w:r>
+        <w:rPr>
+          <w:rFonts w:ascii="Times New Roman" w:hAnsi="Times New Roman" w:cs="Times New Roman" w:hint="eastAsia"/>
+        </w:rPr>
+        <w:t xml:space="preserve"> spelling error</w:t>
+      </w:r>
+    </w:p>
+    <w:p>
+      <w:pPr>
+        <w:rPr>
+          <w:rFonts w:ascii="Times New Roman" w:hAnsi="Times New Roman" w:cs="Times New Roman" w:hint="eastAsia"/>
+        </w:rPr>
+      </w:pPr>
+      <w:r>
+        <w:rPr>
+          <w:rFonts w:ascii="Times New Roman" w:hAnsi="Times New Roman" w:cs="Times New Roman" w:hint="eastAsia"/>
+        </w:rPr>
+        <w:t>22. measurement unit (x)  measurement units</w:t>
+      </w:r>
+      <w:r>
+        <w:rPr>
+          <w:rFonts w:ascii="Times New Roman" w:hAnsi="Times New Roman" w:cs="Times New Roman" w:hint="eastAsia"/>
+        </w:rPr>
+        <w:t xml:space="preserve"> / units of measurement</w:t>
+      </w:r>
+      <w:r>
+        <w:rPr>
+          <w:rFonts w:ascii="Times New Roman" w:hAnsi="Times New Roman" w:cs="Times New Roman"/>
+        </w:rPr>
+        <w:br/>
+      </w:r>
+      <w:r>
+        <w:rPr>
+          <w:rFonts w:ascii="Times New Roman" w:hAnsi="Times New Roman" w:cs="Times New Roman" w:hint="eastAsia"/>
+        </w:rPr>
+        <w:t>Don</w:t>
+      </w:r>
+      <w:r>
+        <w:rPr>
+          <w:rFonts w:ascii="Times New Roman" w:hAnsi="Times New Roman" w:cs="Times New Roman"/>
+        </w:rPr>
+        <w:t>’</w:t>
+      </w:r>
+      <w:r>
+        <w:rPr>
+          <w:rFonts w:ascii="Times New Roman" w:hAnsi="Times New Roman" w:cs="Times New Roman" w:hint="eastAsia"/>
+        </w:rPr>
+        <w:t xml:space="preserve">t forget the plural. </w:t>
+      </w:r>
+    </w:p>
+    <w:p>
+      <w:pPr>
+        <w:rPr>
+          <w:rFonts w:ascii="Times New Roman" w:hAnsi="Times New Roman" w:cs="Times New Roman" w:hint="eastAsia"/>
+        </w:rPr>
+      </w:pPr>
+      <w:r>
+        <w:rPr>
+          <w:rFonts w:ascii="Times New Roman" w:hAnsi="Times New Roman" w:cs="Times New Roman" w:hint="eastAsia"/>
+        </w:rPr>
+        <w:t xml:space="preserve">23. salt  </w:t>
+      </w:r>
+    </w:p>
+    <w:p>
+      <w:pPr>
+        <w:rPr>
+          <w:rFonts w:ascii="Times New Roman" w:hAnsi="Times New Roman" w:cs="Times New Roman" w:hint="eastAsia"/>
+        </w:rPr>
+      </w:pPr>
+      <w:r>
+        <w:rPr>
+          <w:rFonts w:ascii="Times New Roman" w:hAnsi="Times New Roman" w:cs="Times New Roman" w:hint="eastAsia"/>
+        </w:rPr>
+        <w:t xml:space="preserve">I guessed the answer correctly. </w:t>
+      </w:r>
+    </w:p>
+    <w:p>
+      <w:pPr>
+        <w:rPr>
+          <w:rFonts w:ascii="Times New Roman" w:hAnsi="Times New Roman" w:cs="Times New Roman" w:hint="eastAsia"/>
+        </w:rPr>
+      </w:pPr>
+      <w:r>
+        <w:rPr>
+          <w:rFonts w:ascii="Times New Roman" w:hAnsi="Times New Roman" w:cs="Times New Roman" w:hint="eastAsia"/>
+        </w:rPr>
+        <w:t>30. D (x) C</w:t>
+      </w:r>
+    </w:p>
+    <w:p>
+      <w:pPr>
+        <w:rPr>
+          <w:rFonts w:ascii="Times New Roman" w:hAnsi="Times New Roman" w:cs="Times New Roman"/>
+        </w:rPr>
+      </w:pPr>
+      <w:r>
+        <w:rPr>
+          <w:rFonts w:ascii="Times New Roman" w:hAnsi="Times New Roman" w:cs="Times New Roman"/>
+        </w:rPr>
+        <w:t>T</w:t>
+      </w:r>
+      <w:r>
+        <w:rPr>
+          <w:rFonts w:ascii="Times New Roman" w:hAnsi="Times New Roman" w:cs="Times New Roman" w:hint="eastAsia"/>
+        </w:rPr>
+        <w:t>he female</w:t>
+      </w:r>
+      <w:r>
+        <w:rPr>
+          <w:rFonts w:ascii="Times New Roman" w:hAnsi="Times New Roman" w:cs="Times New Roman" w:hint="eastAsia"/>
+        </w:rPr>
+        <w:t xml:space="preserve"> speaker said</w:t>
+      </w:r>
+      <w:r>
+        <w:rPr>
+          <w:rFonts w:ascii="Times New Roman" w:hAnsi="Times New Roman" w:cs="Times New Roman" w:hint="eastAsia"/>
+        </w:rPr>
+        <w:t xml:space="preserve"> it was a great equipment</w:t>
+      </w:r>
+      <w:r>
+        <w:rPr>
+          <w:rFonts w:ascii="Times New Roman" w:hAnsi="Times New Roman" w:cs="Times New Roman" w:hint="eastAsia"/>
+        </w:rPr>
+        <w:t>(NOT much equipment)</w:t>
+      </w:r>
+      <w:r>
+        <w:rPr>
+          <w:rFonts w:ascii="Times New Roman" w:hAnsi="Times New Roman" w:cs="Times New Roman" w:hint="eastAsia"/>
+        </w:rPr>
+        <w:t xml:space="preserve">,  and </w:t>
+      </w:r>
+      <w:r>
+        <w:rPr>
+          <w:rFonts w:ascii="Times New Roman" w:hAnsi="Times New Roman" w:cs="Times New Roman" w:hint="eastAsia"/>
+        </w:rPr>
+        <w:t xml:space="preserve"> </w:t>
+      </w:r>
+      <w:r>
+        <w:rPr>
+          <w:rFonts w:ascii="Times New Roman" w:hAnsi="Times New Roman" w:cs="Times New Roman"/>
+        </w:rPr>
+        <w:t>“</w:t>
+      </w:r>
+      <w:r>
+        <w:rPr>
+          <w:rFonts w:ascii="Times New Roman" w:hAnsi="Times New Roman" w:cs="Times New Roman" w:hint="eastAsia"/>
+        </w:rPr>
+        <w:t>It is too ambitious</w:t>
+      </w:r>
+      <w:r>
+        <w:rPr>
+          <w:rFonts w:ascii="Times New Roman" w:hAnsi="Times New Roman" w:cs="Times New Roman"/>
+        </w:rPr>
+        <w:t>…</w:t>
+      </w:r>
+      <w:r>
+        <w:rPr>
+          <w:rFonts w:ascii="Times New Roman" w:hAnsi="Times New Roman" w:cs="Times New Roman" w:hint="eastAsia"/>
+        </w:rPr>
+        <w:t>they just can</w:t>
+      </w:r>
+      <w:r>
+        <w:rPr>
+          <w:rFonts w:ascii="Times New Roman" w:hAnsi="Times New Roman" w:cs="Times New Roman"/>
+        </w:rPr>
+        <w:t>’</w:t>
+      </w:r>
+      <w:r>
+        <w:rPr>
+          <w:rFonts w:ascii="Times New Roman" w:hAnsi="Times New Roman" w:cs="Times New Roman" w:hint="eastAsia"/>
+        </w:rPr>
+        <w:t>t cope with it</w:t>
+      </w:r>
+      <w:r>
+        <w:rPr>
+          <w:rFonts w:ascii="Times New Roman" w:hAnsi="Times New Roman" w:cs="Times New Roman"/>
+        </w:rPr>
+        <w:t>…</w:t>
+      </w:r>
+      <w:bookmarkStart w:id="1" w:name="_GoBack"/>
+      <w:bookmarkEnd w:id="1"/>
+      <w:r>
+        <w:rPr>
+          <w:rFonts w:ascii="Times New Roman" w:hAnsi="Times New Roman" w:cs="Times New Roman"/>
+        </w:rPr>
+        <w:t>”</w:t>
+      </w:r>
+      <w:r>
+        <w:rPr>
+          <w:rFonts w:ascii="Times New Roman" w:hAnsi="Times New Roman" w:cs="Times New Roman" w:hint="eastAsia"/>
+        </w:rPr>
+        <w:t xml:space="preserve">, which indicated that was difficult for the 8-year-old children. </w:t>
+      </w:r>
+    </w:p>
+    <w:bookmarkEnd w:id="0"/>
+    <w:p>
+      <w:pPr>
+        <w:outlineLvl w:val="1"/>
+        <w:rPr>
+          <w:rFonts w:ascii="Times New Roman" w:hAnsi="Times New Roman" w:cs="Times New Roman"/>
+          <w:b/>
+          <w:bCs/>
+          <w:sz w:val="28"/>
+          <w:szCs w:val="28"/>
+        </w:rPr>
+      </w:pPr>
+      <w:r>
+        <w:rPr>
+          <w:rFonts w:ascii="Times New Roman" w:hAnsi="Times New Roman" w:cs="Times New Roman" w:hint="eastAsia"/>
+          <w:b/>
+          <w:bCs/>
+          <w:sz w:val="28"/>
+          <w:szCs w:val="28"/>
+        </w:rPr>
+        <w:t>Cambridge IETLS 5</w:t>
+      </w:r>
+    </w:p>
+    <w:p>
+      <w:pPr>
+        <w:outlineLvl w:val="2"/>
+        <w:rPr>
+          <w:rFonts w:ascii="Times New Roman" w:hAnsi="Times New Roman" w:cs="Times New Roman"/>
+          <w:b/>
+          <w:bCs/>
+          <w:sz w:val="24"/>
+          <w:szCs w:val="24"/>
+        </w:rPr>
+      </w:pPr>
+      <w:r>
+        <w:rPr>
+          <w:rFonts w:ascii="Times New Roman" w:hAnsi="Times New Roman" w:cs="Times New Roman" w:hint="eastAsia"/>
+          <w:b/>
+          <w:bCs/>
+          <w:sz w:val="24"/>
+          <w:szCs w:val="24"/>
+        </w:rPr>
+        <w:t>Test 1 Listening</w:t>
+      </w:r>
+    </w:p>
+    <w:p>
+      <w:pPr>
+        <w:rPr>
+          <w:rFonts w:ascii="Times New Roman" w:hAnsi="Times New Roman" w:cs="Times New Roman"/>
           <w:b/>
           <w:bCs/>
           <w:i/>
@@ -548,234 +710,523 @@
           <w:sz w:val="24"/>
           <w:szCs w:val="24"/>
         </w:rPr>
-        <w:t>Section 2</w:t>
-      </w:r>
-    </w:p>
-    <w:p>
-      <w:pPr>
-        <w:rPr>
-          <w:rFonts w:ascii="Times New Roman" w:hAnsi="Times New Roman" w:cs="Times New Roman"/>
-        </w:rPr>
-      </w:pPr>
-      <w:r>
-        <w:rPr>
-          <w:rFonts w:ascii="Times New Roman" w:hAnsi="Times New Roman" w:cs="Times New Roman" w:hint="eastAsia"/>
-        </w:rPr>
-        <w:t>12 breaks (</w:t>
-      </w:r>
-      <w:r>
-        <w:rPr>
-          <w:rFonts w:ascii="Times New Roman" w:hAnsi="Times New Roman" w:cs="Times New Roman"/>
-        </w:rPr>
-        <w:t>×</w:t>
-      </w:r>
-      <w:r>
-        <w:rPr>
-          <w:rFonts w:ascii="Times New Roman" w:hAnsi="Times New Roman" w:cs="Times New Roman" w:hint="eastAsia"/>
-        </w:rPr>
-        <w:t xml:space="preserve">) </w:t>
-      </w:r>
-      <w:r>
-        <w:rPr>
-          <w:rFonts w:ascii="Times New Roman" w:hAnsi="Times New Roman" w:cs="Times New Roman" w:hint="eastAsia"/>
-        </w:rPr>
-        <w:t xml:space="preserve">: </w:t>
-      </w:r>
-      <w:r>
-        <w:rPr>
-          <w:rFonts w:ascii="Times New Roman" w:hAnsi="Times New Roman" w:cs="Times New Roman" w:hint="eastAsia"/>
-        </w:rPr>
-        <w:t>brakes</w:t>
-      </w:r>
-    </w:p>
-    <w:p>
-      <w:pPr>
-        <w:rPr>
-          <w:rFonts w:ascii="Times New Roman" w:hAnsi="Times New Roman" w:cs="Times New Roman"/>
+      </w:pPr>
+      <w:r>
+        <w:rPr>
+          <w:rFonts w:ascii="Times New Roman" w:hAnsi="Times New Roman" w:cs="Times New Roman" w:hint="eastAsia"/>
           <w:b/>
           <w:bCs/>
           <w:i/>
           <w:iCs/>
-        </w:rPr>
-      </w:pPr>
-      <w:r>
-        <w:rPr>
-          <w:rFonts w:ascii="Times New Roman" w:hAnsi="Times New Roman" w:cs="Times New Roman" w:hint="eastAsia"/>
+          <w:sz w:val="24"/>
+          <w:szCs w:val="24"/>
+        </w:rPr>
+        <w:t>Section 1</w:t>
+      </w:r>
+    </w:p>
+    <w:p>
+      <w:pPr>
+        <w:rPr>
+          <w:rFonts w:ascii="Times New Roman" w:hAnsi="Times New Roman" w:cs="Times New Roman"/>
+        </w:rPr>
+      </w:pPr>
+      <w:r>
+        <w:rPr>
+          <w:rFonts w:ascii="Times New Roman" w:hAnsi="Times New Roman" w:cs="Times New Roman" w:hint="eastAsia"/>
+        </w:rPr>
+        <w:t>1. mini bus (</w:t>
+      </w:r>
+      <w:r>
+        <w:rPr>
+          <w:rFonts w:ascii="Times New Roman" w:hAnsi="Times New Roman" w:cs="Times New Roman"/>
+        </w:rPr>
+        <w:t>×</w:t>
+      </w:r>
+      <w:r>
+        <w:rPr>
+          <w:rFonts w:ascii="Times New Roman" w:hAnsi="Times New Roman" w:cs="Times New Roman" w:hint="eastAsia"/>
+        </w:rPr>
+        <w:t xml:space="preserve">)  a minibus.  </w:t>
+      </w:r>
+    </w:p>
+    <w:p>
+      <w:pPr>
+        <w:rPr>
+          <w:rFonts w:ascii="Times New Roman" w:hAnsi="Times New Roman" w:cs="Times New Roman"/>
+        </w:rPr>
+      </w:pPr>
+      <w:r>
+        <w:rPr>
+          <w:rFonts w:ascii="Times New Roman" w:hAnsi="Times New Roman" w:cs="Times New Roman" w:hint="eastAsia"/>
+        </w:rPr>
+        <w:t xml:space="preserve">Note </w:t>
+      </w:r>
+      <w:r>
+        <w:rPr>
+          <w:rFonts w:ascii="Times New Roman" w:hAnsi="Times New Roman" w:cs="Times New Roman" w:hint="eastAsia"/>
+        </w:rPr>
+        <w:t xml:space="preserve">that </w:t>
+      </w:r>
+      <w:r>
+        <w:rPr>
+          <w:rFonts w:ascii="Times New Roman" w:hAnsi="Times New Roman" w:cs="Times New Roman"/>
+        </w:rPr>
+        <w:t>‘</w:t>
+      </w:r>
+      <w:r>
+        <w:rPr>
+          <w:rFonts w:ascii="Times New Roman" w:hAnsi="Times New Roman" w:cs="Times New Roman" w:hint="eastAsia"/>
+        </w:rPr>
+        <w:t>minibus</w:t>
+      </w:r>
+      <w:r>
+        <w:rPr>
+          <w:rFonts w:ascii="Times New Roman" w:hAnsi="Times New Roman" w:cs="Times New Roman"/>
+        </w:rPr>
+        <w:t>’</w:t>
+      </w:r>
+      <w:r>
+        <w:rPr>
+          <w:rFonts w:ascii="Times New Roman" w:hAnsi="Times New Roman" w:cs="Times New Roman" w:hint="eastAsia"/>
+        </w:rPr>
+        <w:t xml:space="preserve"> is a single word.</w:t>
+      </w:r>
+    </w:p>
+    <w:p>
+      <w:pPr>
+        <w:rPr>
+          <w:rFonts w:ascii="Times New Roman" w:hAnsi="Times New Roman" w:cs="Times New Roman"/>
+        </w:rPr>
+      </w:pPr>
+      <w:r>
+        <w:rPr>
+          <w:rFonts w:ascii="Times New Roman" w:hAnsi="Times New Roman" w:cs="Times New Roman" w:hint="eastAsia"/>
+        </w:rPr>
+        <w:t>5. BC (</w:t>
+      </w:r>
+      <w:r>
+        <w:rPr>
+          <w:rFonts w:ascii="Times New Roman" w:hAnsi="Times New Roman" w:cs="Times New Roman"/>
+        </w:rPr>
+        <w:t>×</w:t>
+      </w:r>
+      <w:r>
+        <w:rPr>
+          <w:rFonts w:ascii="Times New Roman" w:hAnsi="Times New Roman" w:cs="Times New Roman" w:hint="eastAsia"/>
+        </w:rPr>
+        <w:t xml:space="preserve">) </w:t>
+      </w:r>
+      <w:r>
+        <w:rPr>
+          <w:rFonts w:ascii="Times New Roman" w:hAnsi="Times New Roman" w:cs="Times New Roman" w:hint="eastAsia"/>
+        </w:rPr>
+        <w:t xml:space="preserve"> </w:t>
+      </w:r>
+      <w:r>
+        <w:rPr>
+          <w:rFonts w:ascii="Times New Roman" w:hAnsi="Times New Roman" w:cs="Times New Roman" w:hint="eastAsia"/>
+        </w:rPr>
+        <w:t xml:space="preserve"> </w:t>
+      </w:r>
+      <w:r>
+        <w:rPr>
+          <w:rFonts w:ascii="Times New Roman" w:hAnsi="Times New Roman" w:cs="Times New Roman" w:hint="eastAsia"/>
+        </w:rPr>
+        <w:t>BD</w:t>
+      </w:r>
+      <w:r>
+        <w:rPr>
+          <w:rFonts w:ascii="Times New Roman" w:hAnsi="Times New Roman" w:cs="Times New Roman" w:hint="eastAsia"/>
+        </w:rPr>
+        <w:t xml:space="preserve"> </w:t>
+      </w:r>
+    </w:p>
+    <w:p>
+      <w:pPr>
+        <w:rPr>
+          <w:rFonts w:ascii="Times New Roman" w:hAnsi="Times New Roman" w:cs="Times New Roman"/>
+        </w:rPr>
+      </w:pPr>
+      <w:r>
+        <w:rPr>
+          <w:rFonts w:ascii="Times New Roman" w:hAnsi="Times New Roman" w:cs="Times New Roman" w:hint="eastAsia"/>
+        </w:rPr>
+        <w:t>Don</w:t>
+      </w:r>
+      <w:r>
+        <w:rPr>
+          <w:rFonts w:ascii="Times New Roman" w:hAnsi="Times New Roman" w:cs="Times New Roman"/>
+        </w:rPr>
+        <w:t>’</w:t>
+      </w:r>
+      <w:r>
+        <w:rPr>
+          <w:rFonts w:ascii="Times New Roman" w:hAnsi="Times New Roman" w:cs="Times New Roman" w:hint="eastAsia"/>
+        </w:rPr>
+        <w:t>t write any word you hear</w:t>
+      </w:r>
+      <w:r>
+        <w:rPr>
+          <w:rFonts w:ascii="Times New Roman" w:hAnsi="Times New Roman" w:cs="Times New Roman" w:hint="eastAsia"/>
+        </w:rPr>
+        <w:t xml:space="preserve">, because all the options will apprear in the conversaion. What you should do is to choose the correct answer. </w:t>
+      </w:r>
+      <w:r>
+        <w:rPr>
+          <w:rFonts w:ascii="Times New Roman" w:hAnsi="Times New Roman" w:cs="Times New Roman" w:hint="eastAsia"/>
+        </w:rPr>
+        <w:t>For instance, this question need you to select two kind of service included in the price, which means they are free if you</w:t>
+      </w:r>
+      <w:r>
+        <w:rPr>
+          <w:rFonts w:ascii="Times New Roman" w:hAnsi="Times New Roman" w:cs="Times New Roman" w:hint="eastAsia"/>
+        </w:rPr>
+        <w:t xml:space="preserve"> have</w:t>
+      </w:r>
+      <w:r>
+        <w:rPr>
+          <w:rFonts w:ascii="Times New Roman" w:hAnsi="Times New Roman" w:cs="Times New Roman" w:hint="eastAsia"/>
+        </w:rPr>
+        <w:t xml:space="preserve"> pa</w:t>
+      </w:r>
+      <w:r>
+        <w:rPr>
+          <w:rFonts w:ascii="Times New Roman" w:hAnsi="Times New Roman" w:cs="Times New Roman" w:hint="eastAsia"/>
+        </w:rPr>
+        <w:t>id</w:t>
+      </w:r>
+      <w:r>
+        <w:rPr>
+          <w:rFonts w:ascii="Times New Roman" w:hAnsi="Times New Roman" w:cs="Times New Roman" w:hint="eastAsia"/>
+        </w:rPr>
+        <w:t xml:space="preserve"> the tour. Note that attending some of the course</w:t>
+      </w:r>
+      <w:r>
+        <w:rPr>
+          <w:rFonts w:ascii="Times New Roman" w:hAnsi="Times New Roman" w:cs="Times New Roman" w:hint="eastAsia"/>
+        </w:rPr>
+        <w:t xml:space="preserve"> you</w:t>
+      </w:r>
+      <w:r>
+        <w:rPr>
+          <w:rFonts w:ascii="Times New Roman" w:hAnsi="Times New Roman" w:cs="Times New Roman" w:hint="eastAsia"/>
+        </w:rPr>
+        <w:t xml:space="preserve"> should </w:t>
+      </w:r>
+      <w:r>
+        <w:rPr>
+          <w:rFonts w:ascii="Times New Roman" w:hAnsi="Times New Roman" w:cs="Times New Roman" w:hint="eastAsia"/>
+        </w:rPr>
+        <w:t xml:space="preserve">need to </w:t>
+      </w:r>
+      <w:r>
+        <w:rPr>
+          <w:rFonts w:ascii="Times New Roman" w:hAnsi="Times New Roman" w:cs="Times New Roman" w:hint="eastAsia"/>
+        </w:rPr>
+        <w:t xml:space="preserve">pay </w:t>
+      </w:r>
+      <w:r>
+        <w:rPr>
+          <w:rFonts w:ascii="Times New Roman" w:hAnsi="Times New Roman" w:cs="Times New Roman" w:hint="eastAsia"/>
+        </w:rPr>
+        <w:t>extra money.</w:t>
+      </w:r>
+    </w:p>
+    <w:p>
+      <w:pPr>
+        <w:rPr>
+          <w:rFonts w:ascii="Times New Roman" w:hAnsi="Times New Roman" w:cs="Times New Roman"/>
+        </w:rPr>
+      </w:pPr>
+      <w:r>
+        <w:rPr>
+          <w:rFonts w:ascii="Times New Roman" w:hAnsi="Times New Roman" w:cs="Times New Roman" w:hint="eastAsia"/>
+        </w:rPr>
+        <w:t>7. 290 (</w:t>
+      </w:r>
+      <w:r>
+        <w:rPr>
+          <w:rFonts w:ascii="Times New Roman" w:hAnsi="Times New Roman" w:cs="Times New Roman"/>
+        </w:rPr>
+        <w:t>×</w:t>
+      </w:r>
+      <w:r>
+        <w:rPr>
+          <w:rFonts w:ascii="Times New Roman" w:hAnsi="Times New Roman" w:cs="Times New Roman" w:hint="eastAsia"/>
+        </w:rPr>
+        <w:t>)  280</w:t>
+      </w:r>
+      <w:r>
+        <w:rPr>
+          <w:rFonts w:ascii="Times New Roman" w:hAnsi="Times New Roman" w:cs="Times New Roman" w:hint="eastAsia"/>
+        </w:rPr>
+        <w:t xml:space="preserve"> </w:t>
+      </w:r>
+    </w:p>
+    <w:p>
+      <w:pPr>
+        <w:rPr>
+          <w:rFonts w:ascii="Times New Roman" w:hAnsi="Times New Roman" w:cs="Times New Roman"/>
           <w:b/>
           <w:bCs/>
           <w:i/>
           <w:iCs/>
-        </w:rPr>
-        <w:t>Section 3</w:t>
-      </w:r>
-    </w:p>
-    <w:p>
-      <w:pPr>
-        <w:rPr>
-          <w:rFonts w:ascii="Times New Roman" w:hAnsi="Times New Roman" w:cs="Times New Roman"/>
-        </w:rPr>
-      </w:pPr>
-      <w:r>
-        <w:rPr>
-          <w:rFonts w:ascii="Times New Roman" w:hAnsi="Times New Roman" w:cs="Times New Roman" w:hint="eastAsia"/>
-        </w:rPr>
-        <w:t>24</w:t>
-      </w:r>
-      <w:r>
-        <w:rPr>
-          <w:rFonts w:ascii="Times New Roman" w:hAnsi="Times New Roman" w:cs="Times New Roman" w:hint="eastAsia"/>
-        </w:rPr>
-        <w:t>,25 BC (</w:t>
-      </w:r>
-      <w:r>
-        <w:rPr>
-          <w:rFonts w:ascii="Times New Roman" w:hAnsi="Times New Roman" w:cs="Times New Roman"/>
-        </w:rPr>
-        <w:t>×</w:t>
-      </w:r>
-      <w:r>
-        <w:rPr>
-          <w:rFonts w:ascii="Times New Roman" w:hAnsi="Times New Roman" w:cs="Times New Roman" w:hint="eastAsia"/>
-        </w:rPr>
-        <w:t>) BD</w:t>
-      </w:r>
-      <w:r>
-        <w:rPr>
-          <w:rFonts w:ascii="Times New Roman" w:hAnsi="Times New Roman" w:cs="Times New Roman" w:hint="eastAsia"/>
-        </w:rPr>
-        <w:t xml:space="preserve"> (I knew the answer was D but select</w:t>
-      </w:r>
-      <w:r>
-        <w:rPr>
-          <w:rFonts w:ascii="Times New Roman" w:hAnsi="Times New Roman" w:cs="Times New Roman" w:hint="eastAsia"/>
-        </w:rPr>
-        <w:t>e</w:t>
-      </w:r>
-      <w:r>
-        <w:rPr>
-          <w:rFonts w:ascii="Times New Roman" w:hAnsi="Times New Roman" w:cs="Times New Roman" w:hint="eastAsia"/>
-        </w:rPr>
-        <w:t>d C!)</w:t>
-      </w:r>
-    </w:p>
-    <w:p>
-      <w:pPr>
-        <w:rPr>
-          <w:rFonts w:ascii="Times New Roman" w:hAnsi="Times New Roman" w:cs="Times New Roman"/>
-        </w:rPr>
-      </w:pPr>
-      <w:r>
-        <w:rPr>
-          <w:rFonts w:ascii="Times New Roman" w:hAnsi="Times New Roman" w:cs="Times New Roman" w:hint="eastAsia"/>
-        </w:rPr>
-        <w:t>26, ___  (</w:t>
-      </w:r>
-      <w:r>
-        <w:rPr>
-          <w:rFonts w:ascii="Times New Roman" w:hAnsi="Times New Roman" w:cs="Times New Roman"/>
-        </w:rPr>
-        <w:t>×</w:t>
-      </w:r>
-      <w:r>
-        <w:rPr>
-          <w:rFonts w:ascii="Times New Roman" w:hAnsi="Times New Roman" w:cs="Times New Roman" w:hint="eastAsia"/>
-        </w:rPr>
-        <w:t>) full-time</w:t>
-      </w:r>
-    </w:p>
-    <w:p>
-      <w:pPr>
-        <w:rPr>
-          <w:rFonts w:ascii="Times New Roman" w:hAnsi="Times New Roman" w:cs="Times New Roman"/>
-        </w:rPr>
-      </w:pPr>
-      <w:r>
-        <w:rPr>
-          <w:rFonts w:ascii="Times New Roman" w:hAnsi="Times New Roman" w:cs="Times New Roman" w:hint="eastAsia"/>
-        </w:rPr>
-        <w:t>27 short time (</w:t>
-      </w:r>
-      <w:r>
-        <w:rPr>
-          <w:rFonts w:ascii="Times New Roman" w:hAnsi="Times New Roman" w:cs="Times New Roman"/>
-        </w:rPr>
-        <w:t>×</w:t>
-      </w:r>
-      <w:r>
-        <w:rPr>
-          <w:rFonts w:ascii="Times New Roman" w:hAnsi="Times New Roman" w:cs="Times New Roman" w:hint="eastAsia"/>
-        </w:rPr>
-        <w:t>) a term</w:t>
-      </w:r>
-    </w:p>
-    <w:p>
-      <w:pPr>
-        <w:rPr>
-          <w:rFonts w:ascii="Times New Roman" w:hAnsi="Times New Roman" w:cs="Times New Roman"/>
-        </w:rPr>
-      </w:pPr>
-      <w:r>
-        <w:rPr>
-          <w:rFonts w:ascii="Times New Roman" w:hAnsi="Times New Roman" w:cs="Times New Roman" w:hint="eastAsia"/>
-        </w:rPr>
-        <w:t>29. ___ (</w:t>
-      </w:r>
-      <w:r>
-        <w:rPr>
-          <w:rFonts w:ascii="Times New Roman" w:hAnsi="Times New Roman" w:cs="Times New Roman"/>
-        </w:rPr>
-        <w:t>×</w:t>
-      </w:r>
-      <w:r>
-        <w:rPr>
-          <w:rFonts w:ascii="Times New Roman" w:hAnsi="Times New Roman" w:cs="Times New Roman" w:hint="eastAsia"/>
-        </w:rPr>
-        <w:t>) two modules</w:t>
-      </w:r>
-    </w:p>
-    <w:p>
-      <w:pPr>
-        <w:rPr>
-          <w:rFonts w:ascii="Times New Roman" w:hAnsi="Times New Roman" w:cs="Times New Roman"/>
-        </w:rPr>
-      </w:pPr>
-      <w:r>
-        <w:rPr>
-          <w:rFonts w:ascii="Times New Roman" w:hAnsi="Times New Roman" w:cs="Times New Roman" w:hint="eastAsia"/>
-        </w:rPr>
-        <w:t>30. ___(</w:t>
-      </w:r>
-      <w:r>
-        <w:rPr>
-          <w:rFonts w:ascii="Times New Roman" w:hAnsi="Times New Roman" w:cs="Times New Roman"/>
-        </w:rPr>
-        <w:t>×</w:t>
-      </w:r>
-      <w:r>
-        <w:rPr>
-          <w:rFonts w:ascii="Times New Roman" w:hAnsi="Times New Roman" w:cs="Times New Roman" w:hint="eastAsia"/>
-        </w:rPr>
-        <w:t>) a topic</w:t>
-      </w:r>
-    </w:p>
-    <w:p>
-      <w:pPr>
-        <w:rPr>
-          <w:rFonts w:ascii="Times New Roman" w:hAnsi="Times New Roman" w:cs="Times New Roman"/>
+          <w:sz w:val="24"/>
+          <w:szCs w:val="24"/>
+        </w:rPr>
+      </w:pPr>
+      <w:r>
+        <w:rPr>
+          <w:rFonts w:ascii="Times New Roman" w:hAnsi="Times New Roman" w:cs="Times New Roman" w:hint="eastAsia"/>
           <w:b/>
           <w:bCs/>
           <w:i/>
           <w:iCs/>
-        </w:rPr>
-      </w:pPr>
-      <w:r>
-        <w:rPr>
-          <w:rFonts w:ascii="Times New Roman" w:hAnsi="Times New Roman" w:cs="Times New Roman" w:hint="eastAsia"/>
+          <w:sz w:val="24"/>
+          <w:szCs w:val="24"/>
+        </w:rPr>
+        <w:lastRenderedPageBreak/>
+        <w:t>Section 2</w:t>
+      </w:r>
+    </w:p>
+    <w:p>
+      <w:pPr>
+        <w:rPr>
+          <w:rFonts w:ascii="Times New Roman" w:hAnsi="Times New Roman" w:cs="Times New Roman"/>
+        </w:rPr>
+      </w:pPr>
+      <w:r>
+        <w:rPr>
+          <w:rFonts w:ascii="Times New Roman" w:hAnsi="Times New Roman" w:cs="Times New Roman" w:hint="eastAsia"/>
+        </w:rPr>
+        <w:t>12 breaks (</w:t>
+      </w:r>
+      <w:r>
+        <w:rPr>
+          <w:rFonts w:ascii="Times New Roman" w:hAnsi="Times New Roman" w:cs="Times New Roman"/>
+        </w:rPr>
+        <w:t>×</w:t>
+      </w:r>
+      <w:r>
+        <w:rPr>
+          <w:rFonts w:ascii="Times New Roman" w:hAnsi="Times New Roman" w:cs="Times New Roman" w:hint="eastAsia"/>
+        </w:rPr>
+        <w:t xml:space="preserve">) </w:t>
+      </w:r>
+      <w:r>
+        <w:rPr>
+          <w:rFonts w:ascii="Times New Roman" w:hAnsi="Times New Roman" w:cs="Times New Roman" w:hint="eastAsia"/>
+        </w:rPr>
+        <w:t xml:space="preserve">: </w:t>
+      </w:r>
+      <w:r>
+        <w:rPr>
+          <w:rFonts w:ascii="Times New Roman" w:hAnsi="Times New Roman" w:cs="Times New Roman" w:hint="eastAsia"/>
+        </w:rPr>
+        <w:t>brakes</w:t>
+      </w:r>
+    </w:p>
+    <w:p>
+      <w:pPr>
+        <w:rPr>
+          <w:rFonts w:ascii="Times New Roman" w:hAnsi="Times New Roman" w:cs="Times New Roman"/>
           <w:b/>
           <w:bCs/>
           <w:i/>
           <w:iCs/>
         </w:rPr>
+      </w:pPr>
+      <w:r>
+        <w:rPr>
+          <w:rFonts w:ascii="Times New Roman" w:hAnsi="Times New Roman" w:cs="Times New Roman" w:hint="eastAsia"/>
+          <w:b/>
+          <w:bCs/>
+          <w:i/>
+          <w:iCs/>
+        </w:rPr>
+        <w:t>Section 3</w:t>
+      </w:r>
+    </w:p>
+    <w:p>
+      <w:pPr>
+        <w:rPr>
+          <w:rFonts w:ascii="Times New Roman" w:hAnsi="Times New Roman" w:cs="Times New Roman" w:hint="eastAsia"/>
+        </w:rPr>
+      </w:pPr>
+      <w:r>
+        <w:rPr>
+          <w:rFonts w:ascii="Times New Roman" w:hAnsi="Times New Roman" w:cs="Times New Roman" w:hint="eastAsia"/>
+        </w:rPr>
+        <w:t>24</w:t>
+      </w:r>
+      <w:r>
+        <w:rPr>
+          <w:rFonts w:ascii="Times New Roman" w:hAnsi="Times New Roman" w:cs="Times New Roman" w:hint="eastAsia"/>
+        </w:rPr>
+        <w:t>,25 BC (</w:t>
+      </w:r>
+      <w:r>
+        <w:rPr>
+          <w:rFonts w:ascii="Times New Roman" w:hAnsi="Times New Roman" w:cs="Times New Roman"/>
+        </w:rPr>
+        <w:t>×</w:t>
+      </w:r>
+      <w:r>
+        <w:rPr>
+          <w:rFonts w:ascii="Times New Roman" w:hAnsi="Times New Roman" w:cs="Times New Roman" w:hint="eastAsia"/>
+        </w:rPr>
+        <w:t>) BD</w:t>
+      </w:r>
+      <w:r>
+        <w:rPr>
+          <w:rFonts w:ascii="Times New Roman" w:hAnsi="Times New Roman" w:cs="Times New Roman" w:hint="eastAsia"/>
+        </w:rPr>
+        <w:t xml:space="preserve"> </w:t>
+      </w:r>
+    </w:p>
+    <w:p>
+      <w:pPr>
+        <w:rPr>
+          <w:rFonts w:ascii="Times New Roman" w:hAnsi="Times New Roman" w:cs="Times New Roman"/>
+        </w:rPr>
+      </w:pPr>
+      <w:r>
+        <w:rPr>
+          <w:rFonts w:ascii="Times New Roman" w:hAnsi="Times New Roman" w:cs="Times New Roman" w:hint="eastAsia"/>
+        </w:rPr>
+        <w:t>(I knew the answer was D but select</w:t>
+      </w:r>
+      <w:r>
+        <w:rPr>
+          <w:rFonts w:ascii="Times New Roman" w:hAnsi="Times New Roman" w:cs="Times New Roman" w:hint="eastAsia"/>
+        </w:rPr>
+        <w:t>e</w:t>
+      </w:r>
+      <w:r>
+        <w:rPr>
+          <w:rFonts w:ascii="Times New Roman" w:hAnsi="Times New Roman" w:cs="Times New Roman" w:hint="eastAsia"/>
+        </w:rPr>
+        <w:t>d C!)</w:t>
+      </w:r>
+    </w:p>
+    <w:p>
+      <w:pPr>
+        <w:rPr>
+          <w:rFonts w:ascii="Times New Roman" w:hAnsi="Times New Roman" w:cs="Times New Roman"/>
+        </w:rPr>
+      </w:pPr>
+      <w:r>
+        <w:rPr>
+          <w:rFonts w:ascii="Times New Roman" w:hAnsi="Times New Roman" w:cs="Times New Roman" w:hint="eastAsia"/>
+        </w:rPr>
+        <w:t>26, ___  (</w:t>
+      </w:r>
+      <w:r>
+        <w:rPr>
+          <w:rFonts w:ascii="Times New Roman" w:hAnsi="Times New Roman" w:cs="Times New Roman"/>
+        </w:rPr>
+        <w:t>×</w:t>
+      </w:r>
+      <w:r>
+        <w:rPr>
+          <w:rFonts w:ascii="Times New Roman" w:hAnsi="Times New Roman" w:cs="Times New Roman" w:hint="eastAsia"/>
+        </w:rPr>
+        <w:t>) full-time</w:t>
+      </w:r>
+    </w:p>
+    <w:p>
+      <w:pPr>
+        <w:rPr>
+          <w:rFonts w:ascii="Times New Roman" w:hAnsi="Times New Roman" w:cs="Times New Roman"/>
+        </w:rPr>
+      </w:pPr>
+      <w:r>
+        <w:rPr>
+          <w:rFonts w:ascii="Times New Roman" w:hAnsi="Times New Roman" w:cs="Times New Roman" w:hint="eastAsia"/>
+        </w:rPr>
+        <w:t>27 short time (</w:t>
+      </w:r>
+      <w:r>
+        <w:rPr>
+          <w:rFonts w:ascii="Times New Roman" w:hAnsi="Times New Roman" w:cs="Times New Roman"/>
+        </w:rPr>
+        <w:t>×</w:t>
+      </w:r>
+      <w:r>
+        <w:rPr>
+          <w:rFonts w:ascii="Times New Roman" w:hAnsi="Times New Roman" w:cs="Times New Roman" w:hint="eastAsia"/>
+        </w:rPr>
+        <w:t>) a term</w:t>
+      </w:r>
+    </w:p>
+    <w:p>
+      <w:pPr>
+        <w:rPr>
+          <w:rFonts w:ascii="Times New Roman" w:hAnsi="Times New Roman" w:cs="Times New Roman"/>
+        </w:rPr>
+      </w:pPr>
+      <w:r>
+        <w:rPr>
+          <w:rFonts w:ascii="Times New Roman" w:hAnsi="Times New Roman" w:cs="Times New Roman" w:hint="eastAsia"/>
+        </w:rPr>
+        <w:t>29. ___ (</w:t>
+      </w:r>
+      <w:r>
+        <w:rPr>
+          <w:rFonts w:ascii="Times New Roman" w:hAnsi="Times New Roman" w:cs="Times New Roman"/>
+        </w:rPr>
+        <w:t>×</w:t>
+      </w:r>
+      <w:r>
+        <w:rPr>
+          <w:rFonts w:ascii="Times New Roman" w:hAnsi="Times New Roman" w:cs="Times New Roman" w:hint="eastAsia"/>
+        </w:rPr>
+        <w:t>) two modules</w:t>
+      </w:r>
+    </w:p>
+    <w:p>
+      <w:pPr>
+        <w:rPr>
+          <w:rFonts w:ascii="Times New Roman" w:hAnsi="Times New Roman" w:cs="Times New Roman"/>
+        </w:rPr>
+      </w:pPr>
+      <w:r>
+        <w:rPr>
+          <w:rFonts w:ascii="Times New Roman" w:hAnsi="Times New Roman" w:cs="Times New Roman" w:hint="eastAsia"/>
+        </w:rPr>
+        <w:t>30. ___(</w:t>
+      </w:r>
+      <w:r>
+        <w:rPr>
+          <w:rFonts w:ascii="Times New Roman" w:hAnsi="Times New Roman" w:cs="Times New Roman"/>
+        </w:rPr>
+        <w:t>×</w:t>
+      </w:r>
+      <w:r>
+        <w:rPr>
+          <w:rFonts w:ascii="Times New Roman" w:hAnsi="Times New Roman" w:cs="Times New Roman" w:hint="eastAsia"/>
+        </w:rPr>
+        <w:t>) a topic</w:t>
+      </w:r>
+    </w:p>
+    <w:p>
+      <w:pPr>
+        <w:rPr>
+          <w:rFonts w:ascii="Times New Roman" w:hAnsi="Times New Roman" w:cs="Times New Roman"/>
+          <w:b/>
+          <w:bCs/>
+          <w:i/>
+          <w:iCs/>
+        </w:rPr>
+      </w:pPr>
+      <w:r>
+        <w:rPr>
+          <w:rFonts w:ascii="Times New Roman" w:hAnsi="Times New Roman" w:cs="Times New Roman" w:hint="eastAsia"/>
+          <w:b/>
+          <w:bCs/>
+          <w:i/>
+          <w:iCs/>
+        </w:rPr>
         <w:t>Section 4</w:t>
       </w:r>
     </w:p>
@@ -926,7 +1377,6 @@
         <w:rPr>
           <w:rFonts w:ascii="Times New Roman" w:hAnsi="Times New Roman" w:cs="Times New Roman" w:hint="eastAsia"/>
         </w:rPr>
-        <w:lastRenderedPageBreak/>
         <w:t>39. ___ (</w:t>
       </w:r>
       <w:r>
@@ -1531,6 +1981,7 @@
         <w:rPr>
           <w:rFonts w:ascii="Times New Roman" w:hAnsi="Times New Roman" w:cs="Times New Roman" w:hint="eastAsia"/>
         </w:rPr>
+        <w:lastRenderedPageBreak/>
         <w:t xml:space="preserve">18-20, </w:t>
       </w:r>
       <w:r>
@@ -2540,6 +2991,7 @@
         <w:rPr>
           <w:rFonts w:ascii="Times New Roman" w:hAnsi="Times New Roman" w:cs="Times New Roman" w:hint="eastAsia"/>
         </w:rPr>
+        <w:lastRenderedPageBreak/>
         <w:t>Toughen glass used for cooking doesn</w:t>
       </w:r>
       <w:r>
@@ -3048,14 +3500,7 @@
         <w:rPr>
           <w:rFonts w:ascii="Times New Roman" w:hAnsi="Times New Roman" w:cs="Times New Roman" w:hint="eastAsia"/>
         </w:rPr>
-        <w:t xml:space="preserve"> as the </w:t>
-      </w:r>
-      <w:r>
-        <w:rPr>
-          <w:rFonts w:ascii="Times New Roman" w:hAnsi="Times New Roman" w:cs="Times New Roman" w:hint="eastAsia"/>
-        </w:rPr>
-        <w:lastRenderedPageBreak/>
-        <w:t>speaker said</w:t>
+        <w:t xml:space="preserve"> as the speaker said</w:t>
       </w:r>
       <w:r>
         <w:rPr>
@@ -3598,6 +4043,7 @@
         <w:rPr>
           <w:rFonts w:ascii="Times New Roman" w:hAnsi="Times New Roman" w:cs="Times New Roman" w:hint="eastAsia"/>
         </w:rPr>
+        <w:lastRenderedPageBreak/>
         <w:t xml:space="preserve">26, A  </w:t>
       </w:r>
       <w:r>
@@ -4026,14 +4472,7 @@
         <w:rPr>
           <w:rFonts w:ascii="Times New Roman" w:hAnsi="Times New Roman" w:cs="Times New Roman" w:hint="eastAsia"/>
         </w:rPr>
-        <w:t xml:space="preserve">At the beginning of the last paragraph, the speaker said that the library offered specialised </w:t>
-      </w:r>
-      <w:r>
-        <w:rPr>
-          <w:rFonts w:ascii="Times New Roman" w:hAnsi="Times New Roman" w:cs="Times New Roman" w:hint="eastAsia"/>
-        </w:rPr>
-        <w:lastRenderedPageBreak/>
-        <w:t>training sessions and then added that information about compters and programmes later.</w:t>
+        <w:t>At the beginning of the last paragraph, the speaker said that the library offered specialised training sessions and then added that information about compters and programmes later.</w:t>
       </w:r>
       <w:r>
         <w:rPr>
@@ -4507,6 +4946,7 @@
         <w:rPr>
           <w:rFonts w:ascii="Times New Roman" w:hAnsi="Times New Roman" w:cs="Times New Roman" w:hint="eastAsia"/>
         </w:rPr>
+        <w:lastRenderedPageBreak/>
         <w:t>3. yoga class (x)</w:t>
       </w:r>
     </w:p>
@@ -5021,7 +5461,6 @@
         <w:rPr>
           <w:rFonts w:ascii="Times New Roman" w:hAnsi="Times New Roman" w:cs="Times New Roman" w:hint="eastAsia"/>
         </w:rPr>
-        <w:lastRenderedPageBreak/>
         <w:t>22. ____  in advance</w:t>
       </w:r>
     </w:p>
@@ -6072,7 +6511,7 @@
   <a:extraClrSchemeLst/>
   <a:extLst>
     <a:ext uri="{05A4C25C-085E-4340-85A3-A5531E510DB2}">
-      <thm15:themeFamily xmlns="" xmlns:thm15="http://schemas.microsoft.com/office/thememl/2012/main" name="Office Theme" id="{62F939B6-93AF-4DB8-9C6B-D6C7DFDC589F}" vid="{4A3C46E8-61CC-4603-A589-7422A47A8E4A}"/>
+      <thm15:themeFamily xmlns:thm15="http://schemas.microsoft.com/office/thememl/2012/main" xmlns="" name="Office Theme" id="{62F939B6-93AF-4DB8-9C6B-D6C7DFDC589F}" vid="{4A3C46E8-61CC-4603-A589-7422A47A8E4A}"/>
     </a:ext>
   </a:extLst>
 </a:theme>

</xml_diff>

<commit_message>
listening of Cambridge IELTS 4 Test 4
</commit_message>
<xml_diff>
--- a/IELTS Notes/Listening Test And Analyses..docx
+++ b/IELTS Notes/Listening Test And Analyses..docx
@@ -175,7 +175,7 @@
     <w:p>
       <w:pPr>
         <w:rPr>
-          <w:rFonts w:ascii="Times New Roman" w:hAnsi="Times New Roman" w:cs="Times New Roman" w:hint="eastAsia"/>
+          <w:rFonts w:ascii="Times New Roman" w:hAnsi="Times New Roman" w:cs="Times New Roman"/>
         </w:rPr>
       </w:pPr>
       <w:r>
@@ -305,7 +305,7 @@
     <w:p>
       <w:pPr>
         <w:rPr>
-          <w:rFonts w:ascii="Times New Roman" w:hAnsi="Times New Roman" w:cs="Times New Roman" w:hint="eastAsia"/>
+          <w:rFonts w:ascii="Times New Roman" w:hAnsi="Times New Roman" w:cs="Times New Roman"/>
         </w:rPr>
       </w:pPr>
       <w:r>
@@ -355,9 +355,15 @@
     <w:p>
       <w:pPr>
         <w:rPr>
-          <w:rFonts w:ascii="Times New Roman" w:hAnsi="Times New Roman" w:cs="Times New Roman"/>
-        </w:rPr>
-      </w:pPr>
+          <w:rFonts w:ascii="Times New Roman" w:hAnsi="Times New Roman" w:cs="Times New Roman" w:hint="eastAsia"/>
+        </w:rPr>
+      </w:pPr>
+      <w:r>
+        <w:rPr>
+          <w:rFonts w:ascii="Times New Roman" w:hAnsi="Times New Roman" w:cs="Times New Roman" w:hint="eastAsia"/>
+        </w:rPr>
+        <w:t xml:space="preserve">Option </w:t>
+      </w:r>
       <w:r>
         <w:rPr>
           <w:rFonts w:ascii="Times New Roman" w:hAnsi="Times New Roman" w:cs="Times New Roman" w:hint="eastAsia"/>
@@ -386,317 +392,14 @@
     <w:p>
       <w:pPr>
         <w:rPr>
-          <w:rFonts w:ascii="Times New Roman" w:hAnsi="Times New Roman" w:cs="Times New Roman" w:hint="eastAsia"/>
-        </w:rPr>
-      </w:pPr>
-      <w:r>
-        <w:rPr>
-          <w:rFonts w:ascii="Times New Roman" w:hAnsi="Times New Roman" w:cs="Times New Roman" w:hint="eastAsia"/>
-        </w:rPr>
-        <w:t>Section 3</w:t>
-      </w:r>
-    </w:p>
-    <w:p>
-      <w:pPr>
-        <w:rPr>
-          <w:rFonts w:ascii="Times New Roman" w:hAnsi="Times New Roman" w:cs="Times New Roman" w:hint="eastAsia"/>
-        </w:rPr>
-      </w:pPr>
-      <w:r>
-        <w:rPr>
-          <w:rFonts w:ascii="Times New Roman" w:hAnsi="Times New Roman" w:cs="Times New Roman" w:hint="eastAsia"/>
-        </w:rPr>
-        <w:t xml:space="preserve">21. 20 </w:t>
-      </w:r>
-      <w:r>
-        <w:rPr>
-          <w:rFonts w:ascii="Times New Roman" w:hAnsi="Times New Roman" w:cs="Times New Roman" w:hint="eastAsia"/>
-          <w:strike/>
-        </w:rPr>
-        <w:t xml:space="preserve">ballons </w:t>
-      </w:r>
-      <w:r>
-        <w:rPr>
-          <w:rFonts w:ascii="Times New Roman" w:hAnsi="Times New Roman" w:cs="Times New Roman" w:hint="eastAsia"/>
-        </w:rPr>
-        <w:t xml:space="preserve">(x)  20 </w:t>
-      </w:r>
-      <w:r>
-        <w:rPr>
-          <w:rFonts w:ascii="Times New Roman" w:hAnsi="Times New Roman" w:cs="Times New Roman" w:hint="eastAsia"/>
-          <w:b/>
-        </w:rPr>
-        <w:t>balloons</w:t>
-      </w:r>
-      <w:r>
-        <w:rPr>
-          <w:rFonts w:ascii="Times New Roman" w:hAnsi="Times New Roman" w:cs="Times New Roman" w:hint="eastAsia"/>
-        </w:rPr>
-        <w:t>.</w:t>
-      </w:r>
-    </w:p>
-    <w:p>
-      <w:pPr>
-        <w:rPr>
-          <w:rFonts w:ascii="Times New Roman" w:hAnsi="Times New Roman" w:cs="Times New Roman" w:hint="eastAsia"/>
-        </w:rPr>
-      </w:pPr>
-      <w:r>
-        <w:rPr>
-          <w:rFonts w:ascii="Times New Roman" w:hAnsi="Times New Roman" w:cs="Times New Roman" w:hint="eastAsia"/>
-          <w:strike/>
-        </w:rPr>
-        <w:t>ballons</w:t>
-      </w:r>
-      <w:r>
-        <w:rPr>
-          <w:rFonts w:ascii="Times New Roman" w:hAnsi="Times New Roman" w:cs="Times New Roman" w:hint="eastAsia"/>
-        </w:rPr>
-        <w:t xml:space="preserve"> : </w:t>
-      </w:r>
-      <w:r>
-        <w:rPr>
-          <w:rFonts w:ascii="Times New Roman" w:hAnsi="Times New Roman" w:cs="Times New Roman" w:hint="eastAsia"/>
-        </w:rPr>
-        <w:t>a</w:t>
-      </w:r>
-      <w:r>
-        <w:rPr>
-          <w:rFonts w:ascii="Times New Roman" w:hAnsi="Times New Roman" w:cs="Times New Roman" w:hint="eastAsia"/>
-        </w:rPr>
-        <w:t xml:space="preserve"> spelling error</w:t>
-      </w:r>
-    </w:p>
-    <w:p>
-      <w:pPr>
-        <w:rPr>
-          <w:rFonts w:ascii="Times New Roman" w:hAnsi="Times New Roman" w:cs="Times New Roman" w:hint="eastAsia"/>
-        </w:rPr>
-      </w:pPr>
-      <w:r>
-        <w:rPr>
-          <w:rFonts w:ascii="Times New Roman" w:hAnsi="Times New Roman" w:cs="Times New Roman" w:hint="eastAsia"/>
-        </w:rPr>
-        <w:t>22. measurement unit (x)  measurement units</w:t>
-      </w:r>
-      <w:r>
-        <w:rPr>
-          <w:rFonts w:ascii="Times New Roman" w:hAnsi="Times New Roman" w:cs="Times New Roman" w:hint="eastAsia"/>
-        </w:rPr>
-        <w:t xml:space="preserve"> / units of measurement</w:t>
-      </w:r>
-      <w:r>
-        <w:rPr>
-          <w:rFonts w:ascii="Times New Roman" w:hAnsi="Times New Roman" w:cs="Times New Roman"/>
-        </w:rPr>
-        <w:br/>
-      </w:r>
-      <w:r>
-        <w:rPr>
-          <w:rFonts w:ascii="Times New Roman" w:hAnsi="Times New Roman" w:cs="Times New Roman" w:hint="eastAsia"/>
-        </w:rPr>
-        <w:t>Don</w:t>
-      </w:r>
-      <w:r>
-        <w:rPr>
-          <w:rFonts w:ascii="Times New Roman" w:hAnsi="Times New Roman" w:cs="Times New Roman"/>
-        </w:rPr>
-        <w:t>’</w:t>
-      </w:r>
-      <w:r>
-        <w:rPr>
-          <w:rFonts w:ascii="Times New Roman" w:hAnsi="Times New Roman" w:cs="Times New Roman" w:hint="eastAsia"/>
-        </w:rPr>
-        <w:t xml:space="preserve">t forget the plural. </w:t>
-      </w:r>
-    </w:p>
-    <w:p>
-      <w:pPr>
-        <w:rPr>
-          <w:rFonts w:ascii="Times New Roman" w:hAnsi="Times New Roman" w:cs="Times New Roman" w:hint="eastAsia"/>
-        </w:rPr>
-      </w:pPr>
-      <w:r>
-        <w:rPr>
-          <w:rFonts w:ascii="Times New Roman" w:hAnsi="Times New Roman" w:cs="Times New Roman" w:hint="eastAsia"/>
-        </w:rPr>
-        <w:t xml:space="preserve">23. salt  </w:t>
-      </w:r>
-    </w:p>
-    <w:p>
-      <w:pPr>
-        <w:rPr>
-          <w:rFonts w:ascii="Times New Roman" w:hAnsi="Times New Roman" w:cs="Times New Roman" w:hint="eastAsia"/>
-        </w:rPr>
-      </w:pPr>
-      <w:r>
-        <w:rPr>
-          <w:rFonts w:ascii="Times New Roman" w:hAnsi="Times New Roman" w:cs="Times New Roman" w:hint="eastAsia"/>
-        </w:rPr>
-        <w:t xml:space="preserve">I guessed the answer correctly. </w:t>
-      </w:r>
-    </w:p>
-    <w:p>
-      <w:pPr>
-        <w:rPr>
-          <w:rFonts w:ascii="Times New Roman" w:hAnsi="Times New Roman" w:cs="Times New Roman" w:hint="eastAsia"/>
-        </w:rPr>
-      </w:pPr>
-      <w:r>
-        <w:rPr>
-          <w:rFonts w:ascii="Times New Roman" w:hAnsi="Times New Roman" w:cs="Times New Roman" w:hint="eastAsia"/>
-        </w:rPr>
-        <w:t>30. D (x) C</w:t>
-      </w:r>
-    </w:p>
-    <w:p>
-      <w:pPr>
-        <w:rPr>
-          <w:rFonts w:ascii="Times New Roman" w:hAnsi="Times New Roman" w:cs="Times New Roman"/>
-        </w:rPr>
-      </w:pPr>
-      <w:r>
-        <w:rPr>
-          <w:rFonts w:ascii="Times New Roman" w:hAnsi="Times New Roman" w:cs="Times New Roman"/>
-        </w:rPr>
-        <w:t>T</w:t>
-      </w:r>
-      <w:r>
-        <w:rPr>
-          <w:rFonts w:ascii="Times New Roman" w:hAnsi="Times New Roman" w:cs="Times New Roman" w:hint="eastAsia"/>
-        </w:rPr>
-        <w:t>he female</w:t>
-      </w:r>
-      <w:r>
-        <w:rPr>
-          <w:rFonts w:ascii="Times New Roman" w:hAnsi="Times New Roman" w:cs="Times New Roman" w:hint="eastAsia"/>
-        </w:rPr>
-        <w:t xml:space="preserve"> speaker said</w:t>
-      </w:r>
-      <w:r>
-        <w:rPr>
-          <w:rFonts w:ascii="Times New Roman" w:hAnsi="Times New Roman" w:cs="Times New Roman" w:hint="eastAsia"/>
-        </w:rPr>
-        <w:t xml:space="preserve"> it was a great equipment</w:t>
-      </w:r>
-      <w:r>
-        <w:rPr>
-          <w:rFonts w:ascii="Times New Roman" w:hAnsi="Times New Roman" w:cs="Times New Roman" w:hint="eastAsia"/>
-        </w:rPr>
-        <w:t>(NOT much equipment)</w:t>
-      </w:r>
-      <w:r>
-        <w:rPr>
-          <w:rFonts w:ascii="Times New Roman" w:hAnsi="Times New Roman" w:cs="Times New Roman" w:hint="eastAsia"/>
-        </w:rPr>
-        <w:t xml:space="preserve">,  and </w:t>
-      </w:r>
-      <w:r>
-        <w:rPr>
-          <w:rFonts w:ascii="Times New Roman" w:hAnsi="Times New Roman" w:cs="Times New Roman" w:hint="eastAsia"/>
-        </w:rPr>
-        <w:t xml:space="preserve"> </w:t>
-      </w:r>
-      <w:r>
-        <w:rPr>
-          <w:rFonts w:ascii="Times New Roman" w:hAnsi="Times New Roman" w:cs="Times New Roman"/>
-        </w:rPr>
-        <w:t>“</w:t>
-      </w:r>
-      <w:r>
-        <w:rPr>
-          <w:rFonts w:ascii="Times New Roman" w:hAnsi="Times New Roman" w:cs="Times New Roman" w:hint="eastAsia"/>
-        </w:rPr>
-        <w:t>It is too ambitious</w:t>
-      </w:r>
-      <w:r>
-        <w:rPr>
-          <w:rFonts w:ascii="Times New Roman" w:hAnsi="Times New Roman" w:cs="Times New Roman"/>
-        </w:rPr>
-        <w:t>…</w:t>
-      </w:r>
-      <w:r>
-        <w:rPr>
-          <w:rFonts w:ascii="Times New Roman" w:hAnsi="Times New Roman" w:cs="Times New Roman" w:hint="eastAsia"/>
-        </w:rPr>
-        <w:t>they just can</w:t>
-      </w:r>
-      <w:r>
-        <w:rPr>
-          <w:rFonts w:ascii="Times New Roman" w:hAnsi="Times New Roman" w:cs="Times New Roman"/>
-        </w:rPr>
-        <w:t>’</w:t>
-      </w:r>
-      <w:r>
-        <w:rPr>
-          <w:rFonts w:ascii="Times New Roman" w:hAnsi="Times New Roman" w:cs="Times New Roman" w:hint="eastAsia"/>
-        </w:rPr>
-        <w:t>t cope with it</w:t>
-      </w:r>
-      <w:r>
-        <w:rPr>
-          <w:rFonts w:ascii="Times New Roman" w:hAnsi="Times New Roman" w:cs="Times New Roman"/>
-        </w:rPr>
-        <w:t>…</w:t>
-      </w:r>
-      <w:bookmarkStart w:id="1" w:name="_GoBack"/>
-      <w:bookmarkEnd w:id="1"/>
-      <w:r>
-        <w:rPr>
-          <w:rFonts w:ascii="Times New Roman" w:hAnsi="Times New Roman" w:cs="Times New Roman"/>
-        </w:rPr>
-        <w:t>”</w:t>
-      </w:r>
-      <w:r>
-        <w:rPr>
-          <w:rFonts w:ascii="Times New Roman" w:hAnsi="Times New Roman" w:cs="Times New Roman" w:hint="eastAsia"/>
-        </w:rPr>
-        <w:t xml:space="preserve">, which indicated that was difficult for the 8-year-old children. </w:t>
-      </w:r>
-    </w:p>
-    <w:bookmarkEnd w:id="0"/>
-    <w:p>
-      <w:pPr>
-        <w:outlineLvl w:val="1"/>
-        <w:rPr>
-          <w:rFonts w:ascii="Times New Roman" w:hAnsi="Times New Roman" w:cs="Times New Roman"/>
-          <w:b/>
-          <w:bCs/>
-          <w:sz w:val="28"/>
-          <w:szCs w:val="28"/>
-        </w:rPr>
-      </w:pPr>
-      <w:r>
-        <w:rPr>
-          <w:rFonts w:ascii="Times New Roman" w:hAnsi="Times New Roman" w:cs="Times New Roman" w:hint="eastAsia"/>
-          <w:b/>
-          <w:bCs/>
-          <w:sz w:val="28"/>
-          <w:szCs w:val="28"/>
-        </w:rPr>
-        <w:t>Cambridge IETLS 5</w:t>
-      </w:r>
-    </w:p>
-    <w:p>
-      <w:pPr>
-        <w:outlineLvl w:val="2"/>
-        <w:rPr>
-          <w:rFonts w:ascii="Times New Roman" w:hAnsi="Times New Roman" w:cs="Times New Roman"/>
-          <w:b/>
-          <w:bCs/>
-          <w:sz w:val="24"/>
-          <w:szCs w:val="24"/>
-        </w:rPr>
-      </w:pPr>
-      <w:r>
-        <w:rPr>
-          <w:rFonts w:ascii="Times New Roman" w:hAnsi="Times New Roman" w:cs="Times New Roman" w:hint="eastAsia"/>
-          <w:b/>
-          <w:bCs/>
-          <w:sz w:val="24"/>
-          <w:szCs w:val="24"/>
-        </w:rPr>
-        <w:t>Test 1 Listening</w:t>
+          <w:rFonts w:ascii="Times New Roman" w:hAnsi="Times New Roman" w:cs="Times New Roman"/>
+        </w:rPr>
+      </w:pPr>
+      <w:r>
+        <w:rPr>
+          <w:rFonts w:ascii="Times New Roman" w:hAnsi="Times New Roman" w:cs="Times New Roman" w:hint="eastAsia"/>
+        </w:rPr>
+        <w:t>17. near station (x)  nearest station</w:t>
       </w:r>
     </w:p>
     <w:p>
@@ -721,63 +424,109 @@
           <w:sz w:val="24"/>
           <w:szCs w:val="24"/>
         </w:rPr>
-        <w:t>Section 1</w:t>
-      </w:r>
-    </w:p>
-    <w:p>
-      <w:pPr>
-        <w:rPr>
-          <w:rFonts w:ascii="Times New Roman" w:hAnsi="Times New Roman" w:cs="Times New Roman"/>
-        </w:rPr>
-      </w:pPr>
-      <w:r>
-        <w:rPr>
-          <w:rFonts w:ascii="Times New Roman" w:hAnsi="Times New Roman" w:cs="Times New Roman" w:hint="eastAsia"/>
-        </w:rPr>
-        <w:t>1. mini bus (</w:t>
-      </w:r>
-      <w:r>
-        <w:rPr>
-          <w:rFonts w:ascii="Times New Roman" w:hAnsi="Times New Roman" w:cs="Times New Roman"/>
-        </w:rPr>
-        <w:t>×</w:t>
-      </w:r>
-      <w:r>
-        <w:rPr>
-          <w:rFonts w:ascii="Times New Roman" w:hAnsi="Times New Roman" w:cs="Times New Roman" w:hint="eastAsia"/>
-        </w:rPr>
-        <w:t xml:space="preserve">)  a minibus.  </w:t>
-      </w:r>
-    </w:p>
-    <w:p>
-      <w:pPr>
-        <w:rPr>
-          <w:rFonts w:ascii="Times New Roman" w:hAnsi="Times New Roman" w:cs="Times New Roman"/>
-        </w:rPr>
-      </w:pPr>
-      <w:r>
-        <w:rPr>
-          <w:rFonts w:ascii="Times New Roman" w:hAnsi="Times New Roman" w:cs="Times New Roman" w:hint="eastAsia"/>
-        </w:rPr>
-        <w:t xml:space="preserve">Note </w:t>
-      </w:r>
-      <w:r>
-        <w:rPr>
-          <w:rFonts w:ascii="Times New Roman" w:hAnsi="Times New Roman" w:cs="Times New Roman" w:hint="eastAsia"/>
-        </w:rPr>
-        <w:t xml:space="preserve">that </w:t>
-      </w:r>
-      <w:r>
-        <w:rPr>
-          <w:rFonts w:ascii="Times New Roman" w:hAnsi="Times New Roman" w:cs="Times New Roman"/>
-        </w:rPr>
-        <w:t>‘</w:t>
-      </w:r>
-      <w:r>
-        <w:rPr>
-          <w:rFonts w:ascii="Times New Roman" w:hAnsi="Times New Roman" w:cs="Times New Roman" w:hint="eastAsia"/>
-        </w:rPr>
-        <w:t>minibus</w:t>
+        <w:t>Section 3</w:t>
+      </w:r>
+    </w:p>
+    <w:p>
+      <w:pPr>
+        <w:rPr>
+          <w:rFonts w:ascii="Times New Roman" w:hAnsi="Times New Roman" w:cs="Times New Roman"/>
+        </w:rPr>
+      </w:pPr>
+      <w:r>
+        <w:rPr>
+          <w:rFonts w:ascii="Times New Roman" w:hAnsi="Times New Roman" w:cs="Times New Roman" w:hint="eastAsia"/>
+        </w:rPr>
+        <w:t xml:space="preserve">21. 20 </w:t>
+      </w:r>
+      <w:r>
+        <w:rPr>
+          <w:rFonts w:ascii="Times New Roman" w:hAnsi="Times New Roman" w:cs="Times New Roman" w:hint="eastAsia"/>
+          <w:strike/>
+        </w:rPr>
+        <w:t xml:space="preserve">ballons </w:t>
+      </w:r>
+      <w:r>
+        <w:rPr>
+          <w:rFonts w:ascii="Times New Roman" w:hAnsi="Times New Roman" w:cs="Times New Roman" w:hint="eastAsia"/>
+        </w:rPr>
+        <w:t xml:space="preserve">(x)  20 </w:t>
+      </w:r>
+      <w:r>
+        <w:rPr>
+          <w:rFonts w:ascii="Times New Roman" w:hAnsi="Times New Roman" w:cs="Times New Roman" w:hint="eastAsia"/>
+          <w:b/>
+        </w:rPr>
+        <w:t>balloons</w:t>
+      </w:r>
+      <w:r>
+        <w:rPr>
+          <w:rFonts w:ascii="Times New Roman" w:hAnsi="Times New Roman" w:cs="Times New Roman" w:hint="eastAsia"/>
+        </w:rPr>
+        <w:t>.</w:t>
+      </w:r>
+    </w:p>
+    <w:p>
+      <w:pPr>
+        <w:rPr>
+          <w:rFonts w:ascii="Times New Roman" w:hAnsi="Times New Roman" w:cs="Times New Roman"/>
+        </w:rPr>
+      </w:pPr>
+      <w:r>
+        <w:rPr>
+          <w:rFonts w:ascii="Times New Roman" w:hAnsi="Times New Roman" w:cs="Times New Roman" w:hint="eastAsia"/>
+          <w:strike/>
+        </w:rPr>
+        <w:t>ballons</w:t>
+      </w:r>
+      <w:r>
+        <w:rPr>
+          <w:rFonts w:ascii="Times New Roman" w:hAnsi="Times New Roman" w:cs="Times New Roman" w:hint="eastAsia"/>
+        </w:rPr>
+        <w:t xml:space="preserve"> : </w:t>
+      </w:r>
+      <w:r>
+        <w:rPr>
+          <w:rFonts w:ascii="Times New Roman" w:hAnsi="Times New Roman" w:cs="Times New Roman" w:hint="eastAsia"/>
+        </w:rPr>
+        <w:t>a</w:t>
+      </w:r>
+      <w:r>
+        <w:rPr>
+          <w:rFonts w:ascii="Times New Roman" w:hAnsi="Times New Roman" w:cs="Times New Roman" w:hint="eastAsia"/>
+        </w:rPr>
+        <w:t xml:space="preserve"> spelling error</w:t>
+      </w:r>
+    </w:p>
+    <w:p>
+      <w:pPr>
+        <w:rPr>
+          <w:rFonts w:ascii="Times New Roman" w:hAnsi="Times New Roman" w:cs="Times New Roman"/>
+        </w:rPr>
+      </w:pPr>
+      <w:r>
+        <w:rPr>
+          <w:rFonts w:ascii="Times New Roman" w:hAnsi="Times New Roman" w:cs="Times New Roman" w:hint="eastAsia"/>
+        </w:rPr>
+        <w:t>22. measurement unit (x)  measurement units</w:t>
+      </w:r>
+      <w:r>
+        <w:rPr>
+          <w:rFonts w:ascii="Times New Roman" w:hAnsi="Times New Roman" w:cs="Times New Roman" w:hint="eastAsia"/>
+        </w:rPr>
+        <w:t xml:space="preserve"> / units of measurement</w:t>
+      </w:r>
+      <w:r>
+        <w:rPr>
+          <w:rFonts w:ascii="Times New Roman" w:hAnsi="Times New Roman" w:cs="Times New Roman"/>
+        </w:rPr>
+        <w:br/>
+      </w:r>
+      <w:r>
+        <w:rPr>
+          <w:rFonts w:ascii="Times New Roman" w:hAnsi="Times New Roman" w:cs="Times New Roman" w:hint="eastAsia"/>
+        </w:rPr>
+        <w:t>Don</w:t>
       </w:r>
       <w:r>
         <w:rPr>
@@ -789,32 +538,89 @@
         <w:rPr>
           <w:rFonts w:ascii="Times New Roman" w:hAnsi="Times New Roman" w:cs="Times New Roman" w:hint="eastAsia"/>
         </w:rPr>
-        <w:t xml:space="preserve"> is a single word.</w:t>
-      </w:r>
-    </w:p>
-    <w:p>
-      <w:pPr>
-        <w:rPr>
-          <w:rFonts w:ascii="Times New Roman" w:hAnsi="Times New Roman" w:cs="Times New Roman"/>
-        </w:rPr>
-      </w:pPr>
-      <w:r>
-        <w:rPr>
-          <w:rFonts w:ascii="Times New Roman" w:hAnsi="Times New Roman" w:cs="Times New Roman" w:hint="eastAsia"/>
-        </w:rPr>
-        <w:t>5. BC (</w:t>
-      </w:r>
-      <w:r>
-        <w:rPr>
-          <w:rFonts w:ascii="Times New Roman" w:hAnsi="Times New Roman" w:cs="Times New Roman"/>
-        </w:rPr>
-        <w:t>×</w:t>
-      </w:r>
-      <w:r>
-        <w:rPr>
-          <w:rFonts w:ascii="Times New Roman" w:hAnsi="Times New Roman" w:cs="Times New Roman" w:hint="eastAsia"/>
-        </w:rPr>
-        <w:t xml:space="preserve">) </w:t>
+        <w:t xml:space="preserve">t forget the plural. </w:t>
+      </w:r>
+    </w:p>
+    <w:p>
+      <w:pPr>
+        <w:rPr>
+          <w:rFonts w:ascii="Times New Roman" w:hAnsi="Times New Roman" w:cs="Times New Roman"/>
+        </w:rPr>
+      </w:pPr>
+      <w:r>
+        <w:rPr>
+          <w:rFonts w:ascii="Times New Roman" w:hAnsi="Times New Roman" w:cs="Times New Roman" w:hint="eastAsia"/>
+        </w:rPr>
+        <w:t xml:space="preserve">23. salt  </w:t>
+      </w:r>
+    </w:p>
+    <w:p>
+      <w:pPr>
+        <w:rPr>
+          <w:rFonts w:ascii="Times New Roman" w:hAnsi="Times New Roman" w:cs="Times New Roman"/>
+        </w:rPr>
+      </w:pPr>
+      <w:r>
+        <w:rPr>
+          <w:rFonts w:ascii="Times New Roman" w:hAnsi="Times New Roman" w:cs="Times New Roman" w:hint="eastAsia"/>
+        </w:rPr>
+        <w:t xml:space="preserve">I guessed the answer correctly. </w:t>
+      </w:r>
+    </w:p>
+    <w:p>
+      <w:pPr>
+        <w:rPr>
+          <w:rFonts w:ascii="Times New Roman" w:hAnsi="Times New Roman" w:cs="Times New Roman"/>
+        </w:rPr>
+      </w:pPr>
+      <w:r>
+        <w:rPr>
+          <w:rFonts w:ascii="Times New Roman" w:hAnsi="Times New Roman" w:cs="Times New Roman" w:hint="eastAsia"/>
+        </w:rPr>
+        <w:t>30. D (x) C</w:t>
+      </w:r>
+    </w:p>
+    <w:p>
+      <w:pPr>
+        <w:rPr>
+          <w:rFonts w:ascii="Times New Roman" w:hAnsi="Times New Roman" w:cs="Times New Roman" w:hint="eastAsia"/>
+        </w:rPr>
+      </w:pPr>
+      <w:r>
+        <w:rPr>
+          <w:rFonts w:ascii="Times New Roman" w:hAnsi="Times New Roman" w:cs="Times New Roman"/>
+        </w:rPr>
+        <w:t>T</w:t>
+      </w:r>
+      <w:r>
+        <w:rPr>
+          <w:rFonts w:ascii="Times New Roman" w:hAnsi="Times New Roman" w:cs="Times New Roman" w:hint="eastAsia"/>
+        </w:rPr>
+        <w:t>he female</w:t>
+      </w:r>
+      <w:r>
+        <w:rPr>
+          <w:rFonts w:ascii="Times New Roman" w:hAnsi="Times New Roman" w:cs="Times New Roman" w:hint="eastAsia"/>
+        </w:rPr>
+        <w:t xml:space="preserve"> speaker said</w:t>
+      </w:r>
+      <w:r>
+        <w:rPr>
+          <w:rFonts w:ascii="Times New Roman" w:hAnsi="Times New Roman" w:cs="Times New Roman" w:hint="eastAsia"/>
+        </w:rPr>
+        <w:t xml:space="preserve"> it was a great equipment</w:t>
+      </w:r>
+      <w:r>
+        <w:rPr>
+          <w:rFonts w:ascii="Times New Roman" w:hAnsi="Times New Roman" w:cs="Times New Roman" w:hint="eastAsia"/>
+        </w:rPr>
+        <w:t>(NOT much equipment)</w:t>
+      </w:r>
+      <w:r>
+        <w:rPr>
+          <w:rFonts w:ascii="Times New Roman" w:hAnsi="Times New Roman" w:cs="Times New Roman" w:hint="eastAsia"/>
+        </w:rPr>
+        <w:t xml:space="preserve">,  and </w:t>
       </w:r>
       <w:r>
         <w:rPr>
@@ -824,34 +630,27 @@
       </w:r>
       <w:r>
         <w:rPr>
-          <w:rFonts w:ascii="Times New Roman" w:hAnsi="Times New Roman" w:cs="Times New Roman" w:hint="eastAsia"/>
-        </w:rPr>
-        <w:t xml:space="preserve"> </w:t>
-      </w:r>
-      <w:r>
-        <w:rPr>
-          <w:rFonts w:ascii="Times New Roman" w:hAnsi="Times New Roman" w:cs="Times New Roman" w:hint="eastAsia"/>
-        </w:rPr>
-        <w:t>BD</w:t>
-      </w:r>
-      <w:r>
-        <w:rPr>
-          <w:rFonts w:ascii="Times New Roman" w:hAnsi="Times New Roman" w:cs="Times New Roman" w:hint="eastAsia"/>
-        </w:rPr>
-        <w:t xml:space="preserve"> </w:t>
-      </w:r>
-    </w:p>
-    <w:p>
-      <w:pPr>
-        <w:rPr>
-          <w:rFonts w:ascii="Times New Roman" w:hAnsi="Times New Roman" w:cs="Times New Roman"/>
-        </w:rPr>
-      </w:pPr>
-      <w:r>
-        <w:rPr>
-          <w:rFonts w:ascii="Times New Roman" w:hAnsi="Times New Roman" w:cs="Times New Roman" w:hint="eastAsia"/>
-        </w:rPr>
-        <w:t>Don</w:t>
+          <w:rFonts w:ascii="Times New Roman" w:hAnsi="Times New Roman" w:cs="Times New Roman"/>
+        </w:rPr>
+        <w:t>“</w:t>
+      </w:r>
+      <w:r>
+        <w:rPr>
+          <w:rFonts w:ascii="Times New Roman" w:hAnsi="Times New Roman" w:cs="Times New Roman" w:hint="eastAsia"/>
+        </w:rPr>
+        <w:t>It is too ambitious</w:t>
+      </w:r>
+      <w:r>
+        <w:rPr>
+          <w:rFonts w:ascii="Times New Roman" w:hAnsi="Times New Roman" w:cs="Times New Roman"/>
+        </w:rPr>
+        <w:t>…</w:t>
+      </w:r>
+      <w:r>
+        <w:rPr>
+          <w:rFonts w:ascii="Times New Roman" w:hAnsi="Times New Roman" w:cs="Times New Roman" w:hint="eastAsia"/>
+        </w:rPr>
+        <w:t>they just can</w:t>
       </w:r>
       <w:r>
         <w:rPr>
@@ -863,104 +662,86 @@
         <w:rPr>
           <w:rFonts w:ascii="Times New Roman" w:hAnsi="Times New Roman" w:cs="Times New Roman" w:hint="eastAsia"/>
         </w:rPr>
-        <w:t>t write any word you hear</w:t>
-      </w:r>
-      <w:r>
-        <w:rPr>
-          <w:rFonts w:ascii="Times New Roman" w:hAnsi="Times New Roman" w:cs="Times New Roman" w:hint="eastAsia"/>
-        </w:rPr>
-        <w:t xml:space="preserve">, because all the options will apprear in the conversaion. What you should do is to choose the correct answer. </w:t>
-      </w:r>
-      <w:r>
-        <w:rPr>
-          <w:rFonts w:ascii="Times New Roman" w:hAnsi="Times New Roman" w:cs="Times New Roman" w:hint="eastAsia"/>
-        </w:rPr>
-        <w:t>For instance, this question need you to select two kind of service included in the price, which means they are free if you</w:t>
-      </w:r>
-      <w:r>
-        <w:rPr>
-          <w:rFonts w:ascii="Times New Roman" w:hAnsi="Times New Roman" w:cs="Times New Roman" w:hint="eastAsia"/>
-        </w:rPr>
-        <w:t xml:space="preserve"> have</w:t>
-      </w:r>
-      <w:r>
-        <w:rPr>
-          <w:rFonts w:ascii="Times New Roman" w:hAnsi="Times New Roman" w:cs="Times New Roman" w:hint="eastAsia"/>
-        </w:rPr>
-        <w:t xml:space="preserve"> pa</w:t>
-      </w:r>
-      <w:r>
-        <w:rPr>
-          <w:rFonts w:ascii="Times New Roman" w:hAnsi="Times New Roman" w:cs="Times New Roman" w:hint="eastAsia"/>
-        </w:rPr>
-        <w:t>id</w:t>
-      </w:r>
-      <w:r>
-        <w:rPr>
-          <w:rFonts w:ascii="Times New Roman" w:hAnsi="Times New Roman" w:cs="Times New Roman" w:hint="eastAsia"/>
-        </w:rPr>
-        <w:t xml:space="preserve"> the tour. Note that attending some of the course</w:t>
-      </w:r>
-      <w:r>
-        <w:rPr>
-          <w:rFonts w:ascii="Times New Roman" w:hAnsi="Times New Roman" w:cs="Times New Roman" w:hint="eastAsia"/>
-        </w:rPr>
-        <w:t xml:space="preserve"> you</w:t>
-      </w:r>
-      <w:r>
-        <w:rPr>
-          <w:rFonts w:ascii="Times New Roman" w:hAnsi="Times New Roman" w:cs="Times New Roman" w:hint="eastAsia"/>
-        </w:rPr>
-        <w:t xml:space="preserve"> should </w:t>
-      </w:r>
-      <w:r>
-        <w:rPr>
-          <w:rFonts w:ascii="Times New Roman" w:hAnsi="Times New Roman" w:cs="Times New Roman" w:hint="eastAsia"/>
-        </w:rPr>
-        <w:t xml:space="preserve">need to </w:t>
-      </w:r>
-      <w:r>
-        <w:rPr>
-          <w:rFonts w:ascii="Times New Roman" w:hAnsi="Times New Roman" w:cs="Times New Roman" w:hint="eastAsia"/>
-        </w:rPr>
-        <w:t xml:space="preserve">pay </w:t>
-      </w:r>
-      <w:r>
-        <w:rPr>
-          <w:rFonts w:ascii="Times New Roman" w:hAnsi="Times New Roman" w:cs="Times New Roman" w:hint="eastAsia"/>
-        </w:rPr>
-        <w:t>extra money.</w:t>
-      </w:r>
-    </w:p>
-    <w:p>
-      <w:pPr>
-        <w:rPr>
-          <w:rFonts w:ascii="Times New Roman" w:hAnsi="Times New Roman" w:cs="Times New Roman"/>
-        </w:rPr>
-      </w:pPr>
-      <w:r>
-        <w:rPr>
-          <w:rFonts w:ascii="Times New Roman" w:hAnsi="Times New Roman" w:cs="Times New Roman" w:hint="eastAsia"/>
-        </w:rPr>
-        <w:t>7. 290 (</w:t>
-      </w:r>
-      <w:r>
-        <w:rPr>
-          <w:rFonts w:ascii="Times New Roman" w:hAnsi="Times New Roman" w:cs="Times New Roman"/>
-        </w:rPr>
-        <w:t>×</w:t>
-      </w:r>
-      <w:r>
-        <w:rPr>
-          <w:rFonts w:ascii="Times New Roman" w:hAnsi="Times New Roman" w:cs="Times New Roman" w:hint="eastAsia"/>
-        </w:rPr>
-        <w:t>)  280</w:t>
-      </w:r>
-      <w:r>
-        <w:rPr>
-          <w:rFonts w:ascii="Times New Roman" w:hAnsi="Times New Roman" w:cs="Times New Roman" w:hint="eastAsia"/>
-        </w:rPr>
-        <w:t xml:space="preserve"> </w:t>
+        <w:t>t cope with it</w:t>
+      </w:r>
+      <w:r>
+        <w:rPr>
+          <w:rFonts w:ascii="Times New Roman" w:hAnsi="Times New Roman" w:cs="Times New Roman"/>
+        </w:rPr>
+        <w:t>…</w:t>
+      </w:r>
+      <w:r>
+        <w:rPr>
+          <w:rFonts w:ascii="Times New Roman" w:hAnsi="Times New Roman" w:cs="Times New Roman"/>
+        </w:rPr>
+        <w:t>”</w:t>
+      </w:r>
+      <w:r>
+        <w:rPr>
+          <w:rFonts w:ascii="Times New Roman" w:hAnsi="Times New Roman" w:cs="Times New Roman" w:hint="eastAsia"/>
+        </w:rPr>
+        <w:t xml:space="preserve">, which indicated that was difficult for the 8-year-old children. </w:t>
+      </w:r>
+    </w:p>
+    <w:p>
+      <w:pPr>
+        <w:rPr>
+          <w:rFonts w:ascii="Times New Roman" w:hAnsi="Times New Roman" w:cs="Times New Roman" w:hint="eastAsia"/>
+        </w:rPr>
+      </w:pPr>
+      <w:bookmarkStart w:id="1" w:name="_GoBack"/>
+      <w:bookmarkEnd w:id="1"/>
+    </w:p>
+    <w:p>
+      <w:pPr>
+        <w:rPr>
+          <w:rFonts w:ascii="Times New Roman" w:hAnsi="Times New Roman" w:cs="Times New Roman"/>
+        </w:rPr>
+      </w:pPr>
+    </w:p>
+    <w:bookmarkEnd w:id="0"/>
+    <w:p>
+      <w:pPr>
+        <w:outlineLvl w:val="1"/>
+        <w:rPr>
+          <w:rFonts w:ascii="Times New Roman" w:hAnsi="Times New Roman" w:cs="Times New Roman"/>
+          <w:b/>
+          <w:bCs/>
+          <w:sz w:val="28"/>
+          <w:szCs w:val="28"/>
+        </w:rPr>
+      </w:pPr>
+      <w:r>
+        <w:rPr>
+          <w:rFonts w:ascii="Times New Roman" w:hAnsi="Times New Roman" w:cs="Times New Roman" w:hint="eastAsia"/>
+          <w:b/>
+          <w:bCs/>
+          <w:sz w:val="28"/>
+          <w:szCs w:val="28"/>
+        </w:rPr>
+        <w:t>Cambridge IETLS 5</w:t>
+      </w:r>
+    </w:p>
+    <w:p>
+      <w:pPr>
+        <w:outlineLvl w:val="2"/>
+        <w:rPr>
+          <w:rFonts w:ascii="Times New Roman" w:hAnsi="Times New Roman" w:cs="Times New Roman"/>
+          <w:b/>
+          <w:bCs/>
+          <w:sz w:val="24"/>
+          <w:szCs w:val="24"/>
+        </w:rPr>
+      </w:pPr>
+      <w:r>
+        <w:rPr>
+          <w:rFonts w:ascii="Times New Roman" w:hAnsi="Times New Roman" w:cs="Times New Roman" w:hint="eastAsia"/>
+          <w:b/>
+          <w:bCs/>
+          <w:sz w:val="24"/>
+          <w:szCs w:val="24"/>
+        </w:rPr>
+        <w:t>Test 1 Listening</w:t>
       </w:r>
     </w:p>
     <w:p>
@@ -985,21 +766,229 @@
           <w:sz w:val="24"/>
           <w:szCs w:val="24"/>
         </w:rPr>
+        <w:t>Section 1</w:t>
+      </w:r>
+    </w:p>
+    <w:p>
+      <w:pPr>
+        <w:rPr>
+          <w:rFonts w:ascii="Times New Roman" w:hAnsi="Times New Roman" w:cs="Times New Roman"/>
+        </w:rPr>
+      </w:pPr>
+      <w:r>
+        <w:rPr>
+          <w:rFonts w:ascii="Times New Roman" w:hAnsi="Times New Roman" w:cs="Times New Roman" w:hint="eastAsia"/>
+        </w:rPr>
+        <w:t>1. mini bus (</w:t>
+      </w:r>
+      <w:r>
+        <w:rPr>
+          <w:rFonts w:ascii="Times New Roman" w:hAnsi="Times New Roman" w:cs="Times New Roman"/>
+        </w:rPr>
+        <w:t>×</w:t>
+      </w:r>
+      <w:r>
+        <w:rPr>
+          <w:rFonts w:ascii="Times New Roman" w:hAnsi="Times New Roman" w:cs="Times New Roman" w:hint="eastAsia"/>
+        </w:rPr>
+        <w:t xml:space="preserve">)  a minibus.  </w:t>
+      </w:r>
+    </w:p>
+    <w:p>
+      <w:pPr>
+        <w:rPr>
+          <w:rFonts w:ascii="Times New Roman" w:hAnsi="Times New Roman" w:cs="Times New Roman"/>
+        </w:rPr>
+      </w:pPr>
+      <w:r>
+        <w:rPr>
+          <w:rFonts w:ascii="Times New Roman" w:hAnsi="Times New Roman" w:cs="Times New Roman" w:hint="eastAsia"/>
+        </w:rPr>
+        <w:t xml:space="preserve">Note </w:t>
+      </w:r>
+      <w:r>
+        <w:rPr>
+          <w:rFonts w:ascii="Times New Roman" w:hAnsi="Times New Roman" w:cs="Times New Roman" w:hint="eastAsia"/>
+        </w:rPr>
+        <w:t xml:space="preserve">that </w:t>
+      </w:r>
+      <w:r>
+        <w:rPr>
+          <w:rFonts w:ascii="Times New Roman" w:hAnsi="Times New Roman" w:cs="Times New Roman"/>
+        </w:rPr>
+        <w:t>‘</w:t>
+      </w:r>
+      <w:r>
+        <w:rPr>
+          <w:rFonts w:ascii="Times New Roman" w:hAnsi="Times New Roman" w:cs="Times New Roman" w:hint="eastAsia"/>
+        </w:rPr>
+        <w:t>minibus</w:t>
+      </w:r>
+      <w:r>
+        <w:rPr>
+          <w:rFonts w:ascii="Times New Roman" w:hAnsi="Times New Roman" w:cs="Times New Roman"/>
+        </w:rPr>
+        <w:t>’</w:t>
+      </w:r>
+      <w:r>
+        <w:rPr>
+          <w:rFonts w:ascii="Times New Roman" w:hAnsi="Times New Roman" w:cs="Times New Roman" w:hint="eastAsia"/>
+        </w:rPr>
+        <w:t xml:space="preserve"> is a single word.</w:t>
+      </w:r>
+    </w:p>
+    <w:p>
+      <w:pPr>
+        <w:rPr>
+          <w:rFonts w:ascii="Times New Roman" w:hAnsi="Times New Roman" w:cs="Times New Roman"/>
+        </w:rPr>
+      </w:pPr>
+      <w:r>
+        <w:rPr>
+          <w:rFonts w:ascii="Times New Roman" w:hAnsi="Times New Roman" w:cs="Times New Roman" w:hint="eastAsia"/>
+        </w:rPr>
+        <w:t>5. BC (</w:t>
+      </w:r>
+      <w:r>
+        <w:rPr>
+          <w:rFonts w:ascii="Times New Roman" w:hAnsi="Times New Roman" w:cs="Times New Roman"/>
+        </w:rPr>
+        <w:t>×</w:t>
+      </w:r>
+      <w:r>
+        <w:rPr>
+          <w:rFonts w:ascii="Times New Roman" w:hAnsi="Times New Roman" w:cs="Times New Roman" w:hint="eastAsia"/>
+        </w:rPr>
+        <w:t xml:space="preserve">) </w:t>
+      </w:r>
+      <w:r>
+        <w:rPr>
+          <w:rFonts w:ascii="Times New Roman" w:hAnsi="Times New Roman" w:cs="Times New Roman" w:hint="eastAsia"/>
+        </w:rPr>
+        <w:t xml:space="preserve"> </w:t>
+      </w:r>
+      <w:r>
+        <w:rPr>
+          <w:rFonts w:ascii="Times New Roman" w:hAnsi="Times New Roman" w:cs="Times New Roman" w:hint="eastAsia"/>
+        </w:rPr>
+        <w:t xml:space="preserve"> </w:t>
+      </w:r>
+      <w:r>
+        <w:rPr>
+          <w:rFonts w:ascii="Times New Roman" w:hAnsi="Times New Roman" w:cs="Times New Roman" w:hint="eastAsia"/>
+        </w:rPr>
+        <w:t>BD</w:t>
+      </w:r>
+      <w:r>
+        <w:rPr>
+          <w:rFonts w:ascii="Times New Roman" w:hAnsi="Times New Roman" w:cs="Times New Roman" w:hint="eastAsia"/>
+        </w:rPr>
+        <w:t xml:space="preserve"> </w:t>
+      </w:r>
+    </w:p>
+    <w:p>
+      <w:pPr>
+        <w:rPr>
+          <w:rFonts w:ascii="Times New Roman" w:hAnsi="Times New Roman" w:cs="Times New Roman"/>
+        </w:rPr>
+      </w:pPr>
+      <w:r>
+        <w:rPr>
+          <w:rFonts w:ascii="Times New Roman" w:hAnsi="Times New Roman" w:cs="Times New Roman" w:hint="eastAsia"/>
+        </w:rPr>
         <w:lastRenderedPageBreak/>
-        <w:t>Section 2</w:t>
-      </w:r>
-    </w:p>
-    <w:p>
-      <w:pPr>
-        <w:rPr>
-          <w:rFonts w:ascii="Times New Roman" w:hAnsi="Times New Roman" w:cs="Times New Roman"/>
-        </w:rPr>
-      </w:pPr>
-      <w:r>
-        <w:rPr>
-          <w:rFonts w:ascii="Times New Roman" w:hAnsi="Times New Roman" w:cs="Times New Roman" w:hint="eastAsia"/>
-        </w:rPr>
-        <w:t>12 breaks (</w:t>
+        <w:t>Don</w:t>
+      </w:r>
+      <w:r>
+        <w:rPr>
+          <w:rFonts w:ascii="Times New Roman" w:hAnsi="Times New Roman" w:cs="Times New Roman"/>
+        </w:rPr>
+        <w:t>’</w:t>
+      </w:r>
+      <w:r>
+        <w:rPr>
+          <w:rFonts w:ascii="Times New Roman" w:hAnsi="Times New Roman" w:cs="Times New Roman" w:hint="eastAsia"/>
+        </w:rPr>
+        <w:t>t write any word you hear</w:t>
+      </w:r>
+      <w:r>
+        <w:rPr>
+          <w:rFonts w:ascii="Times New Roman" w:hAnsi="Times New Roman" w:cs="Times New Roman" w:hint="eastAsia"/>
+        </w:rPr>
+        <w:t xml:space="preserve">, because all the options will apprear in the conversaion. What you should do is to choose the correct answer. </w:t>
+      </w:r>
+      <w:r>
+        <w:rPr>
+          <w:rFonts w:ascii="Times New Roman" w:hAnsi="Times New Roman" w:cs="Times New Roman" w:hint="eastAsia"/>
+        </w:rPr>
+        <w:t>For instance, this question need you to select two kind of service included in the price, which means they are free if you</w:t>
+      </w:r>
+      <w:r>
+        <w:rPr>
+          <w:rFonts w:ascii="Times New Roman" w:hAnsi="Times New Roman" w:cs="Times New Roman" w:hint="eastAsia"/>
+        </w:rPr>
+        <w:t xml:space="preserve"> have</w:t>
+      </w:r>
+      <w:r>
+        <w:rPr>
+          <w:rFonts w:ascii="Times New Roman" w:hAnsi="Times New Roman" w:cs="Times New Roman" w:hint="eastAsia"/>
+        </w:rPr>
+        <w:t xml:space="preserve"> pa</w:t>
+      </w:r>
+      <w:r>
+        <w:rPr>
+          <w:rFonts w:ascii="Times New Roman" w:hAnsi="Times New Roman" w:cs="Times New Roman" w:hint="eastAsia"/>
+        </w:rPr>
+        <w:t>id</w:t>
+      </w:r>
+      <w:r>
+        <w:rPr>
+          <w:rFonts w:ascii="Times New Roman" w:hAnsi="Times New Roman" w:cs="Times New Roman" w:hint="eastAsia"/>
+        </w:rPr>
+        <w:t xml:space="preserve"> the tour. Note that attending some of the course</w:t>
+      </w:r>
+      <w:r>
+        <w:rPr>
+          <w:rFonts w:ascii="Times New Roman" w:hAnsi="Times New Roman" w:cs="Times New Roman" w:hint="eastAsia"/>
+        </w:rPr>
+        <w:t xml:space="preserve"> you</w:t>
+      </w:r>
+      <w:r>
+        <w:rPr>
+          <w:rFonts w:ascii="Times New Roman" w:hAnsi="Times New Roman" w:cs="Times New Roman" w:hint="eastAsia"/>
+        </w:rPr>
+        <w:t xml:space="preserve"> should </w:t>
+      </w:r>
+      <w:r>
+        <w:rPr>
+          <w:rFonts w:ascii="Times New Roman" w:hAnsi="Times New Roman" w:cs="Times New Roman" w:hint="eastAsia"/>
+        </w:rPr>
+        <w:t xml:space="preserve">need to </w:t>
+      </w:r>
+      <w:r>
+        <w:rPr>
+          <w:rFonts w:ascii="Times New Roman" w:hAnsi="Times New Roman" w:cs="Times New Roman" w:hint="eastAsia"/>
+        </w:rPr>
+        <w:t xml:space="preserve">pay </w:t>
+      </w:r>
+      <w:r>
+        <w:rPr>
+          <w:rFonts w:ascii="Times New Roman" w:hAnsi="Times New Roman" w:cs="Times New Roman" w:hint="eastAsia"/>
+        </w:rPr>
+        <w:t>extra money.</w:t>
+      </w:r>
+    </w:p>
+    <w:p>
+      <w:pPr>
+        <w:rPr>
+          <w:rFonts w:ascii="Times New Roman" w:hAnsi="Times New Roman" w:cs="Times New Roman"/>
+        </w:rPr>
+      </w:pPr>
+      <w:r>
+        <w:rPr>
+          <w:rFonts w:ascii="Times New Roman" w:hAnsi="Times New Roman" w:cs="Times New Roman" w:hint="eastAsia"/>
+        </w:rPr>
+        <w:t>7. 290 (</w:t>
       </w:r>
       <w:r>
         <w:rPr>
@@ -1011,19 +1000,13 @@
         <w:rPr>
           <w:rFonts w:ascii="Times New Roman" w:hAnsi="Times New Roman" w:cs="Times New Roman" w:hint="eastAsia"/>
         </w:rPr>
-        <w:t xml:space="preserve">) </w:t>
-      </w:r>
-      <w:r>
-        <w:rPr>
-          <w:rFonts w:ascii="Times New Roman" w:hAnsi="Times New Roman" w:cs="Times New Roman" w:hint="eastAsia"/>
-        </w:rPr>
-        <w:t xml:space="preserve">: </w:t>
-      </w:r>
-      <w:r>
-        <w:rPr>
-          <w:rFonts w:ascii="Times New Roman" w:hAnsi="Times New Roman" w:cs="Times New Roman" w:hint="eastAsia"/>
-        </w:rPr>
-        <w:t>brakes</w:t>
+        <w:t>)  280</w:t>
+      </w:r>
+      <w:r>
+        <w:rPr>
+          <w:rFonts w:ascii="Times New Roman" w:hAnsi="Times New Roman" w:cs="Times New Roman" w:hint="eastAsia"/>
+        </w:rPr>
+        <w:t xml:space="preserve"> </w:t>
       </w:r>
     </w:p>
     <w:p>
@@ -1034,6 +1017,8 @@
           <w:bCs/>
           <w:i/>
           <w:iCs/>
+          <w:sz w:val="24"/>
+          <w:szCs w:val="24"/>
         </w:rPr>
       </w:pPr>
       <w:r>
@@ -1043,27 +1028,23 @@
           <w:bCs/>
           <w:i/>
           <w:iCs/>
-        </w:rPr>
-        <w:t>Section 3</w:t>
-      </w:r>
-    </w:p>
-    <w:p>
-      <w:pPr>
-        <w:rPr>
-          <w:rFonts w:ascii="Times New Roman" w:hAnsi="Times New Roman" w:cs="Times New Roman" w:hint="eastAsia"/>
-        </w:rPr>
-      </w:pPr>
-      <w:r>
-        <w:rPr>
-          <w:rFonts w:ascii="Times New Roman" w:hAnsi="Times New Roman" w:cs="Times New Roman" w:hint="eastAsia"/>
-        </w:rPr>
-        <w:t>24</w:t>
-      </w:r>
-      <w:r>
-        <w:rPr>
-          <w:rFonts w:ascii="Times New Roman" w:hAnsi="Times New Roman" w:cs="Times New Roman" w:hint="eastAsia"/>
-        </w:rPr>
-        <w:t>,25 BC (</w:t>
+          <w:sz w:val="24"/>
+          <w:szCs w:val="24"/>
+        </w:rPr>
+        <w:t>Section 2</w:t>
+      </w:r>
+    </w:p>
+    <w:p>
+      <w:pPr>
+        <w:rPr>
+          <w:rFonts w:ascii="Times New Roman" w:hAnsi="Times New Roman" w:cs="Times New Roman"/>
+        </w:rPr>
+      </w:pPr>
+      <w:r>
+        <w:rPr>
+          <w:rFonts w:ascii="Times New Roman" w:hAnsi="Times New Roman" w:cs="Times New Roman" w:hint="eastAsia"/>
+        </w:rPr>
+        <w:t>12 breaks (</w:t>
       </w:r>
       <w:r>
         <w:rPr>
@@ -1075,138 +1056,19 @@
         <w:rPr>
           <w:rFonts w:ascii="Times New Roman" w:hAnsi="Times New Roman" w:cs="Times New Roman" w:hint="eastAsia"/>
         </w:rPr>
-        <w:t>) BD</w:t>
-      </w:r>
-      <w:r>
-        <w:rPr>
-          <w:rFonts w:ascii="Times New Roman" w:hAnsi="Times New Roman" w:cs="Times New Roman" w:hint="eastAsia"/>
-        </w:rPr>
-        <w:t xml:space="preserve"> </w:t>
-      </w:r>
-    </w:p>
-    <w:p>
-      <w:pPr>
-        <w:rPr>
-          <w:rFonts w:ascii="Times New Roman" w:hAnsi="Times New Roman" w:cs="Times New Roman"/>
-        </w:rPr>
-      </w:pPr>
-      <w:r>
-        <w:rPr>
-          <w:rFonts w:ascii="Times New Roman" w:hAnsi="Times New Roman" w:cs="Times New Roman" w:hint="eastAsia"/>
-        </w:rPr>
-        <w:t>(I knew the answer was D but select</w:t>
-      </w:r>
-      <w:r>
-        <w:rPr>
-          <w:rFonts w:ascii="Times New Roman" w:hAnsi="Times New Roman" w:cs="Times New Roman" w:hint="eastAsia"/>
-        </w:rPr>
-        <w:t>e</w:t>
-      </w:r>
-      <w:r>
-        <w:rPr>
-          <w:rFonts w:ascii="Times New Roman" w:hAnsi="Times New Roman" w:cs="Times New Roman" w:hint="eastAsia"/>
-        </w:rPr>
-        <w:t>d C!)</w:t>
-      </w:r>
-    </w:p>
-    <w:p>
-      <w:pPr>
-        <w:rPr>
-          <w:rFonts w:ascii="Times New Roman" w:hAnsi="Times New Roman" w:cs="Times New Roman"/>
-        </w:rPr>
-      </w:pPr>
-      <w:r>
-        <w:rPr>
-          <w:rFonts w:ascii="Times New Roman" w:hAnsi="Times New Roman" w:cs="Times New Roman" w:hint="eastAsia"/>
-        </w:rPr>
-        <w:t>26, ___  (</w:t>
-      </w:r>
-      <w:r>
-        <w:rPr>
-          <w:rFonts w:ascii="Times New Roman" w:hAnsi="Times New Roman" w:cs="Times New Roman"/>
-        </w:rPr>
-        <w:t>×</w:t>
-      </w:r>
-      <w:r>
-        <w:rPr>
-          <w:rFonts w:ascii="Times New Roman" w:hAnsi="Times New Roman" w:cs="Times New Roman" w:hint="eastAsia"/>
-        </w:rPr>
-        <w:t>) full-time</w:t>
-      </w:r>
-    </w:p>
-    <w:p>
-      <w:pPr>
-        <w:rPr>
-          <w:rFonts w:ascii="Times New Roman" w:hAnsi="Times New Roman" w:cs="Times New Roman"/>
-        </w:rPr>
-      </w:pPr>
-      <w:r>
-        <w:rPr>
-          <w:rFonts w:ascii="Times New Roman" w:hAnsi="Times New Roman" w:cs="Times New Roman" w:hint="eastAsia"/>
-        </w:rPr>
-        <w:t>27 short time (</w:t>
-      </w:r>
-      <w:r>
-        <w:rPr>
-          <w:rFonts w:ascii="Times New Roman" w:hAnsi="Times New Roman" w:cs="Times New Roman"/>
-        </w:rPr>
-        <w:t>×</w:t>
-      </w:r>
-      <w:r>
-        <w:rPr>
-          <w:rFonts w:ascii="Times New Roman" w:hAnsi="Times New Roman" w:cs="Times New Roman" w:hint="eastAsia"/>
-        </w:rPr>
-        <w:t>) a term</w:t>
-      </w:r>
-    </w:p>
-    <w:p>
-      <w:pPr>
-        <w:rPr>
-          <w:rFonts w:ascii="Times New Roman" w:hAnsi="Times New Roman" w:cs="Times New Roman"/>
-        </w:rPr>
-      </w:pPr>
-      <w:r>
-        <w:rPr>
-          <w:rFonts w:ascii="Times New Roman" w:hAnsi="Times New Roman" w:cs="Times New Roman" w:hint="eastAsia"/>
-        </w:rPr>
-        <w:t>29. ___ (</w:t>
-      </w:r>
-      <w:r>
-        <w:rPr>
-          <w:rFonts w:ascii="Times New Roman" w:hAnsi="Times New Roman" w:cs="Times New Roman"/>
-        </w:rPr>
-        <w:t>×</w:t>
-      </w:r>
-      <w:r>
-        <w:rPr>
-          <w:rFonts w:ascii="Times New Roman" w:hAnsi="Times New Roman" w:cs="Times New Roman" w:hint="eastAsia"/>
-        </w:rPr>
-        <w:t>) two modules</w:t>
-      </w:r>
-    </w:p>
-    <w:p>
-      <w:pPr>
-        <w:rPr>
-          <w:rFonts w:ascii="Times New Roman" w:hAnsi="Times New Roman" w:cs="Times New Roman"/>
-        </w:rPr>
-      </w:pPr>
-      <w:r>
-        <w:rPr>
-          <w:rFonts w:ascii="Times New Roman" w:hAnsi="Times New Roman" w:cs="Times New Roman" w:hint="eastAsia"/>
-        </w:rPr>
-        <w:t>30. ___(</w:t>
-      </w:r>
-      <w:r>
-        <w:rPr>
-          <w:rFonts w:ascii="Times New Roman" w:hAnsi="Times New Roman" w:cs="Times New Roman"/>
-        </w:rPr>
-        <w:t>×</w:t>
-      </w:r>
-      <w:r>
-        <w:rPr>
-          <w:rFonts w:ascii="Times New Roman" w:hAnsi="Times New Roman" w:cs="Times New Roman" w:hint="eastAsia"/>
-        </w:rPr>
-        <w:t>) a topic</w:t>
+        <w:t xml:space="preserve">) </w:t>
+      </w:r>
+      <w:r>
+        <w:rPr>
+          <w:rFonts w:ascii="Times New Roman" w:hAnsi="Times New Roman" w:cs="Times New Roman" w:hint="eastAsia"/>
+        </w:rPr>
+        <w:t xml:space="preserve">: </w:t>
+      </w:r>
+      <w:r>
+        <w:rPr>
+          <w:rFonts w:ascii="Times New Roman" w:hAnsi="Times New Roman" w:cs="Times New Roman" w:hint="eastAsia"/>
+        </w:rPr>
+        <w:t>brakes</w:t>
       </w:r>
     </w:p>
     <w:p>
@@ -1227,6 +1089,189 @@
           <w:i/>
           <w:iCs/>
         </w:rPr>
+        <w:t>Section 3</w:t>
+      </w:r>
+    </w:p>
+    <w:p>
+      <w:pPr>
+        <w:rPr>
+          <w:rFonts w:ascii="Times New Roman" w:hAnsi="Times New Roman" w:cs="Times New Roman"/>
+        </w:rPr>
+      </w:pPr>
+      <w:r>
+        <w:rPr>
+          <w:rFonts w:ascii="Times New Roman" w:hAnsi="Times New Roman" w:cs="Times New Roman" w:hint="eastAsia"/>
+        </w:rPr>
+        <w:t>24</w:t>
+      </w:r>
+      <w:r>
+        <w:rPr>
+          <w:rFonts w:ascii="Times New Roman" w:hAnsi="Times New Roman" w:cs="Times New Roman" w:hint="eastAsia"/>
+        </w:rPr>
+        <w:t>,25 BC (</w:t>
+      </w:r>
+      <w:r>
+        <w:rPr>
+          <w:rFonts w:ascii="Times New Roman" w:hAnsi="Times New Roman" w:cs="Times New Roman"/>
+        </w:rPr>
+        <w:t>×</w:t>
+      </w:r>
+      <w:r>
+        <w:rPr>
+          <w:rFonts w:ascii="Times New Roman" w:hAnsi="Times New Roman" w:cs="Times New Roman" w:hint="eastAsia"/>
+        </w:rPr>
+        <w:t>) BD</w:t>
+      </w:r>
+      <w:r>
+        <w:rPr>
+          <w:rFonts w:ascii="Times New Roman" w:hAnsi="Times New Roman" w:cs="Times New Roman" w:hint="eastAsia"/>
+        </w:rPr>
+        <w:t xml:space="preserve"> </w:t>
+      </w:r>
+    </w:p>
+    <w:p>
+      <w:pPr>
+        <w:rPr>
+          <w:rFonts w:ascii="Times New Roman" w:hAnsi="Times New Roman" w:cs="Times New Roman"/>
+        </w:rPr>
+      </w:pPr>
+      <w:r>
+        <w:rPr>
+          <w:rFonts w:ascii="Times New Roman" w:hAnsi="Times New Roman" w:cs="Times New Roman" w:hint="eastAsia"/>
+        </w:rPr>
+        <w:t>(I knew the answer was D but select</w:t>
+      </w:r>
+      <w:r>
+        <w:rPr>
+          <w:rFonts w:ascii="Times New Roman" w:hAnsi="Times New Roman" w:cs="Times New Roman" w:hint="eastAsia"/>
+        </w:rPr>
+        <w:t>e</w:t>
+      </w:r>
+      <w:r>
+        <w:rPr>
+          <w:rFonts w:ascii="Times New Roman" w:hAnsi="Times New Roman" w:cs="Times New Roman" w:hint="eastAsia"/>
+        </w:rPr>
+        <w:t>d C!)</w:t>
+      </w:r>
+    </w:p>
+    <w:p>
+      <w:pPr>
+        <w:rPr>
+          <w:rFonts w:ascii="Times New Roman" w:hAnsi="Times New Roman" w:cs="Times New Roman"/>
+        </w:rPr>
+      </w:pPr>
+      <w:r>
+        <w:rPr>
+          <w:rFonts w:ascii="Times New Roman" w:hAnsi="Times New Roman" w:cs="Times New Roman" w:hint="eastAsia"/>
+        </w:rPr>
+        <w:t>26, ___  (</w:t>
+      </w:r>
+      <w:r>
+        <w:rPr>
+          <w:rFonts w:ascii="Times New Roman" w:hAnsi="Times New Roman" w:cs="Times New Roman"/>
+        </w:rPr>
+        <w:t>×</w:t>
+      </w:r>
+      <w:r>
+        <w:rPr>
+          <w:rFonts w:ascii="Times New Roman" w:hAnsi="Times New Roman" w:cs="Times New Roman" w:hint="eastAsia"/>
+        </w:rPr>
+        <w:t>) full-time</w:t>
+      </w:r>
+    </w:p>
+    <w:p>
+      <w:pPr>
+        <w:rPr>
+          <w:rFonts w:ascii="Times New Roman" w:hAnsi="Times New Roman" w:cs="Times New Roman"/>
+        </w:rPr>
+      </w:pPr>
+      <w:r>
+        <w:rPr>
+          <w:rFonts w:ascii="Times New Roman" w:hAnsi="Times New Roman" w:cs="Times New Roman" w:hint="eastAsia"/>
+        </w:rPr>
+        <w:t>27 short time (</w:t>
+      </w:r>
+      <w:r>
+        <w:rPr>
+          <w:rFonts w:ascii="Times New Roman" w:hAnsi="Times New Roman" w:cs="Times New Roman"/>
+        </w:rPr>
+        <w:t>×</w:t>
+      </w:r>
+      <w:r>
+        <w:rPr>
+          <w:rFonts w:ascii="Times New Roman" w:hAnsi="Times New Roman" w:cs="Times New Roman" w:hint="eastAsia"/>
+        </w:rPr>
+        <w:t>) a term</w:t>
+      </w:r>
+    </w:p>
+    <w:p>
+      <w:pPr>
+        <w:rPr>
+          <w:rFonts w:ascii="Times New Roman" w:hAnsi="Times New Roman" w:cs="Times New Roman"/>
+        </w:rPr>
+      </w:pPr>
+      <w:r>
+        <w:rPr>
+          <w:rFonts w:ascii="Times New Roman" w:hAnsi="Times New Roman" w:cs="Times New Roman" w:hint="eastAsia"/>
+        </w:rPr>
+        <w:t>29. ___ (</w:t>
+      </w:r>
+      <w:r>
+        <w:rPr>
+          <w:rFonts w:ascii="Times New Roman" w:hAnsi="Times New Roman" w:cs="Times New Roman"/>
+        </w:rPr>
+        <w:t>×</w:t>
+      </w:r>
+      <w:r>
+        <w:rPr>
+          <w:rFonts w:ascii="Times New Roman" w:hAnsi="Times New Roman" w:cs="Times New Roman" w:hint="eastAsia"/>
+        </w:rPr>
+        <w:t>) two modules</w:t>
+      </w:r>
+    </w:p>
+    <w:p>
+      <w:pPr>
+        <w:rPr>
+          <w:rFonts w:ascii="Times New Roman" w:hAnsi="Times New Roman" w:cs="Times New Roman"/>
+        </w:rPr>
+      </w:pPr>
+      <w:r>
+        <w:rPr>
+          <w:rFonts w:ascii="Times New Roman" w:hAnsi="Times New Roman" w:cs="Times New Roman" w:hint="eastAsia"/>
+        </w:rPr>
+        <w:t>30. ___(</w:t>
+      </w:r>
+      <w:r>
+        <w:rPr>
+          <w:rFonts w:ascii="Times New Roman" w:hAnsi="Times New Roman" w:cs="Times New Roman"/>
+        </w:rPr>
+        <w:t>×</w:t>
+      </w:r>
+      <w:r>
+        <w:rPr>
+          <w:rFonts w:ascii="Times New Roman" w:hAnsi="Times New Roman" w:cs="Times New Roman" w:hint="eastAsia"/>
+        </w:rPr>
+        <w:t>) a topic</w:t>
+      </w:r>
+    </w:p>
+    <w:p>
+      <w:pPr>
+        <w:rPr>
+          <w:rFonts w:ascii="Times New Roman" w:hAnsi="Times New Roman" w:cs="Times New Roman"/>
+          <w:b/>
+          <w:bCs/>
+          <w:i/>
+          <w:iCs/>
+        </w:rPr>
+      </w:pPr>
+      <w:r>
+        <w:rPr>
+          <w:rFonts w:ascii="Times New Roman" w:hAnsi="Times New Roman" w:cs="Times New Roman" w:hint="eastAsia"/>
+          <w:b/>
+          <w:bCs/>
+          <w:i/>
+          <w:iCs/>
+        </w:rPr>
         <w:t>Section 4</w:t>
       </w:r>
     </w:p>
@@ -1793,6 +1838,7 @@
         <w:rPr>
           <w:rFonts w:ascii="Times New Roman" w:hAnsi="Times New Roman" w:cs="Times New Roman" w:hint="eastAsia"/>
         </w:rPr>
+        <w:lastRenderedPageBreak/>
         <w:t>8, charge (</w:t>
       </w:r>
       <w:r>
@@ -1981,7 +2027,6 @@
         <w:rPr>
           <w:rFonts w:ascii="Times New Roman" w:hAnsi="Times New Roman" w:cs="Times New Roman" w:hint="eastAsia"/>
         </w:rPr>
-        <w:lastRenderedPageBreak/>
         <w:t xml:space="preserve">18-20, </w:t>
       </w:r>
       <w:r>
@@ -2891,6 +2936,7 @@
           <w:sz w:val="24"/>
           <w:szCs w:val="24"/>
         </w:rPr>
+        <w:lastRenderedPageBreak/>
         <w:t>Section 4</w:t>
       </w:r>
     </w:p>
@@ -2991,7 +3037,6 @@
         <w:rPr>
           <w:rFonts w:ascii="Times New Roman" w:hAnsi="Times New Roman" w:cs="Times New Roman" w:hint="eastAsia"/>
         </w:rPr>
-        <w:lastRenderedPageBreak/>
         <w:t>Toughen glass used for cooking doesn</w:t>
       </w:r>
       <w:r>
@@ -3981,6 +4026,7 @@
         <w:rPr>
           <w:rFonts w:ascii="Times New Roman" w:hAnsi="Times New Roman" w:cs="Times New Roman" w:hint="eastAsia"/>
         </w:rPr>
+        <w:lastRenderedPageBreak/>
         <w:t>17, _______ (</w:t>
       </w:r>
       <w:r>
@@ -4043,7 +4089,6 @@
         <w:rPr>
           <w:rFonts w:ascii="Times New Roman" w:hAnsi="Times New Roman" w:cs="Times New Roman" w:hint="eastAsia"/>
         </w:rPr>
-        <w:lastRenderedPageBreak/>
         <w:t xml:space="preserve">26, A  </w:t>
       </w:r>
       <w:r>
@@ -4800,6 +4845,7 @@
         <w:rPr>
           <w:rFonts w:ascii="Times New Roman" w:hAnsi="Times New Roman" w:cs="Times New Roman"/>
         </w:rPr>
+        <w:lastRenderedPageBreak/>
         <w:t>“</w:t>
       </w:r>
       <w:r>
@@ -4946,7 +4992,6 @@
         <w:rPr>
           <w:rFonts w:ascii="Times New Roman" w:hAnsi="Times New Roman" w:cs="Times New Roman" w:hint="eastAsia"/>
         </w:rPr>
-        <w:lastRenderedPageBreak/>
         <w:t>3. yoga class (x)</w:t>
       </w:r>
     </w:p>
@@ -6511,7 +6556,7 @@
   <a:extraClrSchemeLst/>
   <a:extLst>
     <a:ext uri="{05A4C25C-085E-4340-85A3-A5531E510DB2}">
-      <thm15:themeFamily xmlns:thm15="http://schemas.microsoft.com/office/thememl/2012/main" xmlns="" name="Office Theme" id="{62F939B6-93AF-4DB8-9C6B-D6C7DFDC589F}" vid="{4A3C46E8-61CC-4603-A589-7422A47A8E4A}"/>
+      <thm15:themeFamily xmlns="" xmlns:thm15="http://schemas.microsoft.com/office/thememl/2012/main" name="Office Theme" id="{62F939B6-93AF-4DB8-9C6B-D6C7DFDC589F}" vid="{4A3C46E8-61CC-4603-A589-7422A47A8E4A}"/>
     </a:ext>
   </a:extLst>
 </a:theme>

</xml_diff>